<commit_message>
fix(typography): eliminate AI artifacts, standardize 12pt abstract, fix TOC dot leaders, compile NoBab3 PDF
</commit_message>
<xml_diff>
--- a/01_Naskah_Utama/Proposal_Arthur_NoBab3.docx
+++ b/01_Naskah_Utama/Proposal_Arthur_NoBab3.docx
@@ -206,7 +206,6 @@
         <w:rPr>
           <w:rFonts w:ascii="Times New Roman" w:hAnsi="Times New Roman"/>
           <w:b/>
-          <w:color w:val="000000"/>
           <w:sz w:val="24"/>
         </w:rPr>
         <w:t>PERNYATAAN KEASLIAN KARYA TUGAS AKHIR</w:t>
@@ -700,7 +699,6 @@
         <w:rPr>
           <w:rFonts w:ascii="Times New Roman" w:hAnsi="Times New Roman"/>
           <w:b/>
-          <w:color w:val="000000"/>
           <w:sz w:val="24"/>
         </w:rPr>
         <w:t>HALAMAN PERSETUJUAN PROPOSAL SKRIPSI</w:t>
@@ -1141,7 +1139,6 @@
         <w:rPr>
           <w:rFonts w:ascii="Times New Roman" w:hAnsi="Times New Roman"/>
           <w:b/>
-          <w:color w:val="000000"/>
           <w:sz w:val="24"/>
         </w:rPr>
         <w:t>HALAMAN PENGESAHAN TIM PENGUJI SEMINAR PROPOSAL</w:t>
@@ -1352,7 +1349,6 @@
         <w:rPr>
           <w:rFonts w:ascii="Times New Roman" w:hAnsi="Times New Roman"/>
           <w:b/>
-          <w:color w:val="000000"/>
           <w:sz w:val="24"/>
         </w:rPr>
         <w:t>KATA PENGANTAR</w:t>
@@ -1568,7 +1564,6 @@
         <w:rPr>
           <w:rFonts w:ascii="Times New Roman" w:hAnsi="Times New Roman"/>
           <w:b/>
-          <w:color w:val="000000"/>
           <w:sz w:val="24"/>
         </w:rPr>
         <w:t>ABSTRAK</w:t>
@@ -1583,7 +1578,7 @@
         <w:rPr>
           <w:rFonts w:ascii="Times New Roman" w:hAnsi="Times New Roman"/>
           <w:b/>
-          <w:sz w:val="20"/>
+          <w:sz w:val="24"/>
         </w:rPr>
         <w:t>PENGARUH HEDONIC MOTIVATION, DESIRE FOR COMPLETENESS, DAN SPECULATIVE MOTIVE TERHADAP IMPULSIVE BUYING BOOSTER PACK KARTU POKÉMON TCG DENGAN SELF-CONTROL SEBAGAI VARIABEL MODERASI</w:t>
         <w:br/>
@@ -1604,7 +1599,7 @@
       <w:r>
         <w:rPr>
           <w:rFonts w:ascii="Times New Roman" w:hAnsi="Times New Roman"/>
-          <w:sz w:val="20"/>
+          <w:sz w:val="24"/>
         </w:rPr>
         <w:t>Penelitian ini bertujuan untuk menganalisis dan menguji secara empiris pengaruh hedonic motivation (motivasi hedonis), desire for completeness (hasrat kelengkapan koleksi), dan speculative motive (motif spekulasi finansial) terhadap impulsive buying (pembelian impulsif) booster pack kartu Pokémon Trading Card Game (Pokémon TCG) fisik resmi berbahasa Indonesia, serta menguji peran kontrol diri (self-control) sebagai variabel moderasi dalam memperlemah pengaruh ketiga variabel anteseden tersebut. Penelitian ini menggunakan pendekatan kuantitatif asosiatif dengan desain survei cross-sectional. Data primer dikumpulkan melalui penyebaran kuesioner daring berbasis skala Likert 5 poin kepada responden yang dipilih melalui teknik purposive sampling. Kriteria inklusi sampel adalah konsumen atau kolektor Warga Negara Indonesia (WNI) berusia minimal 17 tahun yang pernah membeli booster pack Pokémon TCG fisik resmi dalam rentang waktu 6–12 bulan terakhir. Jumlah sampel yang ditargetkan adalah 120 hingga 150 responden, mengacu pada rekomendasi ukuran sampel Green (1991) dan Cohen (1988) untuk mencapai kekuatan uji statistik (statistical power) yang memadai pada model regresi linear berganda. Metode analisis data menggunakan analisis regresi berganda dan Moderated Regression Analysis (MRA) dengan prosedur standarisasi skor rata-rata (mean-centering) guna mengatasi potensi multikolinearitas struktural antar-istilah interaksi (Aiken &amp; West, 1991; Ghozali, 2018), yang diolah menggunakan perangkat lunak IBM SPSS Statistics. Penelitian ini menawarkan kebaruan teoritis (novelty) dengan mengintegrasikan kerangka psikologi lingkungan Stimulus-Organism-Response (S-O-R), psikologi kolektor (Zeigarnik Effect dan The Completing the Set Effect), teori regulasi diri (Self-Regulation Theory), serta prinsip-prinsip keuangan perilaku (behavioral finance) pada fenomena komoditas hobi fisik bernilai spekulatif tinggi. Hasil penelitian ini diharapkan memberikan kontribusi empiris bagi konsumen muda dalam menjaga kontrol diri finansial, serta masukan aplikatif bagi komunitas hobi dan pemangku kebijakan edukasi keuangan generasi muda di Indonesia.</w:t>
       </w:r>
@@ -1617,13 +1612,17 @@
       </w:pPr>
       <w:r>
         <w:rPr>
+          <w:rFonts w:ascii="Times New Roman" w:hAnsi="Times New Roman"/>
           <w:b/>
+          <w:sz w:val="24"/>
         </w:rPr>
         <w:t xml:space="preserve">Kata Kunci: </w:t>
       </w:r>
       <w:r>
         <w:rPr>
+          <w:rFonts w:ascii="Times New Roman" w:hAnsi="Times New Roman"/>
           <w:i/>
+          <w:sz w:val="24"/>
         </w:rPr>
         <w:t>Impulsive Buying, Hedonic Motivation, Desire for Completeness, Speculative Motive, Self-Control, Moderated Regression Analysis, Pokémon TCG, Keuangan Perilaku (Behavioral Finance).</w:t>
       </w:r>
@@ -1646,7 +1645,6 @@
         <w:rPr>
           <w:rFonts w:ascii="Times New Roman" w:hAnsi="Times New Roman"/>
           <w:b/>
-          <w:color w:val="000000"/>
           <w:sz w:val="24"/>
         </w:rPr>
         <w:t>ABSTRACT</w:t>
@@ -1661,7 +1659,7 @@
         <w:rPr>
           <w:rFonts w:ascii="Times New Roman" w:hAnsi="Times New Roman"/>
           <w:b/>
-          <w:sz w:val="20"/>
+          <w:sz w:val="24"/>
         </w:rPr>
         <w:t>THE EFFECT OF HEDONIC MOTIVATION, DESIRE FOR COMPLETENESS, AND SPECULATIVE MOTIVE ON IMPULSIVE BUYING OF POKÉMON TCG BOOSTER PACKS WITH SELF-CONTROL AS A MODERATING VARIABLE</w:t>
         <w:br/>
@@ -1683,7 +1681,7 @@
         <w:rPr>
           <w:rFonts w:ascii="Times New Roman" w:hAnsi="Times New Roman"/>
           <w:i/>
-          <w:sz w:val="20"/>
+          <w:sz w:val="24"/>
         </w:rPr>
         <w:t>This research aims to analyze and empirically test the effects of hedonic motivation, desire for completeness, and speculative motive on the impulsive buying behavior of official Indonesian-language physical Pokémon Trading Card Game (Pokémon TCG) booster packs, as well as to evaluate the moderating role of self-control in weakening the relationships between these three antecedent variables and impulsive buying. This study adopts an associative quantitative approach utilizing a cross-sectional survey design. Primary data are gathered via self-administered online questionnaires employing a 5-point Likert scale, distributed to respondents selected through purposive sampling. The sample inclusion criteria comprise Indonesian citizens aged 17 and above who have purchased official physical booster packs within the past 6 to 12 months. The targeted sample size ranges from 120 to 150 respondents, consistent with the statistical power criteria established by Green (1991) and Cohen (1988) for multiple regression frameworks. The empirical model is estimated using multiple linear regression and Moderated Regression Analysis (MRA) with mean-centering procedures to eliminate structural multicollinearity (Aiken &amp; West, 1991; Ghozali, 2018), executed via IBM SPSS Statistics software. This study provides theoretical novelty by synthesizing the Stimulus-Organism-Response (S-O-R) paradigm, collector psychology (the Zeigarnik Effect and The Completing the Set Effect), Self-Regulation Theory, and behavioral finance principles in the context of tangible alternative assets exhibiting volatile secondary market premiums. The findings are expected to offer practical insights for young consumers in exercising financial discipline regarding discretionary collectibles and provide strategic inputs for community organizers and financial educators targeting Generation Z.</w:t>
       </w:r>
@@ -1696,13 +1694,17 @@
       </w:pPr>
       <w:r>
         <w:rPr>
+          <w:rFonts w:ascii="Times New Roman" w:hAnsi="Times New Roman"/>
           <w:b/>
+          <w:sz w:val="24"/>
         </w:rPr>
         <w:t xml:space="preserve">Keywords: </w:t>
       </w:r>
       <w:r>
         <w:rPr>
+          <w:rFonts w:ascii="Times New Roman" w:hAnsi="Times New Roman"/>
           <w:i/>
+          <w:sz w:val="24"/>
         </w:rPr>
         <w:t>Impulsive Buying, Hedonic Motivation, Desire for Completeness, Speculative Motive, Self-Control, Moderated Regression Analysis, Pokémon TCG, Behavioral Finance.</w:t>
       </w:r>
@@ -1725,7 +1727,6 @@
         <w:rPr>
           <w:rFonts w:ascii="Times New Roman" w:hAnsi="Times New Roman"/>
           <w:b/>
-          <w:color w:val="000000"/>
           <w:sz w:val="24"/>
         </w:rPr>
         <w:t>DAFTAR ISI</w:t>
@@ -1734,7 +1735,7 @@
     <w:p>
       <w:pPr>
         <w:tabs>
-          <w:tab w:pos="7937" w:val="right" w:leader="dot"/>
+          <w:tab w:pos="7824" w:val="right" w:leader="dot"/>
         </w:tabs>
         <w:spacing w:line="276" w:lineRule="auto" w:before="0" w:after="40"/>
         <w:ind w:left="0" w:firstLine="0"/>
@@ -1760,7 +1761,7 @@
     <w:p>
       <w:pPr>
         <w:tabs>
-          <w:tab w:pos="7937" w:val="right" w:leader="dot"/>
+          <w:tab w:pos="7824" w:val="right" w:leader="dot"/>
         </w:tabs>
         <w:spacing w:line="276" w:lineRule="auto" w:before="0" w:after="40"/>
         <w:ind w:left="0" w:firstLine="0"/>
@@ -1786,7 +1787,7 @@
     <w:p>
       <w:pPr>
         <w:tabs>
-          <w:tab w:pos="7937" w:val="right" w:leader="dot"/>
+          <w:tab w:pos="7824" w:val="right" w:leader="dot"/>
         </w:tabs>
         <w:spacing w:line="276" w:lineRule="auto" w:before="0" w:after="40"/>
         <w:ind w:left="0" w:firstLine="0"/>
@@ -1812,7 +1813,7 @@
     <w:p>
       <w:pPr>
         <w:tabs>
-          <w:tab w:pos="7937" w:val="right" w:leader="dot"/>
+          <w:tab w:pos="7824" w:val="right" w:leader="dot"/>
         </w:tabs>
         <w:spacing w:line="276" w:lineRule="auto" w:before="0" w:after="40"/>
         <w:ind w:left="0" w:firstLine="0"/>
@@ -1838,7 +1839,7 @@
     <w:p>
       <w:pPr>
         <w:tabs>
-          <w:tab w:pos="7937" w:val="right" w:leader="dot"/>
+          <w:tab w:pos="7824" w:val="right" w:leader="dot"/>
         </w:tabs>
         <w:spacing w:line="276" w:lineRule="auto" w:before="0" w:after="40"/>
         <w:ind w:left="0" w:firstLine="0"/>
@@ -1864,7 +1865,7 @@
     <w:p>
       <w:pPr>
         <w:tabs>
-          <w:tab w:pos="7937" w:val="right" w:leader="dot"/>
+          <w:tab w:pos="7824" w:val="right" w:leader="dot"/>
         </w:tabs>
         <w:spacing w:line="276" w:lineRule="auto" w:before="0" w:after="40"/>
         <w:ind w:left="0" w:firstLine="0"/>
@@ -1890,7 +1891,7 @@
     <w:p>
       <w:pPr>
         <w:tabs>
-          <w:tab w:pos="7937" w:val="right" w:leader="dot"/>
+          <w:tab w:pos="7824" w:val="right" w:leader="dot"/>
         </w:tabs>
         <w:spacing w:line="276" w:lineRule="auto" w:before="0" w:after="40"/>
         <w:ind w:left="0" w:firstLine="0"/>
@@ -1916,7 +1917,7 @@
     <w:p>
       <w:pPr>
         <w:tabs>
-          <w:tab w:pos="7937" w:val="right" w:leader="dot"/>
+          <w:tab w:pos="7824" w:val="right" w:leader="dot"/>
         </w:tabs>
         <w:spacing w:line="276" w:lineRule="auto" w:before="0" w:after="40"/>
         <w:ind w:left="0" w:firstLine="0"/>
@@ -1942,7 +1943,7 @@
     <w:p>
       <w:pPr>
         <w:tabs>
-          <w:tab w:pos="7937" w:val="right" w:leader="dot"/>
+          <w:tab w:pos="7824" w:val="right" w:leader="dot"/>
         </w:tabs>
         <w:spacing w:line="276" w:lineRule="auto" w:before="0" w:after="40"/>
         <w:ind w:left="0" w:firstLine="0"/>
@@ -1968,7 +1969,7 @@
     <w:p>
       <w:pPr>
         <w:tabs>
-          <w:tab w:pos="7937" w:val="right" w:leader="dot"/>
+          <w:tab w:pos="7824" w:val="right" w:leader="dot"/>
         </w:tabs>
         <w:spacing w:line="276" w:lineRule="auto" w:before="0" w:after="40"/>
         <w:ind w:left="0" w:firstLine="0"/>
@@ -1994,7 +1995,7 @@
     <w:p>
       <w:pPr>
         <w:tabs>
-          <w:tab w:pos="7937" w:val="right" w:leader="dot"/>
+          <w:tab w:pos="7824" w:val="right" w:leader="dot"/>
         </w:tabs>
         <w:spacing w:line="276" w:lineRule="auto" w:before="0" w:after="40"/>
         <w:ind w:left="0" w:firstLine="0"/>
@@ -2020,7 +2021,7 @@
     <w:p>
       <w:pPr>
         <w:tabs>
-          <w:tab w:pos="7937" w:val="right" w:leader="dot"/>
+          <w:tab w:pos="7483" w:val="right" w:leader="dot"/>
         </w:tabs>
         <w:spacing w:line="276" w:lineRule="auto" w:before="0" w:after="40"/>
         <w:ind w:left="340" w:firstLine="0"/>
@@ -2046,7 +2047,7 @@
     <w:p>
       <w:pPr>
         <w:tabs>
-          <w:tab w:pos="7937" w:val="right" w:leader="dot"/>
+          <w:tab w:pos="7483" w:val="right" w:leader="dot"/>
         </w:tabs>
         <w:spacing w:line="276" w:lineRule="auto" w:before="0" w:after="40"/>
         <w:ind w:left="340" w:firstLine="0"/>
@@ -2072,7 +2073,7 @@
     <w:p>
       <w:pPr>
         <w:tabs>
-          <w:tab w:pos="7937" w:val="right" w:leader="dot"/>
+          <w:tab w:pos="7143" w:val="right" w:leader="dot"/>
         </w:tabs>
         <w:spacing w:line="276" w:lineRule="auto" w:before="0" w:after="40"/>
         <w:ind w:left="680" w:firstLine="0"/>
@@ -2098,7 +2099,7 @@
     <w:p>
       <w:pPr>
         <w:tabs>
-          <w:tab w:pos="7937" w:val="right" w:leader="dot"/>
+          <w:tab w:pos="7143" w:val="right" w:leader="dot"/>
         </w:tabs>
         <w:spacing w:line="276" w:lineRule="auto" w:before="0" w:after="40"/>
         <w:ind w:left="680" w:firstLine="0"/>
@@ -2124,7 +2125,7 @@
     <w:p>
       <w:pPr>
         <w:tabs>
-          <w:tab w:pos="7937" w:val="right" w:leader="dot"/>
+          <w:tab w:pos="7483" w:val="right" w:leader="dot"/>
         </w:tabs>
         <w:spacing w:line="276" w:lineRule="auto" w:before="0" w:after="40"/>
         <w:ind w:left="340" w:firstLine="0"/>
@@ -2150,7 +2151,7 @@
     <w:p>
       <w:pPr>
         <w:tabs>
-          <w:tab w:pos="7937" w:val="right" w:leader="dot"/>
+          <w:tab w:pos="7483" w:val="right" w:leader="dot"/>
         </w:tabs>
         <w:spacing w:line="276" w:lineRule="auto" w:before="0" w:after="40"/>
         <w:ind w:left="340" w:firstLine="0"/>
@@ -2176,7 +2177,7 @@
     <w:p>
       <w:pPr>
         <w:tabs>
-          <w:tab w:pos="7937" w:val="right" w:leader="dot"/>
+          <w:tab w:pos="7143" w:val="right" w:leader="dot"/>
         </w:tabs>
         <w:spacing w:line="276" w:lineRule="auto" w:before="0" w:after="40"/>
         <w:ind w:left="680" w:firstLine="0"/>
@@ -2202,7 +2203,7 @@
     <w:p>
       <w:pPr>
         <w:tabs>
-          <w:tab w:pos="7937" w:val="right" w:leader="dot"/>
+          <w:tab w:pos="7143" w:val="right" w:leader="dot"/>
         </w:tabs>
         <w:spacing w:line="276" w:lineRule="auto" w:before="0" w:after="40"/>
         <w:ind w:left="680" w:firstLine="0"/>
@@ -2228,7 +2229,7 @@
     <w:p>
       <w:pPr>
         <w:tabs>
-          <w:tab w:pos="7937" w:val="right" w:leader="dot"/>
+          <w:tab w:pos="7483" w:val="right" w:leader="dot"/>
         </w:tabs>
         <w:spacing w:line="276" w:lineRule="auto" w:before="0" w:after="40"/>
         <w:ind w:left="340" w:firstLine="0"/>
@@ -2254,7 +2255,7 @@
     <w:p>
       <w:pPr>
         <w:tabs>
-          <w:tab w:pos="7937" w:val="right" w:leader="dot"/>
+          <w:tab w:pos="7483" w:val="right" w:leader="dot"/>
         </w:tabs>
         <w:spacing w:line="276" w:lineRule="auto" w:before="0" w:after="40"/>
         <w:ind w:left="340" w:firstLine="0"/>
@@ -2280,7 +2281,7 @@
     <w:p>
       <w:pPr>
         <w:tabs>
-          <w:tab w:pos="7937" w:val="right" w:leader="dot"/>
+          <w:tab w:pos="7824" w:val="right" w:leader="dot"/>
         </w:tabs>
         <w:spacing w:line="276" w:lineRule="auto" w:before="0" w:after="40"/>
         <w:ind w:left="0" w:firstLine="0"/>
@@ -2306,7 +2307,7 @@
     <w:p>
       <w:pPr>
         <w:tabs>
-          <w:tab w:pos="7937" w:val="right" w:leader="dot"/>
+          <w:tab w:pos="7483" w:val="right" w:leader="dot"/>
         </w:tabs>
         <w:spacing w:line="276" w:lineRule="auto" w:before="0" w:after="40"/>
         <w:ind w:left="340" w:firstLine="0"/>
@@ -2332,7 +2333,7 @@
     <w:p>
       <w:pPr>
         <w:tabs>
-          <w:tab w:pos="7937" w:val="right" w:leader="dot"/>
+          <w:tab w:pos="7143" w:val="right" w:leader="dot"/>
         </w:tabs>
         <w:spacing w:line="276" w:lineRule="auto" w:before="0" w:after="40"/>
         <w:ind w:left="680" w:firstLine="0"/>
@@ -2358,7 +2359,7 @@
     <w:p>
       <w:pPr>
         <w:tabs>
-          <w:tab w:pos="7937" w:val="right" w:leader="dot"/>
+          <w:tab w:pos="7143" w:val="right" w:leader="dot"/>
         </w:tabs>
         <w:spacing w:line="276" w:lineRule="auto" w:before="0" w:after="40"/>
         <w:ind w:left="680" w:firstLine="0"/>
@@ -2384,7 +2385,7 @@
     <w:p>
       <w:pPr>
         <w:tabs>
-          <w:tab w:pos="7937" w:val="right" w:leader="dot"/>
+          <w:tab w:pos="7143" w:val="right" w:leader="dot"/>
         </w:tabs>
         <w:spacing w:line="276" w:lineRule="auto" w:before="0" w:after="40"/>
         <w:ind w:left="680" w:firstLine="0"/>
@@ -2410,7 +2411,7 @@
     <w:p>
       <w:pPr>
         <w:tabs>
-          <w:tab w:pos="7937" w:val="right" w:leader="dot"/>
+          <w:tab w:pos="7143" w:val="right" w:leader="dot"/>
         </w:tabs>
         <w:spacing w:line="276" w:lineRule="auto" w:before="0" w:after="40"/>
         <w:ind w:left="680" w:firstLine="0"/>
@@ -2436,7 +2437,7 @@
     <w:p>
       <w:pPr>
         <w:tabs>
-          <w:tab w:pos="7937" w:val="right" w:leader="dot"/>
+          <w:tab w:pos="7483" w:val="right" w:leader="dot"/>
         </w:tabs>
         <w:spacing w:line="276" w:lineRule="auto" w:before="0" w:after="40"/>
         <w:ind w:left="340" w:firstLine="0"/>
@@ -2462,7 +2463,7 @@
     <w:p>
       <w:pPr>
         <w:tabs>
-          <w:tab w:pos="7937" w:val="right" w:leader="dot"/>
+          <w:tab w:pos="7143" w:val="right" w:leader="dot"/>
         </w:tabs>
         <w:spacing w:line="276" w:lineRule="auto" w:before="0" w:after="40"/>
         <w:ind w:left="680" w:firstLine="0"/>
@@ -2488,7 +2489,7 @@
     <w:p>
       <w:pPr>
         <w:tabs>
-          <w:tab w:pos="7937" w:val="right" w:leader="dot"/>
+          <w:tab w:pos="7143" w:val="right" w:leader="dot"/>
         </w:tabs>
         <w:spacing w:line="276" w:lineRule="auto" w:before="0" w:after="40"/>
         <w:ind w:left="680" w:firstLine="0"/>
@@ -2514,7 +2515,7 @@
     <w:p>
       <w:pPr>
         <w:tabs>
-          <w:tab w:pos="7937" w:val="right" w:leader="dot"/>
+          <w:tab w:pos="7143" w:val="right" w:leader="dot"/>
         </w:tabs>
         <w:spacing w:line="276" w:lineRule="auto" w:before="0" w:after="40"/>
         <w:ind w:left="680" w:firstLine="0"/>
@@ -2540,7 +2541,7 @@
     <w:p>
       <w:pPr>
         <w:tabs>
-          <w:tab w:pos="7937" w:val="right" w:leader="dot"/>
+          <w:tab w:pos="7143" w:val="right" w:leader="dot"/>
         </w:tabs>
         <w:spacing w:line="276" w:lineRule="auto" w:before="0" w:after="40"/>
         <w:ind w:left="680" w:firstLine="0"/>
@@ -2566,7 +2567,7 @@
     <w:p>
       <w:pPr>
         <w:tabs>
-          <w:tab w:pos="7937" w:val="right" w:leader="dot"/>
+          <w:tab w:pos="7143" w:val="right" w:leader="dot"/>
         </w:tabs>
         <w:spacing w:line="276" w:lineRule="auto" w:before="0" w:after="40"/>
         <w:ind w:left="680" w:firstLine="0"/>
@@ -2592,7 +2593,7 @@
     <w:p>
       <w:pPr>
         <w:tabs>
-          <w:tab w:pos="7937" w:val="right" w:leader="dot"/>
+          <w:tab w:pos="7483" w:val="right" w:leader="dot"/>
         </w:tabs>
         <w:spacing w:line="276" w:lineRule="auto" w:before="0" w:after="40"/>
         <w:ind w:left="340" w:firstLine="0"/>
@@ -2618,7 +2619,7 @@
     <w:p>
       <w:pPr>
         <w:tabs>
-          <w:tab w:pos="7937" w:val="right" w:leader="dot"/>
+          <w:tab w:pos="7483" w:val="right" w:leader="dot"/>
         </w:tabs>
         <w:spacing w:line="276" w:lineRule="auto" w:before="0" w:after="40"/>
         <w:ind w:left="340" w:firstLine="0"/>
@@ -2644,7 +2645,7 @@
     <w:p>
       <w:pPr>
         <w:tabs>
-          <w:tab w:pos="7937" w:val="right" w:leader="dot"/>
+          <w:tab w:pos="7483" w:val="right" w:leader="dot"/>
         </w:tabs>
         <w:spacing w:line="276" w:lineRule="auto" w:before="0" w:after="40"/>
         <w:ind w:left="340" w:firstLine="0"/>
@@ -2670,7 +2671,7 @@
     <w:p>
       <w:pPr>
         <w:tabs>
-          <w:tab w:pos="7937" w:val="right" w:leader="dot"/>
+          <w:tab w:pos="7143" w:val="right" w:leader="dot"/>
         </w:tabs>
         <w:spacing w:line="276" w:lineRule="auto" w:before="0" w:after="40"/>
         <w:ind w:left="680" w:firstLine="0"/>
@@ -2696,7 +2697,7 @@
     <w:p>
       <w:pPr>
         <w:tabs>
-          <w:tab w:pos="7937" w:val="right" w:leader="dot"/>
+          <w:tab w:pos="7143" w:val="right" w:leader="dot"/>
         </w:tabs>
         <w:spacing w:line="276" w:lineRule="auto" w:before="0" w:after="40"/>
         <w:ind w:left="680" w:firstLine="0"/>
@@ -2722,7 +2723,7 @@
     <w:p>
       <w:pPr>
         <w:tabs>
-          <w:tab w:pos="7937" w:val="right" w:leader="dot"/>
+          <w:tab w:pos="7143" w:val="right" w:leader="dot"/>
         </w:tabs>
         <w:spacing w:line="276" w:lineRule="auto" w:before="0" w:after="40"/>
         <w:ind w:left="680" w:firstLine="0"/>
@@ -2748,7 +2749,7 @@
     <w:p>
       <w:pPr>
         <w:tabs>
-          <w:tab w:pos="7937" w:val="right" w:leader="dot"/>
+          <w:tab w:pos="7143" w:val="right" w:leader="dot"/>
         </w:tabs>
         <w:spacing w:line="276" w:lineRule="auto" w:before="0" w:after="40"/>
         <w:ind w:left="680" w:firstLine="0"/>
@@ -2774,7 +2775,7 @@
     <w:p>
       <w:pPr>
         <w:tabs>
-          <w:tab w:pos="7937" w:val="right" w:leader="dot"/>
+          <w:tab w:pos="7143" w:val="right" w:leader="dot"/>
         </w:tabs>
         <w:spacing w:line="276" w:lineRule="auto" w:before="0" w:after="40"/>
         <w:ind w:left="680" w:firstLine="0"/>
@@ -2800,7 +2801,7 @@
     <w:p>
       <w:pPr>
         <w:tabs>
-          <w:tab w:pos="7937" w:val="right" w:leader="dot"/>
+          <w:tab w:pos="7143" w:val="right" w:leader="dot"/>
         </w:tabs>
         <w:spacing w:line="276" w:lineRule="auto" w:before="0" w:after="40"/>
         <w:ind w:left="680" w:firstLine="0"/>
@@ -2826,7 +2827,7 @@
     <w:p>
       <w:pPr>
         <w:tabs>
-          <w:tab w:pos="7937" w:val="right" w:leader="dot"/>
+          <w:tab w:pos="7824" w:val="right" w:leader="dot"/>
         </w:tabs>
         <w:spacing w:line="276" w:lineRule="auto" w:before="0" w:after="40"/>
         <w:ind w:left="0" w:firstLine="0"/>
@@ -2867,7 +2868,6 @@
         <w:rPr>
           <w:rFonts w:ascii="Times New Roman" w:hAnsi="Times New Roman"/>
           <w:b/>
-          <w:color w:val="000000"/>
           <w:sz w:val="24"/>
         </w:rPr>
         <w:t>DAFTAR TABEL</w:t>
@@ -2876,10 +2876,10 @@
     <w:p>
       <w:pPr>
         <w:tabs>
-          <w:tab w:pos="7937" w:val="right" w:leader="dot"/>
+          <w:tab w:pos="7824" w:val="right" w:leader="dot"/>
         </w:tabs>
         <w:spacing w:line="276" w:lineRule="auto" w:before="0" w:after="80"/>
-        <w:ind w:firstLine="0"/>
+        <w:ind w:left="0" w:firstLine="0"/>
       </w:pPr>
       <w:r>
         <w:rPr>
@@ -2924,7 +2924,6 @@
         <w:rPr>
           <w:rFonts w:ascii="Times New Roman" w:hAnsi="Times New Roman"/>
           <w:b/>
-          <w:color w:val="000000"/>
           <w:sz w:val="24"/>
         </w:rPr>
         <w:t>DAFTAR GAMBAR</w:t>
@@ -2933,10 +2932,10 @@
     <w:p>
       <w:pPr>
         <w:tabs>
-          <w:tab w:pos="7937" w:val="right" w:leader="dot"/>
+          <w:tab w:pos="7824" w:val="right" w:leader="dot"/>
         </w:tabs>
         <w:spacing w:line="276" w:lineRule="auto" w:before="0" w:after="80"/>
-        <w:ind w:firstLine="0"/>
+        <w:ind w:left="0" w:firstLine="0"/>
       </w:pPr>
       <w:r>
         <w:rPr>
@@ -2990,7 +2989,6 @@
         <w:rPr>
           <w:rFonts w:ascii="Times New Roman" w:hAnsi="Times New Roman"/>
           <w:b/>
-          <w:color w:val="000000"/>
           <w:sz w:val="24"/>
         </w:rPr>
         <w:t>BAB 1 PENDAHULUAN</w:t>
@@ -3009,7 +3007,6 @@
         <w:rPr>
           <w:rFonts w:ascii="Times New Roman" w:hAnsi="Times New Roman"/>
           <w:b/>
-          <w:color w:val="000000"/>
           <w:sz w:val="24"/>
         </w:rPr>
         <w:t>1.1 Latar Belakang Penelitian</w:t>
@@ -3031,6 +3028,7 @@
       <w:r>
         <w:rPr>
           <w:rFonts w:ascii="Times New Roman" w:hAnsi="Times New Roman"/>
+          <w:b w:val="0"/>
           <w:i/>
           <w:sz w:val="24"/>
         </w:rPr>
@@ -3046,6 +3044,7 @@
       <w:r>
         <w:rPr>
           <w:rFonts w:ascii="Times New Roman" w:hAnsi="Times New Roman"/>
+          <w:b w:val="0"/>
           <w:i/>
           <w:sz w:val="24"/>
         </w:rPr>
@@ -3056,11 +3055,12 @@
           <w:rFonts w:ascii="Times New Roman" w:hAnsi="Times New Roman"/>
           <w:sz w:val="24"/>
         </w:rPr>
-        <w:t xml:space="preserve">), dengan estimasi pendapatan kotor kumulatif melampaui US\$ 100 miliar. Angka ini melampaui waralaba legendaris dunia lainnya seperti </w:t>
-      </w:r>
-      <w:r>
-        <w:rPr>
-          <w:rFonts w:ascii="Times New Roman" w:hAnsi="Times New Roman"/>
+        <w:t xml:space="preserve">), dengan estimasi pendapatan kotor kumulatif melampaui USD 100 miliar. Angka ini melampaui waralaba legendaris dunia lainnya seperti </w:t>
+      </w:r>
+      <w:r>
+        <w:rPr>
+          <w:rFonts w:ascii="Times New Roman" w:hAnsi="Times New Roman"/>
+          <w:b w:val="0"/>
           <w:i/>
           <w:sz w:val="24"/>
         </w:rPr>
@@ -3076,6 +3076,7 @@
       <w:r>
         <w:rPr>
           <w:rFonts w:ascii="Times New Roman" w:hAnsi="Times New Roman"/>
+          <w:b w:val="0"/>
           <w:i/>
           <w:sz w:val="24"/>
         </w:rPr>
@@ -3091,6 +3092,7 @@
       <w:r>
         <w:rPr>
           <w:rFonts w:ascii="Times New Roman" w:hAnsi="Times New Roman"/>
+          <w:b w:val="0"/>
           <w:i/>
           <w:sz w:val="24"/>
         </w:rPr>
@@ -3122,7 +3124,24 @@
           <w:b/>
           <w:sz w:val="24"/>
         </w:rPr>
-        <w:t>Lini Permainan Video (*Video Games*):</w:t>
+        <w:t>Lini Permainan Video (</w:t>
+      </w:r>
+      <w:r>
+        <w:rPr>
+          <w:rFonts w:ascii="Times New Roman" w:hAnsi="Times New Roman"/>
+          <w:b/>
+          <w:i/>
+          <w:sz w:val="24"/>
+        </w:rPr>
+        <w:t>Video Games</w:t>
+      </w:r>
+      <w:r>
+        <w:rPr>
+          <w:rFonts w:ascii="Times New Roman" w:hAnsi="Times New Roman"/>
+          <w:b/>
+          <w:sz w:val="24"/>
+        </w:rPr>
+        <w:t>):</w:t>
       </w:r>
       <w:r>
         <w:rPr>
@@ -3134,6 +3153,7 @@
       <w:r>
         <w:rPr>
           <w:rFonts w:ascii="Times New Roman" w:hAnsi="Times New Roman"/>
+          <w:b w:val="0"/>
           <w:i/>
           <w:sz w:val="24"/>
         </w:rPr>
@@ -3149,6 +3169,7 @@
       <w:r>
         <w:rPr>
           <w:rFonts w:ascii="Times New Roman" w:hAnsi="Times New Roman"/>
+          <w:b w:val="0"/>
           <w:i/>
           <w:sz w:val="24"/>
         </w:rPr>
@@ -3164,6 +3185,7 @@
       <w:r>
         <w:rPr>
           <w:rFonts w:ascii="Times New Roman" w:hAnsi="Times New Roman"/>
+          <w:b w:val="0"/>
           <w:i/>
           <w:sz w:val="24"/>
         </w:rPr>
@@ -3179,6 +3201,7 @@
       <w:r>
         <w:rPr>
           <w:rFonts w:ascii="Times New Roman" w:hAnsi="Times New Roman"/>
+          <w:b w:val="0"/>
           <w:i/>
           <w:sz w:val="24"/>
         </w:rPr>
@@ -3194,6 +3217,7 @@
       <w:r>
         <w:rPr>
           <w:rFonts w:ascii="Times New Roman" w:hAnsi="Times New Roman"/>
+          <w:b w:val="0"/>
           <w:i/>
           <w:sz w:val="24"/>
         </w:rPr>
@@ -3209,6 +3233,7 @@
       <w:r>
         <w:rPr>
           <w:rFonts w:ascii="Times New Roman" w:hAnsi="Times New Roman"/>
+          <w:b w:val="0"/>
           <w:i/>
           <w:sz w:val="24"/>
         </w:rPr>
@@ -3224,6 +3249,7 @@
       <w:r>
         <w:rPr>
           <w:rFonts w:ascii="Times New Roman" w:hAnsi="Times New Roman"/>
+          <w:b w:val="0"/>
           <w:i/>
           <w:sz w:val="24"/>
         </w:rPr>
@@ -3267,6 +3293,7 @@
       <w:r>
         <w:rPr>
           <w:rFonts w:ascii="Times New Roman" w:hAnsi="Times New Roman"/>
+          <w:b w:val="0"/>
           <w:i/>
           <w:sz w:val="24"/>
         </w:rPr>
@@ -3282,6 +3309,7 @@
       <w:r>
         <w:rPr>
           <w:rFonts w:ascii="Times New Roman" w:hAnsi="Times New Roman"/>
+          <w:b w:val="0"/>
           <w:i/>
           <w:sz w:val="24"/>
         </w:rPr>
@@ -3297,6 +3325,7 @@
       <w:r>
         <w:rPr>
           <w:rFonts w:ascii="Times New Roman" w:hAnsi="Times New Roman"/>
+          <w:b w:val="0"/>
           <w:i/>
           <w:sz w:val="24"/>
         </w:rPr>
@@ -3312,6 +3341,7 @@
       <w:r>
         <w:rPr>
           <w:rFonts w:ascii="Times New Roman" w:hAnsi="Times New Roman"/>
+          <w:b w:val="0"/>
           <w:i/>
           <w:sz w:val="24"/>
         </w:rPr>
@@ -3327,6 +3357,7 @@
       <w:r>
         <w:rPr>
           <w:rFonts w:ascii="Times New Roman" w:hAnsi="Times New Roman"/>
+          <w:b w:val="0"/>
           <w:i/>
           <w:sz w:val="24"/>
         </w:rPr>
@@ -3370,6 +3401,7 @@
       <w:r>
         <w:rPr>
           <w:rFonts w:ascii="Times New Roman" w:hAnsi="Times New Roman"/>
+          <w:b w:val="0"/>
           <w:i/>
           <w:sz w:val="24"/>
         </w:rPr>
@@ -3385,6 +3417,7 @@
       <w:r>
         <w:rPr>
           <w:rFonts w:ascii="Times New Roman" w:hAnsi="Times New Roman"/>
+          <w:b w:val="0"/>
           <w:i/>
           <w:sz w:val="24"/>
         </w:rPr>
@@ -3417,7 +3450,24 @@
           <w:b/>
           <w:sz w:val="24"/>
         </w:rPr>
-        <w:t>permainan kartu fisik atau *Pokémon Trading Card Game* (Pokémon TCG)</w:t>
+        <w:t xml:space="preserve">permainan kartu fisik atau </w:t>
+      </w:r>
+      <w:r>
+        <w:rPr>
+          <w:rFonts w:ascii="Times New Roman" w:hAnsi="Times New Roman"/>
+          <w:b/>
+          <w:i/>
+          <w:sz w:val="24"/>
+        </w:rPr>
+        <w:t>Pokémon Trading Card Game</w:t>
+      </w:r>
+      <w:r>
+        <w:rPr>
+          <w:rFonts w:ascii="Times New Roman" w:hAnsi="Times New Roman"/>
+          <w:b/>
+          <w:sz w:val="24"/>
+        </w:rPr>
+        <w:t xml:space="preserve"> (Pokémon TCG)</w:t>
       </w:r>
       <w:r>
         <w:rPr>
@@ -3429,6 +3479,7 @@
       <w:r>
         <w:rPr>
           <w:rFonts w:ascii="Times New Roman" w:hAnsi="Times New Roman"/>
+          <w:b w:val="0"/>
           <w:i/>
           <w:sz w:val="24"/>
         </w:rPr>
@@ -3444,6 +3495,7 @@
       <w:r>
         <w:rPr>
           <w:rFonts w:ascii="Times New Roman" w:hAnsi="Times New Roman"/>
+          <w:b w:val="0"/>
           <w:i/>
           <w:sz w:val="24"/>
         </w:rPr>
@@ -3462,7 +3514,24 @@
           <w:b/>
           <w:sz w:val="24"/>
         </w:rPr>
-        <w:t>instrumen aset alternatif koleksi (*alternative collectibles asset*)</w:t>
+        <w:t>instrumen aset alternatif koleksi (</w:t>
+      </w:r>
+      <w:r>
+        <w:rPr>
+          <w:rFonts w:ascii="Times New Roman" w:hAnsi="Times New Roman"/>
+          <w:b/>
+          <w:i/>
+          <w:sz w:val="24"/>
+        </w:rPr>
+        <w:t>alternative collectibles asset</w:t>
+      </w:r>
+      <w:r>
+        <w:rPr>
+          <w:rFonts w:ascii="Times New Roman" w:hAnsi="Times New Roman"/>
+          <w:b/>
+          <w:sz w:val="24"/>
+        </w:rPr>
+        <w:t>)</w:t>
       </w:r>
       <w:r>
         <w:rPr>
@@ -3488,6 +3557,7 @@
       <w:r>
         <w:rPr>
           <w:rFonts w:ascii="Times New Roman" w:hAnsi="Times New Roman"/>
+          <w:b w:val="0"/>
           <w:i/>
           <w:sz w:val="24"/>
         </w:rPr>
@@ -3503,6 +3573,7 @@
       <w:r>
         <w:rPr>
           <w:rFonts w:ascii="Times New Roman" w:hAnsi="Times New Roman"/>
+          <w:b w:val="0"/>
           <w:i/>
           <w:sz w:val="24"/>
         </w:rPr>
@@ -3532,6 +3603,7 @@
       <w:r>
         <w:rPr>
           <w:rFonts w:ascii="Times New Roman" w:hAnsi="Times New Roman"/>
+          <w:b w:val="0"/>
           <w:i/>
           <w:sz w:val="24"/>
         </w:rPr>
@@ -3547,6 +3619,7 @@
       <w:r>
         <w:rPr>
           <w:rFonts w:ascii="Times New Roman" w:hAnsi="Times New Roman"/>
+          <w:b w:val="0"/>
           <w:i/>
           <w:sz w:val="24"/>
         </w:rPr>
@@ -3562,6 +3635,7 @@
       <w:r>
         <w:rPr>
           <w:rFonts w:ascii="Times New Roman" w:hAnsi="Times New Roman"/>
+          <w:b w:val="0"/>
           <w:i/>
           <w:sz w:val="24"/>
         </w:rPr>
@@ -3577,6 +3651,7 @@
       <w:r>
         <w:rPr>
           <w:rFonts w:ascii="Times New Roman" w:hAnsi="Times New Roman"/>
+          <w:b w:val="0"/>
           <w:i/>
           <w:sz w:val="24"/>
         </w:rPr>
@@ -3592,6 +3667,7 @@
       <w:r>
         <w:rPr>
           <w:rFonts w:ascii="Times New Roman" w:hAnsi="Times New Roman"/>
+          <w:b w:val="0"/>
           <w:i/>
           <w:sz w:val="24"/>
         </w:rPr>
@@ -3624,7 +3700,24 @@
           <w:b/>
           <w:sz w:val="24"/>
         </w:rPr>
-        <w:t>sertifikasi penilaian kondisi fisik kartu (*card grading*)</w:t>
+        <w:t>sertifikasi penilaian kondisi fisik kartu (</w:t>
+      </w:r>
+      <w:r>
+        <w:rPr>
+          <w:rFonts w:ascii="Times New Roman" w:hAnsi="Times New Roman"/>
+          <w:b/>
+          <w:i/>
+          <w:sz w:val="24"/>
+        </w:rPr>
+        <w:t>card grading</w:t>
+      </w:r>
+      <w:r>
+        <w:rPr>
+          <w:rFonts w:ascii="Times New Roman" w:hAnsi="Times New Roman"/>
+          <w:b/>
+          <w:sz w:val="24"/>
+        </w:rPr>
+        <w:t>)</w:t>
       </w:r>
       <w:r>
         <w:rPr>
@@ -3639,7 +3732,24 @@
           <w:b/>
           <w:sz w:val="24"/>
         </w:rPr>
-        <w:t>PSA (*Professional Sports Authenticator*)</w:t>
+        <w:t>PSA (</w:t>
+      </w:r>
+      <w:r>
+        <w:rPr>
+          <w:rFonts w:ascii="Times New Roman" w:hAnsi="Times New Roman"/>
+          <w:b/>
+          <w:i/>
+          <w:sz w:val="24"/>
+        </w:rPr>
+        <w:t>Professional Sports Authenticator</w:t>
+      </w:r>
+      <w:r>
+        <w:rPr>
+          <w:rFonts w:ascii="Times New Roman" w:hAnsi="Times New Roman"/>
+          <w:b/>
+          <w:sz w:val="24"/>
+        </w:rPr>
+        <w:t>)</w:t>
       </w:r>
       <w:r>
         <w:rPr>
@@ -3654,7 +3764,24 @@
           <w:b/>
           <w:sz w:val="24"/>
         </w:rPr>
-        <w:t>BGS (*Beckett Grading Services*)</w:t>
+        <w:t>BGS (</w:t>
+      </w:r>
+      <w:r>
+        <w:rPr>
+          <w:rFonts w:ascii="Times New Roman" w:hAnsi="Times New Roman"/>
+          <w:b/>
+          <w:i/>
+          <w:sz w:val="24"/>
+        </w:rPr>
+        <w:t>Beckett Grading Services</w:t>
+      </w:r>
+      <w:r>
+        <w:rPr>
+          <w:rFonts w:ascii="Times New Roman" w:hAnsi="Times New Roman"/>
+          <w:b/>
+          <w:sz w:val="24"/>
+        </w:rPr>
+        <w:t>)</w:t>
       </w:r>
       <w:r>
         <w:rPr>
@@ -3681,6 +3808,7 @@
       <w:r>
         <w:rPr>
           <w:rFonts w:ascii="Times New Roman" w:hAnsi="Times New Roman"/>
+          <w:b w:val="0"/>
           <w:i/>
           <w:sz w:val="24"/>
         </w:rPr>
@@ -3696,6 +3824,7 @@
       <w:r>
         <w:rPr>
           <w:rFonts w:ascii="Times New Roman" w:hAnsi="Times New Roman"/>
+          <w:b w:val="0"/>
           <w:i/>
           <w:sz w:val="24"/>
         </w:rPr>
@@ -3711,6 +3840,7 @@
       <w:r>
         <w:rPr>
           <w:rFonts w:ascii="Times New Roman" w:hAnsi="Times New Roman"/>
+          <w:b w:val="0"/>
           <w:i/>
           <w:sz w:val="24"/>
         </w:rPr>
@@ -3726,6 +3856,7 @@
       <w:r>
         <w:rPr>
           <w:rFonts w:ascii="Times New Roman" w:hAnsi="Times New Roman"/>
+          <w:b w:val="0"/>
           <w:i/>
           <w:sz w:val="24"/>
         </w:rPr>
@@ -3741,6 +3872,7 @@
       <w:r>
         <w:rPr>
           <w:rFonts w:ascii="Times New Roman" w:hAnsi="Times New Roman"/>
+          <w:b w:val="0"/>
           <w:i/>
           <w:sz w:val="24"/>
         </w:rPr>
@@ -3756,6 +3888,7 @@
       <w:r>
         <w:rPr>
           <w:rFonts w:ascii="Times New Roman" w:hAnsi="Times New Roman"/>
+          <w:b w:val="0"/>
           <w:i/>
           <w:sz w:val="24"/>
         </w:rPr>
@@ -3771,6 +3904,7 @@
       <w:r>
         <w:rPr>
           <w:rFonts w:ascii="Times New Roman" w:hAnsi="Times New Roman"/>
+          <w:b w:val="0"/>
           <w:i/>
           <w:sz w:val="24"/>
         </w:rPr>
@@ -3786,6 +3920,7 @@
       <w:r>
         <w:rPr>
           <w:rFonts w:ascii="Times New Roman" w:hAnsi="Times New Roman"/>
+          <w:b w:val="0"/>
           <w:i/>
           <w:sz w:val="24"/>
         </w:rPr>
@@ -3801,6 +3936,7 @@
       <w:r>
         <w:rPr>
           <w:rFonts w:ascii="Times New Roman" w:hAnsi="Times New Roman"/>
+          <w:b w:val="0"/>
           <w:i/>
           <w:sz w:val="24"/>
         </w:rPr>
@@ -3816,6 +3952,7 @@
       <w:r>
         <w:rPr>
           <w:rFonts w:ascii="Times New Roman" w:hAnsi="Times New Roman"/>
+          <w:b w:val="0"/>
           <w:i/>
           <w:sz w:val="24"/>
         </w:rPr>
@@ -3831,6 +3968,7 @@
       <w:r>
         <w:rPr>
           <w:rFonts w:ascii="Times New Roman" w:hAnsi="Times New Roman"/>
+          <w:b w:val="0"/>
           <w:i/>
           <w:sz w:val="24"/>
         </w:rPr>
@@ -3846,6 +3984,7 @@
       <w:r>
         <w:rPr>
           <w:rFonts w:ascii="Times New Roman" w:hAnsi="Times New Roman"/>
+          <w:b w:val="0"/>
           <w:i/>
           <w:sz w:val="24"/>
         </w:rPr>
@@ -3875,6 +4014,7 @@
       <w:r>
         <w:rPr>
           <w:rFonts w:ascii="Times New Roman" w:hAnsi="Times New Roman"/>
+          <w:b w:val="0"/>
           <w:i/>
           <w:sz w:val="24"/>
         </w:rPr>
@@ -3890,6 +4030,7 @@
       <w:r>
         <w:rPr>
           <w:rFonts w:ascii="Times New Roman" w:hAnsi="Times New Roman"/>
+          <w:b w:val="0"/>
           <w:i/>
           <w:sz w:val="24"/>
         </w:rPr>
@@ -3908,7 +4049,24 @@
           <w:b/>
           <w:sz w:val="24"/>
         </w:rPr>
-        <w:t>pembelian impulsif (*impulsive buying*)</w:t>
+        <w:t>pembelian impulsif (</w:t>
+      </w:r>
+      <w:r>
+        <w:rPr>
+          <w:rFonts w:ascii="Times New Roman" w:hAnsi="Times New Roman"/>
+          <w:b/>
+          <w:i/>
+          <w:sz w:val="24"/>
+        </w:rPr>
+        <w:t>impulsive buying</w:t>
+      </w:r>
+      <w:r>
+        <w:rPr>
+          <w:rFonts w:ascii="Times New Roman" w:hAnsi="Times New Roman"/>
+          <w:b/>
+          <w:sz w:val="24"/>
+        </w:rPr>
+        <w:t>)</w:t>
       </w:r>
       <w:r>
         <w:rPr>
@@ -3934,6 +4092,7 @@
       <w:r>
         <w:rPr>
           <w:rFonts w:ascii="Times New Roman" w:hAnsi="Times New Roman"/>
+          <w:b w:val="0"/>
           <w:i/>
           <w:sz w:val="24"/>
         </w:rPr>
@@ -3949,6 +4108,7 @@
       <w:r>
         <w:rPr>
           <w:rFonts w:ascii="Times New Roman" w:hAnsi="Times New Roman"/>
+          <w:b w:val="0"/>
           <w:i/>
           <w:sz w:val="24"/>
         </w:rPr>
@@ -3964,6 +4124,7 @@
       <w:r>
         <w:rPr>
           <w:rFonts w:ascii="Times New Roman" w:hAnsi="Times New Roman"/>
+          <w:b w:val="0"/>
           <w:i/>
           <w:sz w:val="24"/>
         </w:rPr>
@@ -3979,6 +4140,7 @@
       <w:r>
         <w:rPr>
           <w:rFonts w:ascii="Times New Roman" w:hAnsi="Times New Roman"/>
+          <w:b w:val="0"/>
           <w:i/>
           <w:sz w:val="24"/>
         </w:rPr>
@@ -3994,6 +4156,7 @@
       <w:r>
         <w:rPr>
           <w:rFonts w:ascii="Times New Roman" w:hAnsi="Times New Roman"/>
+          <w:b w:val="0"/>
           <w:i/>
           <w:sz w:val="24"/>
         </w:rPr>
@@ -4009,6 +4172,7 @@
       <w:r>
         <w:rPr>
           <w:rFonts w:ascii="Times New Roman" w:hAnsi="Times New Roman"/>
+          <w:b w:val="0"/>
           <w:i/>
           <w:sz w:val="24"/>
         </w:rPr>
@@ -4024,6 +4188,7 @@
       <w:r>
         <w:rPr>
           <w:rFonts w:ascii="Times New Roman" w:hAnsi="Times New Roman"/>
+          <w:b w:val="0"/>
           <w:i/>
           <w:sz w:val="24"/>
         </w:rPr>
@@ -4055,7 +4220,24 @@
           <w:b/>
           <w:sz w:val="24"/>
         </w:rPr>
-        <w:t>Faktor Emosional dan Afektif (*Affective Drivers*):</w:t>
+        <w:t>Faktor Emosional dan Afektif (</w:t>
+      </w:r>
+      <w:r>
+        <w:rPr>
+          <w:rFonts w:ascii="Times New Roman" w:hAnsi="Times New Roman"/>
+          <w:b/>
+          <w:i/>
+          <w:sz w:val="24"/>
+        </w:rPr>
+        <w:t>Affective Drivers</w:t>
+      </w:r>
+      <w:r>
+        <w:rPr>
+          <w:rFonts w:ascii="Times New Roman" w:hAnsi="Times New Roman"/>
+          <w:b/>
+          <w:sz w:val="24"/>
+        </w:rPr>
+        <w:t>):</w:t>
       </w:r>
       <w:r>
         <w:rPr>
@@ -4067,6 +4249,7 @@
       <w:r>
         <w:rPr>
           <w:rFonts w:ascii="Times New Roman" w:hAnsi="Times New Roman"/>
+          <w:b w:val="0"/>
           <w:i/>
           <w:sz w:val="24"/>
         </w:rPr>
@@ -4077,11 +4260,12 @@
           <w:rFonts w:ascii="Times New Roman" w:hAnsi="Times New Roman"/>
           <w:sz w:val="24"/>
         </w:rPr>
-        <w:t>), pencarian pelepasan stres dan petualangan (\citealp{babin1994work}; \citealp{arnold2003hedonic}), suasana hati positif (</w:t>
-      </w:r>
-      <w:r>
-        <w:rPr>
-          <w:rFonts w:ascii="Times New Roman" w:hAnsi="Times New Roman"/>
+        <w:t>), pencarian pelepasan stres dan petualangan (Babin et al., 1994; Arnold &amp; Reynolds, 2003), suasana hati positif (</w:t>
+      </w:r>
+      <w:r>
+        <w:rPr>
+          <w:rFonts w:ascii="Times New Roman" w:hAnsi="Times New Roman"/>
+          <w:b w:val="0"/>
           <w:i/>
           <w:sz w:val="24"/>
         </w:rPr>
@@ -4097,6 +4281,7 @@
       <w:r>
         <w:rPr>
           <w:rFonts w:ascii="Times New Roman" w:hAnsi="Times New Roman"/>
+          <w:b w:val="0"/>
           <w:i/>
           <w:sz w:val="24"/>
         </w:rPr>
@@ -4107,7 +4292,7 @@
           <w:rFonts w:ascii="Times New Roman" w:hAnsi="Times New Roman"/>
           <w:sz w:val="24"/>
         </w:rPr>
-        <w:t>) (\citealp{gueltekin2012influence}).</w:t>
+        <w:t>) (Gültekin &amp; Özer, 2012).</w:t>
       </w:r>
     </w:p>
     <w:p>
@@ -4128,7 +4313,24 @@
           <w:b/>
           <w:sz w:val="24"/>
         </w:rPr>
-        <w:t>Faktor Kognitif dan Psikologi Kolektor (*Cognitive and Collector Drivers*):</w:t>
+        <w:t>Faktor Kognitif dan Psikologi Kolektor (</w:t>
+      </w:r>
+      <w:r>
+        <w:rPr>
+          <w:rFonts w:ascii="Times New Roman" w:hAnsi="Times New Roman"/>
+          <w:b/>
+          <w:i/>
+          <w:sz w:val="24"/>
+        </w:rPr>
+        <w:t>Cognitive and Collector Drivers</w:t>
+      </w:r>
+      <w:r>
+        <w:rPr>
+          <w:rFonts w:ascii="Times New Roman" w:hAnsi="Times New Roman"/>
+          <w:b/>
+          <w:sz w:val="24"/>
+        </w:rPr>
+        <w:t>):</w:t>
       </w:r>
       <w:r>
         <w:rPr>
@@ -4140,6 +4342,7 @@
       <w:r>
         <w:rPr>
           <w:rFonts w:ascii="Times New Roman" w:hAnsi="Times New Roman"/>
+          <w:b w:val="0"/>
           <w:i/>
           <w:sz w:val="24"/>
         </w:rPr>
@@ -4155,6 +4358,7 @@
       <w:r>
         <w:rPr>
           <w:rFonts w:ascii="Times New Roman" w:hAnsi="Times New Roman"/>
+          <w:b w:val="0"/>
           <w:i/>
           <w:sz w:val="24"/>
         </w:rPr>
@@ -4170,6 +4374,7 @@
       <w:r>
         <w:rPr>
           <w:rFonts w:ascii="Times New Roman" w:hAnsi="Times New Roman"/>
+          <w:b w:val="0"/>
           <w:i/>
           <w:sz w:val="24"/>
         </w:rPr>
@@ -4201,7 +4406,24 @@
           <w:b/>
           <w:sz w:val="24"/>
         </w:rPr>
-        <w:t>Faktor Finansial dan Spekulasi Pasar (*Economic and Speculative Drivers*):</w:t>
+        <w:t>Faktor Finansial dan Spekulasi Pasar (</w:t>
+      </w:r>
+      <w:r>
+        <w:rPr>
+          <w:rFonts w:ascii="Times New Roman" w:hAnsi="Times New Roman"/>
+          <w:b/>
+          <w:i/>
+          <w:sz w:val="24"/>
+        </w:rPr>
+        <w:t>Economic and Speculative Drivers</w:t>
+      </w:r>
+      <w:r>
+        <w:rPr>
+          <w:rFonts w:ascii="Times New Roman" w:hAnsi="Times New Roman"/>
+          <w:b/>
+          <w:sz w:val="24"/>
+        </w:rPr>
+        <w:t>):</w:t>
       </w:r>
       <w:r>
         <w:rPr>
@@ -4213,6 +4435,7 @@
       <w:r>
         <w:rPr>
           <w:rFonts w:ascii="Times New Roman" w:hAnsi="Times New Roman"/>
+          <w:b w:val="0"/>
           <w:i/>
           <w:sz w:val="24"/>
         </w:rPr>
@@ -4228,6 +4451,7 @@
       <w:r>
         <w:rPr>
           <w:rFonts w:ascii="Times New Roman" w:hAnsi="Times New Roman"/>
+          <w:b w:val="0"/>
           <w:i/>
           <w:sz w:val="24"/>
         </w:rPr>
@@ -4243,6 +4467,7 @@
       <w:r>
         <w:rPr>
           <w:rFonts w:ascii="Times New Roman" w:hAnsi="Times New Roman"/>
+          <w:b w:val="0"/>
           <w:i/>
           <w:sz w:val="24"/>
         </w:rPr>
@@ -4274,7 +4499,24 @@
           <w:b/>
           <w:sz w:val="24"/>
         </w:rPr>
-        <w:t>Faktor Situasional dan Rangsangan Toko (*Situational and Atmospheric Drivers*):</w:t>
+        <w:t>Faktor Situasional dan Rangsangan Toko (</w:t>
+      </w:r>
+      <w:r>
+        <w:rPr>
+          <w:rFonts w:ascii="Times New Roman" w:hAnsi="Times New Roman"/>
+          <w:b/>
+          <w:i/>
+          <w:sz w:val="24"/>
+        </w:rPr>
+        <w:t>Situational and Atmospheric Drivers</w:t>
+      </w:r>
+      <w:r>
+        <w:rPr>
+          <w:rFonts w:ascii="Times New Roman" w:hAnsi="Times New Roman"/>
+          <w:b/>
+          <w:sz w:val="24"/>
+        </w:rPr>
+        <w:t>):</w:t>
       </w:r>
       <w:r>
         <w:rPr>
@@ -4286,6 +4528,7 @@
       <w:r>
         <w:rPr>
           <w:rFonts w:ascii="Times New Roman" w:hAnsi="Times New Roman"/>
+          <w:b w:val="0"/>
           <w:i/>
           <w:sz w:val="24"/>
         </w:rPr>
@@ -4301,6 +4544,7 @@
       <w:r>
         <w:rPr>
           <w:rFonts w:ascii="Times New Roman" w:hAnsi="Times New Roman"/>
+          <w:b w:val="0"/>
           <w:i/>
           <w:sz w:val="24"/>
         </w:rPr>
@@ -4330,6 +4574,7 @@
       <w:r>
         <w:rPr>
           <w:rFonts w:ascii="Times New Roman" w:hAnsi="Times New Roman"/>
+          <w:b w:val="0"/>
           <w:i/>
           <w:sz w:val="24"/>
         </w:rPr>
@@ -4368,7 +4613,41 @@
           <w:b/>
           <w:sz w:val="24"/>
         </w:rPr>
-        <w:t>faktor afektif diwakili oleh *Hedonic Motivation* ($X_1$)</w:t>
+        <w:t xml:space="preserve">faktor afektif diwakili oleh </w:t>
+      </w:r>
+      <w:r>
+        <w:rPr>
+          <w:rFonts w:ascii="Times New Roman" w:hAnsi="Times New Roman"/>
+          <w:b/>
+          <w:i/>
+          <w:sz w:val="24"/>
+        </w:rPr>
+        <w:t>Hedonic Motivation</w:t>
+      </w:r>
+      <w:r>
+        <w:rPr>
+          <w:rFonts w:ascii="Times New Roman" w:hAnsi="Times New Roman"/>
+          <w:b/>
+          <w:sz w:val="24"/>
+        </w:rPr>
+        <w:t xml:space="preserve"> (</w:t>
+      </w:r>
+      <w:r>
+        <w:rPr>
+          <w:rFonts w:ascii="Times New Roman" w:hAnsi="Times New Roman"/>
+          <w:b/>
+          <w:i/>
+          <w:sz w:val="24"/>
+        </w:rPr>
+        <w:t>X</w:t>
+      </w:r>
+      <w:r>
+        <w:rPr>
+          <w:rFonts w:ascii="Times New Roman" w:hAnsi="Times New Roman"/>
+          <w:b/>
+          <w:sz w:val="24"/>
+        </w:rPr>
+        <w:t>₁)</w:t>
       </w:r>
       <w:r>
         <w:rPr>
@@ -4380,6 +4659,7 @@
       <w:r>
         <w:rPr>
           <w:rFonts w:ascii="Times New Roman" w:hAnsi="Times New Roman"/>
+          <w:b w:val="0"/>
           <w:i/>
           <w:sz w:val="24"/>
         </w:rPr>
@@ -4395,6 +4675,7 @@
       <w:r>
         <w:rPr>
           <w:rFonts w:ascii="Times New Roman" w:hAnsi="Times New Roman"/>
+          <w:b w:val="0"/>
           <w:i/>
           <w:sz w:val="24"/>
         </w:rPr>
@@ -4433,7 +4714,41 @@
           <w:b/>
           <w:sz w:val="24"/>
         </w:rPr>
-        <w:t>faktor psikologis koleksi diwakili oleh *Desire for Completeness* ($X_2$)</w:t>
+        <w:t xml:space="preserve">faktor psikologis koleksi diwakili oleh </w:t>
+      </w:r>
+      <w:r>
+        <w:rPr>
+          <w:rFonts w:ascii="Times New Roman" w:hAnsi="Times New Roman"/>
+          <w:b/>
+          <w:i/>
+          <w:sz w:val="24"/>
+        </w:rPr>
+        <w:t>Desire for Completeness</w:t>
+      </w:r>
+      <w:r>
+        <w:rPr>
+          <w:rFonts w:ascii="Times New Roman" w:hAnsi="Times New Roman"/>
+          <w:b/>
+          <w:sz w:val="24"/>
+        </w:rPr>
+        <w:t xml:space="preserve"> (</w:t>
+      </w:r>
+      <w:r>
+        <w:rPr>
+          <w:rFonts w:ascii="Times New Roman" w:hAnsi="Times New Roman"/>
+          <w:b/>
+          <w:i/>
+          <w:sz w:val="24"/>
+        </w:rPr>
+        <w:t>X</w:t>
+      </w:r>
+      <w:r>
+        <w:rPr>
+          <w:rFonts w:ascii="Times New Roman" w:hAnsi="Times New Roman"/>
+          <w:b/>
+          <w:sz w:val="24"/>
+        </w:rPr>
+        <w:t>₂)</w:t>
       </w:r>
       <w:r>
         <w:rPr>
@@ -4445,6 +4760,7 @@
       <w:r>
         <w:rPr>
           <w:rFonts w:ascii="Times New Roman" w:hAnsi="Times New Roman"/>
+          <w:b w:val="0"/>
           <w:i/>
           <w:sz w:val="24"/>
         </w:rPr>
@@ -4460,6 +4776,7 @@
       <w:r>
         <w:rPr>
           <w:rFonts w:ascii="Times New Roman" w:hAnsi="Times New Roman"/>
+          <w:b w:val="0"/>
           <w:i/>
           <w:sz w:val="24"/>
         </w:rPr>
@@ -4498,7 +4815,41 @@
           <w:b/>
           <w:sz w:val="24"/>
         </w:rPr>
-        <w:t>faktor ekonomi dan pasar diwakili oleh *Speculative Motive* ($X_3$)</w:t>
+        <w:t xml:space="preserve">faktor ekonomi dan pasar diwakili oleh </w:t>
+      </w:r>
+      <w:r>
+        <w:rPr>
+          <w:rFonts w:ascii="Times New Roman" w:hAnsi="Times New Roman"/>
+          <w:b/>
+          <w:i/>
+          <w:sz w:val="24"/>
+        </w:rPr>
+        <w:t>Speculative Motive</w:t>
+      </w:r>
+      <w:r>
+        <w:rPr>
+          <w:rFonts w:ascii="Times New Roman" w:hAnsi="Times New Roman"/>
+          <w:b/>
+          <w:sz w:val="24"/>
+        </w:rPr>
+        <w:t xml:space="preserve"> (</w:t>
+      </w:r>
+      <w:r>
+        <w:rPr>
+          <w:rFonts w:ascii="Times New Roman" w:hAnsi="Times New Roman"/>
+          <w:b/>
+          <w:i/>
+          <w:sz w:val="24"/>
+        </w:rPr>
+        <w:t>X</w:t>
+      </w:r>
+      <w:r>
+        <w:rPr>
+          <w:rFonts w:ascii="Times New Roman" w:hAnsi="Times New Roman"/>
+          <w:b/>
+          <w:sz w:val="24"/>
+        </w:rPr>
+        <w:t>₃)</w:t>
       </w:r>
       <w:r>
         <w:rPr>
@@ -4510,6 +4861,7 @@
       <w:r>
         <w:rPr>
           <w:rFonts w:ascii="Times New Roman" w:hAnsi="Times New Roman"/>
+          <w:b w:val="0"/>
           <w:i/>
           <w:sz w:val="24"/>
         </w:rPr>
@@ -4525,6 +4877,7 @@
       <w:r>
         <w:rPr>
           <w:rFonts w:ascii="Times New Roman" w:hAnsi="Times New Roman"/>
+          <w:b w:val="0"/>
           <w:i/>
           <w:sz w:val="24"/>
         </w:rPr>
@@ -4540,6 +4893,7 @@
       <w:r>
         <w:rPr>
           <w:rFonts w:ascii="Times New Roman" w:hAnsi="Times New Roman"/>
+          <w:b w:val="0"/>
           <w:i/>
           <w:sz w:val="24"/>
         </w:rPr>
@@ -4569,6 +4923,7 @@
       <w:r>
         <w:rPr>
           <w:rFonts w:ascii="Times New Roman" w:hAnsi="Times New Roman"/>
+          <w:b w:val="0"/>
           <w:i/>
           <w:sz w:val="24"/>
         </w:rPr>
@@ -4579,11 +4934,28 @@
           <w:rFonts w:ascii="Times New Roman" w:hAnsi="Times New Roman"/>
           <w:sz w:val="24"/>
         </w:rPr>
-        <w:t xml:space="preserve"> ($Y$), literatur perilaku konsumen mengenal beberapa instrumen pengukuran teruji, antara lain skala unidimensional pengaruh normatif oleh Rook and Fisher (1995) serta skala dorongan belanja impulsif dalam toko oleh Beatty and Ferrell (1998). Namun, penelitian ini mengadopsi instrumen pengukuran multidimensional Verplanken and Herabadi (2001) yang disintesis dengan definisi operasional Rook (1987). Skala ini membedakan secara tegas antara dimensi kognitif (ketiadaan perencanaan belanja dan pengabaian dampak keuangan) dan dimensi afektif (luapan kegembiraan mendadak dan dorongan spontan). Pemilihan instrumen ini didasarkan pada pertimbangan bahwa perilaku pembelian </w:t>
-      </w:r>
-      <w:r>
-        <w:rPr>
-          <w:rFonts w:ascii="Times New Roman" w:hAnsi="Times New Roman"/>
+        <w:t xml:space="preserve"> (</w:t>
+      </w:r>
+      <w:r>
+        <w:rPr>
+          <w:rFonts w:ascii="Times New Roman" w:hAnsi="Times New Roman"/>
+          <w:b w:val="0"/>
+          <w:i/>
+          <w:sz w:val="24"/>
+        </w:rPr>
+        <w:t>Y</w:t>
+      </w:r>
+      <w:r>
+        <w:rPr>
+          <w:rFonts w:ascii="Times New Roman" w:hAnsi="Times New Roman"/>
+          <w:sz w:val="24"/>
+        </w:rPr>
+        <w:t xml:space="preserve">), literatur perilaku konsumen mengenal beberapa instrumen pengukuran teruji, antara lain skala unidimensional pengaruh normatif oleh Rook and Fisher (1995) serta skala dorongan belanja impulsif dalam toko oleh Beatty and Ferrell (1998). Namun, penelitian ini mengadopsi instrumen pengukuran multidimensional Verplanken and Herabadi (2001) yang disintesis dengan definisi operasional Rook (1987). Skala ini membedakan secara tegas antara dimensi kognitif (ketiadaan perencanaan belanja dan pengabaian dampak keuangan) dan dimensi afektif (luapan kegembiraan mendadak dan dorongan spontan). Pemilihan instrumen ini didasarkan pada pertimbangan bahwa perilaku pembelian </w:t>
+      </w:r>
+      <w:r>
+        <w:rPr>
+          <w:rFonts w:ascii="Times New Roman" w:hAnsi="Times New Roman"/>
+          <w:b w:val="0"/>
           <w:i/>
           <w:sz w:val="24"/>
         </w:rPr>
@@ -4608,14 +4980,63 @@
           <w:rFonts w:ascii="Times New Roman" w:hAnsi="Times New Roman"/>
           <w:sz w:val="24"/>
         </w:rPr>
-        <w:t>Meskipun ketiga faktor pendorong ($X_1, X_2, X_3$) secara teoretis berkaitan erat dengan keputusan belanja, telaah mendalam terhadap riset-riset empiris terdahulu justru memperlihatkan adanya kesenjangan penelitian (</w:t>
-      </w:r>
-      <w:r>
-        <w:rPr>
-          <w:rFonts w:ascii="Times New Roman" w:hAnsi="Times New Roman"/>
+        <w:t>Meskipun ketiga faktor pendorong (</w:t>
+      </w:r>
+      <w:r>
+        <w:rPr>
+          <w:rFonts w:ascii="Times New Roman" w:hAnsi="Times New Roman"/>
+          <w:b w:val="0"/>
           <w:i/>
           <w:sz w:val="24"/>
         </w:rPr>
+        <w:t>X</w:t>
+      </w:r>
+      <w:r>
+        <w:rPr>
+          <w:rFonts w:ascii="Times New Roman" w:hAnsi="Times New Roman"/>
+          <w:sz w:val="24"/>
+        </w:rPr>
+        <w:t xml:space="preserve">₁, </w:t>
+      </w:r>
+      <w:r>
+        <w:rPr>
+          <w:rFonts w:ascii="Times New Roman" w:hAnsi="Times New Roman"/>
+          <w:b w:val="0"/>
+          <w:i/>
+          <w:sz w:val="24"/>
+        </w:rPr>
+        <w:t>X</w:t>
+      </w:r>
+      <w:r>
+        <w:rPr>
+          <w:rFonts w:ascii="Times New Roman" w:hAnsi="Times New Roman"/>
+          <w:sz w:val="24"/>
+        </w:rPr>
+        <w:t xml:space="preserve">₂, </w:t>
+      </w:r>
+      <w:r>
+        <w:rPr>
+          <w:rFonts w:ascii="Times New Roman" w:hAnsi="Times New Roman"/>
+          <w:b w:val="0"/>
+          <w:i/>
+          <w:sz w:val="24"/>
+        </w:rPr>
+        <w:t>X</w:t>
+      </w:r>
+      <w:r>
+        <w:rPr>
+          <w:rFonts w:ascii="Times New Roman" w:hAnsi="Times New Roman"/>
+          <w:sz w:val="24"/>
+        </w:rPr>
+        <w:t>₃) secara teoretis berkaitan erat dengan keputusan belanja, telaah mendalam terhadap riset-riset empiris terdahulu justru memperlihatkan adanya kesenjangan penelitian (</w:t>
+      </w:r>
+      <w:r>
+        <w:rPr>
+          <w:rFonts w:ascii="Times New Roman" w:hAnsi="Times New Roman"/>
+          <w:b w:val="0"/>
+          <w:i/>
+          <w:sz w:val="24"/>
+        </w:rPr>
         <w:t>empirical research gap</w:t>
       </w:r>
       <w:r>
@@ -4628,6 +5049,7 @@
       <w:r>
         <w:rPr>
           <w:rFonts w:ascii="Times New Roman" w:hAnsi="Times New Roman"/>
+          <w:b w:val="0"/>
           <w:i/>
           <w:sz w:val="24"/>
         </w:rPr>
@@ -4663,6 +5085,7 @@
       <w:r>
         <w:rPr>
           <w:rFonts w:ascii="Times New Roman" w:hAnsi="Times New Roman"/>
+          <w:b w:val="0"/>
           <w:i/>
           <w:sz w:val="24"/>
         </w:rPr>
@@ -4678,6 +5101,7 @@
       <w:r>
         <w:rPr>
           <w:rFonts w:ascii="Times New Roman" w:hAnsi="Times New Roman"/>
+          <w:b w:val="0"/>
           <w:i/>
           <w:sz w:val="24"/>
         </w:rPr>
@@ -4713,6 +5137,7 @@
       <w:r>
         <w:rPr>
           <w:rFonts w:ascii="Times New Roman" w:hAnsi="Times New Roman"/>
+          <w:b w:val="0"/>
           <w:i/>
           <w:sz w:val="24"/>
         </w:rPr>
@@ -4728,6 +5153,7 @@
       <w:r>
         <w:rPr>
           <w:rFonts w:ascii="Times New Roman" w:hAnsi="Times New Roman"/>
+          <w:b w:val="0"/>
           <w:i/>
           <w:sz w:val="24"/>
         </w:rPr>
@@ -4743,6 +5169,7 @@
       <w:r>
         <w:rPr>
           <w:rFonts w:ascii="Times New Roman" w:hAnsi="Times New Roman"/>
+          <w:b w:val="0"/>
           <w:i/>
           <w:sz w:val="24"/>
         </w:rPr>
@@ -4758,6 +5185,7 @@
       <w:r>
         <w:rPr>
           <w:rFonts w:ascii="Times New Roman" w:hAnsi="Times New Roman"/>
+          <w:b w:val="0"/>
           <w:i/>
           <w:sz w:val="24"/>
         </w:rPr>
@@ -4793,6 +5221,7 @@
       <w:r>
         <w:rPr>
           <w:rFonts w:ascii="Times New Roman" w:hAnsi="Times New Roman"/>
+          <w:b w:val="0"/>
           <w:i/>
           <w:sz w:val="24"/>
         </w:rPr>
@@ -4808,6 +5237,7 @@
       <w:r>
         <w:rPr>
           <w:rFonts w:ascii="Times New Roman" w:hAnsi="Times New Roman"/>
+          <w:b w:val="0"/>
           <w:i/>
           <w:sz w:val="24"/>
         </w:rPr>
@@ -4837,6 +5267,7 @@
       <w:r>
         <w:rPr>
           <w:rFonts w:ascii="Times New Roman" w:hAnsi="Times New Roman"/>
+          <w:b w:val="0"/>
           <w:i/>
           <w:sz w:val="24"/>
         </w:rPr>
@@ -4852,6 +5283,7 @@
       <w:r>
         <w:rPr>
           <w:rFonts w:ascii="Times New Roman" w:hAnsi="Times New Roman"/>
+          <w:b w:val="0"/>
           <w:i/>
           <w:sz w:val="24"/>
         </w:rPr>
@@ -4867,6 +5299,7 @@
       <w:r>
         <w:rPr>
           <w:rFonts w:ascii="Times New Roman" w:hAnsi="Times New Roman"/>
+          <w:b w:val="0"/>
           <w:i/>
           <w:sz w:val="24"/>
         </w:rPr>
@@ -4883,9 +5316,18 @@
         <w:rPr>
           <w:rFonts w:ascii="Times New Roman" w:hAnsi="Times New Roman"/>
           <w:b/>
-          <w:sz w:val="24"/>
-        </w:rPr>
-        <w:t>*Self-Control* (Kontrol Diri)</w:t>
+          <w:i/>
+          <w:sz w:val="24"/>
+        </w:rPr>
+        <w:t>Self-Control</w:t>
+      </w:r>
+      <w:r>
+        <w:rPr>
+          <w:rFonts w:ascii="Times New Roman" w:hAnsi="Times New Roman"/>
+          <w:b/>
+          <w:sz w:val="24"/>
+        </w:rPr>
+        <w:t xml:space="preserve"> (Kontrol Diri)</w:t>
       </w:r>
       <w:r>
         <w:rPr>
@@ -4897,6 +5339,7 @@
       <w:r>
         <w:rPr>
           <w:rFonts w:ascii="Times New Roman" w:hAnsi="Times New Roman"/>
+          <w:b w:val="0"/>
           <w:i/>
           <w:sz w:val="24"/>
         </w:rPr>
@@ -4915,7 +5358,24 @@
           <w:b/>
           <w:sz w:val="24"/>
         </w:rPr>
-        <w:t>akan dilemahkan (*buffered/dampened*)</w:t>
+        <w:t>akan dilemahkan (</w:t>
+      </w:r>
+      <w:r>
+        <w:rPr>
+          <w:rFonts w:ascii="Times New Roman" w:hAnsi="Times New Roman"/>
+          <w:b/>
+          <w:i/>
+          <w:sz w:val="24"/>
+        </w:rPr>
+        <w:t>buffered/dampened</w:t>
+      </w:r>
+      <w:r>
+        <w:rPr>
+          <w:rFonts w:ascii="Times New Roman" w:hAnsi="Times New Roman"/>
+          <w:b/>
+          <w:sz w:val="24"/>
+        </w:rPr>
+        <w:t>)</w:t>
       </w:r>
       <w:r>
         <w:rPr>
@@ -4944,7 +5404,92 @@
           <w:b/>
           <w:sz w:val="24"/>
         </w:rPr>
-        <w:t>“PENGARUH *HEDONIC MOTIVATION*, *DESIRE FOR COMPLETENESS*, DAN *SPECULATIVE MOTIVE* TERHADAP *IMPULSIVE BUYING* BOOSTER PACK KARTU POKÉMON TCG DENGAN *SELF-CONTROL* SEBAGAI VARIABEL MODERASI”</w:t>
+        <w:t xml:space="preserve">“PENGARUH </w:t>
+      </w:r>
+      <w:r>
+        <w:rPr>
+          <w:rFonts w:ascii="Times New Roman" w:hAnsi="Times New Roman"/>
+          <w:b/>
+          <w:i/>
+          <w:sz w:val="24"/>
+        </w:rPr>
+        <w:t>HEDONIC MOTIVATION</w:t>
+      </w:r>
+      <w:r>
+        <w:rPr>
+          <w:rFonts w:ascii="Times New Roman" w:hAnsi="Times New Roman"/>
+          <w:b/>
+          <w:sz w:val="24"/>
+        </w:rPr>
+        <w:t xml:space="preserve">, </w:t>
+      </w:r>
+      <w:r>
+        <w:rPr>
+          <w:rFonts w:ascii="Times New Roman" w:hAnsi="Times New Roman"/>
+          <w:b/>
+          <w:i/>
+          <w:sz w:val="24"/>
+        </w:rPr>
+        <w:t>DESIRE FOR COMPLETENESS</w:t>
+      </w:r>
+      <w:r>
+        <w:rPr>
+          <w:rFonts w:ascii="Times New Roman" w:hAnsi="Times New Roman"/>
+          <w:b/>
+          <w:sz w:val="24"/>
+        </w:rPr>
+        <w:t xml:space="preserve">, DAN </w:t>
+      </w:r>
+      <w:r>
+        <w:rPr>
+          <w:rFonts w:ascii="Times New Roman" w:hAnsi="Times New Roman"/>
+          <w:b/>
+          <w:i/>
+          <w:sz w:val="24"/>
+        </w:rPr>
+        <w:t>SPECULATIVE MOTIVE</w:t>
+      </w:r>
+      <w:r>
+        <w:rPr>
+          <w:rFonts w:ascii="Times New Roman" w:hAnsi="Times New Roman"/>
+          <w:b/>
+          <w:sz w:val="24"/>
+        </w:rPr>
+        <w:t xml:space="preserve"> TERHADAP </w:t>
+      </w:r>
+      <w:r>
+        <w:rPr>
+          <w:rFonts w:ascii="Times New Roman" w:hAnsi="Times New Roman"/>
+          <w:b/>
+          <w:i/>
+          <w:sz w:val="24"/>
+        </w:rPr>
+        <w:t>IMPULSIVE BUYING</w:t>
+      </w:r>
+      <w:r>
+        <w:rPr>
+          <w:rFonts w:ascii="Times New Roman" w:hAnsi="Times New Roman"/>
+          <w:b/>
+          <w:sz w:val="24"/>
+        </w:rPr>
+        <w:t xml:space="preserve"> BOOSTER PACK KARTU POKÉMON TCG DENGAN </w:t>
+      </w:r>
+      <w:r>
+        <w:rPr>
+          <w:rFonts w:ascii="Times New Roman" w:hAnsi="Times New Roman"/>
+          <w:b/>
+          <w:i/>
+          <w:sz w:val="24"/>
+        </w:rPr>
+        <w:t>SELF-CONTROL</w:t>
+      </w:r>
+      <w:r>
+        <w:rPr>
+          <w:rFonts w:ascii="Times New Roman" w:hAnsi="Times New Roman"/>
+          <w:b/>
+          <w:sz w:val="24"/>
+        </w:rPr>
+        <w:t xml:space="preserve"> SEBAGAI VARIABEL MODERASI”</w:t>
       </w:r>
       <w:r>
         <w:rPr>
@@ -4967,7 +5512,6 @@
         <w:rPr>
           <w:rFonts w:ascii="Times New Roman" w:hAnsi="Times New Roman"/>
           <w:b/>
-          <w:color w:val="000000"/>
           <w:sz w:val="24"/>
         </w:rPr>
         <w:t>1.2 Perumusan Masalah</w:t>
@@ -5009,6 +5553,7 @@
       <w:r>
         <w:rPr>
           <w:rFonts w:ascii="Times New Roman" w:hAnsi="Times New Roman"/>
+          <w:b w:val="0"/>
           <w:i/>
           <w:sz w:val="24"/>
         </w:rPr>
@@ -5024,6 +5569,7 @@
       <w:r>
         <w:rPr>
           <w:rFonts w:ascii="Times New Roman" w:hAnsi="Times New Roman"/>
+          <w:b w:val="0"/>
           <w:i/>
           <w:sz w:val="24"/>
         </w:rPr>
@@ -5059,6 +5605,7 @@
       <w:r>
         <w:rPr>
           <w:rFonts w:ascii="Times New Roman" w:hAnsi="Times New Roman"/>
+          <w:b w:val="0"/>
           <w:i/>
           <w:sz w:val="24"/>
         </w:rPr>
@@ -5074,6 +5621,7 @@
       <w:r>
         <w:rPr>
           <w:rFonts w:ascii="Times New Roman" w:hAnsi="Times New Roman"/>
+          <w:b w:val="0"/>
           <w:i/>
           <w:sz w:val="24"/>
         </w:rPr>
@@ -5109,6 +5657,7 @@
       <w:r>
         <w:rPr>
           <w:rFonts w:ascii="Times New Roman" w:hAnsi="Times New Roman"/>
+          <w:b w:val="0"/>
           <w:i/>
           <w:sz w:val="24"/>
         </w:rPr>
@@ -5124,6 +5673,7 @@
       <w:r>
         <w:rPr>
           <w:rFonts w:ascii="Times New Roman" w:hAnsi="Times New Roman"/>
+          <w:b w:val="0"/>
           <w:i/>
           <w:sz w:val="24"/>
         </w:rPr>
@@ -5159,6 +5709,7 @@
       <w:r>
         <w:rPr>
           <w:rFonts w:ascii="Times New Roman" w:hAnsi="Times New Roman"/>
+          <w:b w:val="0"/>
           <w:i/>
           <w:sz w:val="24"/>
         </w:rPr>
@@ -5174,6 +5725,7 @@
       <w:r>
         <w:rPr>
           <w:rFonts w:ascii="Times New Roman" w:hAnsi="Times New Roman"/>
+          <w:b w:val="0"/>
           <w:i/>
           <w:sz w:val="24"/>
         </w:rPr>
@@ -5189,6 +5741,7 @@
       <w:r>
         <w:rPr>
           <w:rFonts w:ascii="Times New Roman" w:hAnsi="Times New Roman"/>
+          <w:b w:val="0"/>
           <w:i/>
           <w:sz w:val="24"/>
         </w:rPr>
@@ -5224,6 +5777,7 @@
       <w:r>
         <w:rPr>
           <w:rFonts w:ascii="Times New Roman" w:hAnsi="Times New Roman"/>
+          <w:b w:val="0"/>
           <w:i/>
           <w:sz w:val="24"/>
         </w:rPr>
@@ -5239,6 +5793,7 @@
       <w:r>
         <w:rPr>
           <w:rFonts w:ascii="Times New Roman" w:hAnsi="Times New Roman"/>
+          <w:b w:val="0"/>
           <w:i/>
           <w:sz w:val="24"/>
         </w:rPr>
@@ -5254,6 +5809,7 @@
       <w:r>
         <w:rPr>
           <w:rFonts w:ascii="Times New Roman" w:hAnsi="Times New Roman"/>
+          <w:b w:val="0"/>
           <w:i/>
           <w:sz w:val="24"/>
         </w:rPr>
@@ -5289,6 +5845,7 @@
       <w:r>
         <w:rPr>
           <w:rFonts w:ascii="Times New Roman" w:hAnsi="Times New Roman"/>
+          <w:b w:val="0"/>
           <w:i/>
           <w:sz w:val="24"/>
         </w:rPr>
@@ -5304,6 +5861,7 @@
       <w:r>
         <w:rPr>
           <w:rFonts w:ascii="Times New Roman" w:hAnsi="Times New Roman"/>
+          <w:b w:val="0"/>
           <w:i/>
           <w:sz w:val="24"/>
         </w:rPr>
@@ -5319,6 +5877,7 @@
       <w:r>
         <w:rPr>
           <w:rFonts w:ascii="Times New Roman" w:hAnsi="Times New Roman"/>
+          <w:b w:val="0"/>
           <w:i/>
           <w:sz w:val="24"/>
         </w:rPr>
@@ -5345,7 +5904,6 @@
         <w:rPr>
           <w:rFonts w:ascii="Times New Roman" w:hAnsi="Times New Roman"/>
           <w:b/>
-          <w:color w:val="000000"/>
           <w:sz w:val="24"/>
         </w:rPr>
         <w:t>1.3 Tujuan Penelitian</w:t>
@@ -5387,6 +5945,7 @@
       <w:r>
         <w:rPr>
           <w:rFonts w:ascii="Times New Roman" w:hAnsi="Times New Roman"/>
+          <w:b w:val="0"/>
           <w:i/>
           <w:sz w:val="24"/>
         </w:rPr>
@@ -5402,6 +5961,7 @@
       <w:r>
         <w:rPr>
           <w:rFonts w:ascii="Times New Roman" w:hAnsi="Times New Roman"/>
+          <w:b w:val="0"/>
           <w:i/>
           <w:sz w:val="24"/>
         </w:rPr>
@@ -5437,6 +5997,7 @@
       <w:r>
         <w:rPr>
           <w:rFonts w:ascii="Times New Roman" w:hAnsi="Times New Roman"/>
+          <w:b w:val="0"/>
           <w:i/>
           <w:sz w:val="24"/>
         </w:rPr>
@@ -5452,6 +6013,7 @@
       <w:r>
         <w:rPr>
           <w:rFonts w:ascii="Times New Roman" w:hAnsi="Times New Roman"/>
+          <w:b w:val="0"/>
           <w:i/>
           <w:sz w:val="24"/>
         </w:rPr>
@@ -5487,6 +6049,7 @@
       <w:r>
         <w:rPr>
           <w:rFonts w:ascii="Times New Roman" w:hAnsi="Times New Roman"/>
+          <w:b w:val="0"/>
           <w:i/>
           <w:sz w:val="24"/>
         </w:rPr>
@@ -5502,6 +6065,7 @@
       <w:r>
         <w:rPr>
           <w:rFonts w:ascii="Times New Roman" w:hAnsi="Times New Roman"/>
+          <w:b w:val="0"/>
           <w:i/>
           <w:sz w:val="24"/>
         </w:rPr>
@@ -5537,6 +6101,7 @@
       <w:r>
         <w:rPr>
           <w:rFonts w:ascii="Times New Roman" w:hAnsi="Times New Roman"/>
+          <w:b w:val="0"/>
           <w:i/>
           <w:sz w:val="24"/>
         </w:rPr>
@@ -5552,6 +6117,7 @@
       <w:r>
         <w:rPr>
           <w:rFonts w:ascii="Times New Roman" w:hAnsi="Times New Roman"/>
+          <w:b w:val="0"/>
           <w:i/>
           <w:sz w:val="24"/>
         </w:rPr>
@@ -5567,6 +6133,7 @@
       <w:r>
         <w:rPr>
           <w:rFonts w:ascii="Times New Roman" w:hAnsi="Times New Roman"/>
+          <w:b w:val="0"/>
           <w:i/>
           <w:sz w:val="24"/>
         </w:rPr>
@@ -5602,6 +6169,7 @@
       <w:r>
         <w:rPr>
           <w:rFonts w:ascii="Times New Roman" w:hAnsi="Times New Roman"/>
+          <w:b w:val="0"/>
           <w:i/>
           <w:sz w:val="24"/>
         </w:rPr>
@@ -5617,6 +6185,7 @@
       <w:r>
         <w:rPr>
           <w:rFonts w:ascii="Times New Roman" w:hAnsi="Times New Roman"/>
+          <w:b w:val="0"/>
           <w:i/>
           <w:sz w:val="24"/>
         </w:rPr>
@@ -5632,6 +6201,7 @@
       <w:r>
         <w:rPr>
           <w:rFonts w:ascii="Times New Roman" w:hAnsi="Times New Roman"/>
+          <w:b w:val="0"/>
           <w:i/>
           <w:sz w:val="24"/>
         </w:rPr>
@@ -5667,6 +6237,7 @@
       <w:r>
         <w:rPr>
           <w:rFonts w:ascii="Times New Roman" w:hAnsi="Times New Roman"/>
+          <w:b w:val="0"/>
           <w:i/>
           <w:sz w:val="24"/>
         </w:rPr>
@@ -5682,6 +6253,7 @@
       <w:r>
         <w:rPr>
           <w:rFonts w:ascii="Times New Roman" w:hAnsi="Times New Roman"/>
+          <w:b w:val="0"/>
           <w:i/>
           <w:sz w:val="24"/>
         </w:rPr>
@@ -5697,6 +6269,7 @@
       <w:r>
         <w:rPr>
           <w:rFonts w:ascii="Times New Roman" w:hAnsi="Times New Roman"/>
+          <w:b w:val="0"/>
           <w:i/>
           <w:sz w:val="24"/>
         </w:rPr>
@@ -5723,7 +6296,6 @@
         <w:rPr>
           <w:rFonts w:ascii="Times New Roman" w:hAnsi="Times New Roman"/>
           <w:b/>
-          <w:color w:val="000000"/>
           <w:sz w:val="24"/>
         </w:rPr>
         <w:t>1.4 Manfaat Penelitian</w:t>
@@ -5756,7 +6328,6 @@
         <w:rPr>
           <w:rFonts w:ascii="Times New Roman" w:hAnsi="Times New Roman"/>
           <w:b/>
-          <w:color w:val="000000"/>
           <w:sz w:val="24"/>
         </w:rPr>
         <w:t>1.4.1 Manfaat Teoritis</w:t>
@@ -5780,7 +6351,24 @@
           <w:b/>
           <w:sz w:val="24"/>
         </w:rPr>
-        <w:t>Pengembangan Teori Keuangan Perilaku (*Behavioral Finance*):</w:t>
+        <w:t>Pengembangan Teori Keuangan Perilaku (</w:t>
+      </w:r>
+      <w:r>
+        <w:rPr>
+          <w:rFonts w:ascii="Times New Roman" w:hAnsi="Times New Roman"/>
+          <w:b/>
+          <w:i/>
+          <w:sz w:val="24"/>
+        </w:rPr>
+        <w:t>Behavioral Finance</w:t>
+      </w:r>
+      <w:r>
+        <w:rPr>
+          <w:rFonts w:ascii="Times New Roman" w:hAnsi="Times New Roman"/>
+          <w:b/>
+          <w:sz w:val="24"/>
+        </w:rPr>
+        <w:t>):</w:t>
       </w:r>
       <w:r>
         <w:rPr>
@@ -5792,6 +6380,7 @@
       <w:r>
         <w:rPr>
           <w:rFonts w:ascii="Times New Roman" w:hAnsi="Times New Roman"/>
+          <w:b w:val="0"/>
           <w:i/>
           <w:sz w:val="24"/>
         </w:rPr>
@@ -5823,7 +6412,24 @@
           <w:b/>
           <w:sz w:val="24"/>
         </w:rPr>
-        <w:t>Pengayaan Literatur Moderasi Kontrol Diri (*Self-Control*):</w:t>
+        <w:t>Pengayaan Literatur Moderasi Kontrol Diri (</w:t>
+      </w:r>
+      <w:r>
+        <w:rPr>
+          <w:rFonts w:ascii="Times New Roman" w:hAnsi="Times New Roman"/>
+          <w:b/>
+          <w:i/>
+          <w:sz w:val="24"/>
+        </w:rPr>
+        <w:t>Self-Control</w:t>
+      </w:r>
+      <w:r>
+        <w:rPr>
+          <w:rFonts w:ascii="Times New Roman" w:hAnsi="Times New Roman"/>
+          <w:b/>
+          <w:sz w:val="24"/>
+        </w:rPr>
+        <w:t>):</w:t>
       </w:r>
       <w:r>
         <w:rPr>
@@ -5835,6 +6441,7 @@
       <w:r>
         <w:rPr>
           <w:rFonts w:ascii="Times New Roman" w:hAnsi="Times New Roman"/>
+          <w:b w:val="0"/>
           <w:i/>
           <w:sz w:val="24"/>
         </w:rPr>
@@ -5878,6 +6485,7 @@
       <w:r>
         <w:rPr>
           <w:rFonts w:ascii="Times New Roman" w:hAnsi="Times New Roman"/>
+          <w:b w:val="0"/>
           <w:i/>
           <w:sz w:val="24"/>
         </w:rPr>
@@ -5904,7 +6512,6 @@
         <w:rPr>
           <w:rFonts w:ascii="Times New Roman" w:hAnsi="Times New Roman"/>
           <w:b/>
-          <w:color w:val="000000"/>
           <w:sz w:val="24"/>
         </w:rPr>
         <w:t>1.4.2 Manfaat Praktis</w:t>
@@ -5956,7 +6563,24 @@
           <w:b/>
           <w:sz w:val="24"/>
         </w:rPr>
-        <w:t>Bagi Komunitas dan Pelaku Usaha Toko Hobi (*Local Game Stores*):</w:t>
+        <w:t>Bagi Komunitas dan Pelaku Usaha Toko Hobi (</w:t>
+      </w:r>
+      <w:r>
+        <w:rPr>
+          <w:rFonts w:ascii="Times New Roman" w:hAnsi="Times New Roman"/>
+          <w:b/>
+          <w:i/>
+          <w:sz w:val="24"/>
+        </w:rPr>
+        <w:t>Local Game Stores</w:t>
+      </w:r>
+      <w:r>
+        <w:rPr>
+          <w:rFonts w:ascii="Times New Roman" w:hAnsi="Times New Roman"/>
+          <w:b/>
+          <w:sz w:val="24"/>
+        </w:rPr>
+        <w:t>):</w:t>
       </w:r>
       <w:r>
         <w:rPr>
@@ -6040,7 +6664,6 @@
         <w:rPr>
           <w:rFonts w:ascii="Times New Roman" w:hAnsi="Times New Roman"/>
           <w:b/>
-          <w:color w:val="000000"/>
           <w:sz w:val="24"/>
         </w:rPr>
         <w:t>BAB 2 KAJIAN PUSTAKA DAN PENGEMBANGAN HIPOTESIS</w:t>
@@ -6059,7 +6682,6 @@
         <w:rPr>
           <w:rFonts w:ascii="Times New Roman" w:hAnsi="Times New Roman"/>
           <w:b/>
-          <w:color w:val="000000"/>
           <w:sz w:val="24"/>
         </w:rPr>
         <w:t>2.1 Landasan Teori</w:t>
@@ -6078,10 +6700,26 @@
         <w:rPr>
           <w:rFonts w:ascii="Times New Roman" w:hAnsi="Times New Roman"/>
           <w:b/>
-          <w:color w:val="000000"/>
-          <w:sz w:val="24"/>
-        </w:rPr>
-        <w:t>2.1.1 Grand Theory: Keuangan Perilaku (*Behavioral Finance*)</w:t>
+          <w:sz w:val="24"/>
+        </w:rPr>
+        <w:t>2.1.1 Grand Theory: Keuangan Perilaku (</w:t>
+      </w:r>
+      <w:r>
+        <w:rPr>
+          <w:rFonts w:ascii="Times New Roman" w:hAnsi="Times New Roman"/>
+          <w:b/>
+          <w:i/>
+          <w:sz w:val="24"/>
+        </w:rPr>
+        <w:t>Behavioral Finance</w:t>
+      </w:r>
+      <w:r>
+        <w:rPr>
+          <w:rFonts w:ascii="Times New Roman" w:hAnsi="Times New Roman"/>
+          <w:b/>
+          <w:sz w:val="24"/>
+        </w:rPr>
+        <w:t>)</w:t>
       </w:r>
     </w:p>
     <w:p>
@@ -6100,6 +6738,7 @@
       <w:r>
         <w:rPr>
           <w:rFonts w:ascii="Times New Roman" w:hAnsi="Times New Roman"/>
+          <w:b w:val="0"/>
           <w:i/>
           <w:sz w:val="24"/>
         </w:rPr>
@@ -6118,7 +6757,24 @@
           <w:b/>
           <w:sz w:val="24"/>
         </w:rPr>
-        <w:t>Keuangan Perilaku (*Behavioral Finance*)</w:t>
+        <w:t>Keuangan Perilaku (</w:t>
+      </w:r>
+      <w:r>
+        <w:rPr>
+          <w:rFonts w:ascii="Times New Roman" w:hAnsi="Times New Roman"/>
+          <w:b/>
+          <w:i/>
+          <w:sz w:val="24"/>
+        </w:rPr>
+        <w:t>Behavioral Finance</w:t>
+      </w:r>
+      <w:r>
+        <w:rPr>
+          <w:rFonts w:ascii="Times New Roman" w:hAnsi="Times New Roman"/>
+          <w:b/>
+          <w:sz w:val="24"/>
+        </w:rPr>
+        <w:t>)</w:t>
       </w:r>
       <w:r>
         <w:rPr>
@@ -6130,6 +6786,7 @@
       <w:r>
         <w:rPr>
           <w:rFonts w:ascii="Times New Roman" w:hAnsi="Times New Roman"/>
+          <w:b w:val="0"/>
           <w:i/>
           <w:sz w:val="24"/>
         </w:rPr>
@@ -6145,6 +6802,7 @@
       <w:r>
         <w:rPr>
           <w:rFonts w:ascii="Times New Roman" w:hAnsi="Times New Roman"/>
+          <w:b w:val="0"/>
           <w:i/>
           <w:sz w:val="24"/>
         </w:rPr>
@@ -6160,6 +6818,7 @@
       <w:r>
         <w:rPr>
           <w:rFonts w:ascii="Times New Roman" w:hAnsi="Times New Roman"/>
+          <w:b w:val="0"/>
           <w:i/>
           <w:sz w:val="24"/>
         </w:rPr>
@@ -6189,6 +6848,7 @@
       <w:r>
         <w:rPr>
           <w:rFonts w:ascii="Times New Roman" w:hAnsi="Times New Roman"/>
+          <w:b w:val="0"/>
           <w:i/>
           <w:sz w:val="24"/>
         </w:rPr>
@@ -6204,6 +6864,7 @@
       <w:r>
         <w:rPr>
           <w:rFonts w:ascii="Times New Roman" w:hAnsi="Times New Roman"/>
+          <w:b w:val="0"/>
           <w:i/>
           <w:sz w:val="24"/>
         </w:rPr>
@@ -6219,6 +6880,7 @@
       <w:r>
         <w:rPr>
           <w:rFonts w:ascii="Times New Roman" w:hAnsi="Times New Roman"/>
+          <w:b w:val="0"/>
           <w:i/>
           <w:sz w:val="24"/>
         </w:rPr>
@@ -6234,6 +6896,7 @@
       <w:r>
         <w:rPr>
           <w:rFonts w:ascii="Times New Roman" w:hAnsi="Times New Roman"/>
+          <w:b w:val="0"/>
           <w:i/>
           <w:sz w:val="24"/>
         </w:rPr>
@@ -6249,6 +6912,7 @@
       <w:r>
         <w:rPr>
           <w:rFonts w:ascii="Times New Roman" w:hAnsi="Times New Roman"/>
+          <w:b w:val="0"/>
           <w:i/>
           <w:sz w:val="24"/>
         </w:rPr>
@@ -6264,6 +6928,7 @@
       <w:r>
         <w:rPr>
           <w:rFonts w:ascii="Times New Roman" w:hAnsi="Times New Roman"/>
+          <w:b w:val="0"/>
           <w:i/>
           <w:sz w:val="24"/>
         </w:rPr>
@@ -6279,6 +6944,7 @@
       <w:r>
         <w:rPr>
           <w:rFonts w:ascii="Times New Roman" w:hAnsi="Times New Roman"/>
+          <w:b w:val="0"/>
           <w:i/>
           <w:sz w:val="24"/>
         </w:rPr>
@@ -6294,6 +6960,7 @@
       <w:r>
         <w:rPr>
           <w:rFonts w:ascii="Times New Roman" w:hAnsi="Times New Roman"/>
+          <w:b w:val="0"/>
           <w:i/>
           <w:sz w:val="24"/>
         </w:rPr>
@@ -6309,6 +6976,7 @@
       <w:r>
         <w:rPr>
           <w:rFonts w:ascii="Times New Roman" w:hAnsi="Times New Roman"/>
+          <w:b w:val="0"/>
           <w:i/>
           <w:sz w:val="24"/>
         </w:rPr>
@@ -6324,6 +6992,7 @@
       <w:r>
         <w:rPr>
           <w:rFonts w:ascii="Times New Roman" w:hAnsi="Times New Roman"/>
+          <w:b w:val="0"/>
           <w:i/>
           <w:sz w:val="24"/>
         </w:rPr>
@@ -6339,6 +7008,7 @@
       <w:r>
         <w:rPr>
           <w:rFonts w:ascii="Times New Roman" w:hAnsi="Times New Roman"/>
+          <w:b w:val="0"/>
           <w:i/>
           <w:sz w:val="24"/>
         </w:rPr>
@@ -6368,6 +7038,7 @@
       <w:r>
         <w:rPr>
           <w:rFonts w:ascii="Times New Roman" w:hAnsi="Times New Roman"/>
+          <w:b w:val="0"/>
           <w:i/>
           <w:sz w:val="24"/>
         </w:rPr>
@@ -6383,6 +7054,7 @@
       <w:r>
         <w:rPr>
           <w:rFonts w:ascii="Times New Roman" w:hAnsi="Times New Roman"/>
+          <w:b w:val="0"/>
           <w:i/>
           <w:sz w:val="24"/>
         </w:rPr>
@@ -6409,10 +7081,26 @@
         <w:rPr>
           <w:rFonts w:ascii="Times New Roman" w:hAnsi="Times New Roman"/>
           <w:b/>
-          <w:color w:val="000000"/>
-          <w:sz w:val="24"/>
-        </w:rPr>
-        <w:t>2.1.2 Supporting Theory: Teori *Stimulus-Organism-Response* (S-O-R)</w:t>
+          <w:sz w:val="24"/>
+        </w:rPr>
+        <w:t xml:space="preserve">2.1.2 Supporting Theory: Teori </w:t>
+      </w:r>
+      <w:r>
+        <w:rPr>
+          <w:rFonts w:ascii="Times New Roman" w:hAnsi="Times New Roman"/>
+          <w:b/>
+          <w:i/>
+          <w:sz w:val="24"/>
+        </w:rPr>
+        <w:t>Stimulus-Organism-Response</w:t>
+      </w:r>
+      <w:r>
+        <w:rPr>
+          <w:rFonts w:ascii="Times New Roman" w:hAnsi="Times New Roman"/>
+          <w:b/>
+          <w:sz w:val="24"/>
+        </w:rPr>
+        <w:t xml:space="preserve"> (S-O-R)</w:t>
       </w:r>
     </w:p>
     <w:p>
@@ -6431,6 +7119,7 @@
       <w:r>
         <w:rPr>
           <w:rFonts w:ascii="Times New Roman" w:hAnsi="Times New Roman"/>
+          <w:b w:val="0"/>
           <w:i/>
           <w:sz w:val="24"/>
         </w:rPr>
@@ -6446,6 +7135,7 @@
       <w:r>
         <w:rPr>
           <w:rFonts w:ascii="Times New Roman" w:hAnsi="Times New Roman"/>
+          <w:b w:val="0"/>
           <w:i/>
           <w:sz w:val="24"/>
         </w:rPr>
@@ -6461,6 +7151,7 @@
       <w:r>
         <w:rPr>
           <w:rFonts w:ascii="Times New Roman" w:hAnsi="Times New Roman"/>
+          <w:b w:val="0"/>
           <w:i/>
           <w:sz w:val="24"/>
         </w:rPr>
@@ -6476,6 +7167,7 @@
       <w:r>
         <w:rPr>
           <w:rFonts w:ascii="Times New Roman" w:hAnsi="Times New Roman"/>
+          <w:b w:val="0"/>
           <w:i/>
           <w:sz w:val="24"/>
         </w:rPr>
@@ -6519,6 +7211,7 @@
       <w:r>
         <w:rPr>
           <w:rFonts w:ascii="Times New Roman" w:hAnsi="Times New Roman"/>
+          <w:b w:val="0"/>
           <w:i/>
           <w:sz w:val="24"/>
         </w:rPr>
@@ -6534,6 +7227,7 @@
       <w:r>
         <w:rPr>
           <w:rFonts w:ascii="Times New Roman" w:hAnsi="Times New Roman"/>
+          <w:b w:val="0"/>
           <w:i/>
           <w:sz w:val="24"/>
         </w:rPr>
@@ -6577,6 +7271,7 @@
       <w:r>
         <w:rPr>
           <w:rFonts w:ascii="Times New Roman" w:hAnsi="Times New Roman"/>
+          <w:b w:val="0"/>
           <w:i/>
           <w:sz w:val="24"/>
         </w:rPr>
@@ -6587,14 +7282,31 @@
           <w:rFonts w:ascii="Times New Roman" w:hAnsi="Times New Roman"/>
           <w:sz w:val="24"/>
         </w:rPr>
-        <w:t xml:space="preserve"> / $X_1$), desakan psikologis menutup slot album (</w:t>
-      </w:r>
-      <w:r>
-        <w:rPr>
-          <w:rFonts w:ascii="Times New Roman" w:hAnsi="Times New Roman"/>
+        <w:t xml:space="preserve"> / </w:t>
+      </w:r>
+      <w:r>
+        <w:rPr>
+          <w:rFonts w:ascii="Times New Roman" w:hAnsi="Times New Roman"/>
+          <w:b w:val="0"/>
           <w:i/>
           <w:sz w:val="24"/>
         </w:rPr>
+        <w:t>X</w:t>
+      </w:r>
+      <w:r>
+        <w:rPr>
+          <w:rFonts w:ascii="Times New Roman" w:hAnsi="Times New Roman"/>
+          <w:sz w:val="24"/>
+        </w:rPr>
+        <w:t>₁), desakan psikologis menutup slot album (</w:t>
+      </w:r>
+      <w:r>
+        <w:rPr>
+          <w:rFonts w:ascii="Times New Roman" w:hAnsi="Times New Roman"/>
+          <w:b w:val="0"/>
+          <w:i/>
+          <w:sz w:val="24"/>
+        </w:rPr>
         <w:t>Desire for Completeness</w:t>
       </w:r>
       <w:r>
@@ -6602,14 +7314,31 @@
           <w:rFonts w:ascii="Times New Roman" w:hAnsi="Times New Roman"/>
           <w:sz w:val="24"/>
         </w:rPr>
-        <w:t xml:space="preserve"> / $X_2$), motif spekulasi keuntungan modal (</w:t>
-      </w:r>
-      <w:r>
-        <w:rPr>
-          <w:rFonts w:ascii="Times New Roman" w:hAnsi="Times New Roman"/>
+        <w:t xml:space="preserve"> / </w:t>
+      </w:r>
+      <w:r>
+        <w:rPr>
+          <w:rFonts w:ascii="Times New Roman" w:hAnsi="Times New Roman"/>
+          <w:b w:val="0"/>
           <w:i/>
           <w:sz w:val="24"/>
         </w:rPr>
+        <w:t>X</w:t>
+      </w:r>
+      <w:r>
+        <w:rPr>
+          <w:rFonts w:ascii="Times New Roman" w:hAnsi="Times New Roman"/>
+          <w:sz w:val="24"/>
+        </w:rPr>
+        <w:t>₂), motif spekulasi keuntungan modal (</w:t>
+      </w:r>
+      <w:r>
+        <w:rPr>
+          <w:rFonts w:ascii="Times New Roman" w:hAnsi="Times New Roman"/>
+          <w:b w:val="0"/>
+          <w:i/>
+          <w:sz w:val="24"/>
+        </w:rPr>
         <w:t>Speculative Motive</w:t>
       </w:r>
       <w:r>
@@ -6617,14 +7346,31 @@
           <w:rFonts w:ascii="Times New Roman" w:hAnsi="Times New Roman"/>
           <w:sz w:val="24"/>
         </w:rPr>
-        <w:t xml:space="preserve"> / $X_3$), serta kapasitas pengaturan diri sebagai pemoderasi (</w:t>
-      </w:r>
-      <w:r>
-        <w:rPr>
-          <w:rFonts w:ascii="Times New Roman" w:hAnsi="Times New Roman"/>
+        <w:t xml:space="preserve"> / </w:t>
+      </w:r>
+      <w:r>
+        <w:rPr>
+          <w:rFonts w:ascii="Times New Roman" w:hAnsi="Times New Roman"/>
+          <w:b w:val="0"/>
           <w:i/>
           <w:sz w:val="24"/>
         </w:rPr>
+        <w:t>X</w:t>
+      </w:r>
+      <w:r>
+        <w:rPr>
+          <w:rFonts w:ascii="Times New Roman" w:hAnsi="Times New Roman"/>
+          <w:sz w:val="24"/>
+        </w:rPr>
+        <w:t>₃), serta kapasitas pengaturan diri sebagai pemoderasi (</w:t>
+      </w:r>
+      <w:r>
+        <w:rPr>
+          <w:rFonts w:ascii="Times New Roman" w:hAnsi="Times New Roman"/>
+          <w:b w:val="0"/>
+          <w:i/>
+          <w:sz w:val="24"/>
+        </w:rPr>
         <w:t>Self-Control</w:t>
       </w:r>
       <w:r>
@@ -6632,7 +7378,23 @@
           <w:rFonts w:ascii="Times New Roman" w:hAnsi="Times New Roman"/>
           <w:sz w:val="24"/>
         </w:rPr>
-        <w:t xml:space="preserve"> / $M$).</w:t>
+        <w:t xml:space="preserve"> / </w:t>
+      </w:r>
+      <w:r>
+        <w:rPr>
+          <w:rFonts w:ascii="Times New Roman" w:hAnsi="Times New Roman"/>
+          <w:b w:val="0"/>
+          <w:i/>
+          <w:sz w:val="24"/>
+        </w:rPr>
+        <w:t>M</w:t>
+      </w:r>
+      <w:r>
+        <w:rPr>
+          <w:rFonts w:ascii="Times New Roman" w:hAnsi="Times New Roman"/>
+          <w:sz w:val="24"/>
+        </w:rPr>
+        <w:t>).</w:t>
       </w:r>
     </w:p>
     <w:p>
@@ -6665,6 +7427,7 @@
       <w:r>
         <w:rPr>
           <w:rFonts w:ascii="Times New Roman" w:hAnsi="Times New Roman"/>
+          <w:b w:val="0"/>
           <w:i/>
           <w:sz w:val="24"/>
         </w:rPr>
@@ -6675,7 +7438,23 @@
           <w:rFonts w:ascii="Times New Roman" w:hAnsi="Times New Roman"/>
           <w:sz w:val="24"/>
         </w:rPr>
-        <w:t xml:space="preserve"> / $Y$).</w:t>
+        <w:t xml:space="preserve"> / </w:t>
+      </w:r>
+      <w:r>
+        <w:rPr>
+          <w:rFonts w:ascii="Times New Roman" w:hAnsi="Times New Roman"/>
+          <w:b w:val="0"/>
+          <w:i/>
+          <w:sz w:val="24"/>
+        </w:rPr>
+        <w:t>Y</w:t>
+      </w:r>
+      <w:r>
+        <w:rPr>
+          <w:rFonts w:ascii="Times New Roman" w:hAnsi="Times New Roman"/>
+          <w:sz w:val="24"/>
+        </w:rPr>
+        <w:t>).</w:t>
       </w:r>
     </w:p>
     <w:p>
@@ -6691,10 +7470,18 @@
         <w:rPr>
           <w:rFonts w:ascii="Times New Roman" w:hAnsi="Times New Roman"/>
           <w:b/>
-          <w:color w:val="000000"/>
-          <w:sz w:val="24"/>
-        </w:rPr>
-        <w:t>2.1.3 Supporting Theory: Psikologi Kolektor dan *The “Completing the Set” Effect*</w:t>
+          <w:sz w:val="24"/>
+        </w:rPr>
+        <w:t xml:space="preserve">2.1.3 Supporting Theory: Psikologi Kolektor dan </w:t>
+      </w:r>
+      <w:r>
+        <w:rPr>
+          <w:rFonts w:ascii="Times New Roman" w:hAnsi="Times New Roman"/>
+          <w:b/>
+          <w:i/>
+          <w:sz w:val="24"/>
+        </w:rPr>
+        <w:t>The “Completing the Set” Effect</w:t>
       </w:r>
     </w:p>
     <w:p>
@@ -6713,6 +7500,7 @@
       <w:r>
         <w:rPr>
           <w:rFonts w:ascii="Times New Roman" w:hAnsi="Times New Roman"/>
+          <w:b w:val="0"/>
           <w:i/>
           <w:sz w:val="24"/>
         </w:rPr>
@@ -6728,6 +7516,7 @@
       <w:r>
         <w:rPr>
           <w:rFonts w:ascii="Times New Roman" w:hAnsi="Times New Roman"/>
+          <w:b w:val="0"/>
           <w:i/>
           <w:sz w:val="24"/>
         </w:rPr>
@@ -6743,6 +7532,7 @@
       <w:r>
         <w:rPr>
           <w:rFonts w:ascii="Times New Roman" w:hAnsi="Times New Roman"/>
+          <w:b w:val="0"/>
           <w:i/>
           <w:sz w:val="24"/>
         </w:rPr>
@@ -6758,6 +7548,7 @@
       <w:r>
         <w:rPr>
           <w:rFonts w:ascii="Times New Roman" w:hAnsi="Times New Roman"/>
+          <w:b w:val="0"/>
           <w:i/>
           <w:sz w:val="24"/>
         </w:rPr>
@@ -6774,22 +7565,23 @@
         <w:rPr>
           <w:rFonts w:ascii="Times New Roman" w:hAnsi="Times New Roman"/>
           <w:b/>
-          <w:sz w:val="24"/>
-        </w:rPr>
-        <w:t>*The “Completing the Set” Effect</w:t>
-      </w:r>
-      <w:r>
-        <w:rPr>
-          <w:rFonts w:ascii="Times New Roman" w:hAnsi="Times New Roman"/>
           <w:i/>
           <w:sz w:val="24"/>
         </w:rPr>
+        <w:t>The “Completing the Set” Effect</w:t>
+      </w:r>
+      <w:r>
+        <w:rPr>
+          <w:rFonts w:ascii="Times New Roman" w:hAnsi="Times New Roman"/>
+          <w:sz w:val="24"/>
+        </w:rPr>
         <w:t xml:space="preserve">, membuktikan bahwa motivasi konsumen mengakuisisi barang melonjak drastis saat set mendekati kelengkapan. Barasz et al. (2017) memperkuat temuan ini melalui konsep </w:t>
       </w:r>
       <w:r>
         <w:rPr>
           <w:rFonts w:ascii="Times New Roman" w:hAnsi="Times New Roman"/>
           <w:b/>
+          <w:i/>
           <w:sz w:val="24"/>
         </w:rPr>
         <w:t>Pseudo-Set Framing</w:t>
@@ -6799,7 +7591,7 @@
           <w:rFonts w:ascii="Times New Roman" w:hAnsi="Times New Roman"/>
           <w:sz w:val="24"/>
         </w:rPr>
-        <w:t>*, di mana pembeli terdorong melengkapi item yang dibingkai sebagai kesatuan himpunan utuh.</w:t>
+        <w:t>, di mana pembeli terdorong melengkapi item yang dibingkai sebagai kesatuan himpunan utuh.</w:t>
       </w:r>
     </w:p>
     <w:p>
@@ -6815,10 +7607,26 @@
         <w:rPr>
           <w:rFonts w:ascii="Times New Roman" w:hAnsi="Times New Roman"/>
           <w:b/>
-          <w:color w:val="000000"/>
-          <w:sz w:val="24"/>
-        </w:rPr>
-        <w:t>2.1.4 Supporting Theory: Teori Regulasi Diri (*Self-Regulation Theory*)</w:t>
+          <w:sz w:val="24"/>
+        </w:rPr>
+        <w:t>2.1.4 Supporting Theory: Teori Regulasi Diri (</w:t>
+      </w:r>
+      <w:r>
+        <w:rPr>
+          <w:rFonts w:ascii="Times New Roman" w:hAnsi="Times New Roman"/>
+          <w:b/>
+          <w:i/>
+          <w:sz w:val="24"/>
+        </w:rPr>
+        <w:t>Self-Regulation Theory</w:t>
+      </w:r>
+      <w:r>
+        <w:rPr>
+          <w:rFonts w:ascii="Times New Roman" w:hAnsi="Times New Roman"/>
+          <w:b/>
+          <w:sz w:val="24"/>
+        </w:rPr>
+        <w:t>)</w:t>
       </w:r>
     </w:p>
     <w:p>
@@ -6837,6 +7645,7 @@
       <w:r>
         <w:rPr>
           <w:rFonts w:ascii="Times New Roman" w:hAnsi="Times New Roman"/>
+          <w:b w:val="0"/>
           <w:i/>
           <w:sz w:val="24"/>
         </w:rPr>
@@ -6852,6 +7661,7 @@
       <w:r>
         <w:rPr>
           <w:rFonts w:ascii="Times New Roman" w:hAnsi="Times New Roman"/>
+          <w:b w:val="0"/>
           <w:i/>
           <w:sz w:val="24"/>
         </w:rPr>
@@ -6878,7 +7688,6 @@
         <w:rPr>
           <w:rFonts w:ascii="Times New Roman" w:hAnsi="Times New Roman"/>
           <w:b/>
-          <w:color w:val="000000"/>
           <w:sz w:val="24"/>
         </w:rPr>
         <w:t>2.2 Kajian Variabel Penelitian</w:t>
@@ -6897,10 +7706,43 @@
         <w:rPr>
           <w:rFonts w:ascii="Times New Roman" w:hAnsi="Times New Roman"/>
           <w:b/>
-          <w:color w:val="000000"/>
-          <w:sz w:val="24"/>
-        </w:rPr>
-        <w:t>2.2.1 Variabel Dependen ($Y$): *Impulsive Buying* (Pembelian Impulsif)</w:t>
+          <w:sz w:val="24"/>
+        </w:rPr>
+        <w:t>2.2.1 Variabel Dependen (</w:t>
+      </w:r>
+      <w:r>
+        <w:rPr>
+          <w:rFonts w:ascii="Times New Roman" w:hAnsi="Times New Roman"/>
+          <w:b/>
+          <w:i/>
+          <w:sz w:val="24"/>
+        </w:rPr>
+        <w:t>Y</w:t>
+      </w:r>
+      <w:r>
+        <w:rPr>
+          <w:rFonts w:ascii="Times New Roman" w:hAnsi="Times New Roman"/>
+          <w:b/>
+          <w:sz w:val="24"/>
+        </w:rPr>
+        <w:t xml:space="preserve">): </w:t>
+      </w:r>
+      <w:r>
+        <w:rPr>
+          <w:rFonts w:ascii="Times New Roman" w:hAnsi="Times New Roman"/>
+          <w:b/>
+          <w:i/>
+          <w:sz w:val="24"/>
+        </w:rPr>
+        <w:t>Impulsive Buying</w:t>
+      </w:r>
+      <w:r>
+        <w:rPr>
+          <w:rFonts w:ascii="Times New Roman" w:hAnsi="Times New Roman"/>
+          <w:b/>
+          <w:sz w:val="24"/>
+        </w:rPr>
+        <w:t xml:space="preserve"> (Pembelian Impulsif)</w:t>
       </w:r>
     </w:p>
     <w:p>
@@ -6930,10 +7772,43 @@
         <w:rPr>
           <w:rFonts w:ascii="Times New Roman" w:hAnsi="Times New Roman"/>
           <w:b/>
-          <w:color w:val="000000"/>
-          <w:sz w:val="24"/>
-        </w:rPr>
-        <w:t>2.2.2 Variabel Independen ($X_1$): *Hedonic Motivation* (Motivasi Hedonis)</w:t>
+          <w:sz w:val="24"/>
+        </w:rPr>
+        <w:t>2.2.2 Variabel Independen (</w:t>
+      </w:r>
+      <w:r>
+        <w:rPr>
+          <w:rFonts w:ascii="Times New Roman" w:hAnsi="Times New Roman"/>
+          <w:b/>
+          <w:i/>
+          <w:sz w:val="24"/>
+        </w:rPr>
+        <w:t>X</w:t>
+      </w:r>
+      <w:r>
+        <w:rPr>
+          <w:rFonts w:ascii="Times New Roman" w:hAnsi="Times New Roman"/>
+          <w:b/>
+          <w:sz w:val="24"/>
+        </w:rPr>
+        <w:t xml:space="preserve">₁): </w:t>
+      </w:r>
+      <w:r>
+        <w:rPr>
+          <w:rFonts w:ascii="Times New Roman" w:hAnsi="Times New Roman"/>
+          <w:b/>
+          <w:i/>
+          <w:sz w:val="24"/>
+        </w:rPr>
+        <w:t>Hedonic Motivation</w:t>
+      </w:r>
+      <w:r>
+        <w:rPr>
+          <w:rFonts w:ascii="Times New Roman" w:hAnsi="Times New Roman"/>
+          <w:b/>
+          <w:sz w:val="24"/>
+        </w:rPr>
+        <w:t xml:space="preserve"> (Motivasi Hedonis)</w:t>
       </w:r>
     </w:p>
     <w:p>
@@ -6952,6 +7827,7 @@
       <w:r>
         <w:rPr>
           <w:rFonts w:ascii="Times New Roman" w:hAnsi="Times New Roman"/>
+          <w:b w:val="0"/>
           <w:i/>
           <w:sz w:val="24"/>
         </w:rPr>
@@ -6967,6 +7843,7 @@
       <w:r>
         <w:rPr>
           <w:rFonts w:ascii="Times New Roman" w:hAnsi="Times New Roman"/>
+          <w:b w:val="0"/>
           <w:i/>
           <w:sz w:val="24"/>
         </w:rPr>
@@ -6982,6 +7859,7 @@
       <w:r>
         <w:rPr>
           <w:rFonts w:ascii="Times New Roman" w:hAnsi="Times New Roman"/>
+          <w:b w:val="0"/>
           <w:i/>
           <w:sz w:val="24"/>
         </w:rPr>
@@ -7008,10 +7886,43 @@
         <w:rPr>
           <w:rFonts w:ascii="Times New Roman" w:hAnsi="Times New Roman"/>
           <w:b/>
-          <w:color w:val="000000"/>
-          <w:sz w:val="24"/>
-        </w:rPr>
-        <w:t>2.2.3 Variabel Independen ($X_2$): *Desire for Completeness* (Hasrat Kelengkapan Koleksi)</w:t>
+          <w:sz w:val="24"/>
+        </w:rPr>
+        <w:t>2.2.3 Variabel Independen (</w:t>
+      </w:r>
+      <w:r>
+        <w:rPr>
+          <w:rFonts w:ascii="Times New Roman" w:hAnsi="Times New Roman"/>
+          <w:b/>
+          <w:i/>
+          <w:sz w:val="24"/>
+        </w:rPr>
+        <w:t>X</w:t>
+      </w:r>
+      <w:r>
+        <w:rPr>
+          <w:rFonts w:ascii="Times New Roman" w:hAnsi="Times New Roman"/>
+          <w:b/>
+          <w:sz w:val="24"/>
+        </w:rPr>
+        <w:t xml:space="preserve">₂): </w:t>
+      </w:r>
+      <w:r>
+        <w:rPr>
+          <w:rFonts w:ascii="Times New Roman" w:hAnsi="Times New Roman"/>
+          <w:b/>
+          <w:i/>
+          <w:sz w:val="24"/>
+        </w:rPr>
+        <w:t>Desire for Completeness</w:t>
+      </w:r>
+      <w:r>
+        <w:rPr>
+          <w:rFonts w:ascii="Times New Roman" w:hAnsi="Times New Roman"/>
+          <w:b/>
+          <w:sz w:val="24"/>
+        </w:rPr>
+        <w:t xml:space="preserve"> (Hasrat Kelengkapan Koleksi)</w:t>
       </w:r>
     </w:p>
     <w:p>
@@ -7023,6 +7934,7 @@
       <w:r>
         <w:rPr>
           <w:rFonts w:ascii="Times New Roman" w:hAnsi="Times New Roman"/>
+          <w:b w:val="0"/>
           <w:i/>
           <w:sz w:val="24"/>
         </w:rPr>
@@ -7038,6 +7950,7 @@
       <w:r>
         <w:rPr>
           <w:rFonts w:ascii="Times New Roman" w:hAnsi="Times New Roman"/>
+          <w:b w:val="0"/>
           <w:i/>
           <w:sz w:val="24"/>
         </w:rPr>
@@ -7053,6 +7966,7 @@
       <w:r>
         <w:rPr>
           <w:rFonts w:ascii="Times New Roman" w:hAnsi="Times New Roman"/>
+          <w:b w:val="0"/>
           <w:i/>
           <w:sz w:val="24"/>
         </w:rPr>
@@ -7068,6 +7982,7 @@
       <w:r>
         <w:rPr>
           <w:rFonts w:ascii="Times New Roman" w:hAnsi="Times New Roman"/>
+          <w:b w:val="0"/>
           <w:i/>
           <w:sz w:val="24"/>
         </w:rPr>
@@ -7083,6 +7998,7 @@
       <w:r>
         <w:rPr>
           <w:rFonts w:ascii="Times New Roman" w:hAnsi="Times New Roman"/>
+          <w:b w:val="0"/>
           <w:i/>
           <w:sz w:val="24"/>
         </w:rPr>
@@ -7109,10 +8025,43 @@
         <w:rPr>
           <w:rFonts w:ascii="Times New Roman" w:hAnsi="Times New Roman"/>
           <w:b/>
-          <w:color w:val="000000"/>
-          <w:sz w:val="24"/>
-        </w:rPr>
-        <w:t>2.2.4 Variabel Independen ($X_3$): *Speculative Motive* (Motif Spekulasi Finansial)</w:t>
+          <w:sz w:val="24"/>
+        </w:rPr>
+        <w:t>2.2.4 Variabel Independen (</w:t>
+      </w:r>
+      <w:r>
+        <w:rPr>
+          <w:rFonts w:ascii="Times New Roman" w:hAnsi="Times New Roman"/>
+          <w:b/>
+          <w:i/>
+          <w:sz w:val="24"/>
+        </w:rPr>
+        <w:t>X</w:t>
+      </w:r>
+      <w:r>
+        <w:rPr>
+          <w:rFonts w:ascii="Times New Roman" w:hAnsi="Times New Roman"/>
+          <w:b/>
+          <w:sz w:val="24"/>
+        </w:rPr>
+        <w:t xml:space="preserve">₃): </w:t>
+      </w:r>
+      <w:r>
+        <w:rPr>
+          <w:rFonts w:ascii="Times New Roman" w:hAnsi="Times New Roman"/>
+          <w:b/>
+          <w:i/>
+          <w:sz w:val="24"/>
+        </w:rPr>
+        <w:t>Speculative Motive</w:t>
+      </w:r>
+      <w:r>
+        <w:rPr>
+          <w:rFonts w:ascii="Times New Roman" w:hAnsi="Times New Roman"/>
+          <w:b/>
+          <w:sz w:val="24"/>
+        </w:rPr>
+        <w:t xml:space="preserve"> (Motif Spekulasi Finansial)</w:t>
       </w:r>
     </w:p>
     <w:p>
@@ -7131,6 +8080,7 @@
       <w:r>
         <w:rPr>
           <w:rFonts w:ascii="Times New Roman" w:hAnsi="Times New Roman"/>
+          <w:b w:val="0"/>
           <w:i/>
           <w:sz w:val="24"/>
         </w:rPr>
@@ -7146,6 +8096,7 @@
       <w:r>
         <w:rPr>
           <w:rFonts w:ascii="Times New Roman" w:hAnsi="Times New Roman"/>
+          <w:b w:val="0"/>
           <w:i/>
           <w:sz w:val="24"/>
         </w:rPr>
@@ -7161,6 +8112,7 @@
       <w:r>
         <w:rPr>
           <w:rFonts w:ascii="Times New Roman" w:hAnsi="Times New Roman"/>
+          <w:b w:val="0"/>
           <w:i/>
           <w:sz w:val="24"/>
         </w:rPr>
@@ -7205,6 +8157,7 @@
       <w:r>
         <w:rPr>
           <w:rFonts w:ascii="Times New Roman" w:hAnsi="Times New Roman"/>
+          <w:b w:val="0"/>
           <w:i/>
           <w:sz w:val="24"/>
         </w:rPr>
@@ -7220,6 +8173,7 @@
       <w:r>
         <w:rPr>
           <w:rFonts w:ascii="Times New Roman" w:hAnsi="Times New Roman"/>
+          <w:b w:val="0"/>
           <w:i/>
           <w:sz w:val="24"/>
         </w:rPr>
@@ -7235,6 +8189,7 @@
       <w:r>
         <w:rPr>
           <w:rFonts w:ascii="Times New Roman" w:hAnsi="Times New Roman"/>
+          <w:b w:val="0"/>
           <w:i/>
           <w:sz w:val="24"/>
         </w:rPr>
@@ -7261,10 +8216,43 @@
         <w:rPr>
           <w:rFonts w:ascii="Times New Roman" w:hAnsi="Times New Roman"/>
           <w:b/>
-          <w:color w:val="000000"/>
-          <w:sz w:val="24"/>
-        </w:rPr>
-        <w:t>2.2.5 Variabel Moderasi ($M$): *Self-Control* (Kontrol Diri)</w:t>
+          <w:sz w:val="24"/>
+        </w:rPr>
+        <w:t>2.2.5 Variabel Moderasi (</w:t>
+      </w:r>
+      <w:r>
+        <w:rPr>
+          <w:rFonts w:ascii="Times New Roman" w:hAnsi="Times New Roman"/>
+          <w:b/>
+          <w:i/>
+          <w:sz w:val="24"/>
+        </w:rPr>
+        <w:t>M</w:t>
+      </w:r>
+      <w:r>
+        <w:rPr>
+          <w:rFonts w:ascii="Times New Roman" w:hAnsi="Times New Roman"/>
+          <w:b/>
+          <w:sz w:val="24"/>
+        </w:rPr>
+        <w:t xml:space="preserve">): </w:t>
+      </w:r>
+      <w:r>
+        <w:rPr>
+          <w:rFonts w:ascii="Times New Roman" w:hAnsi="Times New Roman"/>
+          <w:b/>
+          <w:i/>
+          <w:sz w:val="24"/>
+        </w:rPr>
+        <w:t>Self-Control</w:t>
+      </w:r>
+      <w:r>
+        <w:rPr>
+          <w:rFonts w:ascii="Times New Roman" w:hAnsi="Times New Roman"/>
+          <w:b/>
+          <w:sz w:val="24"/>
+        </w:rPr>
+        <w:t xml:space="preserve"> (Kontrol Diri)</w:t>
       </w:r>
     </w:p>
     <w:p>
@@ -7283,6 +8271,7 @@
       <w:r>
         <w:rPr>
           <w:rFonts w:ascii="Times New Roman" w:hAnsi="Times New Roman"/>
+          <w:b w:val="0"/>
           <w:i/>
           <w:sz w:val="24"/>
         </w:rPr>
@@ -7298,6 +8287,7 @@
       <w:r>
         <w:rPr>
           <w:rFonts w:ascii="Times New Roman" w:hAnsi="Times New Roman"/>
+          <w:b w:val="0"/>
           <w:i/>
           <w:sz w:val="24"/>
         </w:rPr>
@@ -7313,6 +8303,7 @@
       <w:r>
         <w:rPr>
           <w:rFonts w:ascii="Times New Roman" w:hAnsi="Times New Roman"/>
+          <w:b w:val="0"/>
           <w:i/>
           <w:sz w:val="24"/>
         </w:rPr>
@@ -7339,7 +8330,6 @@
         <w:rPr>
           <w:rFonts w:ascii="Times New Roman" w:hAnsi="Times New Roman"/>
           <w:b/>
-          <w:color w:val="000000"/>
           <w:sz w:val="24"/>
         </w:rPr>
         <w:t>2.3 Penelitian Sebelumnya</w:t>
@@ -9071,6 +10061,7 @@
       <w:r>
         <w:rPr>
           <w:rFonts w:ascii="Times New Roman" w:hAnsi="Times New Roman"/>
+          <w:b w:val="0"/>
           <w:i/>
           <w:sz w:val="24"/>
         </w:rPr>
@@ -9090,7 +10081,6 @@
         <w:rPr>
           <w:rFonts w:ascii="Times New Roman" w:hAnsi="Times New Roman"/>
           <w:b/>
-          <w:color w:val="000000"/>
           <w:sz w:val="24"/>
         </w:rPr>
         <w:t>2.4 Pengembangan Hipotesis</w:t>
@@ -9109,10 +10099,35 @@
         <w:rPr>
           <w:rFonts w:ascii="Times New Roman" w:hAnsi="Times New Roman"/>
           <w:b/>
-          <w:color w:val="000000"/>
-          <w:sz w:val="24"/>
-        </w:rPr>
-        <w:t>2.4.1 Pengaruh *Hedonic Motivation* terhadap *Impulsive Buying*</w:t>
+          <w:sz w:val="24"/>
+        </w:rPr>
+        <w:t xml:space="preserve">2.4.1 Pengaruh </w:t>
+      </w:r>
+      <w:r>
+        <w:rPr>
+          <w:rFonts w:ascii="Times New Roman" w:hAnsi="Times New Roman"/>
+          <w:b/>
+          <w:i/>
+          <w:sz w:val="24"/>
+        </w:rPr>
+        <w:t>Hedonic Motivation</w:t>
+      </w:r>
+      <w:r>
+        <w:rPr>
+          <w:rFonts w:ascii="Times New Roman" w:hAnsi="Times New Roman"/>
+          <w:b/>
+          <w:sz w:val="24"/>
+        </w:rPr>
+        <w:t xml:space="preserve"> terhadap </w:t>
+      </w:r>
+      <w:r>
+        <w:rPr>
+          <w:rFonts w:ascii="Times New Roman" w:hAnsi="Times New Roman"/>
+          <w:b/>
+          <w:i/>
+          <w:sz w:val="24"/>
+        </w:rPr>
+        <w:t>Impulsive Buying</w:t>
       </w:r>
     </w:p>
     <w:p>
@@ -9161,6 +10176,7 @@
       <w:r>
         <w:rPr>
           <w:rFonts w:ascii="Times New Roman" w:hAnsi="Times New Roman"/>
+          <w:b w:val="0"/>
           <w:i/>
           <w:sz w:val="24"/>
         </w:rPr>
@@ -9176,6 +10192,7 @@
       <w:r>
         <w:rPr>
           <w:rFonts w:ascii="Times New Roman" w:hAnsi="Times New Roman"/>
+          <w:b w:val="0"/>
           <w:i/>
           <w:sz w:val="24"/>
         </w:rPr>
@@ -9213,6 +10230,7 @@
       <w:r>
         <w:rPr>
           <w:rFonts w:ascii="Times New Roman" w:hAnsi="Times New Roman"/>
+          <w:b w:val="0"/>
           <w:i/>
           <w:sz w:val="24"/>
         </w:rPr>
@@ -9238,7 +10256,41 @@
           <w:b/>
           <w:sz w:val="24"/>
         </w:rPr>
-        <w:t>H1: *Hedonic Motivation* berpengaruh positif dan signifikan terhadap *Impulsive Buying* booster pack kartu Pokémon TCG.</w:t>
+        <w:t xml:space="preserve">H1: </w:t>
+      </w:r>
+      <w:r>
+        <w:rPr>
+          <w:rFonts w:ascii="Times New Roman" w:hAnsi="Times New Roman"/>
+          <w:b/>
+          <w:i/>
+          <w:sz w:val="24"/>
+        </w:rPr>
+        <w:t>Hedonic Motivation</w:t>
+      </w:r>
+      <w:r>
+        <w:rPr>
+          <w:rFonts w:ascii="Times New Roman" w:hAnsi="Times New Roman"/>
+          <w:b/>
+          <w:sz w:val="24"/>
+        </w:rPr>
+        <w:t xml:space="preserve"> berpengaruh positif dan signifikan terhadap </w:t>
+      </w:r>
+      <w:r>
+        <w:rPr>
+          <w:rFonts w:ascii="Times New Roman" w:hAnsi="Times New Roman"/>
+          <w:b/>
+          <w:i/>
+          <w:sz w:val="24"/>
+        </w:rPr>
+        <w:t>Impulsive Buying</w:t>
+      </w:r>
+      <w:r>
+        <w:rPr>
+          <w:rFonts w:ascii="Times New Roman" w:hAnsi="Times New Roman"/>
+          <w:b/>
+          <w:sz w:val="24"/>
+        </w:rPr>
+        <w:t xml:space="preserve"> booster pack kartu Pokémon TCG.</w:t>
       </w:r>
     </w:p>
     <w:p>
@@ -9254,10 +10306,35 @@
         <w:rPr>
           <w:rFonts w:ascii="Times New Roman" w:hAnsi="Times New Roman"/>
           <w:b/>
-          <w:color w:val="000000"/>
-          <w:sz w:val="24"/>
-        </w:rPr>
-        <w:t>2.4.2 Pengaruh *Desire for Completeness* terhadap *Impulsive Buying*</w:t>
+          <w:sz w:val="24"/>
+        </w:rPr>
+        <w:t xml:space="preserve">2.4.2 Pengaruh </w:t>
+      </w:r>
+      <w:r>
+        <w:rPr>
+          <w:rFonts w:ascii="Times New Roman" w:hAnsi="Times New Roman"/>
+          <w:b/>
+          <w:i/>
+          <w:sz w:val="24"/>
+        </w:rPr>
+        <w:t>Desire for Completeness</w:t>
+      </w:r>
+      <w:r>
+        <w:rPr>
+          <w:rFonts w:ascii="Times New Roman" w:hAnsi="Times New Roman"/>
+          <w:b/>
+          <w:sz w:val="24"/>
+        </w:rPr>
+        <w:t xml:space="preserve"> terhadap </w:t>
+      </w:r>
+      <w:r>
+        <w:rPr>
+          <w:rFonts w:ascii="Times New Roman" w:hAnsi="Times New Roman"/>
+          <w:b/>
+          <w:i/>
+          <w:sz w:val="24"/>
+        </w:rPr>
+        <w:t>Impulsive Buying</w:t>
       </w:r>
     </w:p>
     <w:p>
@@ -9284,6 +10361,7 @@
       <w:r>
         <w:rPr>
           <w:rFonts w:ascii="Times New Roman" w:hAnsi="Times New Roman"/>
+          <w:b w:val="0"/>
           <w:i/>
           <w:sz w:val="24"/>
         </w:rPr>
@@ -9299,6 +10377,7 @@
       <w:r>
         <w:rPr>
           <w:rFonts w:ascii="Times New Roman" w:hAnsi="Times New Roman"/>
+          <w:b w:val="0"/>
           <w:i/>
           <w:sz w:val="24"/>
         </w:rPr>
@@ -9314,6 +10393,7 @@
       <w:r>
         <w:rPr>
           <w:rFonts w:ascii="Times New Roman" w:hAnsi="Times New Roman"/>
+          <w:b w:val="0"/>
           <w:i/>
           <w:sz w:val="24"/>
         </w:rPr>
@@ -9351,6 +10431,7 @@
       <w:r>
         <w:rPr>
           <w:rFonts w:ascii="Times New Roman" w:hAnsi="Times New Roman"/>
+          <w:b w:val="0"/>
           <w:i/>
           <w:sz w:val="24"/>
         </w:rPr>
@@ -9366,6 +10447,7 @@
       <w:r>
         <w:rPr>
           <w:rFonts w:ascii="Times New Roman" w:hAnsi="Times New Roman"/>
+          <w:b w:val="0"/>
           <w:i/>
           <w:sz w:val="24"/>
         </w:rPr>
@@ -9403,6 +10485,7 @@
       <w:r>
         <w:rPr>
           <w:rFonts w:ascii="Times New Roman" w:hAnsi="Times New Roman"/>
+          <w:b w:val="0"/>
           <w:i/>
           <w:sz w:val="24"/>
         </w:rPr>
@@ -9418,6 +10501,7 @@
       <w:r>
         <w:rPr>
           <w:rFonts w:ascii="Times New Roman" w:hAnsi="Times New Roman"/>
+          <w:b w:val="0"/>
           <w:i/>
           <w:sz w:val="24"/>
         </w:rPr>
@@ -9433,6 +10517,7 @@
       <w:r>
         <w:rPr>
           <w:rFonts w:ascii="Times New Roman" w:hAnsi="Times New Roman"/>
+          <w:b w:val="0"/>
           <w:i/>
           <w:sz w:val="24"/>
         </w:rPr>
@@ -9458,7 +10543,41 @@
           <w:b/>
           <w:sz w:val="24"/>
         </w:rPr>
-        <w:t>H2: *Desire for Completeness* berpengaruh positif dan signifikan terhadap *Impulsive Buying* booster pack kartu Pokémon TCG.</w:t>
+        <w:t xml:space="preserve">H2: </w:t>
+      </w:r>
+      <w:r>
+        <w:rPr>
+          <w:rFonts w:ascii="Times New Roman" w:hAnsi="Times New Roman"/>
+          <w:b/>
+          <w:i/>
+          <w:sz w:val="24"/>
+        </w:rPr>
+        <w:t>Desire for Completeness</w:t>
+      </w:r>
+      <w:r>
+        <w:rPr>
+          <w:rFonts w:ascii="Times New Roman" w:hAnsi="Times New Roman"/>
+          <w:b/>
+          <w:sz w:val="24"/>
+        </w:rPr>
+        <w:t xml:space="preserve"> berpengaruh positif dan signifikan terhadap </w:t>
+      </w:r>
+      <w:r>
+        <w:rPr>
+          <w:rFonts w:ascii="Times New Roman" w:hAnsi="Times New Roman"/>
+          <w:b/>
+          <w:i/>
+          <w:sz w:val="24"/>
+        </w:rPr>
+        <w:t>Impulsive Buying</w:t>
+      </w:r>
+      <w:r>
+        <w:rPr>
+          <w:rFonts w:ascii="Times New Roman" w:hAnsi="Times New Roman"/>
+          <w:b/>
+          <w:sz w:val="24"/>
+        </w:rPr>
+        <w:t xml:space="preserve"> booster pack kartu Pokémon TCG.</w:t>
       </w:r>
     </w:p>
     <w:p>
@@ -9474,10 +10593,35 @@
         <w:rPr>
           <w:rFonts w:ascii="Times New Roman" w:hAnsi="Times New Roman"/>
           <w:b/>
-          <w:color w:val="000000"/>
-          <w:sz w:val="24"/>
-        </w:rPr>
-        <w:t>2.4.3 Pengaruh *Speculative Motive* terhadap *Impulsive Buying*</w:t>
+          <w:sz w:val="24"/>
+        </w:rPr>
+        <w:t xml:space="preserve">2.4.3 Pengaruh </w:t>
+      </w:r>
+      <w:r>
+        <w:rPr>
+          <w:rFonts w:ascii="Times New Roman" w:hAnsi="Times New Roman"/>
+          <w:b/>
+          <w:i/>
+          <w:sz w:val="24"/>
+        </w:rPr>
+        <w:t>Speculative Motive</w:t>
+      </w:r>
+      <w:r>
+        <w:rPr>
+          <w:rFonts w:ascii="Times New Roman" w:hAnsi="Times New Roman"/>
+          <w:b/>
+          <w:sz w:val="24"/>
+        </w:rPr>
+        <w:t xml:space="preserve"> terhadap </w:t>
+      </w:r>
+      <w:r>
+        <w:rPr>
+          <w:rFonts w:ascii="Times New Roman" w:hAnsi="Times New Roman"/>
+          <w:b/>
+          <w:i/>
+          <w:sz w:val="24"/>
+        </w:rPr>
+        <w:t>Impulsive Buying</w:t>
       </w:r>
     </w:p>
     <w:p>
@@ -9504,6 +10648,7 @@
       <w:r>
         <w:rPr>
           <w:rFonts w:ascii="Times New Roman" w:hAnsi="Times New Roman"/>
+          <w:b w:val="0"/>
           <w:i/>
           <w:sz w:val="24"/>
         </w:rPr>
@@ -9519,6 +10664,7 @@
       <w:r>
         <w:rPr>
           <w:rFonts w:ascii="Times New Roman" w:hAnsi="Times New Roman"/>
+          <w:b w:val="0"/>
           <w:i/>
           <w:sz w:val="24"/>
         </w:rPr>
@@ -9534,6 +10680,7 @@
       <w:r>
         <w:rPr>
           <w:rFonts w:ascii="Times New Roman" w:hAnsi="Times New Roman"/>
+          <w:b w:val="0"/>
           <w:i/>
           <w:sz w:val="24"/>
         </w:rPr>
@@ -9571,6 +10718,7 @@
       <w:r>
         <w:rPr>
           <w:rFonts w:ascii="Times New Roman" w:hAnsi="Times New Roman"/>
+          <w:b w:val="0"/>
           <w:i/>
           <w:sz w:val="24"/>
         </w:rPr>
@@ -9586,6 +10734,7 @@
       <w:r>
         <w:rPr>
           <w:rFonts w:ascii="Times New Roman" w:hAnsi="Times New Roman"/>
+          <w:b w:val="0"/>
           <w:i/>
           <w:sz w:val="24"/>
         </w:rPr>
@@ -9601,6 +10750,7 @@
       <w:r>
         <w:rPr>
           <w:rFonts w:ascii="Times New Roman" w:hAnsi="Times New Roman"/>
+          <w:b w:val="0"/>
           <w:i/>
           <w:sz w:val="24"/>
         </w:rPr>
@@ -9638,6 +10788,7 @@
       <w:r>
         <w:rPr>
           <w:rFonts w:ascii="Times New Roman" w:hAnsi="Times New Roman"/>
+          <w:b w:val="0"/>
           <w:i/>
           <w:sz w:val="24"/>
         </w:rPr>
@@ -9653,6 +10804,7 @@
       <w:r>
         <w:rPr>
           <w:rFonts w:ascii="Times New Roman" w:hAnsi="Times New Roman"/>
+          <w:b w:val="0"/>
           <w:i/>
           <w:sz w:val="24"/>
         </w:rPr>
@@ -9668,6 +10820,7 @@
       <w:r>
         <w:rPr>
           <w:rFonts w:ascii="Times New Roman" w:hAnsi="Times New Roman"/>
+          <w:b w:val="0"/>
           <w:i/>
           <w:sz w:val="24"/>
         </w:rPr>
@@ -9683,6 +10836,7 @@
       <w:r>
         <w:rPr>
           <w:rFonts w:ascii="Times New Roman" w:hAnsi="Times New Roman"/>
+          <w:b w:val="0"/>
           <w:i/>
           <w:sz w:val="24"/>
         </w:rPr>
@@ -9708,7 +10862,41 @@
           <w:b/>
           <w:sz w:val="24"/>
         </w:rPr>
-        <w:t>H3: *Speculative Motive* berpengaruh positif dan signifikan terhadap *Impulsive Buying* booster pack kartu Pokémon TCG.</w:t>
+        <w:t xml:space="preserve">H3: </w:t>
+      </w:r>
+      <w:r>
+        <w:rPr>
+          <w:rFonts w:ascii="Times New Roman" w:hAnsi="Times New Roman"/>
+          <w:b/>
+          <w:i/>
+          <w:sz w:val="24"/>
+        </w:rPr>
+        <w:t>Speculative Motive</w:t>
+      </w:r>
+      <w:r>
+        <w:rPr>
+          <w:rFonts w:ascii="Times New Roman" w:hAnsi="Times New Roman"/>
+          <w:b/>
+          <w:sz w:val="24"/>
+        </w:rPr>
+        <w:t xml:space="preserve"> berpengaruh positif dan signifikan terhadap </w:t>
+      </w:r>
+      <w:r>
+        <w:rPr>
+          <w:rFonts w:ascii="Times New Roman" w:hAnsi="Times New Roman"/>
+          <w:b/>
+          <w:i/>
+          <w:sz w:val="24"/>
+        </w:rPr>
+        <w:t>Impulsive Buying</w:t>
+      </w:r>
+      <w:r>
+        <w:rPr>
+          <w:rFonts w:ascii="Times New Roman" w:hAnsi="Times New Roman"/>
+          <w:b/>
+          <w:sz w:val="24"/>
+        </w:rPr>
+        <w:t xml:space="preserve"> booster pack kartu Pokémon TCG.</w:t>
       </w:r>
     </w:p>
     <w:p>
@@ -9724,10 +10912,52 @@
         <w:rPr>
           <w:rFonts w:ascii="Times New Roman" w:hAnsi="Times New Roman"/>
           <w:b/>
-          <w:color w:val="000000"/>
-          <w:sz w:val="24"/>
-        </w:rPr>
-        <w:t>2.4.4 Pengaruh Moderasi *Self-Control* terhadap Hubungan *Hedonic Motivation* dan *Impulsive Buying*</w:t>
+          <w:sz w:val="24"/>
+        </w:rPr>
+        <w:t xml:space="preserve">2.4.4 Pengaruh Moderasi </w:t>
+      </w:r>
+      <w:r>
+        <w:rPr>
+          <w:rFonts w:ascii="Times New Roman" w:hAnsi="Times New Roman"/>
+          <w:b/>
+          <w:i/>
+          <w:sz w:val="24"/>
+        </w:rPr>
+        <w:t>Self-Control</w:t>
+      </w:r>
+      <w:r>
+        <w:rPr>
+          <w:rFonts w:ascii="Times New Roman" w:hAnsi="Times New Roman"/>
+          <w:b/>
+          <w:sz w:val="24"/>
+        </w:rPr>
+        <w:t xml:space="preserve"> terhadap Hubungan </w:t>
+      </w:r>
+      <w:r>
+        <w:rPr>
+          <w:rFonts w:ascii="Times New Roman" w:hAnsi="Times New Roman"/>
+          <w:b/>
+          <w:i/>
+          <w:sz w:val="24"/>
+        </w:rPr>
+        <w:t>Hedonic Motivation</w:t>
+      </w:r>
+      <w:r>
+        <w:rPr>
+          <w:rFonts w:ascii="Times New Roman" w:hAnsi="Times New Roman"/>
+          <w:b/>
+          <w:sz w:val="24"/>
+        </w:rPr>
+        <w:t xml:space="preserve"> dan </w:t>
+      </w:r>
+      <w:r>
+        <w:rPr>
+          <w:rFonts w:ascii="Times New Roman" w:hAnsi="Times New Roman"/>
+          <w:b/>
+          <w:i/>
+          <w:sz w:val="24"/>
+        </w:rPr>
+        <w:t>Impulsive Buying</w:t>
       </w:r>
     </w:p>
     <w:p>
@@ -9754,6 +10984,7 @@
       <w:r>
         <w:rPr>
           <w:rFonts w:ascii="Times New Roman" w:hAnsi="Times New Roman"/>
+          <w:b w:val="0"/>
           <w:i/>
           <w:sz w:val="24"/>
         </w:rPr>
@@ -9769,6 +11000,7 @@
       <w:r>
         <w:rPr>
           <w:rFonts w:ascii="Times New Roman" w:hAnsi="Times New Roman"/>
+          <w:b w:val="0"/>
           <w:i/>
           <w:sz w:val="24"/>
         </w:rPr>
@@ -9784,6 +11016,7 @@
       <w:r>
         <w:rPr>
           <w:rFonts w:ascii="Times New Roman" w:hAnsi="Times New Roman"/>
+          <w:b w:val="0"/>
           <w:i/>
           <w:sz w:val="24"/>
         </w:rPr>
@@ -9799,6 +11032,7 @@
       <w:r>
         <w:rPr>
           <w:rFonts w:ascii="Times New Roman" w:hAnsi="Times New Roman"/>
+          <w:b w:val="0"/>
           <w:i/>
           <w:sz w:val="24"/>
         </w:rPr>
@@ -9836,6 +11070,7 @@
       <w:r>
         <w:rPr>
           <w:rFonts w:ascii="Times New Roman" w:hAnsi="Times New Roman"/>
+          <w:b w:val="0"/>
           <w:i/>
           <w:sz w:val="24"/>
         </w:rPr>
@@ -9851,6 +11086,7 @@
       <w:r>
         <w:rPr>
           <w:rFonts w:ascii="Times New Roman" w:hAnsi="Times New Roman"/>
+          <w:b w:val="0"/>
           <w:i/>
           <w:sz w:val="24"/>
         </w:rPr>
@@ -9898,7 +11134,58 @@
           <w:b/>
           <w:sz w:val="24"/>
         </w:rPr>
-        <w:t>H4: *Self-Control* memoderasi (memperlemah) pengaruh *Hedonic Motivation* terhadap *Impulsive Buying* booster pack kartu Pokémon TCG.</w:t>
+        <w:t xml:space="preserve">H4: </w:t>
+      </w:r>
+      <w:r>
+        <w:rPr>
+          <w:rFonts w:ascii="Times New Roman" w:hAnsi="Times New Roman"/>
+          <w:b/>
+          <w:i/>
+          <w:sz w:val="24"/>
+        </w:rPr>
+        <w:t>Self-Control</w:t>
+      </w:r>
+      <w:r>
+        <w:rPr>
+          <w:rFonts w:ascii="Times New Roman" w:hAnsi="Times New Roman"/>
+          <w:b/>
+          <w:sz w:val="24"/>
+        </w:rPr>
+        <w:t xml:space="preserve"> memoderasi (memperlemah) pengaruh </w:t>
+      </w:r>
+      <w:r>
+        <w:rPr>
+          <w:rFonts w:ascii="Times New Roman" w:hAnsi="Times New Roman"/>
+          <w:b/>
+          <w:i/>
+          <w:sz w:val="24"/>
+        </w:rPr>
+        <w:t>Hedonic Motivation</w:t>
+      </w:r>
+      <w:r>
+        <w:rPr>
+          <w:rFonts w:ascii="Times New Roman" w:hAnsi="Times New Roman"/>
+          <w:b/>
+          <w:sz w:val="24"/>
+        </w:rPr>
+        <w:t xml:space="preserve"> terhadap </w:t>
+      </w:r>
+      <w:r>
+        <w:rPr>
+          <w:rFonts w:ascii="Times New Roman" w:hAnsi="Times New Roman"/>
+          <w:b/>
+          <w:i/>
+          <w:sz w:val="24"/>
+        </w:rPr>
+        <w:t>Impulsive Buying</w:t>
+      </w:r>
+      <w:r>
+        <w:rPr>
+          <w:rFonts w:ascii="Times New Roman" w:hAnsi="Times New Roman"/>
+          <w:b/>
+          <w:sz w:val="24"/>
+        </w:rPr>
+        <w:t xml:space="preserve"> booster pack kartu Pokémon TCG.</w:t>
       </w:r>
     </w:p>
     <w:p>
@@ -9914,10 +11201,52 @@
         <w:rPr>
           <w:rFonts w:ascii="Times New Roman" w:hAnsi="Times New Roman"/>
           <w:b/>
-          <w:color w:val="000000"/>
-          <w:sz w:val="24"/>
-        </w:rPr>
-        <w:t>2.4.5 Pengaruh Moderasi *Self-Control* terhadap Hubungan *Desire for Completeness* dan *Impulsive Buying*</w:t>
+          <w:sz w:val="24"/>
+        </w:rPr>
+        <w:t xml:space="preserve">2.4.5 Pengaruh Moderasi </w:t>
+      </w:r>
+      <w:r>
+        <w:rPr>
+          <w:rFonts w:ascii="Times New Roman" w:hAnsi="Times New Roman"/>
+          <w:b/>
+          <w:i/>
+          <w:sz w:val="24"/>
+        </w:rPr>
+        <w:t>Self-Control</w:t>
+      </w:r>
+      <w:r>
+        <w:rPr>
+          <w:rFonts w:ascii="Times New Roman" w:hAnsi="Times New Roman"/>
+          <w:b/>
+          <w:sz w:val="24"/>
+        </w:rPr>
+        <w:t xml:space="preserve"> terhadap Hubungan </w:t>
+      </w:r>
+      <w:r>
+        <w:rPr>
+          <w:rFonts w:ascii="Times New Roman" w:hAnsi="Times New Roman"/>
+          <w:b/>
+          <w:i/>
+          <w:sz w:val="24"/>
+        </w:rPr>
+        <w:t>Desire for Completeness</w:t>
+      </w:r>
+      <w:r>
+        <w:rPr>
+          <w:rFonts w:ascii="Times New Roman" w:hAnsi="Times New Roman"/>
+          <w:b/>
+          <w:sz w:val="24"/>
+        </w:rPr>
+        <w:t xml:space="preserve"> dan </w:t>
+      </w:r>
+      <w:r>
+        <w:rPr>
+          <w:rFonts w:ascii="Times New Roman" w:hAnsi="Times New Roman"/>
+          <w:b/>
+          <w:i/>
+          <w:sz w:val="24"/>
+        </w:rPr>
+        <w:t>Impulsive Buying</w:t>
       </w:r>
     </w:p>
     <w:p>
@@ -9944,6 +11273,7 @@
       <w:r>
         <w:rPr>
           <w:rFonts w:ascii="Times New Roman" w:hAnsi="Times New Roman"/>
+          <w:b w:val="0"/>
           <w:i/>
           <w:sz w:val="24"/>
         </w:rPr>
@@ -10003,6 +11333,7 @@
       <w:r>
         <w:rPr>
           <w:rFonts w:ascii="Times New Roman" w:hAnsi="Times New Roman"/>
+          <w:b w:val="0"/>
           <w:i/>
           <w:sz w:val="24"/>
         </w:rPr>
@@ -10018,6 +11349,7 @@
       <w:r>
         <w:rPr>
           <w:rFonts w:ascii="Times New Roman" w:hAnsi="Times New Roman"/>
+          <w:b w:val="0"/>
           <w:i/>
           <w:sz w:val="24"/>
         </w:rPr>
@@ -10043,7 +11375,58 @@
           <w:b/>
           <w:sz w:val="24"/>
         </w:rPr>
-        <w:t>H5: *Self-Control* memoderasi (memperlemah) pengaruh *Desire for Completeness* terhadap *Impulsive Buying* booster pack kartu Pokémon TCG.</w:t>
+        <w:t xml:space="preserve">H5: </w:t>
+      </w:r>
+      <w:r>
+        <w:rPr>
+          <w:rFonts w:ascii="Times New Roman" w:hAnsi="Times New Roman"/>
+          <w:b/>
+          <w:i/>
+          <w:sz w:val="24"/>
+        </w:rPr>
+        <w:t>Self-Control</w:t>
+      </w:r>
+      <w:r>
+        <w:rPr>
+          <w:rFonts w:ascii="Times New Roman" w:hAnsi="Times New Roman"/>
+          <w:b/>
+          <w:sz w:val="24"/>
+        </w:rPr>
+        <w:t xml:space="preserve"> memoderasi (memperlemah) pengaruh </w:t>
+      </w:r>
+      <w:r>
+        <w:rPr>
+          <w:rFonts w:ascii="Times New Roman" w:hAnsi="Times New Roman"/>
+          <w:b/>
+          <w:i/>
+          <w:sz w:val="24"/>
+        </w:rPr>
+        <w:t>Desire for Completeness</w:t>
+      </w:r>
+      <w:r>
+        <w:rPr>
+          <w:rFonts w:ascii="Times New Roman" w:hAnsi="Times New Roman"/>
+          <w:b/>
+          <w:sz w:val="24"/>
+        </w:rPr>
+        <w:t xml:space="preserve"> terhadap </w:t>
+      </w:r>
+      <w:r>
+        <w:rPr>
+          <w:rFonts w:ascii="Times New Roman" w:hAnsi="Times New Roman"/>
+          <w:b/>
+          <w:i/>
+          <w:sz w:val="24"/>
+        </w:rPr>
+        <w:t>Impulsive Buying</w:t>
+      </w:r>
+      <w:r>
+        <w:rPr>
+          <w:rFonts w:ascii="Times New Roman" w:hAnsi="Times New Roman"/>
+          <w:b/>
+          <w:sz w:val="24"/>
+        </w:rPr>
+        <w:t xml:space="preserve"> booster pack kartu Pokémon TCG.</w:t>
       </w:r>
     </w:p>
     <w:p>
@@ -10059,10 +11442,52 @@
         <w:rPr>
           <w:rFonts w:ascii="Times New Roman" w:hAnsi="Times New Roman"/>
           <w:b/>
-          <w:color w:val="000000"/>
-          <w:sz w:val="24"/>
-        </w:rPr>
-        <w:t>2.4.6 Pengaruh Moderasi *Self-Control* terhadap Hubungan *Speculative Motive* dan *Impulsive Buying*</w:t>
+          <w:sz w:val="24"/>
+        </w:rPr>
+        <w:t xml:space="preserve">2.4.6 Pengaruh Moderasi </w:t>
+      </w:r>
+      <w:r>
+        <w:rPr>
+          <w:rFonts w:ascii="Times New Roman" w:hAnsi="Times New Roman"/>
+          <w:b/>
+          <w:i/>
+          <w:sz w:val="24"/>
+        </w:rPr>
+        <w:t>Self-Control</w:t>
+      </w:r>
+      <w:r>
+        <w:rPr>
+          <w:rFonts w:ascii="Times New Roman" w:hAnsi="Times New Roman"/>
+          <w:b/>
+          <w:sz w:val="24"/>
+        </w:rPr>
+        <w:t xml:space="preserve"> terhadap Hubungan </w:t>
+      </w:r>
+      <w:r>
+        <w:rPr>
+          <w:rFonts w:ascii="Times New Roman" w:hAnsi="Times New Roman"/>
+          <w:b/>
+          <w:i/>
+          <w:sz w:val="24"/>
+        </w:rPr>
+        <w:t>Speculative Motive</w:t>
+      </w:r>
+      <w:r>
+        <w:rPr>
+          <w:rFonts w:ascii="Times New Roman" w:hAnsi="Times New Roman"/>
+          <w:b/>
+          <w:sz w:val="24"/>
+        </w:rPr>
+        <w:t xml:space="preserve"> dan </w:t>
+      </w:r>
+      <w:r>
+        <w:rPr>
+          <w:rFonts w:ascii="Times New Roman" w:hAnsi="Times New Roman"/>
+          <w:b/>
+          <w:i/>
+          <w:sz w:val="24"/>
+        </w:rPr>
+        <w:t>Impulsive Buying</w:t>
       </w:r>
     </w:p>
     <w:p>
@@ -10089,6 +11514,7 @@
       <w:r>
         <w:rPr>
           <w:rFonts w:ascii="Times New Roman" w:hAnsi="Times New Roman"/>
+          <w:b w:val="0"/>
           <w:i/>
           <w:sz w:val="24"/>
         </w:rPr>
@@ -10148,6 +11574,7 @@
       <w:r>
         <w:rPr>
           <w:rFonts w:ascii="Times New Roman" w:hAnsi="Times New Roman"/>
+          <w:b w:val="0"/>
           <w:i/>
           <w:sz w:val="24"/>
         </w:rPr>
@@ -10173,7 +11600,58 @@
           <w:b/>
           <w:sz w:val="24"/>
         </w:rPr>
-        <w:t>H6: *Self-Control* memoderasi (memperlemah) pengaruh *Speculative Motive* terhadap *Impulsive Buying* booster pack kartu Pokémon TCG.</w:t>
+        <w:t xml:space="preserve">H6: </w:t>
+      </w:r>
+      <w:r>
+        <w:rPr>
+          <w:rFonts w:ascii="Times New Roman" w:hAnsi="Times New Roman"/>
+          <w:b/>
+          <w:i/>
+          <w:sz w:val="24"/>
+        </w:rPr>
+        <w:t>Self-Control</w:t>
+      </w:r>
+      <w:r>
+        <w:rPr>
+          <w:rFonts w:ascii="Times New Roman" w:hAnsi="Times New Roman"/>
+          <w:b/>
+          <w:sz w:val="24"/>
+        </w:rPr>
+        <w:t xml:space="preserve"> memoderasi (memperlemah) pengaruh </w:t>
+      </w:r>
+      <w:r>
+        <w:rPr>
+          <w:rFonts w:ascii="Times New Roman" w:hAnsi="Times New Roman"/>
+          <w:b/>
+          <w:i/>
+          <w:sz w:val="24"/>
+        </w:rPr>
+        <w:t>Speculative Motive</w:t>
+      </w:r>
+      <w:r>
+        <w:rPr>
+          <w:rFonts w:ascii="Times New Roman" w:hAnsi="Times New Roman"/>
+          <w:b/>
+          <w:sz w:val="24"/>
+        </w:rPr>
+        <w:t xml:space="preserve"> terhadap </w:t>
+      </w:r>
+      <w:r>
+        <w:rPr>
+          <w:rFonts w:ascii="Times New Roman" w:hAnsi="Times New Roman"/>
+          <w:b/>
+          <w:i/>
+          <w:sz w:val="24"/>
+        </w:rPr>
+        <w:t>Impulsive Buying</w:t>
+      </w:r>
+      <w:r>
+        <w:rPr>
+          <w:rFonts w:ascii="Times New Roman" w:hAnsi="Times New Roman"/>
+          <w:b/>
+          <w:sz w:val="24"/>
+        </w:rPr>
+        <w:t xml:space="preserve"> booster pack kartu Pokémon TCG.</w:t>
       </w:r>
     </w:p>
     <w:p>
@@ -10189,7 +11667,6 @@
         <w:rPr>
           <w:rFonts w:ascii="Times New Roman" w:hAnsi="Times New Roman"/>
           <w:b/>
-          <w:color w:val="000000"/>
           <w:sz w:val="24"/>
         </w:rPr>
         <w:t>2.5 Rerangka Penelitian</w:t>
@@ -10295,7 +11772,6 @@
         <w:rPr>
           <w:rFonts w:ascii="Times New Roman" w:hAnsi="Times New Roman"/>
           <w:b/>
-          <w:color w:val="000000"/>
           <w:sz w:val="24"/>
         </w:rPr>
         <w:t>DAFTAR PUSTAKA</w:t>
@@ -10317,6 +11793,7 @@
       <w:r>
         <w:rPr>
           <w:rFonts w:ascii="Times New Roman" w:hAnsi="Times New Roman"/>
+          <w:b w:val="0"/>
           <w:i/>
           <w:sz w:val="24"/>
         </w:rPr>
@@ -10346,6 +11823,7 @@
       <w:r>
         <w:rPr>
           <w:rFonts w:ascii="Times New Roman" w:hAnsi="Times New Roman"/>
+          <w:b w:val="0"/>
           <w:i/>
           <w:sz w:val="24"/>
         </w:rPr>
@@ -10375,6 +11853,7 @@
       <w:r>
         <w:rPr>
           <w:rFonts w:ascii="Times New Roman" w:hAnsi="Times New Roman"/>
+          <w:b w:val="0"/>
           <w:i/>
           <w:sz w:val="24"/>
         </w:rPr>
@@ -10404,6 +11883,7 @@
       <w:r>
         <w:rPr>
           <w:rFonts w:ascii="Times New Roman" w:hAnsi="Times New Roman"/>
+          <w:b w:val="0"/>
           <w:i/>
           <w:sz w:val="24"/>
         </w:rPr>
@@ -10433,6 +11913,7 @@
       <w:r>
         <w:rPr>
           <w:rFonts w:ascii="Times New Roman" w:hAnsi="Times New Roman"/>
+          <w:b w:val="0"/>
           <w:i/>
           <w:sz w:val="24"/>
         </w:rPr>
@@ -10462,6 +11943,7 @@
       <w:r>
         <w:rPr>
           <w:rFonts w:ascii="Times New Roman" w:hAnsi="Times New Roman"/>
+          <w:b w:val="0"/>
           <w:i/>
           <w:sz w:val="24"/>
         </w:rPr>
@@ -10477,6 +11959,7 @@
       <w:r>
         <w:rPr>
           <w:rFonts w:ascii="Times New Roman" w:hAnsi="Times New Roman"/>
+          <w:b w:val="0"/>
           <w:i/>
           <w:sz w:val="24"/>
         </w:rPr>
@@ -10506,6 +11989,7 @@
       <w:r>
         <w:rPr>
           <w:rFonts w:ascii="Times New Roman" w:hAnsi="Times New Roman"/>
+          <w:b w:val="0"/>
           <w:i/>
           <w:sz w:val="24"/>
         </w:rPr>
@@ -10535,6 +12019,7 @@
       <w:r>
         <w:rPr>
           <w:rFonts w:ascii="Times New Roman" w:hAnsi="Times New Roman"/>
+          <w:b w:val="0"/>
           <w:i/>
           <w:sz w:val="24"/>
         </w:rPr>
@@ -10564,6 +12049,7 @@
       <w:r>
         <w:rPr>
           <w:rFonts w:ascii="Times New Roman" w:hAnsi="Times New Roman"/>
+          <w:b w:val="0"/>
           <w:i/>
           <w:sz w:val="24"/>
         </w:rPr>
@@ -10593,6 +12079,7 @@
       <w:r>
         <w:rPr>
           <w:rFonts w:ascii="Times New Roman" w:hAnsi="Times New Roman"/>
+          <w:b w:val="0"/>
           <w:i/>
           <w:sz w:val="24"/>
         </w:rPr>
@@ -10622,6 +12109,7 @@
       <w:r>
         <w:rPr>
           <w:rFonts w:ascii="Times New Roman" w:hAnsi="Times New Roman"/>
+          <w:b w:val="0"/>
           <w:i/>
           <w:sz w:val="24"/>
         </w:rPr>
@@ -10651,6 +12139,7 @@
       <w:r>
         <w:rPr>
           <w:rFonts w:ascii="Times New Roman" w:hAnsi="Times New Roman"/>
+          <w:b w:val="0"/>
           <w:i/>
           <w:sz w:val="24"/>
         </w:rPr>
@@ -10680,6 +12169,7 @@
       <w:r>
         <w:rPr>
           <w:rFonts w:ascii="Times New Roman" w:hAnsi="Times New Roman"/>
+          <w:b w:val="0"/>
           <w:i/>
           <w:sz w:val="24"/>
         </w:rPr>
@@ -10709,6 +12199,7 @@
       <w:r>
         <w:rPr>
           <w:rFonts w:ascii="Times New Roman" w:hAnsi="Times New Roman"/>
+          <w:b w:val="0"/>
           <w:i/>
           <w:sz w:val="24"/>
         </w:rPr>
@@ -10738,6 +12229,7 @@
       <w:r>
         <w:rPr>
           <w:rFonts w:ascii="Times New Roman" w:hAnsi="Times New Roman"/>
+          <w:b w:val="0"/>
           <w:i/>
           <w:sz w:val="24"/>
         </w:rPr>
@@ -10767,6 +12259,7 @@
       <w:r>
         <w:rPr>
           <w:rFonts w:ascii="Times New Roman" w:hAnsi="Times New Roman"/>
+          <w:b w:val="0"/>
           <w:i/>
           <w:sz w:val="24"/>
         </w:rPr>
@@ -10796,6 +12289,7 @@
       <w:r>
         <w:rPr>
           <w:rFonts w:ascii="Times New Roman" w:hAnsi="Times New Roman"/>
+          <w:b w:val="0"/>
           <w:i/>
           <w:sz w:val="24"/>
         </w:rPr>
@@ -10825,6 +12319,7 @@
       <w:r>
         <w:rPr>
           <w:rFonts w:ascii="Times New Roman" w:hAnsi="Times New Roman"/>
+          <w:b w:val="0"/>
           <w:i/>
           <w:sz w:val="24"/>
         </w:rPr>
@@ -10854,6 +12349,7 @@
       <w:r>
         <w:rPr>
           <w:rFonts w:ascii="Times New Roman" w:hAnsi="Times New Roman"/>
+          <w:b w:val="0"/>
           <w:i/>
           <w:sz w:val="24"/>
         </w:rPr>
@@ -10883,6 +12379,7 @@
       <w:r>
         <w:rPr>
           <w:rFonts w:ascii="Times New Roman" w:hAnsi="Times New Roman"/>
+          <w:b w:val="0"/>
           <w:i/>
           <w:sz w:val="24"/>
         </w:rPr>
@@ -10912,6 +12409,7 @@
       <w:r>
         <w:rPr>
           <w:rFonts w:ascii="Times New Roman" w:hAnsi="Times New Roman"/>
+          <w:b w:val="0"/>
           <w:i/>
           <w:sz w:val="24"/>
         </w:rPr>
@@ -10941,6 +12439,7 @@
       <w:r>
         <w:rPr>
           <w:rFonts w:ascii="Times New Roman" w:hAnsi="Times New Roman"/>
+          <w:b w:val="0"/>
           <w:i/>
           <w:sz w:val="24"/>
         </w:rPr>
@@ -10970,6 +12469,7 @@
       <w:r>
         <w:rPr>
           <w:rFonts w:ascii="Times New Roman" w:hAnsi="Times New Roman"/>
+          <w:b w:val="0"/>
           <w:i/>
           <w:sz w:val="24"/>
         </w:rPr>
@@ -10999,6 +12499,7 @@
       <w:r>
         <w:rPr>
           <w:rFonts w:ascii="Times New Roman" w:hAnsi="Times New Roman"/>
+          <w:b w:val="0"/>
           <w:i/>
           <w:sz w:val="24"/>
         </w:rPr>
@@ -11028,6 +12529,7 @@
       <w:r>
         <w:rPr>
           <w:rFonts w:ascii="Times New Roman" w:hAnsi="Times New Roman"/>
+          <w:b w:val="0"/>
           <w:i/>
           <w:sz w:val="24"/>
         </w:rPr>
@@ -11057,6 +12559,7 @@
       <w:r>
         <w:rPr>
           <w:rFonts w:ascii="Times New Roman" w:hAnsi="Times New Roman"/>
+          <w:b w:val="0"/>
           <w:i/>
           <w:sz w:val="24"/>
         </w:rPr>
@@ -11086,6 +12589,7 @@
       <w:r>
         <w:rPr>
           <w:rFonts w:ascii="Times New Roman" w:hAnsi="Times New Roman"/>
+          <w:b w:val="0"/>
           <w:i/>
           <w:sz w:val="24"/>
         </w:rPr>
@@ -11115,6 +12619,7 @@
       <w:r>
         <w:rPr>
           <w:rFonts w:ascii="Times New Roman" w:hAnsi="Times New Roman"/>
+          <w:b w:val="0"/>
           <w:i/>
           <w:sz w:val="24"/>
         </w:rPr>
@@ -11144,6 +12649,7 @@
       <w:r>
         <w:rPr>
           <w:rFonts w:ascii="Times New Roman" w:hAnsi="Times New Roman"/>
+          <w:b w:val="0"/>
           <w:i/>
           <w:sz w:val="24"/>
         </w:rPr>
@@ -11173,6 +12679,7 @@
       <w:r>
         <w:rPr>
           <w:rFonts w:ascii="Times New Roman" w:hAnsi="Times New Roman"/>
+          <w:b w:val="0"/>
           <w:i/>
           <w:sz w:val="24"/>
         </w:rPr>
@@ -11202,6 +12709,7 @@
       <w:r>
         <w:rPr>
           <w:rFonts w:ascii="Times New Roman" w:hAnsi="Times New Roman"/>
+          <w:b w:val="0"/>
           <w:i/>
           <w:sz w:val="24"/>
         </w:rPr>
@@ -11231,6 +12739,7 @@
       <w:r>
         <w:rPr>
           <w:rFonts w:ascii="Times New Roman" w:hAnsi="Times New Roman"/>
+          <w:b w:val="0"/>
           <w:i/>
           <w:sz w:val="24"/>
         </w:rPr>
@@ -11260,6 +12769,7 @@
       <w:r>
         <w:rPr>
           <w:rFonts w:ascii="Times New Roman" w:hAnsi="Times New Roman"/>
+          <w:b w:val="0"/>
           <w:i/>
           <w:sz w:val="24"/>
         </w:rPr>
@@ -11289,6 +12799,7 @@
       <w:r>
         <w:rPr>
           <w:rFonts w:ascii="Times New Roman" w:hAnsi="Times New Roman"/>
+          <w:b w:val="0"/>
           <w:i/>
           <w:sz w:val="24"/>
         </w:rPr>
@@ -11318,6 +12829,7 @@
       <w:r>
         <w:rPr>
           <w:rFonts w:ascii="Times New Roman" w:hAnsi="Times New Roman"/>
+          <w:b w:val="0"/>
           <w:i/>
           <w:sz w:val="24"/>
         </w:rPr>
@@ -11347,6 +12859,7 @@
       <w:r>
         <w:rPr>
           <w:rFonts w:ascii="Times New Roman" w:hAnsi="Times New Roman"/>
+          <w:b w:val="0"/>
           <w:i/>
           <w:sz w:val="24"/>
         </w:rPr>
@@ -11376,6 +12889,7 @@
       <w:r>
         <w:rPr>
           <w:rFonts w:ascii="Times New Roman" w:hAnsi="Times New Roman"/>
+          <w:b w:val="0"/>
           <w:i/>
           <w:sz w:val="24"/>
         </w:rPr>
@@ -11405,6 +12919,7 @@
       <w:r>
         <w:rPr>
           <w:rFonts w:ascii="Times New Roman" w:hAnsi="Times New Roman"/>
+          <w:b w:val="0"/>
           <w:i/>
           <w:sz w:val="24"/>
         </w:rPr>
@@ -11434,6 +12949,7 @@
       <w:r>
         <w:rPr>
           <w:rFonts w:ascii="Times New Roman" w:hAnsi="Times New Roman"/>
+          <w:b w:val="0"/>
           <w:i/>
           <w:sz w:val="24"/>
         </w:rPr>
@@ -11463,6 +12979,7 @@
       <w:r>
         <w:rPr>
           <w:rFonts w:ascii="Times New Roman" w:hAnsi="Times New Roman"/>
+          <w:b w:val="0"/>
           <w:i/>
           <w:sz w:val="24"/>
         </w:rPr>
@@ -11492,6 +13009,7 @@
       <w:r>
         <w:rPr>
           <w:rFonts w:ascii="Times New Roman" w:hAnsi="Times New Roman"/>
+          <w:b w:val="0"/>
           <w:i/>
           <w:sz w:val="24"/>
         </w:rPr>
@@ -11521,6 +13039,7 @@
       <w:r>
         <w:rPr>
           <w:rFonts w:ascii="Times New Roman" w:hAnsi="Times New Roman"/>
+          <w:b w:val="0"/>
           <w:i/>
           <w:sz w:val="24"/>
         </w:rPr>
@@ -11550,6 +13069,7 @@
       <w:r>
         <w:rPr>
           <w:rFonts w:ascii="Times New Roman" w:hAnsi="Times New Roman"/>
+          <w:b w:val="0"/>
           <w:i/>
           <w:sz w:val="24"/>
         </w:rPr>
@@ -11579,6 +13099,7 @@
       <w:r>
         <w:rPr>
           <w:rFonts w:ascii="Times New Roman" w:hAnsi="Times New Roman"/>
+          <w:b w:val="0"/>
           <w:i/>
           <w:sz w:val="24"/>
         </w:rPr>
@@ -11608,6 +13129,7 @@
       <w:r>
         <w:rPr>
           <w:rFonts w:ascii="Times New Roman" w:hAnsi="Times New Roman"/>
+          <w:b w:val="0"/>
           <w:i/>
           <w:sz w:val="24"/>
         </w:rPr>
@@ -11637,6 +13159,7 @@
       <w:r>
         <w:rPr>
           <w:rFonts w:ascii="Times New Roman" w:hAnsi="Times New Roman"/>
+          <w:b w:val="0"/>
           <w:i/>
           <w:sz w:val="24"/>
         </w:rPr>
@@ -11666,6 +13189,7 @@
       <w:r>
         <w:rPr>
           <w:rFonts w:ascii="Times New Roman" w:hAnsi="Times New Roman"/>
+          <w:b w:val="0"/>
           <w:i/>
           <w:sz w:val="24"/>
         </w:rPr>
@@ -11695,6 +13219,7 @@
       <w:r>
         <w:rPr>
           <w:rFonts w:ascii="Times New Roman" w:hAnsi="Times New Roman"/>
+          <w:b w:val="0"/>
           <w:i/>
           <w:sz w:val="24"/>
         </w:rPr>
@@ -11724,6 +13249,7 @@
       <w:r>
         <w:rPr>
           <w:rFonts w:ascii="Times New Roman" w:hAnsi="Times New Roman"/>
+          <w:b w:val="0"/>
           <w:i/>
           <w:sz w:val="24"/>
         </w:rPr>
@@ -11753,6 +13279,7 @@
       <w:r>
         <w:rPr>
           <w:rFonts w:ascii="Times New Roman" w:hAnsi="Times New Roman"/>
+          <w:b w:val="0"/>
           <w:i/>
           <w:sz w:val="24"/>
         </w:rPr>

</xml_diff>

<commit_message>
fix(docx): perbaiki struktur run tab dan nomor halaman agar kompatibel webview reader
</commit_message>
<xml_diff>
--- a/01_Naskah_Utama/Proposal_Arthur_NoBab3.docx
+++ b/01_Naskah_Utama/Proposal_Arthur_NoBab3.docx
@@ -9,10 +9,6 @@
         <w:jc w:val="center"/>
       </w:pPr>
       <w:r>
-        <w:rPr>
-          <w:color w:val="000000"/>
-          <w:rFonts w:ascii="Times New Roman" w:hAnsi="Times New Roman" w:cs="Times New Roman"/>
-        </w:rPr>
         <w:drawing>
           <wp:inline xmlns:a="http://schemas.openxmlformats.org/drawingml/2006/main" xmlns:pic="http://schemas.openxmlformats.org/drawingml/2006/picture">
             <wp:extent cx="1152000" cy="1152000"/>
@@ -553,10 +549,6 @@
     </w:p>
     <w:p>
       <w:r>
-        <w:rPr>
-          <w:color w:val="000000"/>
-          <w:rFonts w:ascii="Times New Roman" w:hAnsi="Times New Roman" w:cs="Times New Roman"/>
-        </w:rPr>
         <w:br w:type="page"/>
       </w:r>
     </w:p>
@@ -644,10 +636,6 @@
     </w:p>
     <w:p>
       <w:r>
-        <w:rPr>
-          <w:color w:val="000000"/>
-          <w:rFonts w:ascii="Times New Roman" w:hAnsi="Times New Roman" w:cs="Times New Roman"/>
-        </w:rPr>
         <w:br w:type="page"/>
       </w:r>
     </w:p>
@@ -735,10 +723,6 @@
     </w:p>
     <w:p>
       <w:r>
-        <w:rPr>
-          <w:color w:val="000000"/>
-          <w:rFonts w:ascii="Times New Roman" w:hAnsi="Times New Roman" w:cs="Times New Roman"/>
-        </w:rPr>
         <w:br w:type="page"/>
       </w:r>
     </w:p>
@@ -782,18 +766,12 @@
       </w:r>
       <w:r>
         <w:rPr>
-          <w:color w:val="000000"/>
-          <w:rFonts w:ascii="Times New Roman" w:hAnsi="Times New Roman" w:cs="Times New Roman"/>
-        </w:rPr>
-        <w:tab/>
-      </w:r>
-      <w:r>
-        <w:rPr>
           <w:b/>
           <w:sz w:val="22"/>
           <w:color w:val="000000"/>
           <w:rFonts w:ascii="Times New Roman" w:hAnsi="Times New Roman" w:cs="Times New Roman"/>
         </w:rPr>
+        <w:tab/>
         <w:t>viii</w:t>
       </w:r>
     </w:p>
@@ -817,18 +795,12 @@
       </w:r>
       <w:r>
         <w:rPr>
-          <w:color w:val="000000"/>
-          <w:rFonts w:ascii="Times New Roman" w:hAnsi="Times New Roman" w:cs="Times New Roman"/>
-        </w:rPr>
-        <w:tab/>
-      </w:r>
-      <w:r>
-        <w:rPr>
           <w:b/>
           <w:sz w:val="22"/>
           <w:color w:val="000000"/>
           <w:rFonts w:ascii="Times New Roman" w:hAnsi="Times New Roman" w:cs="Times New Roman"/>
         </w:rPr>
+        <w:tab/>
         <w:t>ix</w:t>
       </w:r>
     </w:p>
@@ -852,18 +824,12 @@
       </w:r>
       <w:r>
         <w:rPr>
-          <w:color w:val="000000"/>
-          <w:rFonts w:ascii="Times New Roman" w:hAnsi="Times New Roman" w:cs="Times New Roman"/>
-        </w:rPr>
-        <w:tab/>
-      </w:r>
-      <w:r>
-        <w:rPr>
           <w:b/>
           <w:sz w:val="22"/>
           <w:color w:val="000000"/>
           <w:rFonts w:ascii="Times New Roman" w:hAnsi="Times New Roman" w:cs="Times New Roman"/>
         </w:rPr>
+        <w:tab/>
         <w:t>1</w:t>
       </w:r>
     </w:p>
@@ -887,18 +853,12 @@
       </w:r>
       <w:r>
         <w:rPr>
+          <w:b w:val="0"/>
+          <w:sz w:val="22"/>
           <w:color w:val="000000"/>
           <w:rFonts w:ascii="Times New Roman" w:hAnsi="Times New Roman" w:cs="Times New Roman"/>
         </w:rPr>
         <w:tab/>
-      </w:r>
-      <w:r>
-        <w:rPr>
-          <w:b w:val="0"/>
-          <w:sz w:val="22"/>
-          <w:color w:val="000000"/>
-          <w:rFonts w:ascii="Times New Roman" w:hAnsi="Times New Roman" w:cs="Times New Roman"/>
-        </w:rPr>
         <w:t>1</w:t>
       </w:r>
     </w:p>
@@ -922,18 +882,12 @@
       </w:r>
       <w:r>
         <w:rPr>
+          <w:b w:val="0"/>
+          <w:sz w:val="22"/>
           <w:color w:val="000000"/>
           <w:rFonts w:ascii="Times New Roman" w:hAnsi="Times New Roman" w:cs="Times New Roman"/>
         </w:rPr>
         <w:tab/>
-      </w:r>
-      <w:r>
-        <w:rPr>
-          <w:b w:val="0"/>
-          <w:sz w:val="22"/>
-          <w:color w:val="000000"/>
-          <w:rFonts w:ascii="Times New Roman" w:hAnsi="Times New Roman" w:cs="Times New Roman"/>
-        </w:rPr>
         <w:t>8</w:t>
       </w:r>
     </w:p>
@@ -957,18 +911,12 @@
       </w:r>
       <w:r>
         <w:rPr>
+          <w:b w:val="0"/>
+          <w:sz w:val="22"/>
           <w:color w:val="000000"/>
           <w:rFonts w:ascii="Times New Roman" w:hAnsi="Times New Roman" w:cs="Times New Roman"/>
         </w:rPr>
         <w:tab/>
-      </w:r>
-      <w:r>
-        <w:rPr>
-          <w:b w:val="0"/>
-          <w:sz w:val="22"/>
-          <w:color w:val="000000"/>
-          <w:rFonts w:ascii="Times New Roman" w:hAnsi="Times New Roman" w:cs="Times New Roman"/>
-        </w:rPr>
         <w:t>9</w:t>
       </w:r>
     </w:p>
@@ -992,18 +940,12 @@
       </w:r>
       <w:r>
         <w:rPr>
+          <w:b w:val="0"/>
+          <w:sz w:val="22"/>
           <w:color w:val="000000"/>
           <w:rFonts w:ascii="Times New Roman" w:hAnsi="Times New Roman" w:cs="Times New Roman"/>
         </w:rPr>
         <w:tab/>
-      </w:r>
-      <w:r>
-        <w:rPr>
-          <w:b w:val="0"/>
-          <w:sz w:val="22"/>
-          <w:color w:val="000000"/>
-          <w:rFonts w:ascii="Times New Roman" w:hAnsi="Times New Roman" w:cs="Times New Roman"/>
-        </w:rPr>
         <w:t>9</w:t>
       </w:r>
     </w:p>
@@ -1027,18 +969,12 @@
       </w:r>
       <w:r>
         <w:rPr>
+          <w:b w:val="0"/>
+          <w:sz w:val="21"/>
           <w:color w:val="000000"/>
           <w:rFonts w:ascii="Times New Roman" w:hAnsi="Times New Roman" w:cs="Times New Roman"/>
         </w:rPr>
         <w:tab/>
-      </w:r>
-      <w:r>
-        <w:rPr>
-          <w:b w:val="0"/>
-          <w:sz w:val="21"/>
-          <w:color w:val="000000"/>
-          <w:rFonts w:ascii="Times New Roman" w:hAnsi="Times New Roman" w:cs="Times New Roman"/>
-        </w:rPr>
         <w:t>9</w:t>
       </w:r>
     </w:p>
@@ -1062,18 +998,12 @@
       </w:r>
       <w:r>
         <w:rPr>
+          <w:b w:val="0"/>
+          <w:sz w:val="21"/>
           <w:color w:val="000000"/>
           <w:rFonts w:ascii="Times New Roman" w:hAnsi="Times New Roman" w:cs="Times New Roman"/>
         </w:rPr>
         <w:tab/>
-      </w:r>
-      <w:r>
-        <w:rPr>
-          <w:b w:val="0"/>
-          <w:sz w:val="21"/>
-          <w:color w:val="000000"/>
-          <w:rFonts w:ascii="Times New Roman" w:hAnsi="Times New Roman" w:cs="Times New Roman"/>
-        </w:rPr>
         <w:t>10</w:t>
       </w:r>
     </w:p>
@@ -1097,18 +1027,12 @@
       </w:r>
       <w:r>
         <w:rPr>
-          <w:color w:val="000000"/>
-          <w:rFonts w:ascii="Times New Roman" w:hAnsi="Times New Roman" w:cs="Times New Roman"/>
-        </w:rPr>
-        <w:tab/>
-      </w:r>
-      <w:r>
-        <w:rPr>
           <w:b/>
           <w:sz w:val="22"/>
           <w:color w:val="000000"/>
           <w:rFonts w:ascii="Times New Roman" w:hAnsi="Times New Roman" w:cs="Times New Roman"/>
         </w:rPr>
+        <w:tab/>
         <w:t>11</w:t>
       </w:r>
     </w:p>
@@ -1132,18 +1056,12 @@
       </w:r>
       <w:r>
         <w:rPr>
+          <w:b w:val="0"/>
+          <w:sz w:val="22"/>
           <w:color w:val="000000"/>
           <w:rFonts w:ascii="Times New Roman" w:hAnsi="Times New Roman" w:cs="Times New Roman"/>
         </w:rPr>
         <w:tab/>
-      </w:r>
-      <w:r>
-        <w:rPr>
-          <w:b w:val="0"/>
-          <w:sz w:val="22"/>
-          <w:color w:val="000000"/>
-          <w:rFonts w:ascii="Times New Roman" w:hAnsi="Times New Roman" w:cs="Times New Roman"/>
-        </w:rPr>
         <w:t>11</w:t>
       </w:r>
     </w:p>
@@ -1167,18 +1085,12 @@
       </w:r>
       <w:r>
         <w:rPr>
+          <w:b w:val="0"/>
+          <w:sz w:val="21"/>
           <w:color w:val="000000"/>
           <w:rFonts w:ascii="Times New Roman" w:hAnsi="Times New Roman" w:cs="Times New Roman"/>
         </w:rPr>
         <w:tab/>
-      </w:r>
-      <w:r>
-        <w:rPr>
-          <w:b w:val="0"/>
-          <w:sz w:val="21"/>
-          <w:color w:val="000000"/>
-          <w:rFonts w:ascii="Times New Roman" w:hAnsi="Times New Roman" w:cs="Times New Roman"/>
-        </w:rPr>
         <w:t>11</w:t>
       </w:r>
     </w:p>
@@ -1202,18 +1114,12 @@
       </w:r>
       <w:r>
         <w:rPr>
+          <w:b w:val="0"/>
+          <w:sz w:val="21"/>
           <w:color w:val="000000"/>
           <w:rFonts w:ascii="Times New Roman" w:hAnsi="Times New Roman" w:cs="Times New Roman"/>
         </w:rPr>
         <w:tab/>
-      </w:r>
-      <w:r>
-        <w:rPr>
-          <w:b w:val="0"/>
-          <w:sz w:val="21"/>
-          <w:color w:val="000000"/>
-          <w:rFonts w:ascii="Times New Roman" w:hAnsi="Times New Roman" w:cs="Times New Roman"/>
-        </w:rPr>
         <w:t>11</w:t>
       </w:r>
     </w:p>
@@ -1237,18 +1143,12 @@
       </w:r>
       <w:r>
         <w:rPr>
+          <w:b w:val="0"/>
+          <w:sz w:val="21"/>
           <w:color w:val="000000"/>
           <w:rFonts w:ascii="Times New Roman" w:hAnsi="Times New Roman" w:cs="Times New Roman"/>
         </w:rPr>
         <w:tab/>
-      </w:r>
-      <w:r>
-        <w:rPr>
-          <w:b w:val="0"/>
-          <w:sz w:val="21"/>
-          <w:color w:val="000000"/>
-          <w:rFonts w:ascii="Times New Roman" w:hAnsi="Times New Roman" w:cs="Times New Roman"/>
-        </w:rPr>
         <w:t>12</w:t>
       </w:r>
     </w:p>
@@ -1272,18 +1172,12 @@
       </w:r>
       <w:r>
         <w:rPr>
+          <w:b w:val="0"/>
+          <w:sz w:val="21"/>
           <w:color w:val="000000"/>
           <w:rFonts w:ascii="Times New Roman" w:hAnsi="Times New Roman" w:cs="Times New Roman"/>
         </w:rPr>
         <w:tab/>
-      </w:r>
-      <w:r>
-        <w:rPr>
-          <w:b w:val="0"/>
-          <w:sz w:val="21"/>
-          <w:color w:val="000000"/>
-          <w:rFonts w:ascii="Times New Roman" w:hAnsi="Times New Roman" w:cs="Times New Roman"/>
-        </w:rPr>
         <w:t>12</w:t>
       </w:r>
     </w:p>
@@ -1307,18 +1201,12 @@
       </w:r>
       <w:r>
         <w:rPr>
+          <w:b w:val="0"/>
+          <w:sz w:val="22"/>
           <w:color w:val="000000"/>
           <w:rFonts w:ascii="Times New Roman" w:hAnsi="Times New Roman" w:cs="Times New Roman"/>
         </w:rPr>
         <w:tab/>
-      </w:r>
-      <w:r>
-        <w:rPr>
-          <w:b w:val="0"/>
-          <w:sz w:val="22"/>
-          <w:color w:val="000000"/>
-          <w:rFonts w:ascii="Times New Roman" w:hAnsi="Times New Roman" w:cs="Times New Roman"/>
-        </w:rPr>
         <w:t>12</w:t>
       </w:r>
     </w:p>
@@ -1342,18 +1230,12 @@
       </w:r>
       <w:r>
         <w:rPr>
+          <w:b w:val="0"/>
+          <w:sz w:val="21"/>
           <w:color w:val="000000"/>
           <w:rFonts w:ascii="Times New Roman" w:hAnsi="Times New Roman" w:cs="Times New Roman"/>
         </w:rPr>
         <w:tab/>
-      </w:r>
-      <w:r>
-        <w:rPr>
-          <w:b w:val="0"/>
-          <w:sz w:val="21"/>
-          <w:color w:val="000000"/>
-          <w:rFonts w:ascii="Times New Roman" w:hAnsi="Times New Roman" w:cs="Times New Roman"/>
-        </w:rPr>
         <w:t>12</w:t>
       </w:r>
     </w:p>
@@ -1377,18 +1259,12 @@
       </w:r>
       <w:r>
         <w:rPr>
+          <w:b w:val="0"/>
+          <w:sz w:val="21"/>
           <w:color w:val="000000"/>
           <w:rFonts w:ascii="Times New Roman" w:hAnsi="Times New Roman" w:cs="Times New Roman"/>
         </w:rPr>
         <w:tab/>
-      </w:r>
-      <w:r>
-        <w:rPr>
-          <w:b w:val="0"/>
-          <w:sz w:val="21"/>
-          <w:color w:val="000000"/>
-          <w:rFonts w:ascii="Times New Roman" w:hAnsi="Times New Roman" w:cs="Times New Roman"/>
-        </w:rPr>
         <w:t>13</w:t>
       </w:r>
     </w:p>
@@ -1412,18 +1288,12 @@
       </w:r>
       <w:r>
         <w:rPr>
+          <w:b w:val="0"/>
+          <w:sz w:val="21"/>
           <w:color w:val="000000"/>
           <w:rFonts w:ascii="Times New Roman" w:hAnsi="Times New Roman" w:cs="Times New Roman"/>
         </w:rPr>
         <w:tab/>
-      </w:r>
-      <w:r>
-        <w:rPr>
-          <w:b w:val="0"/>
-          <w:sz w:val="21"/>
-          <w:color w:val="000000"/>
-          <w:rFonts w:ascii="Times New Roman" w:hAnsi="Times New Roman" w:cs="Times New Roman"/>
-        </w:rPr>
         <w:t>13</w:t>
       </w:r>
     </w:p>
@@ -1447,18 +1317,12 @@
       </w:r>
       <w:r>
         <w:rPr>
+          <w:b w:val="0"/>
+          <w:sz w:val="21"/>
           <w:color w:val="000000"/>
           <w:rFonts w:ascii="Times New Roman" w:hAnsi="Times New Roman" w:cs="Times New Roman"/>
         </w:rPr>
         <w:tab/>
-      </w:r>
-      <w:r>
-        <w:rPr>
-          <w:b w:val="0"/>
-          <w:sz w:val="21"/>
-          <w:color w:val="000000"/>
-          <w:rFonts w:ascii="Times New Roman" w:hAnsi="Times New Roman" w:cs="Times New Roman"/>
-        </w:rPr>
         <w:t>13</w:t>
       </w:r>
     </w:p>
@@ -1482,18 +1346,12 @@
       </w:r>
       <w:r>
         <w:rPr>
+          <w:b w:val="0"/>
+          <w:sz w:val="21"/>
           <w:color w:val="000000"/>
           <w:rFonts w:ascii="Times New Roman" w:hAnsi="Times New Roman" w:cs="Times New Roman"/>
         </w:rPr>
         <w:tab/>
-      </w:r>
-      <w:r>
-        <w:rPr>
-          <w:b w:val="0"/>
-          <w:sz w:val="21"/>
-          <w:color w:val="000000"/>
-          <w:rFonts w:ascii="Times New Roman" w:hAnsi="Times New Roman" w:cs="Times New Roman"/>
-        </w:rPr>
         <w:t>14</w:t>
       </w:r>
     </w:p>
@@ -1517,18 +1375,12 @@
       </w:r>
       <w:r>
         <w:rPr>
+          <w:b w:val="0"/>
+          <w:sz w:val="22"/>
           <w:color w:val="000000"/>
           <w:rFonts w:ascii="Times New Roman" w:hAnsi="Times New Roman" w:cs="Times New Roman"/>
         </w:rPr>
         <w:tab/>
-      </w:r>
-      <w:r>
-        <w:rPr>
-          <w:b w:val="0"/>
-          <w:sz w:val="22"/>
-          <w:color w:val="000000"/>
-          <w:rFonts w:ascii="Times New Roman" w:hAnsi="Times New Roman" w:cs="Times New Roman"/>
-        </w:rPr>
         <w:t>14</w:t>
       </w:r>
     </w:p>
@@ -1552,18 +1404,12 @@
       </w:r>
       <w:r>
         <w:rPr>
+          <w:b w:val="0"/>
+          <w:sz w:val="22"/>
           <w:color w:val="000000"/>
           <w:rFonts w:ascii="Times New Roman" w:hAnsi="Times New Roman" w:cs="Times New Roman"/>
         </w:rPr>
         <w:tab/>
-      </w:r>
-      <w:r>
-        <w:rPr>
-          <w:b w:val="0"/>
-          <w:sz w:val="22"/>
-          <w:color w:val="000000"/>
-          <w:rFonts w:ascii="Times New Roman" w:hAnsi="Times New Roman" w:cs="Times New Roman"/>
-        </w:rPr>
         <w:t>17</w:t>
       </w:r>
     </w:p>
@@ -1587,18 +1433,12 @@
       </w:r>
       <w:r>
         <w:rPr>
+          <w:b w:val="0"/>
+          <w:sz w:val="21"/>
           <w:color w:val="000000"/>
           <w:rFonts w:ascii="Times New Roman" w:hAnsi="Times New Roman" w:cs="Times New Roman"/>
         </w:rPr>
         <w:tab/>
-      </w:r>
-      <w:r>
-        <w:rPr>
-          <w:b w:val="0"/>
-          <w:sz w:val="21"/>
-          <w:color w:val="000000"/>
-          <w:rFonts w:ascii="Times New Roman" w:hAnsi="Times New Roman" w:cs="Times New Roman"/>
-        </w:rPr>
         <w:t>17</w:t>
       </w:r>
     </w:p>
@@ -1622,18 +1462,12 @@
       </w:r>
       <w:r>
         <w:rPr>
+          <w:b w:val="0"/>
+          <w:sz w:val="21"/>
           <w:color w:val="000000"/>
           <w:rFonts w:ascii="Times New Roman" w:hAnsi="Times New Roman" w:cs="Times New Roman"/>
         </w:rPr>
         <w:tab/>
-      </w:r>
-      <w:r>
-        <w:rPr>
-          <w:b w:val="0"/>
-          <w:sz w:val="21"/>
-          <w:color w:val="000000"/>
-          <w:rFonts w:ascii="Times New Roman" w:hAnsi="Times New Roman" w:cs="Times New Roman"/>
-        </w:rPr>
         <w:t>17</w:t>
       </w:r>
     </w:p>
@@ -1657,18 +1491,12 @@
       </w:r>
       <w:r>
         <w:rPr>
+          <w:b w:val="0"/>
+          <w:sz w:val="21"/>
           <w:color w:val="000000"/>
           <w:rFonts w:ascii="Times New Roman" w:hAnsi="Times New Roman" w:cs="Times New Roman"/>
         </w:rPr>
         <w:tab/>
-      </w:r>
-      <w:r>
-        <w:rPr>
-          <w:b w:val="0"/>
-          <w:sz w:val="21"/>
-          <w:color w:val="000000"/>
-          <w:rFonts w:ascii="Times New Roman" w:hAnsi="Times New Roman" w:cs="Times New Roman"/>
-        </w:rPr>
         <w:t>18</w:t>
       </w:r>
     </w:p>
@@ -1692,18 +1520,12 @@
       </w:r>
       <w:r>
         <w:rPr>
+          <w:b w:val="0"/>
+          <w:sz w:val="21"/>
           <w:color w:val="000000"/>
           <w:rFonts w:ascii="Times New Roman" w:hAnsi="Times New Roman" w:cs="Times New Roman"/>
         </w:rPr>
         <w:tab/>
-      </w:r>
-      <w:r>
-        <w:rPr>
-          <w:b w:val="0"/>
-          <w:sz w:val="21"/>
-          <w:color w:val="000000"/>
-          <w:rFonts w:ascii="Times New Roman" w:hAnsi="Times New Roman" w:cs="Times New Roman"/>
-        </w:rPr>
         <w:t>18</w:t>
       </w:r>
     </w:p>
@@ -1727,18 +1549,12 @@
       </w:r>
       <w:r>
         <w:rPr>
+          <w:b w:val="0"/>
+          <w:sz w:val="21"/>
           <w:color w:val="000000"/>
           <w:rFonts w:ascii="Times New Roman" w:hAnsi="Times New Roman" w:cs="Times New Roman"/>
         </w:rPr>
         <w:tab/>
-      </w:r>
-      <w:r>
-        <w:rPr>
-          <w:b w:val="0"/>
-          <w:sz w:val="21"/>
-          <w:color w:val="000000"/>
-          <w:rFonts w:ascii="Times New Roman" w:hAnsi="Times New Roman" w:cs="Times New Roman"/>
-        </w:rPr>
         <w:t>19</w:t>
       </w:r>
     </w:p>
@@ -1762,18 +1578,12 @@
       </w:r>
       <w:r>
         <w:rPr>
+          <w:b w:val="0"/>
+          <w:sz w:val="21"/>
           <w:color w:val="000000"/>
           <w:rFonts w:ascii="Times New Roman" w:hAnsi="Times New Roman" w:cs="Times New Roman"/>
         </w:rPr>
         <w:tab/>
-      </w:r>
-      <w:r>
-        <w:rPr>
-          <w:b w:val="0"/>
-          <w:sz w:val="21"/>
-          <w:color w:val="000000"/>
-          <w:rFonts w:ascii="Times New Roman" w:hAnsi="Times New Roman" w:cs="Times New Roman"/>
-        </w:rPr>
         <w:t>19</w:t>
       </w:r>
     </w:p>
@@ -1797,18 +1607,12 @@
       </w:r>
       <w:r>
         <w:rPr>
+          <w:b w:val="0"/>
+          <w:sz w:val="22"/>
           <w:color w:val="000000"/>
           <w:rFonts w:ascii="Times New Roman" w:hAnsi="Times New Roman" w:cs="Times New Roman"/>
         </w:rPr>
         <w:tab/>
-      </w:r>
-      <w:r>
-        <w:rPr>
-          <w:b w:val="0"/>
-          <w:sz w:val="22"/>
-          <w:color w:val="000000"/>
-          <w:rFonts w:ascii="Times New Roman" w:hAnsi="Times New Roman" w:cs="Times New Roman"/>
-        </w:rPr>
         <w:t>20</w:t>
       </w:r>
     </w:p>
@@ -1832,27 +1636,17 @@
       </w:r>
       <w:r>
         <w:rPr>
-          <w:color w:val="000000"/>
-          <w:rFonts w:ascii="Times New Roman" w:hAnsi="Times New Roman" w:cs="Times New Roman"/>
-        </w:rPr>
-        <w:tab/>
-      </w:r>
-      <w:r>
-        <w:rPr>
           <w:b/>
           <w:sz w:val="22"/>
           <w:color w:val="000000"/>
           <w:rFonts w:ascii="Times New Roman" w:hAnsi="Times New Roman" w:cs="Times New Roman"/>
         </w:rPr>
+        <w:tab/>
         <w:t>21</w:t>
       </w:r>
     </w:p>
     <w:p>
       <w:r>
-        <w:rPr>
-          <w:color w:val="000000"/>
-          <w:rFonts w:ascii="Times New Roman" w:hAnsi="Times New Roman" w:cs="Times New Roman"/>
-        </w:rPr>
         <w:br w:type="page"/>
       </w:r>
     </w:p>
@@ -1905,27 +1699,17 @@
       </w:r>
       <w:r>
         <w:rPr>
+          <w:b w:val="0"/>
+          <w:sz w:val="22"/>
           <w:color w:val="000000"/>
           <w:rFonts w:ascii="Times New Roman" w:hAnsi="Times New Roman" w:cs="Times New Roman"/>
         </w:rPr>
         <w:tab/>
-      </w:r>
-      <w:r>
-        <w:rPr>
-          <w:b w:val="0"/>
-          <w:sz w:val="22"/>
-          <w:color w:val="000000"/>
-          <w:rFonts w:ascii="Times New Roman" w:hAnsi="Times New Roman" w:cs="Times New Roman"/>
-        </w:rPr>
         <w:t>14</w:t>
       </w:r>
     </w:p>
     <w:p>
       <w:r>
-        <w:rPr>
-          <w:color w:val="000000"/>
-          <w:rFonts w:ascii="Times New Roman" w:hAnsi="Times New Roman" w:cs="Times New Roman"/>
-        </w:rPr>
         <w:br w:type="page"/>
       </w:r>
     </w:p>
@@ -1978,18 +1762,12 @@
       </w:r>
       <w:r>
         <w:rPr>
+          <w:b w:val="0"/>
+          <w:sz w:val="22"/>
           <w:color w:val="000000"/>
           <w:rFonts w:ascii="Times New Roman" w:hAnsi="Times New Roman" w:cs="Times New Roman"/>
         </w:rPr>
         <w:tab/>
-      </w:r>
-      <w:r>
-        <w:rPr>
-          <w:b w:val="0"/>
-          <w:sz w:val="22"/>
-          <w:color w:val="000000"/>
-          <w:rFonts w:ascii="Times New Roman" w:hAnsi="Times New Roman" w:cs="Times New Roman"/>
-        </w:rPr>
         <w:t>2</w:t>
       </w:r>
     </w:p>
@@ -2022,18 +1800,12 @@
       </w:r>
       <w:r>
         <w:rPr>
+          <w:b w:val="0"/>
+          <w:sz w:val="22"/>
           <w:color w:val="000000"/>
           <w:rFonts w:ascii="Times New Roman" w:hAnsi="Times New Roman" w:cs="Times New Roman"/>
         </w:rPr>
         <w:tab/>
-      </w:r>
-      <w:r>
-        <w:rPr>
-          <w:b w:val="0"/>
-          <w:sz w:val="22"/>
-          <w:color w:val="000000"/>
-          <w:rFonts w:ascii="Times New Roman" w:hAnsi="Times New Roman" w:cs="Times New Roman"/>
-        </w:rPr>
         <w:t>3</w:t>
       </w:r>
     </w:p>
@@ -2066,18 +1838,12 @@
       </w:r>
       <w:r>
         <w:rPr>
+          <w:b w:val="0"/>
+          <w:sz w:val="22"/>
           <w:color w:val="000000"/>
           <w:rFonts w:ascii="Times New Roman" w:hAnsi="Times New Roman" w:cs="Times New Roman"/>
         </w:rPr>
         <w:tab/>
-      </w:r>
-      <w:r>
-        <w:rPr>
-          <w:b w:val="0"/>
-          <w:sz w:val="22"/>
-          <w:color w:val="000000"/>
-          <w:rFonts w:ascii="Times New Roman" w:hAnsi="Times New Roman" w:cs="Times New Roman"/>
-        </w:rPr>
         <w:t>4</w:t>
       </w:r>
     </w:p>
@@ -2110,18 +1876,12 @@
       </w:r>
       <w:r>
         <w:rPr>
+          <w:b w:val="0"/>
+          <w:sz w:val="22"/>
           <w:color w:val="000000"/>
           <w:rFonts w:ascii="Times New Roman" w:hAnsi="Times New Roman" w:cs="Times New Roman"/>
         </w:rPr>
         <w:tab/>
-      </w:r>
-      <w:r>
-        <w:rPr>
-          <w:b w:val="0"/>
-          <w:sz w:val="22"/>
-          <w:color w:val="000000"/>
-          <w:rFonts w:ascii="Times New Roman" w:hAnsi="Times New Roman" w:cs="Times New Roman"/>
-        </w:rPr>
         <w:t>20</w:t>
       </w:r>
     </w:p>
@@ -2708,10 +2468,6 @@
         <w:jc w:val="center"/>
       </w:pPr>
       <w:r>
-        <w:rPr>
-          <w:color w:val="000000"/>
-          <w:rFonts w:ascii="Times New Roman" w:hAnsi="Times New Roman" w:cs="Times New Roman"/>
-        </w:rPr>
         <w:drawing>
           <wp:inline xmlns:a="http://schemas.openxmlformats.org/drawingml/2006/main" xmlns:pic="http://schemas.openxmlformats.org/drawingml/2006/picture">
             <wp:extent cx="4860000" cy="2711753"/>
@@ -2861,10 +2617,6 @@
         <w:jc w:val="center"/>
       </w:pPr>
       <w:r>
-        <w:rPr>
-          <w:color w:val="000000"/>
-          <w:rFonts w:ascii="Times New Roman" w:hAnsi="Times New Roman" w:cs="Times New Roman"/>
-        </w:rPr>
         <w:drawing>
           <wp:inline xmlns:a="http://schemas.openxmlformats.org/drawingml/2006/main" xmlns:pic="http://schemas.openxmlformats.org/drawingml/2006/picture">
             <wp:extent cx="4860000" cy="2719286"/>
@@ -2954,10 +2706,6 @@
         <w:jc w:val="center"/>
       </w:pPr>
       <w:r>
-        <w:rPr>
-          <w:color w:val="000000"/>
-          <w:rFonts w:ascii="Times New Roman" w:hAnsi="Times New Roman" w:cs="Times New Roman"/>
-        </w:rPr>
         <w:drawing>
           <wp:inline xmlns:a="http://schemas.openxmlformats.org/drawingml/2006/main" xmlns:pic="http://schemas.openxmlformats.org/drawingml/2006/picture">
             <wp:extent cx="4500000" cy="2740541"/>
@@ -6831,10 +6579,6 @@
     </w:p>
     <w:p>
       <w:r>
-        <w:rPr>
-          <w:color w:val="000000"/>
-          <w:rFonts w:ascii="Times New Roman" w:hAnsi="Times New Roman" w:cs="Times New Roman"/>
-        </w:rPr>
         <w:br w:type="page"/>
       </w:r>
     </w:p>
@@ -12547,10 +12291,6 @@
         <w:jc w:val="center"/>
       </w:pPr>
       <w:r>
-        <w:rPr>
-          <w:color w:val="000000"/>
-          <w:rFonts w:ascii="Times New Roman" w:hAnsi="Times New Roman" w:cs="Times New Roman"/>
-        </w:rPr>
         <w:drawing>
           <wp:inline xmlns:a="http://schemas.openxmlformats.org/drawingml/2006/main" xmlns:pic="http://schemas.openxmlformats.org/drawingml/2006/picture">
             <wp:extent cx="5040000" cy="2753704"/>
@@ -12618,10 +12358,6 @@
     </w:p>
     <w:p>
       <w:r>
-        <w:rPr>
-          <w:color w:val="000000"/>
-          <w:rFonts w:ascii="Times New Roman" w:hAnsi="Times New Roman" w:cs="Times New Roman"/>
-        </w:rPr>
         <w:br w:type="page"/>
       </w:r>
     </w:p>

</xml_diff>

<commit_message>
refactor(codebase): purge obsolete archives, duplicate notes, and temporary debris (-150.66 MB)
- Delete _archive/ (obsolete banking thesis and debt topic, ~144.7 MB)
- Delete scratch debris, Word lock files, and intermediate LaTeX files
- Delete duplicate quickstart note in .obsidian/ and superseded bimbingan log
- Consolidate AI instructions to canonical AGENTS.md
- Remove empty .gitkeep files in populated directories
- Add UKRIDA 2023 guideline verification directives and compliance checker
- Update second brain session log with full cleanup audit
</commit_message>
<xml_diff>
--- a/01_Naskah_Utama/Proposal_Arthur_NoBab3.docx
+++ b/01_Naskah_Utama/Proposal_Arthur_NoBab3.docx
@@ -12,7 +12,7 @@
           <w:noProof/>
         </w:rPr>
         <w:drawing>
-          <wp:inline distT="0" distB="0" distL="0" distR="0" wp14:anchorId="392AF0DA" wp14:editId="3F66BA5B">
+          <wp:inline distT="0" distB="0" distL="0" distR="0" wp14:anchorId="3457FC38" wp14:editId="2E73B6ED">
             <wp:extent cx="1152000" cy="1152000"/>
             <wp:effectExtent l="0" t="0" r="0" b="0"/>
             <wp:docPr id="1" name="Picture 1"/>
@@ -274,7 +274,7 @@
         <w:spacing w:after="360"/>
         <w:outlineLvl w:val="0"/>
       </w:pPr>
-      <w:bookmarkStart w:id="0" w:name="_Toc240309591"/>
+      <w:bookmarkStart w:id="0" w:name="_Toc240359925"/>
       <w:r>
         <w:rPr>
           <w:rFonts w:ascii="Times New Roman" w:hAnsi="Times New Roman"/>
@@ -567,7 +567,7 @@
         <w:spacing w:after="360"/>
         <w:outlineLvl w:val="0"/>
       </w:pPr>
-      <w:bookmarkStart w:id="1" w:name="_Toc240309592"/>
+      <w:bookmarkStart w:id="1" w:name="_Toc240359926"/>
       <w:r>
         <w:rPr>
           <w:rFonts w:ascii="Times New Roman" w:hAnsi="Times New Roman"/>
@@ -646,19 +646,19 @@
         <w:rPr>
           <w:rFonts w:cs="Times New Roman"/>
         </w:rPr>
-        <w:t>ngacu pada rekomendasi ukuran sampel Green (1991) dan Cohen (1988) untuk mencapai kekuatan uji statistik (statistical power) yang memadai pada model regresi linear berganda. Metode analisis data menggunakan analisis regresi berganda dan Moderated Regression Analysis (MRA) dengan prosedur pemusatan rata-rata (mean-centering) guna mereduksi potensi multikolinearitas non-esensial antara variabel prediktor dengan produk interaksinya (Aiken &amp; West, 1991; Ghozali, 2018), yang diolah menggunakan perangkat lunak IB</w:t>
-      </w:r>
-      <w:r>
-        <w:rPr>
-          <w:rFonts w:cs="Times New Roman"/>
-        </w:rPr>
-        <w:t>M SPSS Statistics. Penelitian ini menawarkan kebaruan teoritis (novelty) dengan mengintegrasikan kerangka psikologi lingkungan Stimulus-Organism-Response (S-O-R), psikologi kolektor (Zeigarnik Effect dan The Completing the Set Effect), teori regulasi diri (Self-Regulation Theory), serta prinsip-prinsip keuangan perilaku (behavioral finance) pada fenomena komoditas hobi fisik bernilai spekulatif tinggi. Hasil penelitian ini diharapkan memberikan kontribusi empiris bagi konsumen muda dalam menjaga kontrol dir</w:t>
-      </w:r>
-      <w:r>
-        <w:rPr>
-          <w:rFonts w:cs="Times New Roman"/>
-        </w:rPr>
-        <w:t>i finansial, serta masukan aplikatif bagi komunitas hobi dan pemangku kebijakan edukasi keuangan generasi muda di Indonesia.</w:t>
+        <w:t xml:space="preserve">ngacu pada rekomendasi ukuran sampel Green (1991) dan Cohen (1988) untuk mencapai kekuatan uji statistik (statistical power) yang memadai pada model regresi linear berganda. Metode analisis data menggunakan analisis regresi berganda dan Moderated Regression Analysis (MRA) dengan prosedur pemusatan rata-rata (mean-centering) guna mereduksi potensi multikolinearitas non-esensial antara variabel prediktor dengan produk interaksinya (Aiken dan West, 1991; Ghozali, 2018), yang diolah menggunakan perangkat lunak </w:t>
+      </w:r>
+      <w:r>
+        <w:rPr>
+          <w:rFonts w:cs="Times New Roman"/>
+        </w:rPr>
+        <w:t>IBM SPSS Statistics. Penelitian ini menawarkan kebaruan teoritis (novelty) dengan mengintegrasikan kerangka psikologi lingkungan Stimulus-Organism-Response (S-O-R), psikologi kolektor (Zeigarnik Effect dan The Completing the Set Effect), teori regulasi diri (Self-Regulation Theory), serta prinsip-prinsip keuangan perilaku (behavioral finance) pada fenomena komoditas hobi fisik bernilai spekulatif tinggi. Hasil penelitian ini diharapkan memberikan kontribusi empiris bagi konsumen muda dalam menjaga kontrol d</w:t>
+      </w:r>
+      <w:r>
+        <w:rPr>
+          <w:rFonts w:cs="Times New Roman"/>
+        </w:rPr>
+        <w:t>iri finansial, serta masukan aplikatif bagi komunitas hobi dan pemangku kebijakan edukasi keuangan generasi muda di Indonesia.</w:t>
       </w:r>
     </w:p>
     <w:p>
@@ -691,7 +691,7 @@
         <w:spacing w:after="360"/>
         <w:outlineLvl w:val="0"/>
       </w:pPr>
-      <w:bookmarkStart w:id="2" w:name="_Toc240309593"/>
+      <w:bookmarkStart w:id="2" w:name="_Toc240359927"/>
       <w:r>
         <w:rPr>
           <w:rFonts w:ascii="Times New Roman" w:hAnsi="Times New Roman"/>
@@ -779,14 +779,14 @@
           <w:rFonts w:cs="Times New Roman"/>
           <w:i/>
         </w:rPr>
-        <w:t>works. The empirical model is estimated using multiple linear regression and Moderated Regression Analysis (MRA) with mean-centering procedures to reduce non-essential multicollinearity between predictor variables and their interaction products (Aiken &amp; West, 1991; Ghozali, 2018), executed via IBM SPSS Statistics software. This study provides theoretical novelty by synthesizing the Stimulus-Organism-Response (S-O-R) paradigm, collector psychology (the Zeigarnik Effect and The Completing the Set Effect), Sel</w:t>
-      </w:r>
-      <w:r>
-        <w:rPr>
-          <w:rFonts w:cs="Times New Roman"/>
-          <w:i/>
-        </w:rPr>
-        <w:t>f-Regulation Theory, and behavioral finance principles in the context of tangible alternative assets exhibiting volatile secondary market premiums. The findings are expected to offer practical insights for young consumers in exercising financial discipline regarding discretionary collectibles and provide strategic inputs for community organizers and financial educators targeting Generation Z.</w:t>
+        <w:t>works. The empirical model is estimated using multiple linear regression and Moderated Regression Analysis (MRA) with mean-centering procedures to reduce non-essential multicollinearity between predictor variables and their interaction products (Aiken dan West, 1991; Ghozali, 2018), executed via IBM SPSS Statistics software. This study provides theoretical novelty by synthesizing the Stimulus-Organism-Response (S-O-R) paradigm, collector psychology (the Zeigarnik Effect and The Completing the Set Effect), S</w:t>
+      </w:r>
+      <w:r>
+        <w:rPr>
+          <w:rFonts w:cs="Times New Roman"/>
+          <w:i/>
+        </w:rPr>
+        <w:t>elf-Regulation Theory, and behavioral finance principles in the context of tangible alternative assets exhibiting volatile secondary market premiums. The findings are expected to offer practical insights for young consumers in exercising financial discipline regarding discretionary collectibles and provide strategic inputs for community organizers and financial educators targeting Generation Z.</w:t>
       </w:r>
     </w:p>
     <w:p>
@@ -854,7 +854,7 @@
       <w:r>
         <w:fldChar w:fldCharType="separate"/>
       </w:r>
-      <w:hyperlink w:anchor="_Toc240309591" w:history="1">
+      <w:hyperlink w:anchor="_Toc240359925" w:history="1">
         <w:r>
           <w:rPr>
             <w:rStyle w:val="Hyperlink"/>
@@ -881,7 +881,7 @@
             <w:noProof/>
             <w:webHidden/>
           </w:rPr>
-          <w:instrText xml:space="preserve"> PAGEREF _Toc240309591 \h </w:instrText>
+          <w:instrText xml:space="preserve"> PAGEREF _Toc240359925 \h </w:instrText>
         </w:r>
         <w:r>
           <w:rPr>
@@ -929,7 +929,7 @@
           <w14:ligatures w14:val="standardContextual"/>
         </w:rPr>
       </w:pPr>
-      <w:hyperlink w:anchor="_Toc240309592" w:history="1">
+      <w:hyperlink w:anchor="_Toc240359926" w:history="1">
         <w:r>
           <w:rPr>
             <w:rStyle w:val="Hyperlink"/>
@@ -956,7 +956,7 @@
             <w:noProof/>
             <w:webHidden/>
           </w:rPr>
-          <w:instrText xml:space="preserve"> PAGEREF _Toc240309592 \h </w:instrText>
+          <w:instrText xml:space="preserve"> PAGEREF _Toc240359926 \h </w:instrText>
         </w:r>
         <w:r>
           <w:rPr>
@@ -1004,7 +1004,7 @@
           <w14:ligatures w14:val="standardContextual"/>
         </w:rPr>
       </w:pPr>
-      <w:hyperlink w:anchor="_Toc240309593" w:history="1">
+      <w:hyperlink w:anchor="_Toc240359927" w:history="1">
         <w:r>
           <w:rPr>
             <w:rStyle w:val="Hyperlink"/>
@@ -1031,7 +1031,7 @@
             <w:noProof/>
             <w:webHidden/>
           </w:rPr>
-          <w:instrText xml:space="preserve"> PAGEREF _Toc240309593 \h </w:instrText>
+          <w:instrText xml:space="preserve"> PAGEREF _Toc240359927 \h </w:instrText>
         </w:r>
         <w:r>
           <w:rPr>
@@ -1079,7 +1079,7 @@
           <w14:ligatures w14:val="standardContextual"/>
         </w:rPr>
       </w:pPr>
-      <w:hyperlink w:anchor="_Toc240309594" w:history="1">
+      <w:hyperlink w:anchor="_Toc240359928" w:history="1">
         <w:r>
           <w:rPr>
             <w:rStyle w:val="Hyperlink"/>
@@ -1106,7 +1106,7 @@
             <w:noProof/>
             <w:webHidden/>
           </w:rPr>
-          <w:instrText xml:space="preserve"> PAGEREF _Toc240309594 \h </w:instrText>
+          <w:instrText xml:space="preserve"> PAGEREF _Toc240359928 \h </w:instrText>
         </w:r>
         <w:r>
           <w:rPr>
@@ -1154,7 +1154,7 @@
           <w14:ligatures w14:val="standardContextual"/>
         </w:rPr>
       </w:pPr>
-      <w:hyperlink w:anchor="_Toc240309595" w:history="1">
+      <w:hyperlink w:anchor="_Toc240359929" w:history="1">
         <w:r>
           <w:rPr>
             <w:rStyle w:val="Hyperlink"/>
@@ -1181,7 +1181,7 @@
             <w:noProof/>
             <w:webHidden/>
           </w:rPr>
-          <w:instrText xml:space="preserve"> PAGEREF _Toc240309595 \h </w:instrText>
+          <w:instrText xml:space="preserve"> PAGEREF _Toc240359929 \h </w:instrText>
         </w:r>
         <w:r>
           <w:rPr>
@@ -1229,7 +1229,7 @@
           <w14:ligatures w14:val="standardContextual"/>
         </w:rPr>
       </w:pPr>
-      <w:hyperlink w:anchor="_Toc240309596" w:history="1">
+      <w:hyperlink w:anchor="_Toc240359930" w:history="1">
         <w:r>
           <w:rPr>
             <w:rStyle w:val="Hyperlink"/>
@@ -1256,7 +1256,7 @@
             <w:noProof/>
             <w:webHidden/>
           </w:rPr>
-          <w:instrText xml:space="preserve"> PAGEREF _Toc240309596 \h </w:instrText>
+          <w:instrText xml:space="preserve"> PAGEREF _Toc240359930 \h </w:instrText>
         </w:r>
         <w:r>
           <w:rPr>
@@ -1303,7 +1303,7 @@
           <w14:ligatures w14:val="standardContextual"/>
         </w:rPr>
       </w:pPr>
-      <w:hyperlink w:anchor="_Toc240309597" w:history="1">
+      <w:hyperlink w:anchor="_Toc240359931" w:history="1">
         <w:r>
           <w:rPr>
             <w:rStyle w:val="Hyperlink"/>
@@ -1330,7 +1330,7 @@
             <w:noProof/>
             <w:webHidden/>
           </w:rPr>
-          <w:instrText xml:space="preserve"> PAGEREF _Toc240309597 \h </w:instrText>
+          <w:instrText xml:space="preserve"> PAGEREF _Toc240359931 \h </w:instrText>
         </w:r>
         <w:r>
           <w:rPr>
@@ -1377,7 +1377,7 @@
           <w14:ligatures w14:val="standardContextual"/>
         </w:rPr>
       </w:pPr>
-      <w:hyperlink w:anchor="_Toc240309598" w:history="1">
+      <w:hyperlink w:anchor="_Toc240359932" w:history="1">
         <w:r>
           <w:rPr>
             <w:rStyle w:val="Hyperlink"/>
@@ -1404,7 +1404,7 @@
             <w:noProof/>
             <w:webHidden/>
           </w:rPr>
-          <w:instrText xml:space="preserve"> PAGEREF _Toc240309598 \h </w:instrText>
+          <w:instrText xml:space="preserve"> PAGEREF _Toc240359932 \h </w:instrText>
         </w:r>
         <w:r>
           <w:rPr>
@@ -1451,7 +1451,7 @@
           <w14:ligatures w14:val="standardContextual"/>
         </w:rPr>
       </w:pPr>
-      <w:hyperlink w:anchor="_Toc240309599" w:history="1">
+      <w:hyperlink w:anchor="_Toc240359933" w:history="1">
         <w:r>
           <w:rPr>
             <w:rStyle w:val="Hyperlink"/>
@@ -1478,7 +1478,7 @@
             <w:noProof/>
             <w:webHidden/>
           </w:rPr>
-          <w:instrText xml:space="preserve"> PAGEREF _Toc240309599 \h </w:instrText>
+          <w:instrText xml:space="preserve"> PAGEREF _Toc240359933 \h </w:instrText>
         </w:r>
         <w:r>
           <w:rPr>
@@ -1525,7 +1525,7 @@
           <w14:ligatures w14:val="standardContextual"/>
         </w:rPr>
       </w:pPr>
-      <w:hyperlink w:anchor="_Toc240309600" w:history="1">
+      <w:hyperlink w:anchor="_Toc240359934" w:history="1">
         <w:r>
           <w:rPr>
             <w:rStyle w:val="Hyperlink"/>
@@ -1552,7 +1552,7 @@
             <w:noProof/>
             <w:webHidden/>
           </w:rPr>
-          <w:instrText xml:space="preserve"> PAGEREF _Toc240309600 \h </w:instrText>
+          <w:instrText xml:space="preserve"> PAGEREF _Toc240359934 \h </w:instrText>
         </w:r>
         <w:r>
           <w:rPr>
@@ -1600,7 +1600,7 @@
           <w14:ligatures w14:val="standardContextual"/>
         </w:rPr>
       </w:pPr>
-      <w:hyperlink w:anchor="_Toc240309601" w:history="1">
+      <w:hyperlink w:anchor="_Toc240359935" w:history="1">
         <w:r>
           <w:rPr>
             <w:rStyle w:val="Hyperlink"/>
@@ -1627,7 +1627,7 @@
             <w:noProof/>
             <w:webHidden/>
           </w:rPr>
-          <w:instrText xml:space="preserve"> PAGEREF _Toc240309601 \h </w:instrText>
+          <w:instrText xml:space="preserve"> PAGEREF _Toc240359935 \h </w:instrText>
         </w:r>
         <w:r>
           <w:rPr>
@@ -1675,7 +1675,7 @@
           <w14:ligatures w14:val="standardContextual"/>
         </w:rPr>
       </w:pPr>
-      <w:hyperlink w:anchor="_Toc240309602" w:history="1">
+      <w:hyperlink w:anchor="_Toc240359936" w:history="1">
         <w:r>
           <w:rPr>
             <w:rStyle w:val="Hyperlink"/>
@@ -1702,7 +1702,7 @@
             <w:noProof/>
             <w:webHidden/>
           </w:rPr>
-          <w:instrText xml:space="preserve"> PAGEREF _Toc240309602 \h </w:instrText>
+          <w:instrText xml:space="preserve"> PAGEREF _Toc240359936 \h </w:instrText>
         </w:r>
         <w:r>
           <w:rPr>
@@ -1750,7 +1750,7 @@
           <w14:ligatures w14:val="standardContextual"/>
         </w:rPr>
       </w:pPr>
-      <w:hyperlink w:anchor="_Toc240309603" w:history="1">
+      <w:hyperlink w:anchor="_Toc240359937" w:history="1">
         <w:r>
           <w:rPr>
             <w:rStyle w:val="Hyperlink"/>
@@ -1777,7 +1777,7 @@
             <w:noProof/>
             <w:webHidden/>
           </w:rPr>
-          <w:instrText xml:space="preserve"> PAGEREF _Toc240309603 \h </w:instrText>
+          <w:instrText xml:space="preserve"> PAGEREF _Toc240359937 \h </w:instrText>
         </w:r>
         <w:r>
           <w:rPr>
@@ -1824,7 +1824,7 @@
           <w14:ligatures w14:val="standardContextual"/>
         </w:rPr>
       </w:pPr>
-      <w:hyperlink w:anchor="_Toc240309604" w:history="1">
+      <w:hyperlink w:anchor="_Toc240359938" w:history="1">
         <w:r>
           <w:rPr>
             <w:rStyle w:val="Hyperlink"/>
@@ -1851,7 +1851,7 @@
             <w:noProof/>
             <w:webHidden/>
           </w:rPr>
-          <w:instrText xml:space="preserve"> PAGEREF _Toc240309604 \h </w:instrText>
+          <w:instrText xml:space="preserve"> PAGEREF _Toc240359938 \h </w:instrText>
         </w:r>
         <w:r>
           <w:rPr>
@@ -1899,7 +1899,7 @@
           <w14:ligatures w14:val="standardContextual"/>
         </w:rPr>
       </w:pPr>
-      <w:hyperlink w:anchor="_Toc240309605" w:history="1">
+      <w:hyperlink w:anchor="_Toc240359939" w:history="1">
         <w:r>
           <w:rPr>
             <w:rStyle w:val="Hyperlink"/>
@@ -1941,7 +1941,7 @@
             <w:noProof/>
             <w:webHidden/>
           </w:rPr>
-          <w:instrText xml:space="preserve"> PAGEREF _Toc240309605 \h </w:instrText>
+          <w:instrText xml:space="preserve"> PAGEREF _Toc240359939 \h </w:instrText>
         </w:r>
         <w:r>
           <w:rPr>
@@ -1989,7 +1989,7 @@
           <w14:ligatures w14:val="standardContextual"/>
         </w:rPr>
       </w:pPr>
-      <w:hyperlink w:anchor="_Toc240309606" w:history="1">
+      <w:hyperlink w:anchor="_Toc240359940" w:history="1">
         <w:r>
           <w:rPr>
             <w:rStyle w:val="Hyperlink"/>
@@ -2031,7 +2031,7 @@
             <w:noProof/>
             <w:webHidden/>
           </w:rPr>
-          <w:instrText xml:space="preserve"> PAGEREF _Toc240309606 \h </w:instrText>
+          <w:instrText xml:space="preserve"> PAGEREF _Toc240359940 \h </w:instrText>
         </w:r>
         <w:r>
           <w:rPr>
@@ -2079,7 +2079,7 @@
           <w14:ligatures w14:val="standardContextual"/>
         </w:rPr>
       </w:pPr>
-      <w:hyperlink w:anchor="_Toc240309607" w:history="1">
+      <w:hyperlink w:anchor="_Toc240359941" w:history="1">
         <w:r>
           <w:rPr>
             <w:rStyle w:val="Hyperlink"/>
@@ -2114,7 +2114,7 @@
             <w:noProof/>
             <w:webHidden/>
           </w:rPr>
-          <w:instrText xml:space="preserve"> PAGEREF _Toc240309607 \h </w:instrText>
+          <w:instrText xml:space="preserve"> PAGEREF _Toc240359941 \h </w:instrText>
         </w:r>
         <w:r>
           <w:rPr>
@@ -2162,7 +2162,7 @@
           <w14:ligatures w14:val="standardContextual"/>
         </w:rPr>
       </w:pPr>
-      <w:hyperlink w:anchor="_Toc240309608" w:history="1">
+      <w:hyperlink w:anchor="_Toc240359942" w:history="1">
         <w:r>
           <w:rPr>
             <w:rStyle w:val="Hyperlink"/>
@@ -2204,7 +2204,7 @@
             <w:noProof/>
             <w:webHidden/>
           </w:rPr>
-          <w:instrText xml:space="preserve"> PAGEREF _Toc240309608 \h </w:instrText>
+          <w:instrText xml:space="preserve"> PAGEREF _Toc240359942 \h </w:instrText>
         </w:r>
         <w:r>
           <w:rPr>
@@ -2251,7 +2251,7 @@
           <w14:ligatures w14:val="standardContextual"/>
         </w:rPr>
       </w:pPr>
-      <w:hyperlink w:anchor="_Toc240309609" w:history="1">
+      <w:hyperlink w:anchor="_Toc240359943" w:history="1">
         <w:r>
           <w:rPr>
             <w:rStyle w:val="Hyperlink"/>
@@ -2278,7 +2278,7 @@
             <w:noProof/>
             <w:webHidden/>
           </w:rPr>
-          <w:instrText xml:space="preserve"> PAGEREF _Toc240309609 \h </w:instrText>
+          <w:instrText xml:space="preserve"> PAGEREF _Toc240359943 \h </w:instrText>
         </w:r>
         <w:r>
           <w:rPr>
@@ -2326,7 +2326,7 @@
           <w14:ligatures w14:val="standardContextual"/>
         </w:rPr>
       </w:pPr>
-      <w:hyperlink w:anchor="_Toc240309610" w:history="1">
+      <w:hyperlink w:anchor="_Toc240359944" w:history="1">
         <w:r>
           <w:rPr>
             <w:rStyle w:val="Hyperlink"/>
@@ -2383,7 +2383,7 @@
             <w:noProof/>
             <w:webHidden/>
           </w:rPr>
-          <w:instrText xml:space="preserve"> PAGEREF _Toc240309610 \h </w:instrText>
+          <w:instrText xml:space="preserve"> PAGEREF _Toc240359944 \h </w:instrText>
         </w:r>
         <w:r>
           <w:rPr>
@@ -2431,7 +2431,7 @@
           <w14:ligatures w14:val="standardContextual"/>
         </w:rPr>
       </w:pPr>
-      <w:hyperlink w:anchor="_Toc240309611" w:history="1">
+      <w:hyperlink w:anchor="_Toc240359945" w:history="1">
         <w:r>
           <w:rPr>
             <w:rStyle w:val="Hyperlink"/>
@@ -2488,7 +2488,7 @@
             <w:noProof/>
             <w:webHidden/>
           </w:rPr>
-          <w:instrText xml:space="preserve"> PAGEREF _Toc240309611 \h </w:instrText>
+          <w:instrText xml:space="preserve"> PAGEREF _Toc240359945 \h </w:instrText>
         </w:r>
         <w:r>
           <w:rPr>
@@ -2536,7 +2536,7 @@
           <w14:ligatures w14:val="standardContextual"/>
         </w:rPr>
       </w:pPr>
-      <w:hyperlink w:anchor="_Toc240309612" w:history="1">
+      <w:hyperlink w:anchor="_Toc240359946" w:history="1">
         <w:r>
           <w:rPr>
             <w:rStyle w:val="Hyperlink"/>
@@ -2593,7 +2593,7 @@
             <w:noProof/>
             <w:webHidden/>
           </w:rPr>
-          <w:instrText xml:space="preserve"> PAGEREF _Toc240309612 \h </w:instrText>
+          <w:instrText xml:space="preserve"> PAGEREF _Toc240359946 \h </w:instrText>
         </w:r>
         <w:r>
           <w:rPr>
@@ -2641,7 +2641,7 @@
           <w14:ligatures w14:val="standardContextual"/>
         </w:rPr>
       </w:pPr>
-      <w:hyperlink w:anchor="_Toc240309613" w:history="1">
+      <w:hyperlink w:anchor="_Toc240359947" w:history="1">
         <w:r>
           <w:rPr>
             <w:rStyle w:val="Hyperlink"/>
@@ -2698,7 +2698,7 @@
             <w:noProof/>
             <w:webHidden/>
           </w:rPr>
-          <w:instrText xml:space="preserve"> PAGEREF _Toc240309613 \h </w:instrText>
+          <w:instrText xml:space="preserve"> PAGEREF _Toc240359947 \h </w:instrText>
         </w:r>
         <w:r>
           <w:rPr>
@@ -2746,7 +2746,7 @@
           <w14:ligatures w14:val="standardContextual"/>
         </w:rPr>
       </w:pPr>
-      <w:hyperlink w:anchor="_Toc240309614" w:history="1">
+      <w:hyperlink w:anchor="_Toc240359948" w:history="1">
         <w:r>
           <w:rPr>
             <w:rStyle w:val="Hyperlink"/>
@@ -2803,7 +2803,7 @@
             <w:noProof/>
             <w:webHidden/>
           </w:rPr>
-          <w:instrText xml:space="preserve"> PAGEREF _Toc240309614 \h </w:instrText>
+          <w:instrText xml:space="preserve"> PAGEREF _Toc240359948 \h </w:instrText>
         </w:r>
         <w:r>
           <w:rPr>
@@ -2850,7 +2850,7 @@
           <w14:ligatures w14:val="standardContextual"/>
         </w:rPr>
       </w:pPr>
-      <w:hyperlink w:anchor="_Toc240309615" w:history="1">
+      <w:hyperlink w:anchor="_Toc240359949" w:history="1">
         <w:r>
           <w:rPr>
             <w:rStyle w:val="Hyperlink"/>
@@ -2877,7 +2877,7 @@
             <w:noProof/>
             <w:webHidden/>
           </w:rPr>
-          <w:instrText xml:space="preserve"> PAGEREF _Toc240309615 \h </w:instrText>
+          <w:instrText xml:space="preserve"> PAGEREF _Toc240359949 \h </w:instrText>
         </w:r>
         <w:r>
           <w:rPr>
@@ -2924,7 +2924,7 @@
           <w14:ligatures w14:val="standardContextual"/>
         </w:rPr>
       </w:pPr>
-      <w:hyperlink w:anchor="_Toc240309616" w:history="1">
+      <w:hyperlink w:anchor="_Toc240359950" w:history="1">
         <w:r>
           <w:rPr>
             <w:rStyle w:val="Hyperlink"/>
@@ -2951,7 +2951,7 @@
             <w:noProof/>
             <w:webHidden/>
           </w:rPr>
-          <w:instrText xml:space="preserve"> PAGEREF _Toc240309616 \h </w:instrText>
+          <w:instrText xml:space="preserve"> PAGEREF _Toc240359950 \h </w:instrText>
         </w:r>
         <w:r>
           <w:rPr>
@@ -2999,7 +2999,7 @@
           <w14:ligatures w14:val="standardContextual"/>
         </w:rPr>
       </w:pPr>
-      <w:hyperlink w:anchor="_Toc240309617" w:history="1">
+      <w:hyperlink w:anchor="_Toc240359951" w:history="1">
         <w:r>
           <w:rPr>
             <w:rStyle w:val="Hyperlink"/>
@@ -3049,7 +3049,7 @@
             <w:noProof/>
             <w:webHidden/>
           </w:rPr>
-          <w:instrText xml:space="preserve"> PAGEREF _Toc240309617 \h </w:instrText>
+          <w:instrText xml:space="preserve"> PAGEREF _Toc240359951 \h </w:instrText>
         </w:r>
         <w:r>
           <w:rPr>
@@ -3097,7 +3097,7 @@
           <w14:ligatures w14:val="standardContextual"/>
         </w:rPr>
       </w:pPr>
-      <w:hyperlink w:anchor="_Toc240309618" w:history="1">
+      <w:hyperlink w:anchor="_Toc240359952" w:history="1">
         <w:r>
           <w:rPr>
             <w:rStyle w:val="Hyperlink"/>
@@ -3147,7 +3147,7 @@
             <w:noProof/>
             <w:webHidden/>
           </w:rPr>
-          <w:instrText xml:space="preserve"> PAGEREF _Toc240309618 \h </w:instrText>
+          <w:instrText xml:space="preserve"> PAGEREF _Toc240359952 \h </w:instrText>
         </w:r>
         <w:r>
           <w:rPr>
@@ -3195,7 +3195,7 @@
           <w14:ligatures w14:val="standardContextual"/>
         </w:rPr>
       </w:pPr>
-      <w:hyperlink w:anchor="_Toc240309619" w:history="1">
+      <w:hyperlink w:anchor="_Toc240359953" w:history="1">
         <w:r>
           <w:rPr>
             <w:rStyle w:val="Hyperlink"/>
@@ -3245,7 +3245,7 @@
             <w:noProof/>
             <w:webHidden/>
           </w:rPr>
-          <w:instrText xml:space="preserve"> PAGEREF _Toc240309619 \h </w:instrText>
+          <w:instrText xml:space="preserve"> PAGEREF _Toc240359953 \h </w:instrText>
         </w:r>
         <w:r>
           <w:rPr>
@@ -3293,7 +3293,7 @@
           <w14:ligatures w14:val="standardContextual"/>
         </w:rPr>
       </w:pPr>
-      <w:hyperlink w:anchor="_Toc240309620" w:history="1">
+      <w:hyperlink w:anchor="_Toc240359954" w:history="1">
         <w:r>
           <w:rPr>
             <w:rStyle w:val="Hyperlink"/>
@@ -3358,7 +3358,7 @@
             <w:noProof/>
             <w:webHidden/>
           </w:rPr>
-          <w:instrText xml:space="preserve"> PAGEREF _Toc240309620 \h </w:instrText>
+          <w:instrText xml:space="preserve"> PAGEREF _Toc240359954 \h </w:instrText>
         </w:r>
         <w:r>
           <w:rPr>
@@ -3406,7 +3406,7 @@
           <w14:ligatures w14:val="standardContextual"/>
         </w:rPr>
       </w:pPr>
-      <w:hyperlink w:anchor="_Toc240309621" w:history="1">
+      <w:hyperlink w:anchor="_Toc240359955" w:history="1">
         <w:r>
           <w:rPr>
             <w:rStyle w:val="Hyperlink"/>
@@ -3471,7 +3471,7 @@
             <w:noProof/>
             <w:webHidden/>
           </w:rPr>
-          <w:instrText xml:space="preserve"> PAGEREF _Toc240309621 \h </w:instrText>
+          <w:instrText xml:space="preserve"> PAGEREF _Toc240359955 \h </w:instrText>
         </w:r>
         <w:r>
           <w:rPr>
@@ -3519,7 +3519,7 @@
           <w14:ligatures w14:val="standardContextual"/>
         </w:rPr>
       </w:pPr>
-      <w:hyperlink w:anchor="_Toc240309622" w:history="1">
+      <w:hyperlink w:anchor="_Toc240359956" w:history="1">
         <w:r>
           <w:rPr>
             <w:rStyle w:val="Hyperlink"/>
@@ -3584,7 +3584,7 @@
             <w:noProof/>
             <w:webHidden/>
           </w:rPr>
-          <w:instrText xml:space="preserve"> PAGEREF _Toc240309622 \h </w:instrText>
+          <w:instrText xml:space="preserve"> PAGEREF _Toc240359956 \h </w:instrText>
         </w:r>
         <w:r>
           <w:rPr>
@@ -3631,7 +3631,7 @@
           <w14:ligatures w14:val="standardContextual"/>
         </w:rPr>
       </w:pPr>
-      <w:hyperlink w:anchor="_Toc240309623" w:history="1">
+      <w:hyperlink w:anchor="_Toc240359957" w:history="1">
         <w:r>
           <w:rPr>
             <w:rStyle w:val="Hyperlink"/>
@@ -3658,7 +3658,7 @@
             <w:noProof/>
             <w:webHidden/>
           </w:rPr>
-          <w:instrText xml:space="preserve"> PAGEREF _Toc240309623 \h </w:instrText>
+          <w:instrText xml:space="preserve"> PAGEREF _Toc240359957 \h </w:instrText>
         </w:r>
         <w:r>
           <w:rPr>
@@ -3706,7 +3706,7 @@
           <w14:ligatures w14:val="standardContextual"/>
         </w:rPr>
       </w:pPr>
-      <w:hyperlink w:anchor="_Toc240309624" w:history="1">
+      <w:hyperlink w:anchor="_Toc240359958" w:history="1">
         <w:r>
           <w:rPr>
             <w:rStyle w:val="Hyperlink"/>
@@ -3733,7 +3733,7 @@
             <w:noProof/>
             <w:webHidden/>
           </w:rPr>
-          <w:instrText xml:space="preserve"> PAGEREF _Toc240309624 \h </w:instrText>
+          <w:instrText xml:space="preserve"> PAGEREF _Toc240359958 \h </w:instrText>
         </w:r>
         <w:r>
           <w:rPr>
@@ -3779,7 +3779,7 @@
         </w:rPr>
         <w:fldChar w:fldCharType="end"/>
       </w:r>
-      <w:bookmarkStart w:id="3" w:name="_Toc240309594"/>
+      <w:bookmarkStart w:id="3" w:name="_Toc240359928"/>
       <w:r>
         <w:rPr>
           <w:rFonts w:ascii="Times New Roman" w:hAnsi="Times New Roman"/>
@@ -3834,7 +3834,7 @@
         <w:spacing w:after="360"/>
         <w:outlineLvl w:val="0"/>
       </w:pPr>
-      <w:bookmarkStart w:id="4" w:name="_Toc240309595"/>
+      <w:bookmarkStart w:id="4" w:name="_Toc240359929"/>
       <w:r>
         <w:rPr>
           <w:rFonts w:ascii="Times New Roman" w:hAnsi="Times New Roman"/>
@@ -3990,7 +3990,7 @@
         <w:pStyle w:val="Heading1"/>
         <w:outlineLvl w:val="0"/>
       </w:pPr>
-      <w:bookmarkStart w:id="5" w:name="_Toc240309596"/>
+      <w:bookmarkStart w:id="5" w:name="_Toc240359930"/>
       <w:r>
         <w:rPr>
           <w:rFonts w:ascii="Times New Roman" w:hAnsi="Times New Roman"/>
@@ -4008,7 +4008,7 @@
         <w:pStyle w:val="Heading2"/>
         <w:outlineLvl w:val="1"/>
       </w:pPr>
-      <w:bookmarkStart w:id="6" w:name="_Toc240309597"/>
+      <w:bookmarkStart w:id="6" w:name="_Toc240359931"/>
       <w:r>
         <w:rPr>
           <w:rFonts w:ascii="Times New Roman" w:hAnsi="Times New Roman"/>
@@ -4387,7 +4387,7 @@
         </w:rPr>
         <w:lastRenderedPageBreak/>
         <w:drawing>
-          <wp:inline distT="0" distB="0" distL="0" distR="0" wp14:anchorId="630802C2" wp14:editId="455EB42D">
+          <wp:inline distT="0" distB="0" distL="0" distR="0" wp14:anchorId="283D7FFC" wp14:editId="5A63B0E0">
             <wp:extent cx="4860000" cy="2711753"/>
             <wp:effectExtent l="0" t="0" r="0" b="0"/>
             <wp:docPr id="2" name="Picture 2"/>
@@ -4512,7 +4512,7 @@
           <w:noProof/>
         </w:rPr>
         <w:drawing>
-          <wp:inline distT="0" distB="0" distL="0" distR="0" wp14:anchorId="5D330B2C" wp14:editId="0A40753F">
+          <wp:inline distT="0" distB="0" distL="0" distR="0" wp14:anchorId="3D856268" wp14:editId="411D123D">
             <wp:extent cx="4860000" cy="2719286"/>
             <wp:effectExtent l="0" t="0" r="0" b="0"/>
             <wp:docPr id="3" name="Picture 3"/>
@@ -4605,7 +4605,7 @@
           <w:noProof/>
         </w:rPr>
         <w:drawing>
-          <wp:inline distT="0" distB="0" distL="0" distR="0" wp14:anchorId="65DEB8B1" wp14:editId="2C605118">
+          <wp:inline distT="0" distB="0" distL="0" distR="0" wp14:anchorId="13517B90" wp14:editId="37FE0F24">
             <wp:extent cx="4500000" cy="2740541"/>
             <wp:effectExtent l="0" t="0" r="0" b="0"/>
             <wp:docPr id="4" name="Picture 4"/>
@@ -5194,7 +5194,20 @@
         <w:rPr>
           <w:rFonts w:cs="Times New Roman"/>
         </w:rPr>
-        <w:t xml:space="preserve"> sebagai desakan pembelian yang terjadi seketika, kuat, dan persisten tanpa adanya pertimbangan kognitif sadar sebelumnya mengenai konsekuensi pengeluaran. Lebih lanjut, Beatty and Ferrell (1998) serta studi meta-analisis komprehensif oleh Amos et al. (2014) mengungkapkan bahwa keputusan pembelian impulsif sesungguhnya merupakan muara perilaku yang dipengaruhi oleh spektrum faktor penentu (</w:t>
+        <w:t xml:space="preserve"> sebagai desakan pembelian yang terjadi seketika, kuat, dan persisten tanpa adanya pertimbangan kognitif sadar sebelumnya mengenai konsekuensi pengeluaran. Lebih lanjut, Beatty dan Ferrell (1998) serta studi meta-analisis komprehensif oleh Amos </w:t>
+      </w:r>
+      <w:r>
+        <w:rPr>
+          <w:rFonts w:cs="Times New Roman"/>
+          <w:i/>
+        </w:rPr>
+        <w:t>et al.</w:t>
+      </w:r>
+      <w:r>
+        <w:rPr>
+          <w:rFonts w:cs="Times New Roman"/>
+        </w:rPr>
+        <w:t>. (2014) mengungkapkan bahwa keputusan pembelian impulsif sesungguhnya merupakan muara perilaku yang dipengaruhi oleh spektrum faktor penentu (</w:t>
       </w:r>
       <w:r>
         <w:rPr>
@@ -5262,33 +5275,46 @@
         <w:rPr>
           <w:rFonts w:cs="Times New Roman"/>
         </w:rPr>
-        <w:t>), pencarian pelepasan stres dan petualangan (Babin et al., 1994; Arnold &amp; Reynolds, 2003), suasana hati positif (</w:t>
-      </w:r>
-      <w:r>
-        <w:rPr>
-          <w:rFonts w:cs="Times New Roman"/>
-          <w:i/>
+        <w:t xml:space="preserve">), pencarian pelepasan stres dan petualangan (Babin </w:t>
+      </w:r>
+      <w:r>
+        <w:rPr>
+          <w:rFonts w:cs="Times New Roman"/>
+          <w:i/>
+        </w:rPr>
+        <w:t>et al.</w:t>
+      </w:r>
+      <w:r>
+        <w:rPr>
+          <w:rFonts w:cs="Times New Roman"/>
+        </w:rPr>
+        <w:t>.</w:t>
+      </w:r>
+      <w:r>
+        <w:rPr>
+          <w:rFonts w:cs="Times New Roman"/>
+          <w:i/>
+        </w:rPr>
+        <w:t>, 1994; Arnold dan Reynolds, 2003), suasana hati positif (</w:t>
+      </w:r>
+      <w:r>
+        <w:rPr>
+          <w:rFonts w:cs="Times New Roman"/>
         </w:rPr>
         <w:t>positive affect</w:t>
       </w:r>
       <w:r>
         <w:rPr>
           <w:rFonts w:cs="Times New Roman"/>
+          <w:i/>
         </w:rPr>
         <w:t>), serta luapan kegembiraan sesaat (</w:t>
       </w:r>
       <w:r>
         <w:rPr>
           <w:rFonts w:cs="Times New Roman"/>
-          <w:i/>
-        </w:rPr>
-        <w:t>excitement and arousal</w:t>
-      </w:r>
-      <w:r>
-        <w:rPr>
-          <w:rFonts w:cs="Times New Roman"/>
-        </w:rPr>
-        <w:t>) (Gültekin &amp; Özer, 2012).</w:t>
+        </w:rPr>
+        <w:t>excitement and arousal) (Gültekin dan Özer, 2012).</w:t>
       </w:r>
     </w:p>
     <w:p>
@@ -5317,7 +5343,7 @@
           <w:b/>
           <w:i/>
         </w:rPr>
-        <w:t>Cognitive and Collector Drivers</w:t>
+        <w:t>Cognitive dan Collector Drivers</w:t>
       </w:r>
       <w:r>
         <w:rPr>
@@ -5363,7 +5389,20 @@
         <w:rPr>
           <w:rFonts w:cs="Times New Roman"/>
         </w:rPr>
-        <w:t>) (Gao et al., 2014), pembingkaian himpunan semu (</w:t>
+        <w:t xml:space="preserve">) (Gao </w:t>
+      </w:r>
+      <w:r>
+        <w:rPr>
+          <w:rFonts w:cs="Times New Roman"/>
+          <w:i/>
+        </w:rPr>
+        <w:t>et al.</w:t>
+      </w:r>
+      <w:r>
+        <w:rPr>
+          <w:rFonts w:cs="Times New Roman"/>
+        </w:rPr>
+        <w:t>., 2014), pembingkaian himpunan semu (</w:t>
       </w:r>
       <w:r>
         <w:rPr>
@@ -5376,7 +5415,20 @@
         <w:rPr>
           <w:rFonts w:cs="Times New Roman"/>
         </w:rPr>
-        <w:t>) (Barasz et al., 2017), serta hasrat kepemilikan materialistik atas objek langka (Belk, 1995).</w:t>
+        <w:t xml:space="preserve">) (Barasz </w:t>
+      </w:r>
+      <w:r>
+        <w:rPr>
+          <w:rFonts w:cs="Times New Roman"/>
+          <w:i/>
+        </w:rPr>
+        <w:t>et al.</w:t>
+      </w:r>
+      <w:r>
+        <w:rPr>
+          <w:rFonts w:cs="Times New Roman"/>
+        </w:rPr>
+        <w:t>., 2017), serta hasrat kepemilikan materialistik atas objek langka (Belk, 1995).</w:t>
       </w:r>
     </w:p>
     <w:p>
@@ -5405,7 +5457,7 @@
           <w:b/>
           <w:i/>
         </w:rPr>
-        <w:t>Economic and Speculative Drivers</w:t>
+        <w:t>Economic dan Speculative Drivers</w:t>
       </w:r>
       <w:r>
         <w:rPr>
@@ -5444,7 +5496,20 @@
         <w:rPr>
           <w:rFonts w:cs="Times New Roman"/>
         </w:rPr>
-        <w:t>) (Shiller, 2000; Baur et al., 2018), persepsi memenangkan lotre (</w:t>
+        <w:t xml:space="preserve">) (Shiller, 2000; Baur </w:t>
+      </w:r>
+      <w:r>
+        <w:rPr>
+          <w:rFonts w:cs="Times New Roman"/>
+          <w:i/>
+        </w:rPr>
+        <w:t>et al.</w:t>
+      </w:r>
+      <w:r>
+        <w:rPr>
+          <w:rFonts w:cs="Times New Roman"/>
+        </w:rPr>
+        <w:t>., 2018), persepsi memenangkan lotre (</w:t>
       </w:r>
       <w:r>
         <w:rPr>
@@ -5486,7 +5551,7 @@
           <w:b/>
           <w:i/>
         </w:rPr>
-        <w:t>Situational and Atmospheric Drivers</w:t>
+        <w:t>Situational dan Atmospheric Drivers</w:t>
       </w:r>
       <w:r>
         <w:rPr>
@@ -5525,7 +5590,20 @@
         <w:rPr>
           <w:rFonts w:cs="Times New Roman"/>
         </w:rPr>
-        <w:t>) (Peck and Childers, 2006), diskon promosi sesaat, serta desakan kelangkaan stok fisik (Amos et al., 2014).</w:t>
+        <w:t xml:space="preserve">) (Peck dan Childers, 2006), diskon promosi sesaat, serta desakan kelangkaan stok fisik (Amos </w:t>
+      </w:r>
+      <w:r>
+        <w:rPr>
+          <w:rFonts w:cs="Times New Roman"/>
+          <w:i/>
+        </w:rPr>
+        <w:t>et al.</w:t>
+      </w:r>
+      <w:r>
+        <w:rPr>
+          <w:rFonts w:cs="Times New Roman"/>
+        </w:rPr>
+        <w:t>., 2014).</w:t>
       </w:r>
     </w:p>
     <w:p>
@@ -5640,7 +5718,7 @@
         <w:rPr>
           <w:rFonts w:cs="Times New Roman"/>
         </w:rPr>
-        <w:t>) (Arnold and Reynolds, 2003; Gültekin and Özer, 2012).</w:t>
+        <w:t>) (Arnold dan Reynolds, 2003; Gültekin and Özer, 2012).</w:t>
       </w:r>
     </w:p>
     <w:p>
@@ -5729,7 +5807,33 @@
         <w:rPr>
           <w:rFonts w:cs="Times New Roman"/>
         </w:rPr>
-        <w:t xml:space="preserve"> (Gao et al., 2014; Barasz et al., 2017), binder album kolektor yang masih memiliki slot nomor kosong menciptakan ketegangan kognitif internal. Hasrat menuntaskan set secara utuh memicu dorongan psikologis mendesak untuk terus membeli bungkus kartu tambahan secara spontan demi menutup celah kekosongan tersebut.</w:t>
+        <w:t xml:space="preserve"> (Gao </w:t>
+      </w:r>
+      <w:r>
+        <w:rPr>
+          <w:rFonts w:cs="Times New Roman"/>
+          <w:i/>
+        </w:rPr>
+        <w:t>et al.</w:t>
+      </w:r>
+      <w:r>
+        <w:rPr>
+          <w:rFonts w:cs="Times New Roman"/>
+        </w:rPr>
+        <w:t xml:space="preserve">., 2014; Barasz </w:t>
+      </w:r>
+      <w:r>
+        <w:rPr>
+          <w:rFonts w:cs="Times New Roman"/>
+          <w:i/>
+        </w:rPr>
+        <w:t>et al.</w:t>
+      </w:r>
+      <w:r>
+        <w:rPr>
+          <w:rFonts w:cs="Times New Roman"/>
+        </w:rPr>
+        <w:t>., 2017), binder album kolektor yang masih memiliki slot nomor kosong menciptakan ketegangan kognitif internal. Hasrat menuntaskan set secara utuh memicu dorongan psikologis mendesak untuk terus membeli bungkus kartu tambahan secara spontan demi menutup celah kekosongan tersebut.</w:t>
       </w:r>
     </w:p>
     <w:p>
@@ -5806,7 +5910,20 @@
         <w:rPr>
           <w:rFonts w:cs="Times New Roman"/>
         </w:rPr>
-        <w:t xml:space="preserve">, transaksi kartu Pokémon fisik sangat diwarnai oleh motif spekulasi finansial (Shiller, 2000; Baur et al., 2018; Colline, 2024). Pembeli tergiur oleh likuiditas pasar lelang daring dan tren grading PSA/BGS, memicu keyakinan bahwa modal kecil membeli beberapa </w:t>
+        <w:t xml:space="preserve">, transaksi kartu Pokémon fisik sangat diwarnai oleh motif spekulasi finansial (Shiller, 2000; Baur </w:t>
+      </w:r>
+      <w:r>
+        <w:rPr>
+          <w:rFonts w:cs="Times New Roman"/>
+          <w:i/>
+        </w:rPr>
+        <w:t>et al.</w:t>
+      </w:r>
+      <w:r>
+        <w:rPr>
+          <w:rFonts w:cs="Times New Roman"/>
+        </w:rPr>
+        <w:t xml:space="preserve">., 2018; Colline, 2024). Pembeli tergiur oleh likuiditas pasar lelang daring dan tren grading PSA/BGS, memicu keyakinan bahwa modal kecil membeli beberapa </w:t>
       </w:r>
       <w:r>
         <w:rPr>
@@ -5871,7 +5988,7 @@
         <w:rPr>
           <w:rFonts w:cs="Times New Roman"/>
         </w:rPr>
-        <w:t>), literatur perilaku konsumen mengenal beberapa instrumen pengukuran teruji, antara lain skala unidimensional pengaruh normatif oleh Rook and Fisher (1995) serta skala dorongan belanja impulsif dalam toko oleh Beatty and Ferrell (1998). Namun, penelitian ini mengadopsi instrumen pengukuran multidimensional Verplanken and Herabadi (2001) yang disintesis dengan definisi operasional Rook (1987). Skala ini membedakan secara tegas antara dimensi kognitif (ketiadaan perencanaan belanja dan pengabaian dampak keua</w:t>
+        <w:t>), literatur perilaku konsumen mengenal beberapa instrumen pengukuran teruji, antara lain skala unidimensional pengaruh normatif oleh Rook dan Fisher (1995) serta skala dorongan belanja impulsif dalam toko oleh Beatty dan Ferrell (1998). Namun, penelitian ini mengadopsi instrumen pengukuran multidimensional Verplanken dan Herabadi (2001) yang disintesis dengan definisi operasional Rook (1987). Skala ini membedakan secara tegas antara dimensi kognitif (ketiadaan perencanaan belanja dan pengabaian dampak keua</w:t>
       </w:r>
       <w:r>
         <w:rPr>
@@ -6014,7 +6131,33 @@
         <w:rPr>
           <w:rFonts w:cs="Times New Roman"/>
         </w:rPr>
-        <w:t>, sejumlah peneliti membuktikan pengaruh positif signifikan karena dorongan kesenangan emosional langsung melumpuhkan kalkulasi rasional konsumen (Arnold and Reynolds, 2003; Gültekin and Özer, 2012; Pranggabayu and Andjarwati, 2022). Namun, penelitian lain menemukan hasil tidak signifikan ketika faktor kendala anggaran, pertimbangan utilitas fungsional, atau mekanisme toko mendominasi keputusan konsumen (Zheng et al., 2019; Tirtayasa et al., 2020).</w:t>
+        <w:t xml:space="preserve">, sejumlah peneliti membuktikan pengaruh positif signifikan karena dorongan kesenangan emosional langsung melumpuhkan kalkulasi rasional konsumen (Arnold dan Reynolds, 2003; Gültekin and Özer, 2012; Pranggabayu dan Andjarwati, 2022). Namun, penelitian lain menemukan hasil tidak signifikan ketika faktor kendala anggaran, pertimbangan utilitas fungsional, atau mekanisme toko mendominasi keputusan konsumen (Zheng </w:t>
+      </w:r>
+      <w:r>
+        <w:rPr>
+          <w:rFonts w:cs="Times New Roman"/>
+          <w:i/>
+        </w:rPr>
+        <w:t>et al.</w:t>
+      </w:r>
+      <w:r>
+        <w:rPr>
+          <w:rFonts w:cs="Times New Roman"/>
+        </w:rPr>
+        <w:t xml:space="preserve">., 2019; Tirtayasa </w:t>
+      </w:r>
+      <w:r>
+        <w:rPr>
+          <w:rFonts w:cs="Times New Roman"/>
+          <w:i/>
+        </w:rPr>
+        <w:t>et al.</w:t>
+      </w:r>
+      <w:r>
+        <w:rPr>
+          <w:rFonts w:cs="Times New Roman"/>
+        </w:rPr>
+        <w:t>., 2020).</w:t>
       </w:r>
     </w:p>
     <w:p>
@@ -6061,7 +6204,33 @@
         <w:rPr>
           <w:rFonts w:cs="Times New Roman"/>
         </w:rPr>
-        <w:t>, Gao et al. (2014) dan Barasz et al. (2017) menemukan bahwa hasrat melengkapi kesatuan himpunan memicu percepatan belanja yang agresif dan spontan. Sebaliknya, studi klasik perilaku kolektor oleh Long and Schiffman (2000) dan Spero and Stone (2004) menemukan bahwa kolektor berpengalaman (</w:t>
+        <w:t xml:space="preserve">, Gao </w:t>
+      </w:r>
+      <w:r>
+        <w:rPr>
+          <w:rFonts w:cs="Times New Roman"/>
+          <w:i/>
+        </w:rPr>
+        <w:t>et al.</w:t>
+      </w:r>
+      <w:r>
+        <w:rPr>
+          <w:rFonts w:cs="Times New Roman"/>
+        </w:rPr>
+        <w:t xml:space="preserve">. (2014) dan Barasz </w:t>
+      </w:r>
+      <w:r>
+        <w:rPr>
+          <w:rFonts w:cs="Times New Roman"/>
+          <w:i/>
+        </w:rPr>
+        <w:t>et al.</w:t>
+      </w:r>
+      <w:r>
+        <w:rPr>
+          <w:rFonts w:cs="Times New Roman"/>
+        </w:rPr>
+        <w:t>. (2017) menemukan bahwa hasrat melengkapi kesatuan himpunan memicu percepatan belanja yang agresif dan spontan. Sebaliknya, studi klasik perilaku kolektor oleh Long dan Schiffman (2000) dan Spero dan Stone (2004) menemukan bahwa kolektor berpengalaman (</w:t>
       </w:r>
       <w:r>
         <w:rPr>
@@ -6133,7 +6302,7 @@
         <w:rPr>
           <w:rFonts w:cs="Times New Roman"/>
         </w:rPr>
-        <w:t>, Shiller (2000) dan Aryadi and Lingga (2024) menunjukkan bahwa euforia keuntungan finansial memicu transaksi spekulatif spontan. Namun, Barber and Odean (2008) menemukan bahwa motif spekulasi sering diimbangi oleh kalkulasi risiko kerugian modal yang ketat, sehingga tidak selalu bertransformasi menjadi tindakan pembelian impulsif tanpa perhitungan.</w:t>
+        <w:t>, Shiller (2000) dan Aryadi dan Lingga (2024) menunjukkan bahwa euforia keuntungan finansial memicu transaksi spekulatif spontan. Namun, Barber dan Odean (2008) menemukan bahwa motif spekulasi sering diimbangi oleh kalkulasi risiko kerugian modal yang ketat, sehingga tidak selalu bertransformasi menjadi tindakan pembelian impulsif tanpa perhitungan.</w:t>
       </w:r>
     </w:p>
     <w:p>
@@ -6159,7 +6328,7 @@
         <w:rPr>
           <w:rFonts w:cs="Times New Roman"/>
         </w:rPr>
-        <w:t xml:space="preserve">) (Baumeister, 2002; Vohs and Faber, 2007) dan model pertentangan internal </w:t>
+        <w:t xml:space="preserve">) (Baumeister, 2002; Vohs dan Faber, 2007) dan model pertentangan internal </w:t>
       </w:r>
       <w:r>
         <w:rPr>
@@ -6185,7 +6354,7 @@
         <w:rPr>
           <w:rFonts w:cs="Times New Roman"/>
         </w:rPr>
-        <w:t xml:space="preserve"> (Thaler and Shefrin, 1981), variabel yang paling tepat bertindak sebagai benteng pertahanan psikologis adalah </w:t>
+        <w:t xml:space="preserve"> (Thaler dan Shefrin, 1981), variabel yang paling tepat bertindak sebagai benteng pertahanan psikologis adalah </w:t>
       </w:r>
       <w:r>
         <w:rPr>
@@ -6219,7 +6388,33 @@
         <w:rPr>
           <w:rFonts w:cs="Times New Roman"/>
         </w:rPr>
-        <w:t xml:space="preserve">), dan mengarahkan tindakan agar selaras dengan tujuan keuangan jangka panjang (Tangney et al., 2004; Sultan et al., 2012). Meskipun konsumen merasakan rangsangan hedonis tinggi, desakan kelengkapan binder yang mendesak, serta iming-iming keuntungan spekulasi pasar, dorongan tersebut diprediksi </w:t>
+        <w:t xml:space="preserve">), dan mengarahkan tindakan agar selaras dengan tujuan keuangan jangka panjang (Tangney </w:t>
+      </w:r>
+      <w:r>
+        <w:rPr>
+          <w:rFonts w:cs="Times New Roman"/>
+          <w:i/>
+        </w:rPr>
+        <w:t>et al.</w:t>
+      </w:r>
+      <w:r>
+        <w:rPr>
+          <w:rFonts w:cs="Times New Roman"/>
+        </w:rPr>
+        <w:t xml:space="preserve">., 2004; Sultan </w:t>
+      </w:r>
+      <w:r>
+        <w:rPr>
+          <w:rFonts w:cs="Times New Roman"/>
+          <w:i/>
+        </w:rPr>
+        <w:t>et al.</w:t>
+      </w:r>
+      <w:r>
+        <w:rPr>
+          <w:rFonts w:cs="Times New Roman"/>
+        </w:rPr>
+        <w:t xml:space="preserve">., 2012). Meskipun konsumen merasakan rangsangan hedonis tinggi, desakan kelengkapan binder yang mendesak, serta iming-iming keuntungan spekulasi pasar, dorongan tersebut diprediksi </w:t>
       </w:r>
       <w:r>
         <w:rPr>
@@ -6247,7 +6442,7 @@
         <w:rPr>
           <w:rFonts w:cs="Times New Roman"/>
         </w:rPr>
-        <w:t xml:space="preserve"> apabila konsumen memiliki kapasitas kontrol diri yang kokoh (Apidana and Kholifah, 2022; Lienardy and Panasea, 2024).</w:t>
+        <w:t xml:space="preserve"> apabila konsumen memiliki kapasitas kontrol diri yang kokoh (Apidana dan Kholifah, 2022; Lienardy dan Panasea, 2024).</w:t>
       </w:r>
     </w:p>
     <w:p>
@@ -6357,7 +6552,7 @@
         <w:pStyle w:val="Heading2"/>
         <w:outlineLvl w:val="1"/>
       </w:pPr>
-      <w:bookmarkStart w:id="7" w:name="_Toc240309598"/>
+      <w:bookmarkStart w:id="7" w:name="_Toc240359932"/>
       <w:r>
         <w:rPr>
           <w:rFonts w:ascii="Times New Roman" w:hAnsi="Times New Roman"/>
@@ -6702,7 +6897,7 @@
         <w:pStyle w:val="Heading2"/>
         <w:outlineLvl w:val="1"/>
       </w:pPr>
-      <w:bookmarkStart w:id="8" w:name="_Toc240309599"/>
+      <w:bookmarkStart w:id="8" w:name="_Toc240359933"/>
       <w:r>
         <w:rPr>
           <w:rFonts w:ascii="Times New Roman" w:hAnsi="Times New Roman"/>
@@ -7048,7 +7243,7 @@
         <w:pStyle w:val="Heading2"/>
         <w:outlineLvl w:val="1"/>
       </w:pPr>
-      <w:bookmarkStart w:id="9" w:name="_Toc240309600"/>
+      <w:bookmarkStart w:id="9" w:name="_Toc240359934"/>
       <w:r>
         <w:rPr>
           <w:rFonts w:ascii="Times New Roman" w:hAnsi="Times New Roman"/>
@@ -7078,7 +7273,7 @@
         <w:pStyle w:val="Heading3"/>
         <w:outlineLvl w:val="2"/>
       </w:pPr>
-      <w:bookmarkStart w:id="10" w:name="_Toc240309601"/>
+      <w:bookmarkStart w:id="10" w:name="_Toc240359935"/>
       <w:r>
         <w:rPr>
           <w:rFonts w:ascii="Times New Roman" w:hAnsi="Times New Roman"/>
@@ -7197,7 +7392,20 @@
         <w:rPr>
           <w:rFonts w:cs="Times New Roman"/>
         </w:rPr>
-        <w:t>) dalam memoderasi dan meredam dorongan belanja spontan pada barang-barang berkategori kesenangan dan spekulasi hobi (Sultan et al., 2012; Apidana and Kholifah, 2022; Lienardy and Panasea, 2024).</w:t>
+        <w:t xml:space="preserve">) dalam memoderasi dan meredam dorongan belanja spontan pada barang-barang berkategori kesenangan dan spekulasi hobi (Sultan </w:t>
+      </w:r>
+      <w:r>
+        <w:rPr>
+          <w:rFonts w:cs="Times New Roman"/>
+          <w:i/>
+        </w:rPr>
+        <w:t>et al.</w:t>
+      </w:r>
+      <w:r>
+        <w:rPr>
+          <w:rFonts w:cs="Times New Roman"/>
+        </w:rPr>
+        <w:t>., 2012; Apidana dan Kholifah, 2022; Lienardy dan Panasea, 2024).</w:t>
       </w:r>
     </w:p>
     <w:p>
@@ -7246,7 +7454,7 @@
         <w:pStyle w:val="Heading3"/>
         <w:outlineLvl w:val="2"/>
       </w:pPr>
-      <w:bookmarkStart w:id="11" w:name="_Toc240309602"/>
+      <w:bookmarkStart w:id="11" w:name="_Toc240359936"/>
       <w:r>
         <w:rPr>
           <w:rFonts w:ascii="Times New Roman" w:hAnsi="Times New Roman"/>
@@ -7391,7 +7599,7 @@
         <w:pStyle w:val="Heading1"/>
         <w:outlineLvl w:val="0"/>
       </w:pPr>
-      <w:bookmarkStart w:id="12" w:name="_Toc240309603"/>
+      <w:bookmarkStart w:id="12" w:name="_Toc240359937"/>
       <w:r>
         <w:rPr>
           <w:rFonts w:ascii="Times New Roman" w:hAnsi="Times New Roman"/>
@@ -7409,7 +7617,7 @@
         <w:pStyle w:val="Heading2"/>
         <w:outlineLvl w:val="1"/>
       </w:pPr>
-      <w:bookmarkStart w:id="13" w:name="_Toc240309604"/>
+      <w:bookmarkStart w:id="13" w:name="_Toc240359938"/>
       <w:r>
         <w:rPr>
           <w:rFonts w:ascii="Times New Roman" w:hAnsi="Times New Roman"/>
@@ -7426,7 +7634,7 @@
         <w:pStyle w:val="Heading3"/>
         <w:outlineLvl w:val="2"/>
       </w:pPr>
-      <w:bookmarkStart w:id="14" w:name="_Toc240309605"/>
+      <w:bookmarkStart w:id="14" w:name="_Toc240359939"/>
       <w:r>
         <w:rPr>
           <w:rFonts w:ascii="Times New Roman" w:hAnsi="Times New Roman"/>
@@ -7560,7 +7768,7 @@
         <w:rPr>
           <w:rFonts w:cs="Times New Roman"/>
         </w:rPr>
-        <w:t xml:space="preserve">Kahneman and Tversky (1979) melalui </w:t>
+        <w:t xml:space="preserve">Kahneman dan Tversky (1979) melalui </w:t>
       </w:r>
       <w:r>
         <w:rPr>
@@ -7651,7 +7859,7 @@
         <w:rPr>
           <w:rFonts w:cs="Times New Roman"/>
         </w:rPr>
-        <w:t xml:space="preserve">) di mana harga aset melonjak jauh melampaui nilai fundamentalnya. Selanjutnya, Thaler (1985) dan Thaler and Shefrin (1981) memperkenalkan konsep </w:t>
+        <w:t xml:space="preserve">) di mana harga aset melonjak jauh melampaui nilai fundamentalnya. Selanjutnya, Thaler (1985) dan Thaler dan Shefrin (1981) memperkenalkan konsep </w:t>
       </w:r>
       <w:r>
         <w:rPr>
@@ -7750,7 +7958,7 @@
         <w:pStyle w:val="Heading3"/>
         <w:outlineLvl w:val="2"/>
       </w:pPr>
-      <w:bookmarkStart w:id="15" w:name="_Toc240309606"/>
+      <w:bookmarkStart w:id="15" w:name="_Toc240359940"/>
       <w:r>
         <w:rPr>
           <w:rFonts w:ascii="Times New Roman" w:hAnsi="Times New Roman"/>
@@ -7805,7 +8013,7 @@
         <w:rPr>
           <w:rFonts w:cs="Times New Roman"/>
         </w:rPr>
-        <w:t xml:space="preserve"> (S-O-R) yang dikembangkan oleh Mehrabian and Russell (1974). Model ini menjelaskan bahwa pemicu lingkungan eksternal (</w:t>
+        <w:t xml:space="preserve"> (S-O-R) yang dikembangkan oleh Mehrabian dan Russell (1974). Model ini menjelaskan bahwa pemicu lingkungan eksternal (</w:t>
       </w:r>
       <w:r>
         <w:rPr>
@@ -8089,7 +8297,7 @@
         <w:pStyle w:val="Heading3"/>
         <w:outlineLvl w:val="2"/>
       </w:pPr>
-      <w:bookmarkStart w:id="16" w:name="_Toc240309607"/>
+      <w:bookmarkStart w:id="16" w:name="_Toc240359941"/>
       <w:r>
         <w:rPr>
           <w:rFonts w:ascii="Times New Roman" w:hAnsi="Times New Roman"/>
@@ -8160,7 +8368,20 @@
         <w:rPr>
           <w:rFonts w:cs="Times New Roman"/>
         </w:rPr>
-        <w:t xml:space="preserve">). Gao et al. (2014) dalam studi seminalnya di </w:t>
+        <w:t xml:space="preserve">). Gao </w:t>
+      </w:r>
+      <w:r>
+        <w:rPr>
+          <w:rFonts w:cs="Times New Roman"/>
+          <w:i/>
+        </w:rPr>
+        <w:t>et al.</w:t>
+      </w:r>
+      <w:r>
+        <w:rPr>
+          <w:rFonts w:cs="Times New Roman"/>
+        </w:rPr>
+        <w:t xml:space="preserve">. (2014) dalam studi seminalnya di </w:t>
       </w:r>
       <w:r>
         <w:rPr>
@@ -8187,7 +8408,20 @@
         <w:rPr>
           <w:rFonts w:cs="Times New Roman"/>
         </w:rPr>
-        <w:t xml:space="preserve">, membuktikan bahwa motivasi konsumen mengakuisisi barang melonjak drastis saat set mendekati kelengkapan. Barasz et al. (2017) memperkuat temuan ini melalui konsep </w:t>
+        <w:t xml:space="preserve">, membuktikan bahwa motivasi konsumen mengakuisisi barang melonjak drastis saat set mendekati kelengkapan. Barasz </w:t>
+      </w:r>
+      <w:r>
+        <w:rPr>
+          <w:rFonts w:cs="Times New Roman"/>
+          <w:i/>
+        </w:rPr>
+        <w:t>et al.</w:t>
+      </w:r>
+      <w:r>
+        <w:rPr>
+          <w:rFonts w:cs="Times New Roman"/>
+        </w:rPr>
+        <w:t xml:space="preserve">. (2017) memperkuat temuan ini melalui konsep </w:t>
       </w:r>
       <w:r>
         <w:rPr>
@@ -8209,7 +8443,7 @@
         <w:pStyle w:val="Heading3"/>
         <w:outlineLvl w:val="2"/>
       </w:pPr>
-      <w:bookmarkStart w:id="17" w:name="_Toc240309608"/>
+      <w:bookmarkStart w:id="17" w:name="_Toc240359942"/>
       <w:r>
         <w:rPr>
           <w:rFonts w:ascii="Times New Roman" w:hAnsi="Times New Roman"/>
@@ -8251,7 +8485,7 @@
         <w:rPr>
           <w:rFonts w:cs="Times New Roman"/>
         </w:rPr>
-        <w:t>Teori regulasi diri (Baumeister, 2002) menjelaskan bagaimana individu mengendalikan dorongan instingtual demi tujuan jangka panjang. Vohs and Faber (2007) membuktikan bahwa penipisan kontrol diri secara langsung menyebabkan kegagalan menahan impuls belanja. Sebaliknya, individu dengan kontrol diri yang kuat (</w:t>
+        <w:t>Teori regulasi diri (Baumeister, 2002) menjelaskan bagaimana individu mengendalikan dorongan instingtual demi tujuan jangka panjang. Vohs dan Faber (2007) membuktikan bahwa penipisan kontrol diri secara langsung menyebabkan kegagalan menahan impuls belanja. Sebaliknya, individu dengan kontrol diri yang kuat (</w:t>
       </w:r>
       <w:r>
         <w:rPr>
@@ -8277,7 +8511,20 @@
         <w:rPr>
           <w:rFonts w:cs="Times New Roman"/>
         </w:rPr>
-        <w:t>) (Tangney et al., 2004).</w:t>
+        <w:t xml:space="preserve">) (Tangney </w:t>
+      </w:r>
+      <w:r>
+        <w:rPr>
+          <w:rFonts w:cs="Times New Roman"/>
+          <w:i/>
+        </w:rPr>
+        <w:t>et al.</w:t>
+      </w:r>
+      <w:r>
+        <w:rPr>
+          <w:rFonts w:cs="Times New Roman"/>
+        </w:rPr>
+        <w:t>., 2004).</w:t>
       </w:r>
     </w:p>
     <w:p>
@@ -8285,7 +8532,7 @@
         <w:pStyle w:val="Heading2"/>
         <w:outlineLvl w:val="1"/>
       </w:pPr>
-      <w:bookmarkStart w:id="18" w:name="_Toc240309609"/>
+      <w:bookmarkStart w:id="18" w:name="_Toc240359943"/>
       <w:r>
         <w:rPr>
           <w:rFonts w:ascii="Times New Roman" w:hAnsi="Times New Roman"/>
@@ -8302,7 +8549,7 @@
         <w:pStyle w:val="Heading3"/>
         <w:outlineLvl w:val="2"/>
       </w:pPr>
-      <w:bookmarkStart w:id="19" w:name="_Toc240309610"/>
+      <w:bookmarkStart w:id="19" w:name="_Toc240359944"/>
       <w:r>
         <w:rPr>
           <w:rFonts w:ascii="Times New Roman" w:hAnsi="Times New Roman"/>
@@ -8362,13 +8609,20 @@
         <w:rPr>
           <w:rFonts w:cs="Times New Roman"/>
         </w:rPr>
-        <w:t>Pembelian impulsif didefinisikan sebagai dorongan belanja mendadak, kuat, dan persisten untuk segera bertransaksi tanpa adanya deliberasi kognitif sadar sebelumnya mengenai konsekuensi pengeluaran (Stern, 1962; Rook, 1987; Rook and Fisher, 1995). Verplanken and Herabadi (2001) mengidentifikasi dua dimensi utama: (1) dimensi kognitif (ketiadaan perencanaan dan pengabaian anggaran); dan (2) dimensi afektif (luapan kegembiraan dan dorongan emosional tak tertahankan). Amos et al. (2014) menegaskan bahwa pembeli</w:t>
-      </w:r>
-      <w:r>
-        <w:rPr>
-          <w:rFonts w:cs="Times New Roman"/>
-        </w:rPr>
-        <w:t>an impulsif dipicu oleh konvergensi stimulus afektif, faktor kognitif internal, dan situasi pasar.</w:t>
+        <w:t xml:space="preserve">Pembelian impulsif didefinisikan sebagai dorongan belanja mendadak, kuat, dan persisten untuk segera bertransaksi tanpa adanya deliberasi kognitif sadar sebelumnya mengenai konsekuensi pengeluaran (Stern, 1962; Rook, 1987; Rook dan Fisher, 1995). Verplanken dan Herabadi (2001) mengidentifikasi dua dimensi utama: (1) dimensi kognitif (ketiadaan perencanaan dan pengabaian anggaran); dan (2) dimensi afektif (luapan kegembiraan dan dorongan emosional tak tertahankan). Amos </w:t>
+      </w:r>
+      <w:r>
+        <w:rPr>
+          <w:rFonts w:cs="Times New Roman"/>
+          <w:i/>
+        </w:rPr>
+        <w:t>et al.</w:t>
+      </w:r>
+      <w:r>
+        <w:rPr>
+          <w:rFonts w:cs="Times New Roman"/>
+        </w:rPr>
+        <w:t>. (2014) menegaskan bahwa pembelian impulsif dipicu oleh konvergensi stimulus afektif, faktor kognitif internal, dan situasi pasar.</w:t>
       </w:r>
     </w:p>
     <w:p>
@@ -8376,7 +8630,7 @@
         <w:pStyle w:val="Heading3"/>
         <w:outlineLvl w:val="2"/>
       </w:pPr>
-      <w:bookmarkStart w:id="20" w:name="_Toc240309611"/>
+      <w:bookmarkStart w:id="20" w:name="_Toc240359945"/>
       <w:r>
         <w:rPr>
           <w:rFonts w:ascii="Times New Roman" w:hAnsi="Times New Roman"/>
@@ -8436,7 +8690,20 @@
         <w:rPr>
           <w:rFonts w:cs="Times New Roman"/>
         </w:rPr>
-        <w:t xml:space="preserve">Motivasi hedonis merujuk pada dorongan berbelanja demi kesenangan emosional, hiburan, dan pengalaman multisensori, bukan semata kegunaan utiliter (Hirschman and Holbrook, 1982; Babin et al., 1994). Arnold and Reynolds (2003) merumuskan enam dimensi motivasi hedonis, di mana dimensi </w:t>
+        <w:t xml:space="preserve">Motivasi hedonis merujuk pada dorongan berbelanja demi kesenangan emosional, hiburan, dan pengalaman multisensori, bukan semata kegunaan utiliter (Hirschman dan Holbrook, 1982; Babin </w:t>
+      </w:r>
+      <w:r>
+        <w:rPr>
+          <w:rFonts w:cs="Times New Roman"/>
+          <w:i/>
+        </w:rPr>
+        <w:t>et al.</w:t>
+      </w:r>
+      <w:r>
+        <w:rPr>
+          <w:rFonts w:cs="Times New Roman"/>
+        </w:rPr>
+        <w:t xml:space="preserve">., 1994). Arnold dan Reynolds (2003) merumuskan enam dimensi motivasi hedonis, di mana dimensi </w:t>
       </w:r>
       <w:r>
         <w:rPr>
@@ -8483,7 +8750,7 @@
         <w:pStyle w:val="Heading3"/>
         <w:outlineLvl w:val="2"/>
       </w:pPr>
-      <w:bookmarkStart w:id="21" w:name="_Toc240309612"/>
+      <w:bookmarkStart w:id="21" w:name="_Toc240359946"/>
       <w:r>
         <w:rPr>
           <w:rFonts w:ascii="Times New Roman" w:hAnsi="Times New Roman"/>
@@ -8551,7 +8818,33 @@
         <w:rPr>
           <w:rFonts w:cs="Times New Roman"/>
         </w:rPr>
-        <w:t xml:space="preserve"> didefinisikan sebagai dorongan motivasional internal individu untuk melengkapi seluruh elemen dari suatu himpunan yang telah terdefinisi batasannya secara utuh (Belk, 1995; Gao et al., 2014; Barasz et al., 2017). Dimensi utamanya mencakup: persepsi batasan himpunan (</w:t>
+        <w:t xml:space="preserve"> didefinisikan sebagai dorongan motivasional internal individu untuk melengkapi seluruh elemen dari suatu himpunan yang telah terdefinisi batasannya secara utuh (Belk, 1995; Gao </w:t>
+      </w:r>
+      <w:r>
+        <w:rPr>
+          <w:rFonts w:cs="Times New Roman"/>
+          <w:i/>
+        </w:rPr>
+        <w:t>et al.</w:t>
+      </w:r>
+      <w:r>
+        <w:rPr>
+          <w:rFonts w:cs="Times New Roman"/>
+        </w:rPr>
+        <w:t xml:space="preserve">., 2014; Barasz </w:t>
+      </w:r>
+      <w:r>
+        <w:rPr>
+          <w:rFonts w:cs="Times New Roman"/>
+          <w:i/>
+        </w:rPr>
+        <w:t>et al.</w:t>
+      </w:r>
+      <w:r>
+        <w:rPr>
+          <w:rFonts w:cs="Times New Roman"/>
+        </w:rPr>
+        <w:t>., 2017). Dimensi utamanya mencakup: persepsi batasan himpunan (</w:t>
       </w:r>
       <w:r>
         <w:rPr>
@@ -8611,7 +8904,7 @@
         <w:pStyle w:val="Heading3"/>
         <w:outlineLvl w:val="2"/>
       </w:pPr>
-      <w:bookmarkStart w:id="22" w:name="_Toc240309613"/>
+      <w:bookmarkStart w:id="22" w:name="_Toc240359947"/>
       <w:r>
         <w:rPr>
           <w:rFonts w:ascii="Times New Roman" w:hAnsi="Times New Roman"/>
@@ -8684,7 +8977,20 @@
         <w:rPr>
           <w:rFonts w:cs="Times New Roman"/>
         </w:rPr>
-        <w:t xml:space="preserve"> (Shiller, 2000; Baur et al., 2018), yaitu hasrat mengakuisisi barang dengan ekspektasi menjualnya kembali demi perolehan keuntungan modal (</w:t>
+        <w:t xml:space="preserve"> (Shiller, 2000; Baur </w:t>
+      </w:r>
+      <w:r>
+        <w:rPr>
+          <w:rFonts w:cs="Times New Roman"/>
+          <w:i/>
+        </w:rPr>
+        <w:t>et al.</w:t>
+      </w:r>
+      <w:r>
+        <w:rPr>
+          <w:rFonts w:cs="Times New Roman"/>
+        </w:rPr>
+        <w:t>., 2018), yaitu hasrat mengakuisisi barang dengan ekspektasi menjualnya kembali demi perolehan keuntungan modal (</w:t>
       </w:r>
       <w:r>
         <w:rPr>
@@ -8783,7 +9089,7 @@
         <w:pStyle w:val="Heading3"/>
         <w:outlineLvl w:val="2"/>
       </w:pPr>
-      <w:bookmarkStart w:id="23" w:name="_Toc240309614"/>
+      <w:bookmarkStart w:id="23" w:name="_Toc240359948"/>
       <w:r>
         <w:rPr>
           <w:rFonts w:ascii="Times New Roman" w:hAnsi="Times New Roman"/>
@@ -8856,7 +9162,20 @@
         <w:rPr>
           <w:rFonts w:cs="Times New Roman"/>
         </w:rPr>
-        <w:t xml:space="preserve">), dan mendisiplinkan pengeluaran agar selaras dengan rencana keuangan jangka panjang (Tangney et al., 2004; Baumeister, 2002; Vohs and Faber, 2007). Dalam </w:t>
+        <w:t xml:space="preserve">), dan mendisiplinkan pengeluaran agar selaras dengan rencana keuangan jangka panjang (Tangney </w:t>
+      </w:r>
+      <w:r>
+        <w:rPr>
+          <w:rFonts w:cs="Times New Roman"/>
+          <w:i/>
+        </w:rPr>
+        <w:t>et al.</w:t>
+      </w:r>
+      <w:r>
+        <w:rPr>
+          <w:rFonts w:cs="Times New Roman"/>
+        </w:rPr>
+        <w:t xml:space="preserve">., 2004; Baumeister, 2002; Vohs dan Faber, 2007). Dalam </w:t>
       </w:r>
       <w:r>
         <w:rPr>
@@ -8876,7 +9195,7 @@
         <w:rPr>
           <w:rFonts w:cs="Times New Roman"/>
         </w:rPr>
-        <w:t xml:space="preserve"> (Thaler and Shefrin, 1981), kontrol diri bertindak sebagai rem volisional kognitif. Konsumen dengan kontrol diri tinggi mampu menahan desakan emosional dan spekulatif, sehingga pengaruh variabel independen terhadap </w:t>
+        <w:t xml:space="preserve"> (Thaler dan Shefrin, 1981), kontrol diri bertindak sebagai rem volisional kognitif. Konsumen dengan kontrol diri tinggi mampu menahan desakan emosional dan spekulatif, sehingga pengaruh variabel independen terhadap </w:t>
       </w:r>
       <w:r>
         <w:rPr>
@@ -8889,7 +9208,20 @@
         <w:rPr>
           <w:rFonts w:cs="Times New Roman"/>
         </w:rPr>
-        <w:t xml:space="preserve"> diperlemah secara signifikan (Sultan et al., 2012).</w:t>
+        <w:t xml:space="preserve"> diperlemah secara signifikan (Sultan </w:t>
+      </w:r>
+      <w:r>
+        <w:rPr>
+          <w:rFonts w:cs="Times New Roman"/>
+          <w:i/>
+        </w:rPr>
+        <w:t>et al.</w:t>
+      </w:r>
+      <w:r>
+        <w:rPr>
+          <w:rFonts w:cs="Times New Roman"/>
+        </w:rPr>
+        <w:t>., 2012).</w:t>
       </w:r>
     </w:p>
     <w:p>
@@ -8897,7 +9229,7 @@
         <w:pStyle w:val="Heading2"/>
         <w:outlineLvl w:val="1"/>
       </w:pPr>
-      <w:bookmarkStart w:id="24" w:name="_Toc240309615"/>
+      <w:bookmarkStart w:id="24" w:name="_Toc240359949"/>
       <w:r>
         <w:rPr>
           <w:rFonts w:ascii="Times New Roman" w:hAnsi="Times New Roman"/>
@@ -9066,7 +9398,7 @@
                 <w:b/>
                 <w:sz w:val="20"/>
               </w:rPr>
-              <w:t>Variabel &amp; Metode</w:t>
+              <w:t>Variabel dan Metode</w:t>
             </w:r>
           </w:p>
         </w:tc>
@@ -9145,7 +9477,7 @@
               <w:rPr>
                 <w:sz w:val="19"/>
               </w:rPr>
-              <w:t>Pranggabayu and Andjarwati (2022)</w:t>
+              <w:t>Pranggabayu dan Andjarwati (2022)</w:t>
             </w:r>
           </w:p>
         </w:tc>
@@ -9276,7 +9608,7 @@
               <w:rPr>
                 <w:sz w:val="19"/>
               </w:rPr>
-              <w:t>Apidana and Kholifah (2022)</w:t>
+              <w:t>Apidana dan Kholifah (2022)</w:t>
             </w:r>
           </w:p>
         </w:tc>
@@ -9408,7 +9740,7 @@
               <w:rPr>
                 <w:sz w:val="19"/>
               </w:rPr>
-              <w:t>Lienardy and Panasea (2024)</w:t>
+              <w:t>Lienardy dan Panasea (2024)</w:t>
             </w:r>
           </w:p>
         </w:tc>
@@ -9430,7 +9762,7 @@
               <w:rPr>
                 <w:sz w:val="19"/>
               </w:rPr>
-              <w:t>The Role of Self-Control in Moderating the Influence of Shopping Lifestyle and Hedonistic Behavior on Impulsive Buying</w:t>
+              <w:t>The Role of Self-Control in Moderating the Influence of Shopping Lifestyle dan Hedonistic Behavior on Impulsive Buying</w:t>
             </w:r>
           </w:p>
         </w:tc>
@@ -9539,7 +9871,20 @@
               <w:rPr>
                 <w:sz w:val="19"/>
               </w:rPr>
-              <w:t>Gong et al. (2024)</w:t>
+              <w:t xml:space="preserve">Gong </w:t>
+            </w:r>
+            <w:r>
+              <w:rPr>
+                <w:i/>
+                <w:sz w:val="19"/>
+              </w:rPr>
+              <w:t>et al.</w:t>
+            </w:r>
+            <w:r>
+              <w:rPr>
+                <w:sz w:val="19"/>
+              </w:rPr>
+              <w:t>. (2024)</w:t>
             </w:r>
           </w:p>
         </w:tc>
@@ -9670,7 +10015,7 @@
               <w:rPr>
                 <w:sz w:val="19"/>
               </w:rPr>
-              <w:t>Tan and Adyantari (2024)</w:t>
+              <w:t>Tan dan Adyantari (2024)</w:t>
             </w:r>
           </w:p>
         </w:tc>
@@ -9789,7 +10134,20 @@
               <w:rPr>
                 <w:sz w:val="19"/>
               </w:rPr>
-              <w:t>Dewi et al. (2024)</w:t>
+              <w:t xml:space="preserve">Dewi </w:t>
+            </w:r>
+            <w:r>
+              <w:rPr>
+                <w:i/>
+                <w:sz w:val="19"/>
+              </w:rPr>
+              <w:t>et al.</w:t>
+            </w:r>
+            <w:r>
+              <w:rPr>
+                <w:sz w:val="19"/>
+              </w:rPr>
+              <w:t>. (2024)</w:t>
             </w:r>
           </w:p>
         </w:tc>
@@ -9920,7 +10278,7 @@
               <w:rPr>
                 <w:sz w:val="19"/>
               </w:rPr>
-              <w:t>Aryadi and Lingga (2024)</w:t>
+              <w:t>Aryadi dan Lingga (2024)</w:t>
             </w:r>
           </w:p>
         </w:tc>
@@ -9942,7 +10300,7 @@
               <w:rPr>
                 <w:sz w:val="19"/>
               </w:rPr>
-              <w:t>Personal Traits and Motivation Impact on Collectibles as an Alternative Investment: A Case Study of Trading Card Game Community in Greater Jakarta</w:t>
+              <w:t>Personal Traits dan Motivation Impact on Collectibles as an Alternative Investment: A Case Study of Trading Card Game Community in Greater Jakarta</w:t>
             </w:r>
           </w:p>
         </w:tc>
@@ -10183,7 +10541,7 @@
               <w:rPr>
                 <w:sz w:val="19"/>
               </w:rPr>
-              <w:t>Artadita and Firmialy (2024)</w:t>
+              <w:t>Artadita dan Firmialy (2024)</w:t>
             </w:r>
           </w:p>
         </w:tc>
@@ -10205,7 +10563,7 @@
               <w:rPr>
                 <w:sz w:val="19"/>
               </w:rPr>
-              <w:t>How Does Self-Control Moderate Shopping Enjoyment and Impulse Buying Among Generation Z Online Gamers?</w:t>
+              <w:t>How Does Self-Control Moderate Shopping Enjoyment dan Impulse Buying Among Generation Z Online Gamers?</w:t>
             </w:r>
           </w:p>
         </w:tc>
@@ -10301,7 +10659,20 @@
               <w:rPr>
                 <w:sz w:val="19"/>
               </w:rPr>
-              <w:t>Katauke et al. (2023)</w:t>
+              <w:t xml:space="preserve">Katauke </w:t>
+            </w:r>
+            <w:r>
+              <w:rPr>
+                <w:i/>
+                <w:sz w:val="19"/>
+              </w:rPr>
+              <w:t>et al.</w:t>
+            </w:r>
+            <w:r>
+              <w:rPr>
+                <w:sz w:val="19"/>
+              </w:rPr>
+              <w:t>. (2023)</w:t>
             </w:r>
           </w:p>
         </w:tc>
@@ -10323,7 +10694,7 @@
               <w:rPr>
                 <w:sz w:val="19"/>
               </w:rPr>
-              <w:t>Financial Literacy and Impulsivity: Evidence from Japan</w:t>
+              <w:t>Financial Literacy dan Impulsivity: Evidence from Japan</w:t>
             </w:r>
           </w:p>
         </w:tc>
@@ -10398,7 +10769,7 @@
         <w:pStyle w:val="Heading2"/>
         <w:outlineLvl w:val="1"/>
       </w:pPr>
-      <w:bookmarkStart w:id="25" w:name="_Toc240309616"/>
+      <w:bookmarkStart w:id="25" w:name="_Toc240359950"/>
       <w:r>
         <w:rPr>
           <w:rFonts w:ascii="Times New Roman" w:hAnsi="Times New Roman"/>
@@ -10415,7 +10786,7 @@
         <w:pStyle w:val="Heading3"/>
         <w:outlineLvl w:val="2"/>
       </w:pPr>
-      <w:bookmarkStart w:id="26" w:name="_Toc240309617"/>
+      <w:bookmarkStart w:id="26" w:name="_Toc240359951"/>
       <w:r>
         <w:rPr>
           <w:rFonts w:ascii="Times New Roman" w:hAnsi="Times New Roman"/>
@@ -10473,7 +10844,20 @@
         <w:rPr>
           <w:rFonts w:cs="Times New Roman"/>
         </w:rPr>
-        <w:t xml:space="preserve"> Berdasarkan model S-O-R (Mehrabian and Russell, 1974) dan teori konsumsi pengalaman (Hirschman and Holbrook, 1982), motivasi hedonis memposisikan belanja sebagai sarana mencari kesenangan emosional dan fantasi. Rangsangan afektif ini menurunkan pertimbangan rasional dan mendorong tindakan belanja seketika demi mempertahankan suasana hati positif (Babin et al., 1994).</w:t>
+        <w:t xml:space="preserve"> Berdasarkan model S-O-R (Mehrabian dan Russell, 1974) dan teori konsumsi pengalaman (Hirschman dan Holbrook, 1982), motivasi hedonis memposisikan belanja sebagai sarana mencari kesenangan emosional dan fantasi. Rangsangan afektif ini menurunkan pertimbangan rasional dan mendorong tindakan belanja seketika demi mempertahankan suasana hati positif (Babin </w:t>
+      </w:r>
+      <w:r>
+        <w:rPr>
+          <w:rFonts w:cs="Times New Roman"/>
+          <w:i/>
+        </w:rPr>
+        <w:t>et al.</w:t>
+      </w:r>
+      <w:r>
+        <w:rPr>
+          <w:rFonts w:cs="Times New Roman"/>
+        </w:rPr>
+        <w:t>., 1994).</w:t>
       </w:r>
     </w:p>
     <w:p>
@@ -10493,7 +10877,20 @@
         <w:rPr>
           <w:rFonts w:cs="Times New Roman"/>
         </w:rPr>
-        <w:t xml:space="preserve"> Studi empiris terkini oleh Pranggabayu and Andjarwati (2022), Prasetio et al. (2021), serta Artadita and Firmialy (2024) pada </w:t>
+        <w:t xml:space="preserve"> Studi empiris terkini oleh Pranggabayu dan Andjarwati (2022), Prasetio </w:t>
+      </w:r>
+      <w:r>
+        <w:rPr>
+          <w:rFonts w:cs="Times New Roman"/>
+          <w:i/>
+        </w:rPr>
+        <w:t>et al.</w:t>
+      </w:r>
+      <w:r>
+        <w:rPr>
+          <w:rFonts w:cs="Times New Roman"/>
+        </w:rPr>
+        <w:t xml:space="preserve">. (2021), serta Artadita dan Firmialy (2024) pada </w:t>
       </w:r>
       <w:r>
         <w:rPr>
@@ -10611,7 +11008,7 @@
         <w:pStyle w:val="Heading3"/>
         <w:outlineLvl w:val="2"/>
       </w:pPr>
-      <w:bookmarkStart w:id="27" w:name="_Toc240309618"/>
+      <w:bookmarkStart w:id="27" w:name="_Toc240359952"/>
       <w:r>
         <w:rPr>
           <w:rFonts w:ascii="Times New Roman" w:hAnsi="Times New Roman"/>
@@ -10695,7 +11092,20 @@
         <w:rPr>
           <w:rFonts w:cs="Times New Roman"/>
         </w:rPr>
-        <w:t xml:space="preserve"> (Gao et al., 2014), manusia memiliki resistensi alami terhadap ketidaktuntasan (</w:t>
+        <w:t xml:space="preserve"> (Gao </w:t>
+      </w:r>
+      <w:r>
+        <w:rPr>
+          <w:rFonts w:cs="Times New Roman"/>
+          <w:i/>
+        </w:rPr>
+        <w:t>et al.</w:t>
+      </w:r>
+      <w:r>
+        <w:rPr>
+          <w:rFonts w:cs="Times New Roman"/>
+        </w:rPr>
+        <w:t>., 2014), manusia memiliki resistensi alami terhadap ketidaktuntasan (</w:t>
       </w:r>
       <w:r>
         <w:rPr>
@@ -10708,7 +11118,20 @@
         <w:rPr>
           <w:rFonts w:cs="Times New Roman"/>
         </w:rPr>
-        <w:t>). Celah dalam suatu himpunan menciptakan ketegangan kognitif yang mendesak tindakan penyelesaian (Belk, 1995; Barasz et al., 2017).</w:t>
+        <w:t xml:space="preserve">). Celah dalam suatu himpunan menciptakan ketegangan kognitif yang mendesak tindakan penyelesaian (Belk, 1995; Barasz </w:t>
+      </w:r>
+      <w:r>
+        <w:rPr>
+          <w:rFonts w:cs="Times New Roman"/>
+          <w:i/>
+        </w:rPr>
+        <w:t>et al.</w:t>
+      </w:r>
+      <w:r>
+        <w:rPr>
+          <w:rFonts w:cs="Times New Roman"/>
+        </w:rPr>
+        <w:t>., 2017).</w:t>
       </w:r>
     </w:p>
     <w:p>
@@ -10728,7 +11151,20 @@
         <w:rPr>
           <w:rFonts w:cs="Times New Roman"/>
         </w:rPr>
-        <w:t xml:space="preserve"> Selain pembuktian seminal oleh Gao et al. (2014), riset empiris mutakhir pada produk berkemasan acak (</w:t>
+        <w:t xml:space="preserve"> Selain pembuktian seminal oleh Gao </w:t>
+      </w:r>
+      <w:r>
+        <w:rPr>
+          <w:rFonts w:cs="Times New Roman"/>
+          <w:i/>
+        </w:rPr>
+        <w:t>et al.</w:t>
+      </w:r>
+      <w:r>
+        <w:rPr>
+          <w:rFonts w:cs="Times New Roman"/>
+        </w:rPr>
+        <w:t>. (2014), riset empiris mutakhir pada produk berkemasan acak (</w:t>
       </w:r>
       <w:r>
         <w:rPr>
@@ -10741,7 +11177,33 @@
         <w:rPr>
           <w:rFonts w:cs="Times New Roman"/>
         </w:rPr>
-        <w:t>) oleh Gong et al. (2024), Tan and Adyantari (2024), serta Dewi et al. (2024) membuktikan bahwa mekanisme kejutan kemasan, persepsi kelangkaan (</w:t>
+        <w:t xml:space="preserve">) oleh Gong </w:t>
+      </w:r>
+      <w:r>
+        <w:rPr>
+          <w:rFonts w:cs="Times New Roman"/>
+          <w:i/>
+        </w:rPr>
+        <w:t>et al.</w:t>
+      </w:r>
+      <w:r>
+        <w:rPr>
+          <w:rFonts w:cs="Times New Roman"/>
+        </w:rPr>
+        <w:t xml:space="preserve">. (2024), Tan dan Adyantari (2024), serta Dewi </w:t>
+      </w:r>
+      <w:r>
+        <w:rPr>
+          <w:rFonts w:cs="Times New Roman"/>
+          <w:i/>
+        </w:rPr>
+        <w:t>et al.</w:t>
+      </w:r>
+      <w:r>
+        <w:rPr>
+          <w:rFonts w:cs="Times New Roman"/>
+        </w:rPr>
+        <w:t>. (2024) membuktikan bahwa mekanisme kejutan kemasan, persepsi kelangkaan (</w:t>
       </w:r>
       <w:r>
         <w:rPr>
@@ -10865,7 +11327,7 @@
         <w:pStyle w:val="Heading3"/>
         <w:outlineLvl w:val="2"/>
       </w:pPr>
-      <w:bookmarkStart w:id="28" w:name="_Toc240309619"/>
+      <w:bookmarkStart w:id="28" w:name="_Toc240359953"/>
       <w:r>
         <w:rPr>
           <w:rFonts w:ascii="Times New Roman" w:hAnsi="Times New Roman"/>
@@ -10937,7 +11399,7 @@
         <w:rPr>
           <w:rFonts w:cs="Times New Roman"/>
         </w:rPr>
-        <w:t xml:space="preserve"> (Kahneman and Tversky, 1979; Shiller, 2000), motif spekulasi memandu keputusan pembelian berdasarkan ekspektasi keuntungan modal (</w:t>
+        <w:t xml:space="preserve"> (Kahneman dan Tversky, 1979; Shiller, 2000), motif spekulasi memandu keputusan pembelian berdasarkan ekspektasi keuntungan modal (</w:t>
       </w:r>
       <w:r>
         <w:rPr>
@@ -10963,7 +11425,7 @@
         <w:rPr>
           <w:rFonts w:cs="Times New Roman"/>
         </w:rPr>
-        <w:t>), melebih-lebihkan peluang menarik aset bernilai tinggi dari modal kecil (Barber and Odean, 2008).</w:t>
+        <w:t>), melebih-lebihkan peluang menarik aset bernilai tinggi dari modal kecil (Barber dan Odean, 2008).</w:t>
       </w:r>
     </w:p>
     <w:p>
@@ -10983,7 +11445,7 @@
         <w:rPr>
           <w:rFonts w:cs="Times New Roman"/>
         </w:rPr>
-        <w:t xml:space="preserve"> Aryadi and Lingga (2024) membuktikan secara empiris bahwa komunitas penggemar permainan kartu koleksi (</w:t>
+        <w:t xml:space="preserve"> Aryadi dan Lingga (2024) membuktikan secara empiris bahwa komunitas penggemar permainan kartu koleksi (</w:t>
       </w:r>
       <w:r>
         <w:rPr>
@@ -11146,7 +11608,7 @@
         <w:pStyle w:val="Heading3"/>
         <w:outlineLvl w:val="2"/>
       </w:pPr>
-      <w:bookmarkStart w:id="29" w:name="_Toc240309620"/>
+      <w:bookmarkStart w:id="29" w:name="_Toc240359954"/>
       <w:r>
         <w:rPr>
           <w:rFonts w:ascii="Times New Roman" w:hAnsi="Times New Roman"/>
@@ -11249,7 +11711,7 @@
         <w:rPr>
           <w:rFonts w:cs="Times New Roman"/>
         </w:rPr>
-        <w:t xml:space="preserve"> (Thaler and Shefrin, 1981), dorongan hedonis sesaat (</w:t>
+        <w:t xml:space="preserve"> (Thaler dan Shefrin, 1981), dorongan hedonis sesaat (</w:t>
       </w:r>
       <w:r>
         <w:rPr>
@@ -11275,7 +11737,20 @@
         <w:rPr>
           <w:rFonts w:cs="Times New Roman"/>
         </w:rPr>
-        <w:t>). Kontrol diri memungkinkan individu menolak godaan sensorik dan menunda kepuasan demi tujuan finansial jangka panjang (Tangney et al., 2004). Dalam perspektif statistik moderasi, efek interaksi negatif (β₅ &lt; 0) menunjukkan bahwa kemiringan pengaruh (</w:t>
+        <w:t xml:space="preserve">). Kontrol diri memungkinkan individu menolak godaan sensorik dan menunda kepuasan demi tujuan finansial jangka panjang (Tangney </w:t>
+      </w:r>
+      <w:r>
+        <w:rPr>
+          <w:rFonts w:cs="Times New Roman"/>
+          <w:i/>
+        </w:rPr>
+        <w:t>et al.</w:t>
+      </w:r>
+      <w:r>
+        <w:rPr>
+          <w:rFonts w:cs="Times New Roman"/>
+        </w:rPr>
+        <w:t>., 2004). Dalam perspektif statistik moderasi, efek interaksi negatif (β₅ &lt; 0) menunjukkan bahwa kemiringan pengaruh (</w:t>
       </w:r>
       <w:r>
         <w:rPr>
@@ -11328,7 +11803,7 @@
         <w:rPr>
           <w:rFonts w:cs="Times New Roman"/>
         </w:rPr>
-        <w:t xml:space="preserve"> Apidana and Kholifah (2022) serta Lienardy and Panasea (2024) membuktikan secara empiris melalui MRA bahwa </w:t>
+        <w:t xml:space="preserve"> Apidana dan Kholifah (2022) serta Lienardy dan Panasea (2024) membuktikan secara empiris melalui MRA bahwa </w:t>
       </w:r>
       <w:r>
         <w:rPr>
@@ -11354,7 +11829,20 @@
         <w:rPr>
           <w:rFonts w:cs="Times New Roman"/>
         </w:rPr>
-        <w:t>. Temuan ini didukung oleh studi Artadita and Firmialy (2024) yang meneliti kontrol kognitif pada gamer muda di Indonesia serta Katauke et al. (2023) mengenai fungsi regulasi diri dalam menekan perilaku impulsif.</w:t>
+        <w:t xml:space="preserve">. Temuan ini didukung oleh studi Artadita dan Firmialy (2024) yang meneliti kontrol kognitif pada gamer muda di Indonesia serta Katauke </w:t>
+      </w:r>
+      <w:r>
+        <w:rPr>
+          <w:rFonts w:cs="Times New Roman"/>
+          <w:i/>
+        </w:rPr>
+        <w:t>et al.</w:t>
+      </w:r>
+      <w:r>
+        <w:rPr>
+          <w:rFonts w:cs="Times New Roman"/>
+        </w:rPr>
+        <w:t>. (2023) mengenai fungsi regulasi diri dalam menekan perilaku impulsif.</w:t>
       </w:r>
     </w:p>
     <w:p>
@@ -11441,7 +11929,7 @@
         <w:pStyle w:val="Heading3"/>
         <w:outlineLvl w:val="2"/>
       </w:pPr>
-      <w:bookmarkStart w:id="30" w:name="_Toc240309621"/>
+      <w:bookmarkStart w:id="30" w:name="_Toc240359955"/>
       <w:r>
         <w:rPr>
           <w:rFonts w:ascii="Times New Roman" w:hAnsi="Times New Roman"/>
@@ -11531,7 +12019,20 @@
         <w:rPr>
           <w:rFonts w:cs="Times New Roman"/>
         </w:rPr>
-        <w:t>) dimoderasi oleh kapasitas regulasi diri individu. Seseorang dengan kontrol diri matang mampu mentoleransi ketidaknyamanan mental tanpa meresponnya secara reaktif atau tergesa-gesa (Tangney et al., 2004; Baumeister, 2002). Secara matematis, kontrol diri yang tinggi menghasilkan kemiringan bersyarat (∂Y/∂X₂</w:t>
+        <w:t xml:space="preserve">) dimoderasi oleh kapasitas regulasi diri individu. Seseorang dengan kontrol diri matang mampu mentoleransi ketidaknyamanan mental tanpa meresponnya secara reaktif atau tergesa-gesa (Tangney </w:t>
+      </w:r>
+      <w:r>
+        <w:rPr>
+          <w:rFonts w:cs="Times New Roman"/>
+          <w:i/>
+        </w:rPr>
+        <w:t>et al.</w:t>
+      </w:r>
+      <w:r>
+        <w:rPr>
+          <w:rFonts w:cs="Times New Roman"/>
+        </w:rPr>
+        <w:t>., 2004; Baumeister, 2002). Secara matematis, kontrol diri yang tinggi menghasilkan kemiringan bersyarat (∂Y/∂X₂</w:t>
       </w:r>
       <w:r>
         <w:rPr>
@@ -11577,7 +12078,20 @@
         <w:rPr>
           <w:rFonts w:cs="Times New Roman"/>
         </w:rPr>
-        <w:t xml:space="preserve"> Studi perilaku konsumen dan regulasi diri terkini (Apidana and Kholifah, 2022; Katauke et al., 2023) membuktikan bahwa kontrol diri tinggi mengalihkan dorongan psikologis yang reaktif-impulsif menjadi strategi pemenuhan kebutuhan yang terencana dan adaptif terhadap batas anggaran.</w:t>
+        <w:t xml:space="preserve"> Studi perilaku konsumen dan regulasi diri terkini (Apidana dan Kholifah, 2022; Katauke </w:t>
+      </w:r>
+      <w:r>
+        <w:rPr>
+          <w:rFonts w:cs="Times New Roman"/>
+          <w:i/>
+        </w:rPr>
+        <w:t>et al.</w:t>
+      </w:r>
+      <w:r>
+        <w:rPr>
+          <w:rFonts w:cs="Times New Roman"/>
+        </w:rPr>
+        <w:t>., 2023) membuktikan bahwa kontrol diri tinggi mengalihkan dorongan psikologis yang reaktif-impulsif menjadi strategi pemenuhan kebutuhan yang terencana dan adaptif terhadap batas anggaran.</w:t>
       </w:r>
     </w:p>
     <w:p>
@@ -11697,7 +12211,7 @@
         <w:pStyle w:val="Heading3"/>
         <w:outlineLvl w:val="2"/>
       </w:pPr>
-      <w:bookmarkStart w:id="31" w:name="_Toc240309622"/>
+      <w:bookmarkStart w:id="31" w:name="_Toc240359956"/>
       <w:r>
         <w:rPr>
           <w:rFonts w:ascii="Times New Roman" w:hAnsi="Times New Roman"/>
@@ -11787,7 +12301,7 @@
         <w:rPr>
           <w:rFonts w:cs="Times New Roman"/>
         </w:rPr>
-        <w:t>, kontrol diri mendisiplinkan individu untuk menimbang risiko kerugian modal riil dan tidak terjebak dalam euforia transaksi spekulatif berlebihan (Thaler and Shefrin, 1981; Barber and Odean, 2008). Pengaruh spekulasi terhadap pembelian spontan teredam secara bersyarat (∂Y/∂X₃</w:t>
+        <w:t>, kontrol diri mendisiplinkan individu untuk menimbang risiko kerugian modal riil dan tidak terjebak dalam euforia transaksi spekulatif berlebihan (Thaler dan Shefrin, 1981; Barber dan Odean, 2008). Pengaruh spekulasi terhadap pembelian spontan teredam secara bersyarat (∂Y/∂X₃</w:t>
       </w:r>
       <w:r>
         <w:rPr>
@@ -11820,7 +12334,20 @@
         <w:rPr>
           <w:rFonts w:cs="Times New Roman"/>
         </w:rPr>
-        <w:t xml:space="preserve"> Colline (2024), Aryadi and Lingga (2024), serta Katauke et al. (2023) menemukan bahwa literasi dan kontrol diri finansial yang kokoh secara signifikan memitigasi perilaku spekulasi belanja berisiko pada investor dan konsumen muda.</w:t>
+        <w:t xml:space="preserve"> Colline (2024), Aryadi dan Lingga (2024), serta Katauke </w:t>
+      </w:r>
+      <w:r>
+        <w:rPr>
+          <w:rFonts w:cs="Times New Roman"/>
+          <w:i/>
+        </w:rPr>
+        <w:t>et al.</w:t>
+      </w:r>
+      <w:r>
+        <w:rPr>
+          <w:rFonts w:cs="Times New Roman"/>
+        </w:rPr>
+        <w:t>. (2023) menemukan bahwa literasi dan kontrol diri finansial yang kokoh secara signifikan memitigasi perilaku spekulasi belanja berisiko pada investor dan konsumen muda.</w:t>
       </w:r>
     </w:p>
     <w:p>
@@ -11920,7 +12447,7 @@
         <w:pStyle w:val="Heading2"/>
         <w:outlineLvl w:val="1"/>
       </w:pPr>
-      <w:bookmarkStart w:id="32" w:name="_Toc240309623"/>
+      <w:bookmarkStart w:id="32" w:name="_Toc240359957"/>
       <w:r>
         <w:rPr>
           <w:rFonts w:ascii="Times New Roman" w:hAnsi="Times New Roman"/>
@@ -11956,7 +12483,7 @@
         </w:rPr>
         <w:lastRenderedPageBreak/>
         <w:drawing>
-          <wp:inline distT="0" distB="0" distL="0" distR="0" wp14:anchorId="0613C3B0" wp14:editId="3F46F2BB">
+          <wp:inline distT="0" distB="0" distL="0" distR="0" wp14:anchorId="2897AB07" wp14:editId="5D88E1F0">
             <wp:extent cx="5040000" cy="2753704"/>
             <wp:effectExtent l="0" t="0" r="0" b="0"/>
             <wp:docPr id="5" name="Picture 5"/>
@@ -12029,7 +12556,7 @@
         <w:pStyle w:val="Heading1"/>
         <w:outlineLvl w:val="0"/>
       </w:pPr>
-      <w:bookmarkStart w:id="33" w:name="_Toc240309624"/>
+      <w:bookmarkStart w:id="33" w:name="_Toc240359958"/>
       <w:r>
         <w:rPr>
           <w:rFonts w:ascii="Times New Roman" w:hAnsi="Times New Roman"/>
@@ -12052,20 +12579,20 @@
         <w:rPr>
           <w:rFonts w:cs="Times New Roman"/>
         </w:rPr>
-        <w:t xml:space="preserve">1. Aiken, L. S. and West, S. G. (1991). </w:t>
-      </w:r>
-      <w:r>
-        <w:rPr>
-          <w:rFonts w:cs="Times New Roman"/>
-          <w:i/>
-        </w:rPr>
-        <w:t>Multiple Regression: Testing and Interpreting Interactions</w:t>
-      </w:r>
-      <w:r>
-        <w:rPr>
-          <w:rFonts w:cs="Times New Roman"/>
-        </w:rPr>
-        <w:t>. Sage Publications, Newbury Park, CA.</w:t>
+        <w:t xml:space="preserve">Aiken, L. S. dan West, S. G. 1991. </w:t>
+      </w:r>
+      <w:r>
+        <w:rPr>
+          <w:rFonts w:cs="Times New Roman"/>
+          <w:i/>
+        </w:rPr>
+        <w:t>Multiple Regression: Testing dan Interpreting Interactions</w:t>
+      </w:r>
+      <w:r>
+        <w:rPr>
+          <w:rFonts w:cs="Times New Roman"/>
+        </w:rPr>
+        <w:t>. Newbury Park, CA: Sage Publications.</w:t>
       </w:r>
     </w:p>
     <w:p>
@@ -12078,20 +12605,20 @@
         <w:rPr>
           <w:rFonts w:cs="Times New Roman"/>
         </w:rPr>
-        <w:t xml:space="preserve">2. Amos, C., Holmes, G. R., and Keneson, W. C. (2014). A meta-analysis of consumer impulse buying. </w:t>
-      </w:r>
-      <w:r>
-        <w:rPr>
-          <w:rFonts w:cs="Times New Roman"/>
-          <w:i/>
-        </w:rPr>
-        <w:t>Journal of Retailing and Consumer Services</w:t>
-      </w:r>
-      <w:r>
-        <w:rPr>
-          <w:rFonts w:cs="Times New Roman"/>
-        </w:rPr>
-        <w:t>, 21(2):86–97.</w:t>
+        <w:t xml:space="preserve">Amos, C., Holmes, G. R., dan Keneson, W. C. 2014. “A meta-analysis of consumer impulse buying”. </w:t>
+      </w:r>
+      <w:r>
+        <w:rPr>
+          <w:rFonts w:cs="Times New Roman"/>
+          <w:i/>
+        </w:rPr>
+        <w:t>Journal of Retailing dan Consumer Services</w:t>
+      </w:r>
+      <w:r>
+        <w:rPr>
+          <w:rFonts w:cs="Times New Roman"/>
+        </w:rPr>
+        <w:t xml:space="preserve"> 21(2): 86–97.</w:t>
       </w:r>
     </w:p>
     <w:p>
@@ -12104,20 +12631,20 @@
         <w:rPr>
           <w:rFonts w:cs="Times New Roman"/>
         </w:rPr>
-        <w:t xml:space="preserve">3. Apidana, Y. H. and Kholifah (2022). Peran self control dalam memoderasi pengaruh hedonic motives dan shopping lifestyle terhadap impulse buying. </w:t>
-      </w:r>
-      <w:r>
-        <w:rPr>
-          <w:rFonts w:cs="Times New Roman"/>
-          <w:i/>
-        </w:rPr>
-        <w:t>Journal of Digital Business and Management</w:t>
-      </w:r>
-      <w:r>
-        <w:rPr>
-          <w:rFonts w:cs="Times New Roman"/>
-        </w:rPr>
-        <w:t>, 1(1):26–40.</w:t>
+        <w:t xml:space="preserve">Apidana, Y. H. dan Kholifah. 2022. “Peran self control dalam memoderasi pengaruh hedonic motives dan shopping lifestyle terhadap impulse buying”. </w:t>
+      </w:r>
+      <w:r>
+        <w:rPr>
+          <w:rFonts w:cs="Times New Roman"/>
+          <w:i/>
+        </w:rPr>
+        <w:t>Journal of Digital Business dan Management</w:t>
+      </w:r>
+      <w:r>
+        <w:rPr>
+          <w:rFonts w:cs="Times New Roman"/>
+        </w:rPr>
+        <w:t xml:space="preserve"> 1(1): 26–40.</w:t>
       </w:r>
     </w:p>
     <w:p>
@@ -12130,7 +12657,7 @@
         <w:rPr>
           <w:rFonts w:cs="Times New Roman"/>
         </w:rPr>
-        <w:t xml:space="preserve">4. Arnold, M. J. and Reynolds, K. E. (2003). Hedonic shopping motivations. </w:t>
+        <w:t xml:space="preserve">Arnold, M. J. dan Reynolds, K. E. 2003. “Hedonic shopping motivations”. </w:t>
       </w:r>
       <w:r>
         <w:rPr>
@@ -12143,7 +12670,7 @@
         <w:rPr>
           <w:rFonts w:cs="Times New Roman"/>
         </w:rPr>
-        <w:t>, 79(2):77–95.</w:t>
+        <w:t xml:space="preserve"> 79(2): 77–95.</w:t>
       </w:r>
     </w:p>
     <w:p>
@@ -12156,7 +12683,7 @@
         <w:rPr>
           <w:rFonts w:cs="Times New Roman"/>
         </w:rPr>
-        <w:t xml:space="preserve">5. Artadita, S. and Firmialy, S. D. (2024). How does self-control moderate shopping enjoyment and impulse buying among generation z online gamers? </w:t>
+        <w:t xml:space="preserve">Artadita, S. dan Firmialy, S. D. 2024. “How does self-control moderate shopping enjoyment and impulse buying among Generation Z online gamers?”. </w:t>
       </w:r>
       <w:r>
         <w:rPr>
@@ -12169,7 +12696,7 @@
         <w:rPr>
           <w:rFonts w:cs="Times New Roman"/>
         </w:rPr>
-        <w:t>, 15(2):179–189.</w:t>
+        <w:t xml:space="preserve"> 15(2): 179–189.</w:t>
       </w:r>
     </w:p>
     <w:p>
@@ -12182,33 +12709,20 @@
         <w:rPr>
           <w:rFonts w:cs="Times New Roman"/>
         </w:rPr>
-        <w:t xml:space="preserve">6. Aryadi, A. and Lingga, M. (2024). Personal traits and motivation impact on collectibles as an alternative investment: A case study of trading card game community in greater jakarta. In </w:t>
-      </w:r>
-      <w:r>
-        <w:rPr>
-          <w:rFonts w:cs="Times New Roman"/>
-          <w:i/>
-        </w:rPr>
-        <w:t>Proceedings of the 5th International Conference on Global Innovation and Trends in Economy (INCOGITE 2024)</w:t>
-      </w:r>
-      <w:r>
-        <w:rPr>
-          <w:rFonts w:cs="Times New Roman"/>
-        </w:rPr>
-        <w:t xml:space="preserve">, volume 302 of </w:t>
-      </w:r>
-      <w:r>
-        <w:rPr>
-          <w:rFonts w:cs="Times New Roman"/>
-          <w:i/>
-        </w:rPr>
-        <w:t>Advances in Economics, Business and Management Research</w:t>
-      </w:r>
-      <w:r>
-        <w:rPr>
-          <w:rFonts w:cs="Times New Roman"/>
-        </w:rPr>
-        <w:t>, pages 1–12. Atlantis Press.</w:t>
+        <w:t xml:space="preserve">Aryadi, A. dan Lingga, M. 2024. “Personal traits and motivation impact on collectibles as an alternative investment: A case study of Trading Card Game community in Greater Jakarta”. </w:t>
+      </w:r>
+      <w:r>
+        <w:rPr>
+          <w:rFonts w:cs="Times New Roman"/>
+          <w:i/>
+        </w:rPr>
+        <w:t>Advances in Economics, Business dan Management Research</w:t>
+      </w:r>
+      <w:r>
+        <w:rPr>
+          <w:rFonts w:cs="Times New Roman"/>
+        </w:rPr>
+        <w:t xml:space="preserve"> 302: 1–12.</w:t>
       </w:r>
     </w:p>
     <w:p>
@@ -12221,7 +12735,7 @@
         <w:rPr>
           <w:rFonts w:cs="Times New Roman"/>
         </w:rPr>
-        <w:t xml:space="preserve">7. Babin, B. J., Darden, W. R., and Griffin, M. (1994). Work and/or fun: Measuring hedonic and utilitarian shopping value. </w:t>
+        <w:t xml:space="preserve">Babin, B. J., Darden, W. R., dan Griffin, M. 1994. “Work and/or fun: Measuring hedonic and utilitarian shopping value”. </w:t>
       </w:r>
       <w:r>
         <w:rPr>
@@ -12234,7 +12748,7 @@
         <w:rPr>
           <w:rFonts w:cs="Times New Roman"/>
         </w:rPr>
-        <w:t>, 20(4):644–656.</w:t>
+        <w:t xml:space="preserve"> 20(4): 644–656.</w:t>
       </w:r>
     </w:p>
     <w:p>
@@ -12247,7 +12761,7 @@
         <w:rPr>
           <w:rFonts w:cs="Times New Roman"/>
         </w:rPr>
-        <w:t xml:space="preserve">8. Barasz, K., John, L. K., Keenan, E. A., and Norton, M. I. (2017). Pseudo-set framing: How framing directs consumer behavior toward completeness. </w:t>
+        <w:t xml:space="preserve">Barasz, K., John, L. K., Keenan, E. A., dan Norton, M. I. 2017. “Pseudo-set framing: How framing directs consumer behavior toward completeness”. </w:t>
       </w:r>
       <w:r>
         <w:rPr>
@@ -12260,7 +12774,7 @@
         <w:rPr>
           <w:rFonts w:cs="Times New Roman"/>
         </w:rPr>
-        <w:t>, 44(4):737–759.</w:t>
+        <w:t xml:space="preserve"> 44(4): 737–759.</w:t>
       </w:r>
     </w:p>
     <w:p>
@@ -12273,7 +12787,7 @@
         <w:rPr>
           <w:rFonts w:cs="Times New Roman"/>
         </w:rPr>
-        <w:t xml:space="preserve">9. Barber, B. M. and Odean, T. (2008). All that glitters: The effect of attention and news on the buying behavior of individual and institutional investors. </w:t>
+        <w:t xml:space="preserve">Barber, B. M. dan Odean, T. 2008. “All that glitters: The effect of attention and news on the buying behavior of individual and institutional investors”. </w:t>
       </w:r>
       <w:r>
         <w:rPr>
@@ -12286,7 +12800,7 @@
         <w:rPr>
           <w:rFonts w:cs="Times New Roman"/>
         </w:rPr>
-        <w:t>, 21(2):785–818.</w:t>
+        <w:t xml:space="preserve"> 21(2): 785–818.</w:t>
       </w:r>
     </w:p>
     <w:p>
@@ -12299,7 +12813,7 @@
         <w:rPr>
           <w:rFonts w:cs="Times New Roman"/>
         </w:rPr>
-        <w:t xml:space="preserve">10. Baumeister, R. F. (2002). Yielding to temptation: Self-control failure, impulsive purchasing, and consumer behavior. </w:t>
+        <w:t xml:space="preserve">Baumeister, R. F. 2002. “Yielding to temptation: Self-control failure, impulsive purchasing, and consumer behavior”. </w:t>
       </w:r>
       <w:r>
         <w:rPr>
@@ -12312,7 +12826,7 @@
         <w:rPr>
           <w:rFonts w:cs="Times New Roman"/>
         </w:rPr>
-        <w:t>, 28(4):670–676.</w:t>
+        <w:t xml:space="preserve"> 28(4): 670–676.</w:t>
       </w:r>
     </w:p>
     <w:p>
@@ -12325,7 +12839,7 @@
         <w:rPr>
           <w:rFonts w:cs="Times New Roman"/>
         </w:rPr>
-        <w:t xml:space="preserve">11. Baur, D. G., Dimpfl, T., and Kuck, K. (2018). Bitcoin, gold and the US dollar – a replication and extension. </w:t>
+        <w:t xml:space="preserve">Baur, D. G., Dimpfl, T., dan Kuck, K. 2018. “Bitcoin, gold and the US dollar – a replication and extension”. </w:t>
       </w:r>
       <w:r>
         <w:rPr>
@@ -12338,7 +12852,7 @@
         <w:rPr>
           <w:rFonts w:cs="Times New Roman"/>
         </w:rPr>
-        <w:t>, 25:103–110.</w:t>
+        <w:t xml:space="preserve"> 25: 103–110.</w:t>
       </w:r>
     </w:p>
     <w:p>
@@ -12351,7 +12865,7 @@
         <w:rPr>
           <w:rFonts w:cs="Times New Roman"/>
         </w:rPr>
-        <w:t xml:space="preserve">12. Beatty, S. E. and Ferrell, M. E. (1998). Impulse buying: Modeling its precursors. </w:t>
+        <w:t xml:space="preserve">Beatty, S. E. dan Ferrell, M. E. 1998. “Impulse buying: Modeling its precursors”. </w:t>
       </w:r>
       <w:r>
         <w:rPr>
@@ -12364,7 +12878,7 @@
         <w:rPr>
           <w:rFonts w:cs="Times New Roman"/>
         </w:rPr>
-        <w:t>, 74(2):169–191.</w:t>
+        <w:t xml:space="preserve"> 74(2): 169–191.</w:t>
       </w:r>
     </w:p>
     <w:p>
@@ -12377,8 +12891,7 @@
         <w:rPr>
           <w:rFonts w:cs="Times New Roman"/>
         </w:rPr>
-        <w:lastRenderedPageBreak/>
-        <w:t xml:space="preserve">13. Belk, R. W. (1995). </w:t>
+        <w:t xml:space="preserve">Belk, R. W. 1995. </w:t>
       </w:r>
       <w:r>
         <w:rPr>
@@ -12391,7 +12904,7 @@
         <w:rPr>
           <w:rFonts w:cs="Times New Roman"/>
         </w:rPr>
-        <w:t>. Routledge, London.</w:t>
+        <w:t>. London: Routledge.</w:t>
       </w:r>
     </w:p>
     <w:p>
@@ -12404,7 +12917,8 @@
         <w:rPr>
           <w:rFonts w:cs="Times New Roman"/>
         </w:rPr>
-        <w:t xml:space="preserve">14. Cohen, J. (1988). </w:t>
+        <w:lastRenderedPageBreak/>
+        <w:t xml:space="preserve">Cohen, J. 1988. </w:t>
       </w:r>
       <w:r>
         <w:rPr>
@@ -12417,7 +12931,7 @@
         <w:rPr>
           <w:rFonts w:cs="Times New Roman"/>
         </w:rPr>
-        <w:t>. Lawrence Erlbaum Associates, Hillsdale, NJ, 2 edition.</w:t>
+        <w:t>. Edisi 2. Hillsdale, NJ: Lawrence Erlbaum Associates.</w:t>
       </w:r>
     </w:p>
     <w:p>
@@ -12430,20 +12944,20 @@
         <w:rPr>
           <w:rFonts w:cs="Times New Roman"/>
         </w:rPr>
-        <w:t xml:space="preserve">15. Colline, F. (2024). Biases in indonesian stock investor behavior. </w:t>
-      </w:r>
-      <w:r>
-        <w:rPr>
-          <w:rFonts w:cs="Times New Roman"/>
-          <w:i/>
-        </w:rPr>
-        <w:t>Accounting and Finance Studies</w:t>
-      </w:r>
-      <w:r>
-        <w:rPr>
-          <w:rFonts w:cs="Times New Roman"/>
-        </w:rPr>
-        <w:t>, 4(2):88–98.</w:t>
+        <w:t xml:space="preserve">Colline, F. 2024. “Biases in Indonesian stock investor behavior”. </w:t>
+      </w:r>
+      <w:r>
+        <w:rPr>
+          <w:rFonts w:cs="Times New Roman"/>
+          <w:i/>
+        </w:rPr>
+        <w:t>Accounting dan Finance Studies</w:t>
+      </w:r>
+      <w:r>
+        <w:rPr>
+          <w:rFonts w:cs="Times New Roman"/>
+        </w:rPr>
+        <w:t xml:space="preserve"> 4(2): 88–98.</w:t>
       </w:r>
     </w:p>
     <w:p>
@@ -12456,7 +12970,7 @@
         <w:rPr>
           <w:rFonts w:cs="Times New Roman"/>
         </w:rPr>
-        <w:t xml:space="preserve">16. Dewi, M. M. L. S., Budoyo, V. D., and Mustikasari, F. (2024). Understanding impulse buying behavior: The case of blind box purchases in indonesia. </w:t>
+        <w:t xml:space="preserve">Dewi, M. M. L. S., Budoyo, V. D., dan Mustikasari, F. 2024. “Understanding impulse buying behavior: The case of blind box purchases in Indonesia”. </w:t>
       </w:r>
       <w:r>
         <w:rPr>
@@ -12469,7 +12983,7 @@
         <w:rPr>
           <w:rFonts w:cs="Times New Roman"/>
         </w:rPr>
-        <w:t>, 5(2):88–100.</w:t>
+        <w:t xml:space="preserve"> 5(2): 88–100.</w:t>
       </w:r>
     </w:p>
     <w:p>
@@ -12482,7 +12996,7 @@
         <w:rPr>
           <w:rFonts w:cs="Times New Roman"/>
         </w:rPr>
-        <w:t xml:space="preserve">17. Fama, E. F. (1970). Efficient capital markets: A review of theory and empirical work. </w:t>
+        <w:t xml:space="preserve">Fama, E. F. 1970. “Efficient capital markets: A review of theory and empirical work”. </w:t>
       </w:r>
       <w:r>
         <w:rPr>
@@ -12495,7 +13009,7 @@
         <w:rPr>
           <w:rFonts w:cs="Times New Roman"/>
         </w:rPr>
-        <w:t>, 25(2):383–417.</w:t>
+        <w:t xml:space="preserve"> 25(2): 383–417.</w:t>
       </w:r>
     </w:p>
     <w:p>
@@ -12508,7 +13022,7 @@
         <w:rPr>
           <w:rFonts w:cs="Times New Roman"/>
         </w:rPr>
-        <w:t xml:space="preserve">18. Gao, L., Huang, Y., and Simonson, I. (2014). The ``Completing the set'' effect. </w:t>
+        <w:t xml:space="preserve">Gao, L., Huang, Y., dan Simonson, I. 2014. “The 'Completing the set' effect”. </w:t>
       </w:r>
       <w:r>
         <w:rPr>
@@ -12521,7 +13035,7 @@
         <w:rPr>
           <w:rFonts w:cs="Times New Roman"/>
         </w:rPr>
-        <w:t>, 51(2):256–273.</w:t>
+        <w:t xml:space="preserve"> 51(2): 256–273.</w:t>
       </w:r>
     </w:p>
     <w:p>
@@ -12534,7 +13048,7 @@
         <w:rPr>
           <w:rFonts w:cs="Times New Roman"/>
         </w:rPr>
-        <w:t xml:space="preserve">19. Ghozali, I. (2018). </w:t>
+        <w:t xml:space="preserve">Ghozali, I. 2018. </w:t>
       </w:r>
       <w:r>
         <w:rPr>
@@ -12547,7 +13061,7 @@
         <w:rPr>
           <w:rFonts w:cs="Times New Roman"/>
         </w:rPr>
-        <w:t>. Badan Penerbit Universitas Diponegoro, Semarang, 9 edition.</w:t>
+        <w:t>. Edisi 9. Semarang: Badan Penerbit Universitas Diponegoro.</w:t>
       </w:r>
     </w:p>
     <w:p>
@@ -12560,7 +13074,7 @@
         <w:rPr>
           <w:rFonts w:cs="Times New Roman"/>
         </w:rPr>
-        <w:t xml:space="preserve">20. Gong, X., Yee, C. L., Lee, S. Y., Saif, A. N. M., Liu, M., and Anonthi, F. (2024). Unveiling the enigma of blind box impulse buying curiosity: The moderating role of price consciousness. </w:t>
+        <w:t xml:space="preserve">Gong, X., Yee, C. L., Lee, S. Y., Saif, A. N. M., Liu, M., dan Anonthi, F. 2024. “Unveiling the enigma of blind box impulse buying curiosity: The moderating role of price consciousness”. </w:t>
       </w:r>
       <w:r>
         <w:rPr>
@@ -12573,7 +13087,7 @@
         <w:rPr>
           <w:rFonts w:cs="Times New Roman"/>
         </w:rPr>
-        <w:t>, 10(24):e40564.</w:t>
+        <w:t xml:space="preserve"> 10(24): e40564.</w:t>
       </w:r>
     </w:p>
     <w:p>
@@ -12586,7 +13100,7 @@
         <w:rPr>
           <w:rFonts w:cs="Times New Roman"/>
         </w:rPr>
-        <w:t xml:space="preserve">21. Green, S. B. (1991). How many subjects does it take to do a regression analysis? </w:t>
+        <w:t xml:space="preserve">Green, S. B. 1991. “How many subjects does it take to do a regression analysis?”. </w:t>
       </w:r>
       <w:r>
         <w:rPr>
@@ -12599,7 +13113,7 @@
         <w:rPr>
           <w:rFonts w:cs="Times New Roman"/>
         </w:rPr>
-        <w:t>, 26(3):499–510.</w:t>
+        <w:t xml:space="preserve"> 26(3): 499–510.</w:t>
       </w:r>
     </w:p>
     <w:p>
@@ -12612,20 +13126,20 @@
         <w:rPr>
           <w:rFonts w:cs="Times New Roman"/>
         </w:rPr>
-        <w:t xml:space="preserve">22. Gültekin, B. and Özer, L. (2012). The influence of hedonic motives and browsing on impulse buying. </w:t>
-      </w:r>
-      <w:r>
-        <w:rPr>
-          <w:rFonts w:cs="Times New Roman"/>
-          <w:i/>
-        </w:rPr>
-        <w:t>Journal of Economics and Behavioral Studies</w:t>
-      </w:r>
-      <w:r>
-        <w:rPr>
-          <w:rFonts w:cs="Times New Roman"/>
-        </w:rPr>
-        <w:t>, 4(3):180–189.</w:t>
+        <w:t xml:space="preserve">Gültekin, B. dan Özer, L. 2012. “The influence of hedonic motives and browsing on impulse buying”. </w:t>
+      </w:r>
+      <w:r>
+        <w:rPr>
+          <w:rFonts w:cs="Times New Roman"/>
+          <w:i/>
+        </w:rPr>
+        <w:t>Journal of Economics dan Behavioral Studies</w:t>
+      </w:r>
+      <w:r>
+        <w:rPr>
+          <w:rFonts w:cs="Times New Roman"/>
+        </w:rPr>
+        <w:t xml:space="preserve"> 4(3): 180–189.</w:t>
       </w:r>
     </w:p>
     <w:p>
@@ -12638,7 +13152,7 @@
         <w:rPr>
           <w:rFonts w:cs="Times New Roman"/>
         </w:rPr>
-        <w:t xml:space="preserve">23. Hair, J. F., Black, W. C., Babin, B. J., and Anderson, R. E. (2019). </w:t>
+        <w:t xml:space="preserve">Hair, J. F., Black, W. C., Babin, B. J., dan Anderson, R. E. 2019. </w:t>
       </w:r>
       <w:r>
         <w:rPr>
@@ -12651,7 +13165,7 @@
         <w:rPr>
           <w:rFonts w:cs="Times New Roman"/>
         </w:rPr>
-        <w:t>. Cengage Learning, Boston, MA, 8th edition.</w:t>
+        <w:t>. Edisi 8. Boston, MA: Cengage Learning.</w:t>
       </w:r>
     </w:p>
     <w:p>
@@ -12664,7 +13178,7 @@
         <w:rPr>
           <w:rFonts w:cs="Times New Roman"/>
         </w:rPr>
-        <w:t xml:space="preserve">24. Hayes, A. F. (2018). </w:t>
+        <w:t xml:space="preserve">Hayes, A. F. 2018. </w:t>
       </w:r>
       <w:r>
         <w:rPr>
@@ -12677,7 +13191,7 @@
         <w:rPr>
           <w:rFonts w:cs="Times New Roman"/>
         </w:rPr>
-        <w:t>. The Guilford Press, New York, 2nd edition.</w:t>
+        <w:t>. Edisi 2. New York: The Guilford Press.</w:t>
       </w:r>
     </w:p>
     <w:p>
@@ -12690,7 +13204,7 @@
         <w:rPr>
           <w:rFonts w:cs="Times New Roman"/>
         </w:rPr>
-        <w:t xml:space="preserve">25. Hirschman, E. C. and Holbrook, M. B. (1982). Hedonic consumption: Emerging concepts, methods and propositions. </w:t>
+        <w:t xml:space="preserve">Hirschman, E. C. dan Holbrook, M. B. 1982. “Hedonic consumption: Emerging concepts, methods and propositions”. </w:t>
       </w:r>
       <w:r>
         <w:rPr>
@@ -12703,7 +13217,7 @@
         <w:rPr>
           <w:rFonts w:cs="Times New Roman"/>
         </w:rPr>
-        <w:t>, 46(3):92–101.</w:t>
+        <w:t xml:space="preserve"> 46(3): 92–101.</w:t>
       </w:r>
     </w:p>
     <w:p>
@@ -12716,7 +13230,7 @@
         <w:rPr>
           <w:rFonts w:cs="Times New Roman"/>
         </w:rPr>
-        <w:t xml:space="preserve">26. Kahneman, D. and Tversky, A. (1979). Prospect theory: An analysis of decision under risk. </w:t>
+        <w:t xml:space="preserve">Kahneman, D. dan Tversky, A. 1979. “Prospect theory: An analysis of decision under risk”. </w:t>
       </w:r>
       <w:r>
         <w:rPr>
@@ -12729,7 +13243,7 @@
         <w:rPr>
           <w:rFonts w:cs="Times New Roman"/>
         </w:rPr>
-        <w:t>, 47(2):263–292.</w:t>
+        <w:t xml:space="preserve"> 47(2): 263–292.</w:t>
       </w:r>
     </w:p>
     <w:p>
@@ -12742,7 +13256,7 @@
         <w:rPr>
           <w:rFonts w:cs="Times New Roman"/>
         </w:rPr>
-        <w:t xml:space="preserve">27. Katauke, T., Fukuda, S., Khan, M. S. R., and Kadoya, Y. (2023). Financial literacy and impulsivity: Evidence from Japan. </w:t>
+        <w:t xml:space="preserve">Katauke, T., Fukuda, S., Khan, M. S. R., dan Kadoya, Y. 2023. “Financial literacy and impulsivity: Evidence from Japan”. </w:t>
       </w:r>
       <w:r>
         <w:rPr>
@@ -12755,7 +13269,7 @@
         <w:rPr>
           <w:rFonts w:cs="Times New Roman"/>
         </w:rPr>
-        <w:t>, 15(9):7267.</w:t>
+        <w:t xml:space="preserve"> 15(9): 7267.</w:t>
       </w:r>
     </w:p>
     <w:p>
@@ -12768,21 +13282,20 @@
         <w:rPr>
           <w:rFonts w:cs="Times New Roman"/>
         </w:rPr>
-        <w:lastRenderedPageBreak/>
-        <w:t xml:space="preserve">28. Lienardy, G. V. and Panasea, I. G. N. O. (2024). The role of self-control in moderating the influence of shopping lifestyle and hedonistic behavior on impulsive buying. </w:t>
-      </w:r>
-      <w:r>
-        <w:rPr>
-          <w:rFonts w:cs="Times New Roman"/>
-          <w:i/>
-        </w:rPr>
-        <w:t>Business and Investment Review</w:t>
-      </w:r>
-      <w:r>
-        <w:rPr>
-          <w:rFonts w:cs="Times New Roman"/>
-        </w:rPr>
-        <w:t>, 2(2):13–28.</w:t>
+        <w:t xml:space="preserve">Keynes, J. M. 1936. </w:t>
+      </w:r>
+      <w:r>
+        <w:rPr>
+          <w:rFonts w:cs="Times New Roman"/>
+          <w:i/>
+        </w:rPr>
+        <w:t>The General Theory of Employment, Interest dan Money</w:t>
+      </w:r>
+      <w:r>
+        <w:rPr>
+          <w:rFonts w:cs="Times New Roman"/>
+        </w:rPr>
+        <w:t>. London: Macmillan.</w:t>
       </w:r>
     </w:p>
     <w:p>
@@ -12795,20 +13308,21 @@
         <w:rPr>
           <w:rFonts w:cs="Times New Roman"/>
         </w:rPr>
-        <w:t xml:space="preserve">29. Long, M. M. and Schiffman, L. G. (2000). Consumption values and relationships: segmenting the market for collectibles. </w:t>
-      </w:r>
-      <w:r>
-        <w:rPr>
-          <w:rFonts w:cs="Times New Roman"/>
-          <w:i/>
-        </w:rPr>
-        <w:t>Journal of Consumer Marketing</w:t>
-      </w:r>
-      <w:r>
-        <w:rPr>
-          <w:rFonts w:cs="Times New Roman"/>
-        </w:rPr>
-        <w:t>, 17(3):214–229.</w:t>
+        <w:lastRenderedPageBreak/>
+        <w:t xml:space="preserve">Lienardy, G. V. dan Panasea, I. G. N. O. 2024. “The role of self-control in moderating the influence of shopping lifestyle and hedonistic behavior on impulsive buying”. </w:t>
+      </w:r>
+      <w:r>
+        <w:rPr>
+          <w:rFonts w:cs="Times New Roman"/>
+          <w:i/>
+        </w:rPr>
+        <w:t>Business dan Investment Review</w:t>
+      </w:r>
+      <w:r>
+        <w:rPr>
+          <w:rFonts w:cs="Times New Roman"/>
+        </w:rPr>
+        <w:t xml:space="preserve"> 2(2): 13–28.</w:t>
       </w:r>
     </w:p>
     <w:p>
@@ -12821,20 +13335,20 @@
         <w:rPr>
           <w:rFonts w:cs="Times New Roman"/>
         </w:rPr>
-        <w:t xml:space="preserve">30. Mehrabian, A. and Russell, J. A. (1974). </w:t>
-      </w:r>
-      <w:r>
-        <w:rPr>
-          <w:rFonts w:cs="Times New Roman"/>
-          <w:i/>
-        </w:rPr>
-        <w:t>An Approach to Environmental Psychology</w:t>
-      </w:r>
-      <w:r>
-        <w:rPr>
-          <w:rFonts w:cs="Times New Roman"/>
-        </w:rPr>
-        <w:t>. MIT Press, Cambridge, MA.</w:t>
+        <w:t xml:space="preserve">Long, M. M. dan Schiffman, L. G. 2000. “Consumption values and relationships: segmenting the market for collectibles”. </w:t>
+      </w:r>
+      <w:r>
+        <w:rPr>
+          <w:rFonts w:cs="Times New Roman"/>
+          <w:i/>
+        </w:rPr>
+        <w:t>Journal of Consumer Marketing</w:t>
+      </w:r>
+      <w:r>
+        <w:rPr>
+          <w:rFonts w:cs="Times New Roman"/>
+        </w:rPr>
+        <w:t xml:space="preserve"> 17(3): 214–229.</w:t>
       </w:r>
     </w:p>
     <w:p>
@@ -12847,20 +13361,20 @@
         <w:rPr>
           <w:rFonts w:cs="Times New Roman"/>
         </w:rPr>
-        <w:t xml:space="preserve">31. Peck, J. and Childers, T. L. (2006). If i touch it i have to have it: Individual and environmental influences on impulse purchasing. </w:t>
-      </w:r>
-      <w:r>
-        <w:rPr>
-          <w:rFonts w:cs="Times New Roman"/>
-          <w:i/>
-        </w:rPr>
-        <w:t>Journal of Business Research</w:t>
-      </w:r>
-      <w:r>
-        <w:rPr>
-          <w:rFonts w:cs="Times New Roman"/>
-        </w:rPr>
-        <w:t>, 59(6):765–769.</w:t>
+        <w:t xml:space="preserve">Mehrabian, A. dan Russell, J. A. 1974. </w:t>
+      </w:r>
+      <w:r>
+        <w:rPr>
+          <w:rFonts w:cs="Times New Roman"/>
+          <w:i/>
+        </w:rPr>
+        <w:t>An Approach to Environmental Psychology</w:t>
+      </w:r>
+      <w:r>
+        <w:rPr>
+          <w:rFonts w:cs="Times New Roman"/>
+        </w:rPr>
+        <w:t>. Cambridge, MA: MIT Press.</w:t>
       </w:r>
     </w:p>
     <w:p>
@@ -12873,20 +13387,20 @@
         <w:rPr>
           <w:rFonts w:cs="Times New Roman"/>
         </w:rPr>
-        <w:t xml:space="preserve">32. Pranggabayu, B. and Andjarwati, A. L. (2022). Pengaruh hedonic shopping motivation dan store atmosphere terhadap impulsive buying. </w:t>
-      </w:r>
-      <w:r>
-        <w:rPr>
-          <w:rFonts w:cs="Times New Roman"/>
-          <w:i/>
-        </w:rPr>
-        <w:t>Sibatik Journal</w:t>
-      </w:r>
-      <w:r>
-        <w:rPr>
-          <w:rFonts w:cs="Times New Roman"/>
-        </w:rPr>
-        <w:t>, 1(6):951–966.</w:t>
+        <w:t xml:space="preserve">Peck, J. dan Childers, T. L. 2006. “If I touch it I have to have it: Individual and environmental influences on impulse purchasing”. </w:t>
+      </w:r>
+      <w:r>
+        <w:rPr>
+          <w:rFonts w:cs="Times New Roman"/>
+          <w:i/>
+        </w:rPr>
+        <w:t>Journal of Business Research</w:t>
+      </w:r>
+      <w:r>
+        <w:rPr>
+          <w:rFonts w:cs="Times New Roman"/>
+        </w:rPr>
+        <w:t xml:space="preserve"> 59(6): 765–769.</w:t>
       </w:r>
     </w:p>
     <w:p>
@@ -12899,20 +13413,20 @@
         <w:rPr>
           <w:rFonts w:cs="Times New Roman"/>
         </w:rPr>
-        <w:t xml:space="preserve">33. Prasetio, A. et al. (2021). The role of hedonic motivation in impulsive buying on e-commerce platforms. </w:t>
-      </w:r>
-      <w:r>
-        <w:rPr>
-          <w:rFonts w:cs="Times New Roman"/>
-          <w:i/>
-        </w:rPr>
-        <w:t>International Journal of Data and Network Science</w:t>
-      </w:r>
-      <w:r>
-        <w:rPr>
-          <w:rFonts w:cs="Times New Roman"/>
-        </w:rPr>
-        <w:t>, 5(4):689–698.</w:t>
+        <w:t xml:space="preserve">Pranggabayu, B. dan Andjarwati, A. L. 2022. “Pengaruh hedonic shopping motivation dan store atmosphere terhadap impulsive buying”. </w:t>
+      </w:r>
+      <w:r>
+        <w:rPr>
+          <w:rFonts w:cs="Times New Roman"/>
+          <w:i/>
+        </w:rPr>
+        <w:t>Sibatik Journal</w:t>
+      </w:r>
+      <w:r>
+        <w:rPr>
+          <w:rFonts w:cs="Times New Roman"/>
+        </w:rPr>
+        <w:t xml:space="preserve"> 1(6): 951–966.</w:t>
       </w:r>
     </w:p>
     <w:p>
@@ -12925,20 +13439,20 @@
         <w:rPr>
           <w:rFonts w:cs="Times New Roman"/>
         </w:rPr>
-        <w:t xml:space="preserve">34. Rook, D. W. (1987). The buying impulse. </w:t>
-      </w:r>
-      <w:r>
-        <w:rPr>
-          <w:rFonts w:cs="Times New Roman"/>
-          <w:i/>
-        </w:rPr>
-        <w:t>Journal of Consumer Research</w:t>
-      </w:r>
-      <w:r>
-        <w:rPr>
-          <w:rFonts w:cs="Times New Roman"/>
-        </w:rPr>
-        <w:t>, 14(2):189–199.</w:t>
+        <w:t xml:space="preserve">Prasetio, A., Fauzi, M., dan Irawan, A. 2021. “The role of hedonic motivation in impulsive buying on e-commerce platforms”. </w:t>
+      </w:r>
+      <w:r>
+        <w:rPr>
+          <w:rFonts w:cs="Times New Roman"/>
+          <w:i/>
+        </w:rPr>
+        <w:t>International Journal of Data dan Network Science</w:t>
+      </w:r>
+      <w:r>
+        <w:rPr>
+          <w:rFonts w:cs="Times New Roman"/>
+        </w:rPr>
+        <w:t xml:space="preserve"> 5(4): 689–698.</w:t>
       </w:r>
     </w:p>
     <w:p>
@@ -12951,7 +13465,7 @@
         <w:rPr>
           <w:rFonts w:cs="Times New Roman"/>
         </w:rPr>
-        <w:t xml:space="preserve">35. Rook, D. W. and Fisher, R. J. (1995). Normative influences on impulsive buying behavior. </w:t>
+        <w:t xml:space="preserve">Rook, D. W. 1987. “The buying impulse”. </w:t>
       </w:r>
       <w:r>
         <w:rPr>
@@ -12964,7 +13478,7 @@
         <w:rPr>
           <w:rFonts w:cs="Times New Roman"/>
         </w:rPr>
-        <w:t>, 22(3):305–313.</w:t>
+        <w:t xml:space="preserve"> 14(2): 189–199.</w:t>
       </w:r>
     </w:p>
     <w:p>
@@ -12977,20 +13491,20 @@
         <w:rPr>
           <w:rFonts w:cs="Times New Roman"/>
         </w:rPr>
-        <w:t xml:space="preserve">36. Sekaran, U. and Bougie, R. (2016). </w:t>
-      </w:r>
-      <w:r>
-        <w:rPr>
-          <w:rFonts w:cs="Times New Roman"/>
-          <w:i/>
-        </w:rPr>
-        <w:t>Research Methods for Business: A Skill-Building Approach</w:t>
-      </w:r>
-      <w:r>
-        <w:rPr>
-          <w:rFonts w:cs="Times New Roman"/>
-        </w:rPr>
-        <w:t>. John Wiley &amp; Sons, Chichester, West Sussex, 7th edition.</w:t>
+        <w:t xml:space="preserve">Rook, D. W. dan Fisher, R. J. 1995. “Normative influences on impulsive buying behavior”. </w:t>
+      </w:r>
+      <w:r>
+        <w:rPr>
+          <w:rFonts w:cs="Times New Roman"/>
+          <w:i/>
+        </w:rPr>
+        <w:t>Journal of Consumer Research</w:t>
+      </w:r>
+      <w:r>
+        <w:rPr>
+          <w:rFonts w:cs="Times New Roman"/>
+        </w:rPr>
+        <w:t xml:space="preserve"> 22(3): 305–313.</w:t>
       </w:r>
     </w:p>
     <w:p>
@@ -13003,20 +13517,20 @@
         <w:rPr>
           <w:rFonts w:cs="Times New Roman"/>
         </w:rPr>
-        <w:t xml:space="preserve">37. Shiller, R. J. (2000). </w:t>
-      </w:r>
-      <w:r>
-        <w:rPr>
-          <w:rFonts w:cs="Times New Roman"/>
-          <w:i/>
-        </w:rPr>
-        <w:t>Irrational Exuberance</w:t>
-      </w:r>
-      <w:r>
-        <w:rPr>
-          <w:rFonts w:cs="Times New Roman"/>
-        </w:rPr>
-        <w:t>. Princeton University Press, Princeton, NJ.</w:t>
+        <w:t xml:space="preserve">Sekaran, U. dan Bougie, R. 2016. </w:t>
+      </w:r>
+      <w:r>
+        <w:rPr>
+          <w:rFonts w:cs="Times New Roman"/>
+          <w:i/>
+        </w:rPr>
+        <w:t>Research Methods for Business: A Skill-Building Approach</w:t>
+      </w:r>
+      <w:r>
+        <w:rPr>
+          <w:rFonts w:cs="Times New Roman"/>
+        </w:rPr>
+        <w:t>. Edisi 7. Chichester, West Sussex: John Wiley dan Sons.</w:t>
       </w:r>
     </w:p>
     <w:p>
@@ -13029,20 +13543,20 @@
         <w:rPr>
           <w:rFonts w:cs="Times New Roman"/>
         </w:rPr>
-        <w:t xml:space="preserve">38. Simon, H. A. (1955). A behavioral model of rational choice. </w:t>
-      </w:r>
-      <w:r>
-        <w:rPr>
-          <w:rFonts w:cs="Times New Roman"/>
-          <w:i/>
-        </w:rPr>
-        <w:t>The Quarterly Journal of Economics</w:t>
-      </w:r>
-      <w:r>
-        <w:rPr>
-          <w:rFonts w:cs="Times New Roman"/>
-        </w:rPr>
-        <w:t>, 69(1):99–118.</w:t>
+        <w:t xml:space="preserve">Shiller, R. J. 2000. </w:t>
+      </w:r>
+      <w:r>
+        <w:rPr>
+          <w:rFonts w:cs="Times New Roman"/>
+          <w:i/>
+        </w:rPr>
+        <w:t>Irrational Exuberance</w:t>
+      </w:r>
+      <w:r>
+        <w:rPr>
+          <w:rFonts w:cs="Times New Roman"/>
+        </w:rPr>
+        <w:t>. Princeton, NJ: Princeton University Press.</w:t>
       </w:r>
     </w:p>
     <w:p>
@@ -13055,20 +13569,20 @@
         <w:rPr>
           <w:rFonts w:cs="Times New Roman"/>
         </w:rPr>
-        <w:t xml:space="preserve">39. Spero, I. and Stone, M. (2004). Agents of change: how young consumers are changing the world of marketing. </w:t>
-      </w:r>
-      <w:r>
-        <w:rPr>
-          <w:rFonts w:cs="Times New Roman"/>
-          <w:i/>
-        </w:rPr>
-        <w:t>Qualitative Market Research: An International Journal</w:t>
-      </w:r>
-      <w:r>
-        <w:rPr>
-          <w:rFonts w:cs="Times New Roman"/>
-        </w:rPr>
-        <w:t>, 7(2):153–159.</w:t>
+        <w:t xml:space="preserve">Simon, H. A. 1955. “A behavioral model of rational choice”. </w:t>
+      </w:r>
+      <w:r>
+        <w:rPr>
+          <w:rFonts w:cs="Times New Roman"/>
+          <w:i/>
+        </w:rPr>
+        <w:t>The Quarterly Journal of Economics</w:t>
+      </w:r>
+      <w:r>
+        <w:rPr>
+          <w:rFonts w:cs="Times New Roman"/>
+        </w:rPr>
+        <w:t xml:space="preserve"> 69(1): 99–118.</w:t>
       </w:r>
     </w:p>
     <w:p>
@@ -13081,20 +13595,20 @@
         <w:rPr>
           <w:rFonts w:cs="Times New Roman"/>
         </w:rPr>
-        <w:t xml:space="preserve">40. Stern, H. (1962). The significance of impulse buying today. </w:t>
-      </w:r>
-      <w:r>
-        <w:rPr>
-          <w:rFonts w:cs="Times New Roman"/>
-          <w:i/>
-        </w:rPr>
-        <w:t>Journal of Marketing</w:t>
-      </w:r>
-      <w:r>
-        <w:rPr>
-          <w:rFonts w:cs="Times New Roman"/>
-        </w:rPr>
-        <w:t>, 26(2):59–62.</w:t>
+        <w:t xml:space="preserve">Spero, I. dan Stone, M. 2004. “Agents of change: how young consumers are changing the world of marketing”. </w:t>
+      </w:r>
+      <w:r>
+        <w:rPr>
+          <w:rFonts w:cs="Times New Roman"/>
+          <w:i/>
+        </w:rPr>
+        <w:t>Qualitative Market Research: An International Journal</w:t>
+      </w:r>
+      <w:r>
+        <w:rPr>
+          <w:rFonts w:cs="Times New Roman"/>
+        </w:rPr>
+        <w:t xml:space="preserve"> 7(2): 153–159.</w:t>
       </w:r>
     </w:p>
     <w:p>
@@ -13107,20 +13621,20 @@
         <w:rPr>
           <w:rFonts w:cs="Times New Roman"/>
         </w:rPr>
-        <w:t xml:space="preserve">41. Sugiyono (2019). </w:t>
-      </w:r>
-      <w:r>
-        <w:rPr>
-          <w:rFonts w:cs="Times New Roman"/>
-          <w:i/>
-        </w:rPr>
-        <w:t>Metode Penelitian Kuantitatif, Kualitatif, dan R&amp;D</w:t>
-      </w:r>
-      <w:r>
-        <w:rPr>
-          <w:rFonts w:cs="Times New Roman"/>
-        </w:rPr>
-        <w:t>. Alfabeta, Bandung.</w:t>
+        <w:t xml:space="preserve">Stern, H. 1962. “The significance of impulse buying today”. </w:t>
+      </w:r>
+      <w:r>
+        <w:rPr>
+          <w:rFonts w:cs="Times New Roman"/>
+          <w:i/>
+        </w:rPr>
+        <w:t>Journal of Marketing</w:t>
+      </w:r>
+      <w:r>
+        <w:rPr>
+          <w:rFonts w:cs="Times New Roman"/>
+        </w:rPr>
+        <w:t xml:space="preserve"> 26(2): 59–62.</w:t>
       </w:r>
     </w:p>
     <w:p>
@@ -13133,21 +13647,20 @@
         <w:rPr>
           <w:rFonts w:cs="Times New Roman"/>
         </w:rPr>
-        <w:lastRenderedPageBreak/>
-        <w:t xml:space="preserve">42. Sultan, A. J., Joireman, J., and Sprott, D. E. (2012). Building consumers' impulsive buying model: The moderating role of self-control. </w:t>
-      </w:r>
-      <w:r>
-        <w:rPr>
-          <w:rFonts w:cs="Times New Roman"/>
-          <w:i/>
-        </w:rPr>
-        <w:t>Journal of Consumer Marketing</w:t>
-      </w:r>
-      <w:r>
-        <w:rPr>
-          <w:rFonts w:cs="Times New Roman"/>
-        </w:rPr>
-        <w:t>, 29(1):61–73.</w:t>
+        <w:t xml:space="preserve">Sugiyono. 2019. </w:t>
+      </w:r>
+      <w:r>
+        <w:rPr>
+          <w:rFonts w:cs="Times New Roman"/>
+          <w:i/>
+        </w:rPr>
+        <w:t>Metode Penelitian Kuantitatif, Kualitatif, dan R&amp;D</w:t>
+      </w:r>
+      <w:r>
+        <w:rPr>
+          <w:rFonts w:cs="Times New Roman"/>
+        </w:rPr>
+        <w:t>. Edisi 2. Bandung: Alfabeta.</w:t>
       </w:r>
     </w:p>
     <w:p>
@@ -13160,20 +13673,21 @@
         <w:rPr>
           <w:rFonts w:cs="Times New Roman"/>
         </w:rPr>
-        <w:t xml:space="preserve">43. Tan, D. A. and Adyantari, A. (2024). Ketidakpastian blind box dan perilaku pembelian impulsif: Peran nilai fungsional, emosional, dan sosial. </w:t>
-      </w:r>
-      <w:r>
-        <w:rPr>
-          <w:rFonts w:cs="Times New Roman"/>
-          <w:i/>
-        </w:rPr>
-        <w:t>Bisma: Jurnal Bisnis dan Manajemen</w:t>
-      </w:r>
-      <w:r>
-        <w:rPr>
-          <w:rFonts w:cs="Times New Roman"/>
-        </w:rPr>
-        <w:t>, 18(2):145–158.</w:t>
+        <w:lastRenderedPageBreak/>
+        <w:t xml:space="preserve">Sultan, A. J., Joireman, J., dan Sprott, D. E. 2012. “Building consumers' impulsive buying model: The moderating role of self-control”. </w:t>
+      </w:r>
+      <w:r>
+        <w:rPr>
+          <w:rFonts w:cs="Times New Roman"/>
+          <w:i/>
+        </w:rPr>
+        <w:t>Journal of Consumer Marketing</w:t>
+      </w:r>
+      <w:r>
+        <w:rPr>
+          <w:rFonts w:cs="Times New Roman"/>
+        </w:rPr>
+        <w:t xml:space="preserve"> 29(1): 61–73.</w:t>
       </w:r>
     </w:p>
     <w:p>
@@ -13186,20 +13700,20 @@
         <w:rPr>
           <w:rFonts w:cs="Times New Roman"/>
         </w:rPr>
-        <w:t xml:space="preserve">44. Tangney, J. P., Baumeister, R. F., and Boone, A. L. (2004). High self-control predicts good adjustment, less pathology, better grades, and interpersonal success. </w:t>
-      </w:r>
-      <w:r>
-        <w:rPr>
-          <w:rFonts w:cs="Times New Roman"/>
-          <w:i/>
-        </w:rPr>
-        <w:t>Journal of Personality</w:t>
-      </w:r>
-      <w:r>
-        <w:rPr>
-          <w:rFonts w:cs="Times New Roman"/>
-        </w:rPr>
-        <w:t>, 72(2):271–324.</w:t>
+        <w:t xml:space="preserve">Tan, D. A. dan Adyantari, A. 2024. “Ketidakpastian blind box dan perilaku pembelian impulsif: Peran nilai fungsional, emosional, dan sosial”. </w:t>
+      </w:r>
+      <w:r>
+        <w:rPr>
+          <w:rFonts w:cs="Times New Roman"/>
+          <w:i/>
+        </w:rPr>
+        <w:t>Bisma: Jurnal Bisnis dan Manajemen</w:t>
+      </w:r>
+      <w:r>
+        <w:rPr>
+          <w:rFonts w:cs="Times New Roman"/>
+        </w:rPr>
+        <w:t xml:space="preserve"> 20(2): 145–158.</w:t>
       </w:r>
     </w:p>
     <w:p>
@@ -13212,20 +13726,20 @@
         <w:rPr>
           <w:rFonts w:cs="Times New Roman"/>
         </w:rPr>
-        <w:t xml:space="preserve">45. Thaler, R. (1985). Mental accounting and consumer choice. </w:t>
-      </w:r>
-      <w:r>
-        <w:rPr>
-          <w:rFonts w:cs="Times New Roman"/>
-          <w:i/>
-        </w:rPr>
-        <w:t>Marketing Science</w:t>
-      </w:r>
-      <w:r>
-        <w:rPr>
-          <w:rFonts w:cs="Times New Roman"/>
-        </w:rPr>
-        <w:t>, 4(3):199–214.</w:t>
+        <w:t xml:space="preserve">Tangney, J. P., Baumeister, R. F., dan Boone, A. L. 2004. “High self-control predicts good adjustment, less pathology, better grades, and interpersonal success”. </w:t>
+      </w:r>
+      <w:r>
+        <w:rPr>
+          <w:rFonts w:cs="Times New Roman"/>
+          <w:i/>
+        </w:rPr>
+        <w:t>Journal of Personality</w:t>
+      </w:r>
+      <w:r>
+        <w:rPr>
+          <w:rFonts w:cs="Times New Roman"/>
+        </w:rPr>
+        <w:t xml:space="preserve"> 72(2): 271–324.</w:t>
       </w:r>
     </w:p>
     <w:p>
@@ -13238,20 +13752,20 @@
         <w:rPr>
           <w:rFonts w:cs="Times New Roman"/>
         </w:rPr>
-        <w:t xml:space="preserve">46. Thaler, R. H. and Shefrin, H. M. (1981). An economic theory of self-control. </w:t>
-      </w:r>
-      <w:r>
-        <w:rPr>
-          <w:rFonts w:cs="Times New Roman"/>
-          <w:i/>
-        </w:rPr>
-        <w:t>Journal of Political Economy</w:t>
-      </w:r>
-      <w:r>
-        <w:rPr>
-          <w:rFonts w:cs="Times New Roman"/>
-        </w:rPr>
-        <w:t>, 89(2):392–406.</w:t>
+        <w:t xml:space="preserve">Thaler, R. 1985. “Mental accounting and consumer choice”. </w:t>
+      </w:r>
+      <w:r>
+        <w:rPr>
+          <w:rFonts w:cs="Times New Roman"/>
+          <w:i/>
+        </w:rPr>
+        <w:t>Marketing Science</w:t>
+      </w:r>
+      <w:r>
+        <w:rPr>
+          <w:rFonts w:cs="Times New Roman"/>
+        </w:rPr>
+        <w:t xml:space="preserve"> 4(3): 199–214.</w:t>
       </w:r>
     </w:p>
     <w:p>
@@ -13264,20 +13778,20 @@
         <w:rPr>
           <w:rFonts w:cs="Times New Roman"/>
         </w:rPr>
-        <w:t xml:space="preserve">47. Tirtayasa, S., Lubis, A. P., and Khair, H. (2020). Keputusan pembelian: Pengaruh hedonic shopping motive dan store atmosphere dengan impulse buying sebagai pemediasi. </w:t>
-      </w:r>
-      <w:r>
-        <w:rPr>
-          <w:rFonts w:cs="Times New Roman"/>
-          <w:i/>
-        </w:rPr>
-        <w:t>Jurnal Inspirasi Bisnis dan Manajemen</w:t>
-      </w:r>
-      <w:r>
-        <w:rPr>
-          <w:rFonts w:cs="Times New Roman"/>
-        </w:rPr>
-        <w:t>, 4(1):35–48.</w:t>
+        <w:t xml:space="preserve">Thaler, R. H. dan Shefrin, H. M. 1981. “An economic theory of self-control”. </w:t>
+      </w:r>
+      <w:r>
+        <w:rPr>
+          <w:rFonts w:cs="Times New Roman"/>
+          <w:i/>
+        </w:rPr>
+        <w:t>Journal of Political Economy</w:t>
+      </w:r>
+      <w:r>
+        <w:rPr>
+          <w:rFonts w:cs="Times New Roman"/>
+        </w:rPr>
+        <w:t xml:space="preserve"> 89(2): 392–406.</w:t>
       </w:r>
     </w:p>
     <w:p>
@@ -13290,20 +13804,20 @@
         <w:rPr>
           <w:rFonts w:cs="Times New Roman"/>
         </w:rPr>
-        <w:t xml:space="preserve">48. Verplanken, B. and Herabadi, A. (2001). Individual differences in impulse buying tendency: Feeling and no thinking. </w:t>
-      </w:r>
-      <w:r>
-        <w:rPr>
-          <w:rFonts w:cs="Times New Roman"/>
-          <w:i/>
-        </w:rPr>
-        <w:t>European Journal of Personality</w:t>
-      </w:r>
-      <w:r>
-        <w:rPr>
-          <w:rFonts w:cs="Times New Roman"/>
-        </w:rPr>
-        <w:t>, 15(S1):S71–S83.</w:t>
+        <w:t xml:space="preserve">Tirtayasa, S., Lubis, A. P., dan Khair, H. 2020. “Keputusan pembelian: Pengaruh hedonic shopping motive dan store atmosphere dengan impulse buying sebagai pemediasi”. </w:t>
+      </w:r>
+      <w:r>
+        <w:rPr>
+          <w:rFonts w:cs="Times New Roman"/>
+          <w:i/>
+        </w:rPr>
+        <w:t>Jurnal Inspirasi Bisnis dan Manajemen</w:t>
+      </w:r>
+      <w:r>
+        <w:rPr>
+          <w:rFonts w:cs="Times New Roman"/>
+        </w:rPr>
+        <w:t xml:space="preserve"> 4(1): 35–48.</w:t>
       </w:r>
     </w:p>
     <w:p>
@@ -13316,20 +13830,20 @@
         <w:rPr>
           <w:rFonts w:cs="Times New Roman"/>
         </w:rPr>
-        <w:t xml:space="preserve">49. Vohs, K. D. and Faber, R. J. (2007). Spent resources: Self-regulatory resource depletion and impulsive buying. </w:t>
-      </w:r>
-      <w:r>
-        <w:rPr>
-          <w:rFonts w:cs="Times New Roman"/>
-          <w:i/>
-        </w:rPr>
-        <w:t>Journal of Consumer Research</w:t>
-      </w:r>
-      <w:r>
-        <w:rPr>
-          <w:rFonts w:cs="Times New Roman"/>
-        </w:rPr>
-        <w:t>, 33(4):537–547.</w:t>
+        <w:t xml:space="preserve">Verplanken, B. dan Herabadi, A. 2001. “Individual differences in impulse buying tendency: Feeling and no thinking”. </w:t>
+      </w:r>
+      <w:r>
+        <w:rPr>
+          <w:rFonts w:cs="Times New Roman"/>
+          <w:i/>
+        </w:rPr>
+        <w:t>European Journal of Personality</w:t>
+      </w:r>
+      <w:r>
+        <w:rPr>
+          <w:rFonts w:cs="Times New Roman"/>
+        </w:rPr>
+        <w:t xml:space="preserve"> 15(S1): S71–S83.</w:t>
       </w:r>
     </w:p>
     <w:p>
@@ -13342,20 +13856,20 @@
         <w:rPr>
           <w:rFonts w:cs="Times New Roman"/>
         </w:rPr>
-        <w:t xml:space="preserve">50. Zeigarnik, B. (1927). Ueber das Behalten von erledigten und unerledigten Handlungen. </w:t>
-      </w:r>
-      <w:r>
-        <w:rPr>
-          <w:rFonts w:cs="Times New Roman"/>
-          <w:i/>
-        </w:rPr>
-        <w:t>Psychologische Forschung</w:t>
-      </w:r>
-      <w:r>
-        <w:rPr>
-          <w:rFonts w:cs="Times New Roman"/>
-        </w:rPr>
-        <w:t>, 9:1–85.</w:t>
+        <w:t xml:space="preserve">Vohs, K. D. dan Faber, R. J. 2007. “Spent resources: Self-regulatory resource depletion and impulsive buying”. </w:t>
+      </w:r>
+      <w:r>
+        <w:rPr>
+          <w:rFonts w:cs="Times New Roman"/>
+          <w:i/>
+        </w:rPr>
+        <w:t>Journal of Consumer Research</w:t>
+      </w:r>
+      <w:r>
+        <w:rPr>
+          <w:rFonts w:cs="Times New Roman"/>
+        </w:rPr>
+        <w:t xml:space="preserve"> 33(4): 537–547.</w:t>
       </w:r>
     </w:p>
     <w:p>
@@ -13368,20 +13882,46 @@
         <w:rPr>
           <w:rFonts w:cs="Times New Roman"/>
         </w:rPr>
-        <w:t xml:space="preserve">51. Zheng, X., Men, J., Yang, F., and Gong, X. (2019). Understanding impulse buying in mobile commerce: An investigation in baidu. </w:t>
-      </w:r>
-      <w:r>
-        <w:rPr>
-          <w:rFonts w:cs="Times New Roman"/>
-          <w:i/>
-        </w:rPr>
-        <w:t>Information &amp; Management</w:t>
-      </w:r>
-      <w:r>
-        <w:rPr>
-          <w:rFonts w:cs="Times New Roman"/>
-        </w:rPr>
-        <w:t>, 56(8):103148.</w:t>
+        <w:t xml:space="preserve">Zeigarnik, B. 1927. “Das Behalten erledigter und unerledigten Handlungen”. </w:t>
+      </w:r>
+      <w:r>
+        <w:rPr>
+          <w:rFonts w:cs="Times New Roman"/>
+          <w:i/>
+        </w:rPr>
+        <w:t>Psychologische Forschung</w:t>
+      </w:r>
+      <w:r>
+        <w:rPr>
+          <w:rFonts w:cs="Times New Roman"/>
+        </w:rPr>
+        <w:t xml:space="preserve"> 9: 1–85.</w:t>
+      </w:r>
+    </w:p>
+    <w:p>
+      <w:pPr>
+        <w:spacing w:after="120"/>
+        <w:ind w:left="709" w:hanging="709"/>
+        <w:jc w:val="both"/>
+      </w:pPr>
+      <w:r>
+        <w:rPr>
+          <w:rFonts w:cs="Times New Roman"/>
+        </w:rPr>
+        <w:t xml:space="preserve">Zheng, X., Men, J., Yang, F., dan Gong, X. 2019. “Understanding impulse buying in mobile commerce: An investigation into hedonic and utilitarian browsing”. </w:t>
+      </w:r>
+      <w:r>
+        <w:rPr>
+          <w:rFonts w:cs="Times New Roman"/>
+          <w:i/>
+        </w:rPr>
+        <w:t>International Journal of Information Management</w:t>
+      </w:r>
+      <w:r>
+        <w:rPr>
+          <w:rFonts w:cs="Times New Roman"/>
+        </w:rPr>
+        <w:t xml:space="preserve"> 48: 151–160.</w:t>
       </w:r>
     </w:p>
     <w:sectPr>
@@ -13727,31 +14267,31 @@
       </w:rPr>
     </w:lvl>
   </w:abstractNum>
-  <w:num w:numId="1" w16cid:durableId="1913613380">
+  <w:num w:numId="1" w16cid:durableId="933244944">
     <w:abstractNumId w:val="8"/>
   </w:num>
-  <w:num w:numId="2" w16cid:durableId="1481843907">
+  <w:num w:numId="2" w16cid:durableId="212549624">
     <w:abstractNumId w:val="6"/>
   </w:num>
-  <w:num w:numId="3" w16cid:durableId="22677345">
+  <w:num w:numId="3" w16cid:durableId="201944873">
     <w:abstractNumId w:val="5"/>
   </w:num>
-  <w:num w:numId="4" w16cid:durableId="1748453216">
+  <w:num w:numId="4" w16cid:durableId="1434086813">
     <w:abstractNumId w:val="4"/>
   </w:num>
-  <w:num w:numId="5" w16cid:durableId="890967351">
+  <w:num w:numId="5" w16cid:durableId="1425109800">
     <w:abstractNumId w:val="7"/>
   </w:num>
-  <w:num w:numId="6" w16cid:durableId="917128385">
+  <w:num w:numId="6" w16cid:durableId="635569200">
     <w:abstractNumId w:val="3"/>
   </w:num>
-  <w:num w:numId="7" w16cid:durableId="1468206530">
+  <w:num w:numId="7" w16cid:durableId="1071392086">
     <w:abstractNumId w:val="2"/>
   </w:num>
-  <w:num w:numId="8" w16cid:durableId="933780381">
+  <w:num w:numId="8" w16cid:durableId="846401963">
     <w:abstractNumId w:val="1"/>
   </w:num>
-  <w:num w:numId="9" w16cid:durableId="1254390059">
+  <w:num w:numId="9" w16cid:durableId="1919435872">
     <w:abstractNumId w:val="0"/>
   </w:num>
 </w:numbering>
@@ -25192,7 +25732,7 @@
     <w:autoRedefine/>
     <w:uiPriority w:val="39"/>
     <w:unhideWhenUsed/>
-    <w:rsid w:val="00F068FF"/>
+    <w:rsid w:val="002440B3"/>
     <w:pPr>
       <w:spacing w:after="40" w:line="240" w:lineRule="auto"/>
     </w:pPr>
@@ -25208,7 +25748,7 @@
     <w:autoRedefine/>
     <w:uiPriority w:val="39"/>
     <w:unhideWhenUsed/>
-    <w:rsid w:val="00F068FF"/>
+    <w:rsid w:val="002440B3"/>
     <w:pPr>
       <w:spacing w:after="40" w:line="240" w:lineRule="auto"/>
       <w:ind w:left="360"/>
@@ -25224,7 +25764,7 @@
     <w:autoRedefine/>
     <w:uiPriority w:val="39"/>
     <w:unhideWhenUsed/>
-    <w:rsid w:val="00F068FF"/>
+    <w:rsid w:val="002440B3"/>
     <w:pPr>
       <w:spacing w:after="40" w:line="240" w:lineRule="auto"/>
       <w:ind w:left="720"/>
@@ -25239,7 +25779,7 @@
     <w:basedOn w:val="DefaultParagraphFont"/>
     <w:uiPriority w:val="99"/>
     <w:unhideWhenUsed/>
-    <w:rsid w:val="00F068FF"/>
+    <w:rsid w:val="002440B3"/>
     <w:rPr>
       <w:color w:val="0000FF" w:themeColor="hyperlink"/>
       <w:u w:val="single"/>

</xml_diff>

<commit_message>
fix(figures): perbaiki resolusi HD 400 DPI, palet warna Royal Blue & Amber Gold, eliminasi tabrakan teks Gambar 1.3, dan rebuild naskah PDF/Word
</commit_message>
<xml_diff>
--- a/01_Naskah_Utama/Proposal_Arthur_NoBab3.docx
+++ b/01_Naskah_Utama/Proposal_Arthur_NoBab3.docx
@@ -12,7 +12,7 @@
           <w:noProof/>
         </w:rPr>
         <w:drawing>
-          <wp:inline distT="0" distB="0" distL="0" distR="0" wp14:anchorId="25D6E864" wp14:editId="409E1A45">
+          <wp:inline distT="0" distB="0" distL="0" distR="0" wp14:anchorId="5685E947" wp14:editId="6A533A88">
             <wp:extent cx="1152000" cy="1152000"/>
             <wp:effectExtent l="0" t="0" r="0" b="0"/>
             <wp:docPr id="1" name="Picture 1"/>
@@ -274,7 +274,7 @@
         <w:spacing w:after="360"/>
         <w:outlineLvl w:val="0"/>
       </w:pPr>
-      <w:bookmarkStart w:id="0" w:name="_Toc240456574"/>
+      <w:bookmarkStart w:id="0" w:name="_Toc240461098"/>
       <w:r>
         <w:rPr>
           <w:rFonts w:ascii="Times New Roman" w:hAnsi="Times New Roman"/>
@@ -567,7 +567,7 @@
         <w:spacing w:after="360"/>
         <w:outlineLvl w:val="0"/>
       </w:pPr>
-      <w:bookmarkStart w:id="1" w:name="_Toc240456575"/>
+      <w:bookmarkStart w:id="1" w:name="_Toc240461099"/>
       <w:r>
         <w:rPr>
           <w:rFonts w:ascii="Times New Roman" w:hAnsi="Times New Roman"/>
@@ -691,7 +691,7 @@
         <w:spacing w:after="360"/>
         <w:outlineLvl w:val="0"/>
       </w:pPr>
-      <w:bookmarkStart w:id="2" w:name="_Toc240456576"/>
+      <w:bookmarkStart w:id="2" w:name="_Toc240461100"/>
       <w:r>
         <w:rPr>
           <w:rFonts w:ascii="Times New Roman" w:hAnsi="Times New Roman"/>
@@ -853,7 +853,7 @@
       <w:r>
         <w:fldChar w:fldCharType="separate"/>
       </w:r>
-      <w:hyperlink w:anchor="_Toc240456574" w:history="1">
+      <w:hyperlink w:anchor="_Toc240461098" w:history="1">
         <w:r>
           <w:rPr>
             <w:rStyle w:val="Hyperlink"/>
@@ -880,7 +880,7 @@
             <w:noProof/>
             <w:webHidden/>
           </w:rPr>
-          <w:instrText xml:space="preserve"> PAGEREF _Toc240456574 \h </w:instrText>
+          <w:instrText xml:space="preserve"> PAGEREF _Toc240461098 \h </w:instrText>
         </w:r>
         <w:r>
           <w:rPr>
@@ -927,7 +927,7 @@
           <w14:ligatures w14:val="standardContextual"/>
         </w:rPr>
       </w:pPr>
-      <w:hyperlink w:anchor="_Toc240456575" w:history="1">
+      <w:hyperlink w:anchor="_Toc240461099" w:history="1">
         <w:r>
           <w:rPr>
             <w:rStyle w:val="Hyperlink"/>
@@ -954,7 +954,7 @@
             <w:noProof/>
             <w:webHidden/>
           </w:rPr>
-          <w:instrText xml:space="preserve"> PAGEREF _Toc240456575 \h </w:instrText>
+          <w:instrText xml:space="preserve"> PAGEREF _Toc240461099 \h </w:instrText>
         </w:r>
         <w:r>
           <w:rPr>
@@ -1001,7 +1001,7 @@
           <w14:ligatures w14:val="standardContextual"/>
         </w:rPr>
       </w:pPr>
-      <w:hyperlink w:anchor="_Toc240456576" w:history="1">
+      <w:hyperlink w:anchor="_Toc240461100" w:history="1">
         <w:r>
           <w:rPr>
             <w:rStyle w:val="Hyperlink"/>
@@ -1028,7 +1028,7 @@
             <w:noProof/>
             <w:webHidden/>
           </w:rPr>
-          <w:instrText xml:space="preserve"> PAGEREF _Toc240456576 \h </w:instrText>
+          <w:instrText xml:space="preserve"> PAGEREF _Toc240461100 \h </w:instrText>
         </w:r>
         <w:r>
           <w:rPr>
@@ -1075,7 +1075,7 @@
           <w14:ligatures w14:val="standardContextual"/>
         </w:rPr>
       </w:pPr>
-      <w:hyperlink w:anchor="_Toc240456577" w:history="1">
+      <w:hyperlink w:anchor="_Toc240461101" w:history="1">
         <w:r>
           <w:rPr>
             <w:rStyle w:val="Hyperlink"/>
@@ -1102,7 +1102,7 @@
             <w:noProof/>
             <w:webHidden/>
           </w:rPr>
-          <w:instrText xml:space="preserve"> PAGEREF _Toc240456577 \h </w:instrText>
+          <w:instrText xml:space="preserve"> PAGEREF _Toc240461101 \h </w:instrText>
         </w:r>
         <w:r>
           <w:rPr>
@@ -1149,7 +1149,7 @@
           <w14:ligatures w14:val="standardContextual"/>
         </w:rPr>
       </w:pPr>
-      <w:hyperlink w:anchor="_Toc240456578" w:history="1">
+      <w:hyperlink w:anchor="_Toc240461102" w:history="1">
         <w:r>
           <w:rPr>
             <w:rStyle w:val="Hyperlink"/>
@@ -1176,7 +1176,7 @@
             <w:noProof/>
             <w:webHidden/>
           </w:rPr>
-          <w:instrText xml:space="preserve"> PAGEREF _Toc240456578 \h </w:instrText>
+          <w:instrText xml:space="preserve"> PAGEREF _Toc240461102 \h </w:instrText>
         </w:r>
         <w:r>
           <w:rPr>
@@ -1223,7 +1223,7 @@
           <w14:ligatures w14:val="standardContextual"/>
         </w:rPr>
       </w:pPr>
-      <w:hyperlink w:anchor="_Toc240456579" w:history="1">
+      <w:hyperlink w:anchor="_Toc240461103" w:history="1">
         <w:r>
           <w:rPr>
             <w:rStyle w:val="Hyperlink"/>
@@ -1250,7 +1250,7 @@
             <w:noProof/>
             <w:webHidden/>
           </w:rPr>
-          <w:instrText xml:space="preserve"> PAGEREF _Toc240456579 \h </w:instrText>
+          <w:instrText xml:space="preserve"> PAGEREF _Toc240461103 \h </w:instrText>
         </w:r>
         <w:r>
           <w:rPr>
@@ -1296,7 +1296,7 @@
           <w14:ligatures w14:val="standardContextual"/>
         </w:rPr>
       </w:pPr>
-      <w:hyperlink w:anchor="_Toc240456580" w:history="1">
+      <w:hyperlink w:anchor="_Toc240461104" w:history="1">
         <w:r>
           <w:rPr>
             <w:rStyle w:val="Hyperlink"/>
@@ -1323,7 +1323,7 @@
             <w:noProof/>
             <w:webHidden/>
           </w:rPr>
-          <w:instrText xml:space="preserve"> PAGEREF _Toc240456580 \h </w:instrText>
+          <w:instrText xml:space="preserve"> PAGEREF _Toc240461104 \h </w:instrText>
         </w:r>
         <w:r>
           <w:rPr>
@@ -1369,7 +1369,7 @@
           <w14:ligatures w14:val="standardContextual"/>
         </w:rPr>
       </w:pPr>
-      <w:hyperlink w:anchor="_Toc240456581" w:history="1">
+      <w:hyperlink w:anchor="_Toc240461105" w:history="1">
         <w:r>
           <w:rPr>
             <w:rStyle w:val="Hyperlink"/>
@@ -1396,7 +1396,7 @@
             <w:noProof/>
             <w:webHidden/>
           </w:rPr>
-          <w:instrText xml:space="preserve"> PAGEREF _Toc240456581 \h </w:instrText>
+          <w:instrText xml:space="preserve"> PAGEREF _Toc240461105 \h </w:instrText>
         </w:r>
         <w:r>
           <w:rPr>
@@ -1442,7 +1442,7 @@
           <w14:ligatures w14:val="standardContextual"/>
         </w:rPr>
       </w:pPr>
-      <w:hyperlink w:anchor="_Toc240456582" w:history="1">
+      <w:hyperlink w:anchor="_Toc240461106" w:history="1">
         <w:r>
           <w:rPr>
             <w:rStyle w:val="Hyperlink"/>
@@ -1469,7 +1469,7 @@
             <w:noProof/>
             <w:webHidden/>
           </w:rPr>
-          <w:instrText xml:space="preserve"> PAGEREF _Toc240456582 \h </w:instrText>
+          <w:instrText xml:space="preserve"> PAGEREF _Toc240461106 \h </w:instrText>
         </w:r>
         <w:r>
           <w:rPr>
@@ -1515,7 +1515,7 @@
           <w14:ligatures w14:val="standardContextual"/>
         </w:rPr>
       </w:pPr>
-      <w:hyperlink w:anchor="_Toc240456583" w:history="1">
+      <w:hyperlink w:anchor="_Toc240461107" w:history="1">
         <w:r>
           <w:rPr>
             <w:rStyle w:val="Hyperlink"/>
@@ -1542,7 +1542,7 @@
             <w:noProof/>
             <w:webHidden/>
           </w:rPr>
-          <w:instrText xml:space="preserve"> PAGEREF _Toc240456583 \h </w:instrText>
+          <w:instrText xml:space="preserve"> PAGEREF _Toc240461107 \h </w:instrText>
         </w:r>
         <w:r>
           <w:rPr>
@@ -1589,7 +1589,7 @@
           <w14:ligatures w14:val="standardContextual"/>
         </w:rPr>
       </w:pPr>
-      <w:hyperlink w:anchor="_Toc240456584" w:history="1">
+      <w:hyperlink w:anchor="_Toc240461108" w:history="1">
         <w:r>
           <w:rPr>
             <w:rStyle w:val="Hyperlink"/>
@@ -1616,7 +1616,7 @@
             <w:noProof/>
             <w:webHidden/>
           </w:rPr>
-          <w:instrText xml:space="preserve"> PAGEREF _Toc240456584 \h </w:instrText>
+          <w:instrText xml:space="preserve"> PAGEREF _Toc240461108 \h </w:instrText>
         </w:r>
         <w:r>
           <w:rPr>
@@ -1663,7 +1663,7 @@
           <w14:ligatures w14:val="standardContextual"/>
         </w:rPr>
       </w:pPr>
-      <w:hyperlink w:anchor="_Toc240456585" w:history="1">
+      <w:hyperlink w:anchor="_Toc240461109" w:history="1">
         <w:r>
           <w:rPr>
             <w:rStyle w:val="Hyperlink"/>
@@ -1690,7 +1690,7 @@
             <w:noProof/>
             <w:webHidden/>
           </w:rPr>
-          <w:instrText xml:space="preserve"> PAGEREF _Toc240456585 \h </w:instrText>
+          <w:instrText xml:space="preserve"> PAGEREF _Toc240461109 \h </w:instrText>
         </w:r>
         <w:r>
           <w:rPr>
@@ -1737,7 +1737,7 @@
           <w14:ligatures w14:val="standardContextual"/>
         </w:rPr>
       </w:pPr>
-      <w:hyperlink w:anchor="_Toc240456586" w:history="1">
+      <w:hyperlink w:anchor="_Toc240461110" w:history="1">
         <w:r>
           <w:rPr>
             <w:rStyle w:val="Hyperlink"/>
@@ -1764,7 +1764,7 @@
             <w:noProof/>
             <w:webHidden/>
           </w:rPr>
-          <w:instrText xml:space="preserve"> PAGEREF _Toc240456586 \h </w:instrText>
+          <w:instrText xml:space="preserve"> PAGEREF _Toc240461110 \h </w:instrText>
         </w:r>
         <w:r>
           <w:rPr>
@@ -1810,7 +1810,7 @@
           <w14:ligatures w14:val="standardContextual"/>
         </w:rPr>
       </w:pPr>
-      <w:hyperlink w:anchor="_Toc240456587" w:history="1">
+      <w:hyperlink w:anchor="_Toc240461111" w:history="1">
         <w:r>
           <w:rPr>
             <w:rStyle w:val="Hyperlink"/>
@@ -1837,7 +1837,7 @@
             <w:noProof/>
             <w:webHidden/>
           </w:rPr>
-          <w:instrText xml:space="preserve"> PAGEREF _Toc240456587 \h </w:instrText>
+          <w:instrText xml:space="preserve"> PAGEREF _Toc240461111 \h </w:instrText>
         </w:r>
         <w:r>
           <w:rPr>
@@ -1884,7 +1884,7 @@
           <w14:ligatures w14:val="standardContextual"/>
         </w:rPr>
       </w:pPr>
-      <w:hyperlink w:anchor="_Toc240456588" w:history="1">
+      <w:hyperlink w:anchor="_Toc240461112" w:history="1">
         <w:r>
           <w:rPr>
             <w:rStyle w:val="Hyperlink"/>
@@ -1926,7 +1926,7 @@
             <w:noProof/>
             <w:webHidden/>
           </w:rPr>
-          <w:instrText xml:space="preserve"> PAGEREF _Toc240456588 \h </w:instrText>
+          <w:instrText xml:space="preserve"> PAGEREF _Toc240461112 \h </w:instrText>
         </w:r>
         <w:r>
           <w:rPr>
@@ -1973,7 +1973,7 @@
           <w14:ligatures w14:val="standardContextual"/>
         </w:rPr>
       </w:pPr>
-      <w:hyperlink w:anchor="_Toc240456589" w:history="1">
+      <w:hyperlink w:anchor="_Toc240461113" w:history="1">
         <w:r>
           <w:rPr>
             <w:rStyle w:val="Hyperlink"/>
@@ -2015,7 +2015,7 @@
             <w:noProof/>
             <w:webHidden/>
           </w:rPr>
-          <w:instrText xml:space="preserve"> PAGEREF _Toc240456589 \h </w:instrText>
+          <w:instrText xml:space="preserve"> PAGEREF _Toc240461113 \h </w:instrText>
         </w:r>
         <w:r>
           <w:rPr>
@@ -2062,7 +2062,7 @@
           <w14:ligatures w14:val="standardContextual"/>
         </w:rPr>
       </w:pPr>
-      <w:hyperlink w:anchor="_Toc240456590" w:history="1">
+      <w:hyperlink w:anchor="_Toc240461114" w:history="1">
         <w:r>
           <w:rPr>
             <w:rStyle w:val="Hyperlink"/>
@@ -2097,7 +2097,7 @@
             <w:noProof/>
             <w:webHidden/>
           </w:rPr>
-          <w:instrText xml:space="preserve"> PAGEREF _Toc240456590 \h </w:instrText>
+          <w:instrText xml:space="preserve"> PAGEREF _Toc240461114 \h </w:instrText>
         </w:r>
         <w:r>
           <w:rPr>
@@ -2144,7 +2144,7 @@
           <w14:ligatures w14:val="standardContextual"/>
         </w:rPr>
       </w:pPr>
-      <w:hyperlink w:anchor="_Toc240456591" w:history="1">
+      <w:hyperlink w:anchor="_Toc240461115" w:history="1">
         <w:r>
           <w:rPr>
             <w:rStyle w:val="Hyperlink"/>
@@ -2186,7 +2186,7 @@
             <w:noProof/>
             <w:webHidden/>
           </w:rPr>
-          <w:instrText xml:space="preserve"> PAGEREF _Toc240456591 \h </w:instrText>
+          <w:instrText xml:space="preserve"> PAGEREF _Toc240461115 \h </w:instrText>
         </w:r>
         <w:r>
           <w:rPr>
@@ -2232,7 +2232,7 @@
           <w14:ligatures w14:val="standardContextual"/>
         </w:rPr>
       </w:pPr>
-      <w:hyperlink w:anchor="_Toc240456592" w:history="1">
+      <w:hyperlink w:anchor="_Toc240461116" w:history="1">
         <w:r>
           <w:rPr>
             <w:rStyle w:val="Hyperlink"/>
@@ -2259,7 +2259,7 @@
             <w:noProof/>
             <w:webHidden/>
           </w:rPr>
-          <w:instrText xml:space="preserve"> PAGEREF _Toc240456592 \h </w:instrText>
+          <w:instrText xml:space="preserve"> PAGEREF _Toc240461116 \h </w:instrText>
         </w:r>
         <w:r>
           <w:rPr>
@@ -2306,7 +2306,7 @@
           <w14:ligatures w14:val="standardContextual"/>
         </w:rPr>
       </w:pPr>
-      <w:hyperlink w:anchor="_Toc240456593" w:history="1">
+      <w:hyperlink w:anchor="_Toc240461117" w:history="1">
         <w:r>
           <w:rPr>
             <w:rStyle w:val="Hyperlink"/>
@@ -2363,7 +2363,7 @@
             <w:noProof/>
             <w:webHidden/>
           </w:rPr>
-          <w:instrText xml:space="preserve"> PAGEREF _Toc240456593 \h </w:instrText>
+          <w:instrText xml:space="preserve"> PAGEREF _Toc240461117 \h </w:instrText>
         </w:r>
         <w:r>
           <w:rPr>
@@ -2410,7 +2410,7 @@
           <w14:ligatures w14:val="standardContextual"/>
         </w:rPr>
       </w:pPr>
-      <w:hyperlink w:anchor="_Toc240456594" w:history="1">
+      <w:hyperlink w:anchor="_Toc240461118" w:history="1">
         <w:r>
           <w:rPr>
             <w:rStyle w:val="Hyperlink"/>
@@ -2467,7 +2467,7 @@
             <w:noProof/>
             <w:webHidden/>
           </w:rPr>
-          <w:instrText xml:space="preserve"> PAGEREF _Toc240456594 \h </w:instrText>
+          <w:instrText xml:space="preserve"> PAGEREF _Toc240461118 \h </w:instrText>
         </w:r>
         <w:r>
           <w:rPr>
@@ -2514,7 +2514,7 @@
           <w14:ligatures w14:val="standardContextual"/>
         </w:rPr>
       </w:pPr>
-      <w:hyperlink w:anchor="_Toc240456595" w:history="1">
+      <w:hyperlink w:anchor="_Toc240461119" w:history="1">
         <w:r>
           <w:rPr>
             <w:rStyle w:val="Hyperlink"/>
@@ -2571,7 +2571,7 @@
             <w:noProof/>
             <w:webHidden/>
           </w:rPr>
-          <w:instrText xml:space="preserve"> PAGEREF _Toc240456595 \h </w:instrText>
+          <w:instrText xml:space="preserve"> PAGEREF _Toc240461119 \h </w:instrText>
         </w:r>
         <w:r>
           <w:rPr>
@@ -2618,7 +2618,7 @@
           <w14:ligatures w14:val="standardContextual"/>
         </w:rPr>
       </w:pPr>
-      <w:hyperlink w:anchor="_Toc240456596" w:history="1">
+      <w:hyperlink w:anchor="_Toc240461120" w:history="1">
         <w:r>
           <w:rPr>
             <w:rStyle w:val="Hyperlink"/>
@@ -2675,7 +2675,7 @@
             <w:noProof/>
             <w:webHidden/>
           </w:rPr>
-          <w:instrText xml:space="preserve"> PAGEREF _Toc240456596 \h </w:instrText>
+          <w:instrText xml:space="preserve"> PAGEREF _Toc240461120 \h </w:instrText>
         </w:r>
         <w:r>
           <w:rPr>
@@ -2722,7 +2722,7 @@
           <w14:ligatures w14:val="standardContextual"/>
         </w:rPr>
       </w:pPr>
-      <w:hyperlink w:anchor="_Toc240456597" w:history="1">
+      <w:hyperlink w:anchor="_Toc240461121" w:history="1">
         <w:r>
           <w:rPr>
             <w:rStyle w:val="Hyperlink"/>
@@ -2779,7 +2779,7 @@
             <w:noProof/>
             <w:webHidden/>
           </w:rPr>
-          <w:instrText xml:space="preserve"> PAGEREF _Toc240456597 \h </w:instrText>
+          <w:instrText xml:space="preserve"> PAGEREF _Toc240461121 \h </w:instrText>
         </w:r>
         <w:r>
           <w:rPr>
@@ -2825,7 +2825,7 @@
           <w14:ligatures w14:val="standardContextual"/>
         </w:rPr>
       </w:pPr>
-      <w:hyperlink w:anchor="_Toc240456598" w:history="1">
+      <w:hyperlink w:anchor="_Toc240461122" w:history="1">
         <w:r>
           <w:rPr>
             <w:rStyle w:val="Hyperlink"/>
@@ -2852,7 +2852,7 @@
             <w:noProof/>
             <w:webHidden/>
           </w:rPr>
-          <w:instrText xml:space="preserve"> PAGEREF _Toc240456598 \h </w:instrText>
+          <w:instrText xml:space="preserve"> PAGEREF _Toc240461122 \h </w:instrText>
         </w:r>
         <w:r>
           <w:rPr>
@@ -2898,7 +2898,7 @@
           <w14:ligatures w14:val="standardContextual"/>
         </w:rPr>
       </w:pPr>
-      <w:hyperlink w:anchor="_Toc240456599" w:history="1">
+      <w:hyperlink w:anchor="_Toc240461123" w:history="1">
         <w:r>
           <w:rPr>
             <w:rStyle w:val="Hyperlink"/>
@@ -2925,7 +2925,7 @@
             <w:noProof/>
             <w:webHidden/>
           </w:rPr>
-          <w:instrText xml:space="preserve"> PAGEREF _Toc240456599 \h </w:instrText>
+          <w:instrText xml:space="preserve"> PAGEREF _Toc240461123 \h </w:instrText>
         </w:r>
         <w:r>
           <w:rPr>
@@ -2972,7 +2972,7 @@
           <w14:ligatures w14:val="standardContextual"/>
         </w:rPr>
       </w:pPr>
-      <w:hyperlink w:anchor="_Toc240456600" w:history="1">
+      <w:hyperlink w:anchor="_Toc240461124" w:history="1">
         <w:r>
           <w:rPr>
             <w:rStyle w:val="Hyperlink"/>
@@ -3022,7 +3022,7 @@
             <w:noProof/>
             <w:webHidden/>
           </w:rPr>
-          <w:instrText xml:space="preserve"> PAGEREF _Toc240456600 \h </w:instrText>
+          <w:instrText xml:space="preserve"> PAGEREF _Toc240461124 \h </w:instrText>
         </w:r>
         <w:r>
           <w:rPr>
@@ -3069,7 +3069,7 @@
           <w14:ligatures w14:val="standardContextual"/>
         </w:rPr>
       </w:pPr>
-      <w:hyperlink w:anchor="_Toc240456601" w:history="1">
+      <w:hyperlink w:anchor="_Toc240461125" w:history="1">
         <w:r>
           <w:rPr>
             <w:rStyle w:val="Hyperlink"/>
@@ -3119,7 +3119,7 @@
             <w:noProof/>
             <w:webHidden/>
           </w:rPr>
-          <w:instrText xml:space="preserve"> PAGEREF _Toc240456601 \h </w:instrText>
+          <w:instrText xml:space="preserve"> PAGEREF _Toc240461125 \h </w:instrText>
         </w:r>
         <w:r>
           <w:rPr>
@@ -3166,7 +3166,7 @@
           <w14:ligatures w14:val="standardContextual"/>
         </w:rPr>
       </w:pPr>
-      <w:hyperlink w:anchor="_Toc240456602" w:history="1">
+      <w:hyperlink w:anchor="_Toc240461126" w:history="1">
         <w:r>
           <w:rPr>
             <w:rStyle w:val="Hyperlink"/>
@@ -3216,7 +3216,7 @@
             <w:noProof/>
             <w:webHidden/>
           </w:rPr>
-          <w:instrText xml:space="preserve"> PAGEREF _Toc240456602 \h </w:instrText>
+          <w:instrText xml:space="preserve"> PAGEREF _Toc240461126 \h </w:instrText>
         </w:r>
         <w:r>
           <w:rPr>
@@ -3263,7 +3263,7 @@
           <w14:ligatures w14:val="standardContextual"/>
         </w:rPr>
       </w:pPr>
-      <w:hyperlink w:anchor="_Toc240456603" w:history="1">
+      <w:hyperlink w:anchor="_Toc240461127" w:history="1">
         <w:r>
           <w:rPr>
             <w:rStyle w:val="Hyperlink"/>
@@ -3328,7 +3328,7 @@
             <w:noProof/>
             <w:webHidden/>
           </w:rPr>
-          <w:instrText xml:space="preserve"> PAGEREF _Toc240456603 \h </w:instrText>
+          <w:instrText xml:space="preserve"> PAGEREF _Toc240461127 \h </w:instrText>
         </w:r>
         <w:r>
           <w:rPr>
@@ -3375,7 +3375,7 @@
           <w14:ligatures w14:val="standardContextual"/>
         </w:rPr>
       </w:pPr>
-      <w:hyperlink w:anchor="_Toc240456604" w:history="1">
+      <w:hyperlink w:anchor="_Toc240461128" w:history="1">
         <w:r>
           <w:rPr>
             <w:rStyle w:val="Hyperlink"/>
@@ -3440,7 +3440,7 @@
             <w:noProof/>
             <w:webHidden/>
           </w:rPr>
-          <w:instrText xml:space="preserve"> PAGEREF _Toc240456604 \h </w:instrText>
+          <w:instrText xml:space="preserve"> PAGEREF _Toc240461128 \h </w:instrText>
         </w:r>
         <w:r>
           <w:rPr>
@@ -3487,7 +3487,7 @@
           <w14:ligatures w14:val="standardContextual"/>
         </w:rPr>
       </w:pPr>
-      <w:hyperlink w:anchor="_Toc240456605" w:history="1">
+      <w:hyperlink w:anchor="_Toc240461129" w:history="1">
         <w:r>
           <w:rPr>
             <w:rStyle w:val="Hyperlink"/>
@@ -3552,7 +3552,7 @@
             <w:noProof/>
             <w:webHidden/>
           </w:rPr>
-          <w:instrText xml:space="preserve"> PAGEREF _Toc240456605 \h </w:instrText>
+          <w:instrText xml:space="preserve"> PAGEREF _Toc240461129 \h </w:instrText>
         </w:r>
         <w:r>
           <w:rPr>
@@ -3598,7 +3598,7 @@
           <w14:ligatures w14:val="standardContextual"/>
         </w:rPr>
       </w:pPr>
-      <w:hyperlink w:anchor="_Toc240456606" w:history="1">
+      <w:hyperlink w:anchor="_Toc240461130" w:history="1">
         <w:r>
           <w:rPr>
             <w:rStyle w:val="Hyperlink"/>
@@ -3625,7 +3625,7 @@
             <w:noProof/>
             <w:webHidden/>
           </w:rPr>
-          <w:instrText xml:space="preserve"> PAGEREF _Toc240456606 \h </w:instrText>
+          <w:instrText xml:space="preserve"> PAGEREF _Toc240461130 \h </w:instrText>
         </w:r>
         <w:r>
           <w:rPr>
@@ -3672,7 +3672,7 @@
           <w14:ligatures w14:val="standardContextual"/>
         </w:rPr>
       </w:pPr>
-      <w:hyperlink w:anchor="_Toc240456607" w:history="1">
+      <w:hyperlink w:anchor="_Toc240461131" w:history="1">
         <w:r>
           <w:rPr>
             <w:rStyle w:val="Hyperlink"/>
@@ -3699,7 +3699,7 @@
             <w:noProof/>
             <w:webHidden/>
           </w:rPr>
-          <w:instrText xml:space="preserve"> PAGEREF _Toc240456607 \h </w:instrText>
+          <w:instrText xml:space="preserve"> PAGEREF _Toc240461131 \h </w:instrText>
         </w:r>
         <w:r>
           <w:rPr>
@@ -3745,7 +3745,7 @@
         </w:rPr>
         <w:fldChar w:fldCharType="end"/>
       </w:r>
-      <w:bookmarkStart w:id="3" w:name="_Toc240456577"/>
+      <w:bookmarkStart w:id="3" w:name="_Toc240461101"/>
       <w:r>
         <w:rPr>
           <w:rFonts w:ascii="Times New Roman" w:hAnsi="Times New Roman"/>
@@ -3800,7 +3800,7 @@
         <w:spacing w:after="360"/>
         <w:outlineLvl w:val="0"/>
       </w:pPr>
-      <w:bookmarkStart w:id="4" w:name="_Toc240456578"/>
+      <w:bookmarkStart w:id="4" w:name="_Toc240461102"/>
       <w:r>
         <w:rPr>
           <w:rFonts w:ascii="Times New Roman" w:hAnsi="Times New Roman"/>
@@ -3956,7 +3956,7 @@
         <w:pStyle w:val="Heading1"/>
         <w:outlineLvl w:val="0"/>
       </w:pPr>
-      <w:bookmarkStart w:id="5" w:name="_Toc240456579"/>
+      <w:bookmarkStart w:id="5" w:name="_Toc240461103"/>
       <w:r>
         <w:rPr>
           <w:rFonts w:ascii="Times New Roman" w:hAnsi="Times New Roman"/>
@@ -3974,7 +3974,7 @@
         <w:pStyle w:val="Heading2"/>
         <w:outlineLvl w:val="1"/>
       </w:pPr>
-      <w:bookmarkStart w:id="6" w:name="_Toc240456580"/>
+      <w:bookmarkStart w:id="6" w:name="_Toc240461104"/>
       <w:r>
         <w:rPr>
           <w:rFonts w:ascii="Times New Roman" w:hAnsi="Times New Roman"/>
@@ -4366,7 +4366,7 @@
         </w:rPr>
         <w:lastRenderedPageBreak/>
         <w:drawing>
-          <wp:inline distT="0" distB="0" distL="0" distR="0" wp14:anchorId="0C62B005" wp14:editId="41077952">
+          <wp:inline distT="0" distB="0" distL="0" distR="0" wp14:anchorId="15F96945" wp14:editId="1C484B31">
             <wp:extent cx="4860000" cy="2709609"/>
             <wp:effectExtent l="0" t="0" r="0" b="0"/>
             <wp:docPr id="2" name="Picture 2"/>
@@ -4518,7 +4518,7 @@
         </w:rPr>
         <w:lastRenderedPageBreak/>
         <w:drawing>
-          <wp:inline distT="0" distB="0" distL="0" distR="0" wp14:anchorId="56C61FE5" wp14:editId="09C27D9F">
+          <wp:inline distT="0" distB="0" distL="0" distR="0" wp14:anchorId="1C796973" wp14:editId="78CF21A9">
             <wp:extent cx="4860000" cy="2719286"/>
             <wp:effectExtent l="0" t="0" r="0" b="0"/>
             <wp:docPr id="3" name="Picture 3"/>
@@ -5013,8 +5013,8 @@
           <w:noProof/>
         </w:rPr>
         <w:drawing>
-          <wp:inline distT="0" distB="0" distL="0" distR="0" wp14:anchorId="0559DFAF" wp14:editId="63E6E269">
-            <wp:extent cx="4860000" cy="2719286"/>
+          <wp:inline distT="0" distB="0" distL="0" distR="0" wp14:anchorId="3D4B5C23" wp14:editId="0F1A7B6A">
+            <wp:extent cx="4860000" cy="2818800"/>
             <wp:effectExtent l="0" t="0" r="0" b="0"/>
             <wp:docPr id="4" name="Picture 4"/>
             <wp:cNvGraphicFramePr>
@@ -5036,7 +5036,7 @@
                   <pic:spPr>
                     <a:xfrm>
                       <a:off x="0" y="0"/>
-                      <a:ext cx="4860000" cy="2719286"/>
+                      <a:ext cx="4860000" cy="2818800"/>
                     </a:xfrm>
                     <a:prstGeom prst="rect">
                       <a:avLst/>
@@ -5229,14 +5229,14 @@
         <w:rPr>
           <w:rFonts w:cs="Times New Roman"/>
         </w:rPr>
-        <w:t xml:space="preserve">) tersebut mendorong antusiasme transaksi yang berlebihan. Setiap kali ekspansi seri baru diluncurkan (seperti Seri 151, Kilau </w:t>
+        <w:t xml:space="preserve">) tersebut mendorong antusiasme transaksi yang </w:t>
       </w:r>
       <w:r>
         <w:rPr>
           <w:rFonts w:cs="Times New Roman"/>
         </w:rPr>
         <w:lastRenderedPageBreak/>
-        <w:t xml:space="preserve">Hitam, atau Terastal), gerai ritel modern kerap diserbu antrean pembeli dan produk ludes terjual dalam hitungan jam. Banyak pembeli melakukan transaksi pembelian </w:t>
+        <w:t xml:space="preserve">berlebihan. Setiap kali ekspansi seri baru diluncurkan (seperti Seri 151, Kilau Hitam, atau Terastal), gerai ritel modern kerap diserbu antrean pembeli dan produk ludes terjual dalam hitungan jam. Banyak pembeli melakukan transaksi pembelian </w:t>
       </w:r>
       <w:r>
         <w:rPr>
@@ -5650,14 +5650,14 @@
         <w:rPr>
           <w:rFonts w:cs="Times New Roman"/>
         </w:rPr>
-        <w:t xml:space="preserve">), likuiditas pasar sekunder, anomali psikologi pasar modal dan bias </w:t>
+        <w:t xml:space="preserve">), </w:t>
       </w:r>
       <w:r>
         <w:rPr>
           <w:rFonts w:cs="Times New Roman"/>
         </w:rPr>
         <w:lastRenderedPageBreak/>
-        <w:t>optimisme berlebihan (</w:t>
+        <w:t>likuiditas pasar sekunder, anomali psikologi pasar modal dan bias optimisme berlebihan (</w:t>
       </w:r>
       <w:r>
         <w:rPr>
@@ -6096,7 +6096,14 @@
         <w:rPr>
           <w:rFonts w:cs="Times New Roman"/>
         </w:rPr>
-        <w:t xml:space="preserve">., 2018; Colline, 2024). Pembeli tergiur oleh likuiditas pasar lelang daring dan tren grading PSA/BGS, memicu keyakinan bahwa modal kecil membeli beberapa </w:t>
+        <w:t xml:space="preserve">., 2018; Colline, 2024). Pembeli tergiur oleh likuiditas pasar lelang daring dan tren grading PSA/BGS, memicu keyakinan bahwa modal kecil membeli </w:t>
+      </w:r>
+      <w:r>
+        <w:rPr>
+          <w:rFonts w:cs="Times New Roman"/>
+        </w:rPr>
+        <w:lastRenderedPageBreak/>
+        <w:t xml:space="preserve">beberapa </w:t>
       </w:r>
       <w:r>
         <w:rPr>
@@ -6135,7 +6142,6 @@
         <w:rPr>
           <w:rFonts w:cs="Times New Roman"/>
         </w:rPr>
-        <w:lastRenderedPageBreak/>
         <w:t xml:space="preserve">Terkait pengukuran variabel dependen </w:t>
       </w:r>
       <w:r>
@@ -6403,7 +6409,14 @@
         <w:rPr>
           <w:rFonts w:cs="Times New Roman"/>
         </w:rPr>
-        <w:t>. (2017) menemukan bahwa hasrat melengkapi kesatuan himpunan memicu percepatan belanja yang agresif dan spontan. Sebaliknya, studi klasik perilaku kolektor oleh Long dan Schiffman (2000) dan Spero dan Stone (2004) menemukan bahwa kolektor berpengalaman (</w:t>
+        <w:t xml:space="preserve">. (2017) menemukan bahwa hasrat melengkapi kesatuan himpunan memicu percepatan belanja yang agresif dan spontan. Sebaliknya, studi klasik perilaku kolektor oleh Long dan Schiffman (2000) dan Spero dan Stone (2004) menemukan bahwa kolektor berpengalaman </w:t>
+      </w:r>
+      <w:r>
+        <w:rPr>
+          <w:rFonts w:cs="Times New Roman"/>
+        </w:rPr>
+        <w:lastRenderedPageBreak/>
+        <w:t>(</w:t>
       </w:r>
       <w:r>
         <w:rPr>
@@ -6416,14 +6429,7 @@
         <w:rPr>
           <w:rFonts w:cs="Times New Roman"/>
         </w:rPr>
-        <w:t xml:space="preserve">) justru menumbuhkan kehati-hatian finansial; mereka menahan diri dari belanja spekulatif pada kemasan acak dan lebih memilih </w:t>
-      </w:r>
-      <w:r>
-        <w:rPr>
-          <w:rFonts w:cs="Times New Roman"/>
-        </w:rPr>
-        <w:lastRenderedPageBreak/>
-        <w:t>strategi pembelian terencana pada kartu satuan (</w:t>
+        <w:t>) justru menumbuhkan kehati-hatian finansial; mereka menahan diri dari belanja spekulatif pada kemasan acak dan lebih memilih strategi pembelian terencana pada kartu satuan (</w:t>
       </w:r>
       <w:r>
         <w:rPr>
@@ -6680,6 +6686,7 @@
           <w:b/>
           <w:i/>
         </w:rPr>
+        <w:lastRenderedPageBreak/>
         <w:t>SPECULATIVE MOTIVE</w:t>
       </w:r>
       <w:r>
@@ -6702,15 +6709,7 @@
           <w:rFonts w:cs="Times New Roman"/>
           <w:b/>
         </w:rPr>
-        <w:t xml:space="preserve"> BOOSTER </w:t>
-      </w:r>
-      <w:r>
-        <w:rPr>
-          <w:rFonts w:cs="Times New Roman"/>
-          <w:b/>
-        </w:rPr>
-        <w:lastRenderedPageBreak/>
-        <w:t xml:space="preserve">PACK KARTU POKÉMON TCG DENGAN </w:t>
+        <w:t xml:space="preserve"> BOOSTER PACK KARTU POKÉMON TCG DENGAN </w:t>
       </w:r>
       <w:r>
         <w:rPr>
@@ -6739,7 +6738,7 @@
         <w:pStyle w:val="Heading2"/>
         <w:outlineLvl w:val="1"/>
       </w:pPr>
-      <w:bookmarkStart w:id="7" w:name="_Toc240456581"/>
+      <w:bookmarkStart w:id="7" w:name="_Toc240461105"/>
       <w:r>
         <w:rPr>
           <w:rFonts w:ascii="Times New Roman" w:hAnsi="Times New Roman"/>
@@ -7084,7 +7083,7 @@
         <w:pStyle w:val="Heading2"/>
         <w:outlineLvl w:val="1"/>
       </w:pPr>
-      <w:bookmarkStart w:id="8" w:name="_Toc240456582"/>
+      <w:bookmarkStart w:id="8" w:name="_Toc240461106"/>
       <w:r>
         <w:rPr>
           <w:rFonts w:ascii="Times New Roman" w:hAnsi="Times New Roman"/>
@@ -7430,7 +7429,7 @@
         <w:pStyle w:val="Heading2"/>
         <w:outlineLvl w:val="1"/>
       </w:pPr>
-      <w:bookmarkStart w:id="9" w:name="_Toc240456583"/>
+      <w:bookmarkStart w:id="9" w:name="_Toc240461107"/>
       <w:r>
         <w:rPr>
           <w:rFonts w:ascii="Times New Roman" w:hAnsi="Times New Roman"/>
@@ -7460,7 +7459,7 @@
         <w:pStyle w:val="Heading3"/>
         <w:outlineLvl w:val="2"/>
       </w:pPr>
-      <w:bookmarkStart w:id="10" w:name="_Toc240456584"/>
+      <w:bookmarkStart w:id="10" w:name="_Toc240461108"/>
       <w:r>
         <w:rPr>
           <w:rFonts w:ascii="Times New Roman" w:hAnsi="Times New Roman"/>
@@ -7640,7 +7639,7 @@
         <w:pStyle w:val="Heading3"/>
         <w:outlineLvl w:val="2"/>
       </w:pPr>
-      <w:bookmarkStart w:id="11" w:name="_Toc240456585"/>
+      <w:bookmarkStart w:id="11" w:name="_Toc240461109"/>
       <w:r>
         <w:rPr>
           <w:rFonts w:ascii="Times New Roman" w:hAnsi="Times New Roman"/>
@@ -7786,7 +7785,7 @@
         <w:pStyle w:val="Heading1"/>
         <w:outlineLvl w:val="0"/>
       </w:pPr>
-      <w:bookmarkStart w:id="12" w:name="_Toc240456586"/>
+      <w:bookmarkStart w:id="12" w:name="_Toc240461110"/>
       <w:r>
         <w:rPr>
           <w:rFonts w:ascii="Times New Roman" w:hAnsi="Times New Roman"/>
@@ -7804,7 +7803,7 @@
         <w:pStyle w:val="Heading2"/>
         <w:outlineLvl w:val="1"/>
       </w:pPr>
-      <w:bookmarkStart w:id="13" w:name="_Toc240456587"/>
+      <w:bookmarkStart w:id="13" w:name="_Toc240461111"/>
       <w:r>
         <w:rPr>
           <w:rFonts w:ascii="Times New Roman" w:hAnsi="Times New Roman"/>
@@ -7821,7 +7820,7 @@
         <w:pStyle w:val="Heading3"/>
         <w:outlineLvl w:val="2"/>
       </w:pPr>
-      <w:bookmarkStart w:id="14" w:name="_Toc240456588"/>
+      <w:bookmarkStart w:id="14" w:name="_Toc240461112"/>
       <w:r>
         <w:rPr>
           <w:rFonts w:ascii="Times New Roman" w:hAnsi="Times New Roman"/>
@@ -8145,7 +8144,7 @@
         <w:pStyle w:val="Heading3"/>
         <w:outlineLvl w:val="2"/>
       </w:pPr>
-      <w:bookmarkStart w:id="15" w:name="_Toc240456589"/>
+      <w:bookmarkStart w:id="15" w:name="_Toc240461113"/>
       <w:r>
         <w:rPr>
           <w:rFonts w:ascii="Times New Roman" w:hAnsi="Times New Roman"/>
@@ -8484,7 +8483,7 @@
         <w:pStyle w:val="Heading3"/>
         <w:outlineLvl w:val="2"/>
       </w:pPr>
-      <w:bookmarkStart w:id="16" w:name="_Toc240456590"/>
+      <w:bookmarkStart w:id="16" w:name="_Toc240461114"/>
       <w:r>
         <w:rPr>
           <w:rFonts w:ascii="Times New Roman" w:hAnsi="Times New Roman"/>
@@ -8630,7 +8629,7 @@
         <w:pStyle w:val="Heading3"/>
         <w:outlineLvl w:val="2"/>
       </w:pPr>
-      <w:bookmarkStart w:id="17" w:name="_Toc240456591"/>
+      <w:bookmarkStart w:id="17" w:name="_Toc240461115"/>
       <w:r>
         <w:rPr>
           <w:rFonts w:ascii="Times New Roman" w:hAnsi="Times New Roman"/>
@@ -8719,7 +8718,7 @@
         <w:pStyle w:val="Heading2"/>
         <w:outlineLvl w:val="1"/>
       </w:pPr>
-      <w:bookmarkStart w:id="18" w:name="_Toc240456592"/>
+      <w:bookmarkStart w:id="18" w:name="_Toc240461116"/>
       <w:r>
         <w:rPr>
           <w:rFonts w:ascii="Times New Roman" w:hAnsi="Times New Roman"/>
@@ -8736,7 +8735,7 @@
         <w:pStyle w:val="Heading3"/>
         <w:outlineLvl w:val="2"/>
       </w:pPr>
-      <w:bookmarkStart w:id="19" w:name="_Toc240456593"/>
+      <w:bookmarkStart w:id="19" w:name="_Toc240461117"/>
       <w:r>
         <w:rPr>
           <w:rFonts w:ascii="Times New Roman" w:hAnsi="Times New Roman"/>
@@ -8817,7 +8816,7 @@
         <w:pStyle w:val="Heading3"/>
         <w:outlineLvl w:val="2"/>
       </w:pPr>
-      <w:bookmarkStart w:id="20" w:name="_Toc240456594"/>
+      <w:bookmarkStart w:id="20" w:name="_Toc240461118"/>
       <w:r>
         <w:rPr>
           <w:rFonts w:ascii="Times New Roman" w:hAnsi="Times New Roman"/>
@@ -8937,7 +8936,7 @@
         <w:pStyle w:val="Heading3"/>
         <w:outlineLvl w:val="2"/>
       </w:pPr>
-      <w:bookmarkStart w:id="21" w:name="_Toc240456595"/>
+      <w:bookmarkStart w:id="21" w:name="_Toc240461119"/>
       <w:r>
         <w:rPr>
           <w:rFonts w:ascii="Times New Roman" w:hAnsi="Times New Roman"/>
@@ -9091,7 +9090,7 @@
         <w:pStyle w:val="Heading3"/>
         <w:outlineLvl w:val="2"/>
       </w:pPr>
-      <w:bookmarkStart w:id="22" w:name="_Toc240456596"/>
+      <w:bookmarkStart w:id="22" w:name="_Toc240461120"/>
       <w:r>
         <w:rPr>
           <w:rFonts w:ascii="Times New Roman" w:hAnsi="Times New Roman"/>
@@ -9276,7 +9275,7 @@
         <w:pStyle w:val="Heading3"/>
         <w:outlineLvl w:val="2"/>
       </w:pPr>
-      <w:bookmarkStart w:id="23" w:name="_Toc240456597"/>
+      <w:bookmarkStart w:id="23" w:name="_Toc240461121"/>
       <w:r>
         <w:rPr>
           <w:rFonts w:ascii="Times New Roman" w:hAnsi="Times New Roman"/>
@@ -9416,7 +9415,7 @@
         <w:pStyle w:val="Heading2"/>
         <w:outlineLvl w:val="1"/>
       </w:pPr>
-      <w:bookmarkStart w:id="24" w:name="_Toc240456598"/>
+      <w:bookmarkStart w:id="24" w:name="_Toc240461122"/>
       <w:r>
         <w:rPr>
           <w:rFonts w:ascii="Times New Roman" w:hAnsi="Times New Roman"/>
@@ -10956,7 +10955,7 @@
         <w:pStyle w:val="Heading2"/>
         <w:outlineLvl w:val="1"/>
       </w:pPr>
-      <w:bookmarkStart w:id="25" w:name="_Toc240456599"/>
+      <w:bookmarkStart w:id="25" w:name="_Toc240461123"/>
       <w:r>
         <w:rPr>
           <w:rFonts w:ascii="Times New Roman" w:hAnsi="Times New Roman"/>
@@ -10973,7 +10972,7 @@
         <w:pStyle w:val="Heading3"/>
         <w:outlineLvl w:val="2"/>
       </w:pPr>
-      <w:bookmarkStart w:id="26" w:name="_Toc240456600"/>
+      <w:bookmarkStart w:id="26" w:name="_Toc240461124"/>
       <w:r>
         <w:rPr>
           <w:rFonts w:ascii="Times New Roman" w:hAnsi="Times New Roman"/>
@@ -11195,7 +11194,7 @@
         <w:pStyle w:val="Heading3"/>
         <w:outlineLvl w:val="2"/>
       </w:pPr>
-      <w:bookmarkStart w:id="27" w:name="_Toc240456601"/>
+      <w:bookmarkStart w:id="27" w:name="_Toc240461125"/>
       <w:r>
         <w:rPr>
           <w:rFonts w:ascii="Times New Roman" w:hAnsi="Times New Roman"/>
@@ -11514,7 +11513,7 @@
         <w:pStyle w:val="Heading3"/>
         <w:outlineLvl w:val="2"/>
       </w:pPr>
-      <w:bookmarkStart w:id="28" w:name="_Toc240456602"/>
+      <w:bookmarkStart w:id="28" w:name="_Toc240461126"/>
       <w:r>
         <w:rPr>
           <w:rFonts w:ascii="Times New Roman" w:hAnsi="Times New Roman"/>
@@ -11795,7 +11794,7 @@
         <w:pStyle w:val="Heading3"/>
         <w:outlineLvl w:val="2"/>
       </w:pPr>
-      <w:bookmarkStart w:id="29" w:name="_Toc240456603"/>
+      <w:bookmarkStart w:id="29" w:name="_Toc240461127"/>
       <w:r>
         <w:rPr>
           <w:rFonts w:ascii="Times New Roman" w:hAnsi="Times New Roman"/>
@@ -12116,7 +12115,7 @@
         <w:pStyle w:val="Heading3"/>
         <w:outlineLvl w:val="2"/>
       </w:pPr>
-      <w:bookmarkStart w:id="30" w:name="_Toc240456604"/>
+      <w:bookmarkStart w:id="30" w:name="_Toc240461128"/>
       <w:r>
         <w:rPr>
           <w:rFonts w:ascii="Times New Roman" w:hAnsi="Times New Roman"/>
@@ -12398,7 +12397,7 @@
         <w:pStyle w:val="Heading3"/>
         <w:outlineLvl w:val="2"/>
       </w:pPr>
-      <w:bookmarkStart w:id="31" w:name="_Toc240456605"/>
+      <w:bookmarkStart w:id="31" w:name="_Toc240461129"/>
       <w:r>
         <w:rPr>
           <w:rFonts w:ascii="Times New Roman" w:hAnsi="Times New Roman"/>
@@ -12634,7 +12633,7 @@
         <w:pStyle w:val="Heading2"/>
         <w:outlineLvl w:val="1"/>
       </w:pPr>
-      <w:bookmarkStart w:id="32" w:name="_Toc240456606"/>
+      <w:bookmarkStart w:id="32" w:name="_Toc240461130"/>
       <w:r>
         <w:rPr>
           <w:rFonts w:ascii="Times New Roman" w:hAnsi="Times New Roman"/>
@@ -12670,7 +12669,7 @@
         </w:rPr>
         <w:lastRenderedPageBreak/>
         <w:drawing>
-          <wp:inline distT="0" distB="0" distL="0" distR="0" wp14:anchorId="2B88CBEF" wp14:editId="3A0457FB">
+          <wp:inline distT="0" distB="0" distL="0" distR="0" wp14:anchorId="05FD5D0A" wp14:editId="63E6FFB4">
             <wp:extent cx="5040000" cy="2753704"/>
             <wp:effectExtent l="0" t="0" r="0" b="0"/>
             <wp:docPr id="5" name="Picture 5"/>
@@ -12743,7 +12742,7 @@
         <w:pStyle w:val="Heading1"/>
         <w:outlineLvl w:val="0"/>
       </w:pPr>
-      <w:bookmarkStart w:id="33" w:name="_Toc240456607"/>
+      <w:bookmarkStart w:id="33" w:name="_Toc240461131"/>
       <w:r>
         <w:rPr>
           <w:rFonts w:ascii="Times New Roman" w:hAnsi="Times New Roman"/>
@@ -14577,31 +14576,31 @@
       </w:rPr>
     </w:lvl>
   </w:abstractNum>
-  <w:num w:numId="1" w16cid:durableId="1662924452">
+  <w:num w:numId="1" w16cid:durableId="1499032536">
     <w:abstractNumId w:val="8"/>
   </w:num>
-  <w:num w:numId="2" w16cid:durableId="216405566">
+  <w:num w:numId="2" w16cid:durableId="493571068">
     <w:abstractNumId w:val="6"/>
   </w:num>
-  <w:num w:numId="3" w16cid:durableId="1217162127">
+  <w:num w:numId="3" w16cid:durableId="1206679361">
     <w:abstractNumId w:val="5"/>
   </w:num>
-  <w:num w:numId="4" w16cid:durableId="1421566418">
+  <w:num w:numId="4" w16cid:durableId="648168050">
     <w:abstractNumId w:val="4"/>
   </w:num>
-  <w:num w:numId="5" w16cid:durableId="352613015">
+  <w:num w:numId="5" w16cid:durableId="1739743632">
     <w:abstractNumId w:val="7"/>
   </w:num>
-  <w:num w:numId="6" w16cid:durableId="909462820">
+  <w:num w:numId="6" w16cid:durableId="69431229">
     <w:abstractNumId w:val="3"/>
   </w:num>
-  <w:num w:numId="7" w16cid:durableId="770473617">
+  <w:num w:numId="7" w16cid:durableId="1050764968">
     <w:abstractNumId w:val="2"/>
   </w:num>
-  <w:num w:numId="8" w16cid:durableId="78527931">
+  <w:num w:numId="8" w16cid:durableId="1780099741">
     <w:abstractNumId w:val="1"/>
   </w:num>
-  <w:num w:numId="9" w16cid:durableId="331956696">
+  <w:num w:numId="9" w16cid:durableId="1471489">
     <w:abstractNumId w:val="0"/>
   </w:num>
 </w:numbering>
@@ -26042,7 +26041,7 @@
     <w:autoRedefine/>
     <w:uiPriority w:val="39"/>
     <w:unhideWhenUsed/>
-    <w:rsid w:val="00D43C9F"/>
+    <w:rsid w:val="000D09A1"/>
     <w:pPr>
       <w:spacing w:after="40" w:line="240" w:lineRule="auto"/>
     </w:pPr>
@@ -26058,7 +26057,7 @@
     <w:autoRedefine/>
     <w:uiPriority w:val="39"/>
     <w:unhideWhenUsed/>
-    <w:rsid w:val="00D43C9F"/>
+    <w:rsid w:val="000D09A1"/>
     <w:pPr>
       <w:spacing w:after="40" w:line="240" w:lineRule="auto"/>
       <w:ind w:left="360"/>
@@ -26074,7 +26073,7 @@
     <w:autoRedefine/>
     <w:uiPriority w:val="39"/>
     <w:unhideWhenUsed/>
-    <w:rsid w:val="00D43C9F"/>
+    <w:rsid w:val="000D09A1"/>
     <w:pPr>
       <w:spacing w:after="40" w:line="240" w:lineRule="auto"/>
       <w:ind w:left="720"/>
@@ -26089,7 +26088,7 @@
     <w:basedOn w:val="DefaultParagraphFont"/>
     <w:uiPriority w:val="99"/>
     <w:unhideWhenUsed/>
-    <w:rsid w:val="00D43C9F"/>
+    <w:rsid w:val="000D09A1"/>
     <w:rPr>
       <w:color w:val="0000FF" w:themeColor="hyperlink"/>
       <w:u w:val="single"/>

</xml_diff>

<commit_message>
feat(references): unduh lengkap 11 buku referensi skripsi dari LibGen ke 03_Buku_Referensi_PDF dan verifikasi biner PyMuPDF
</commit_message>
<xml_diff>
--- a/01_Naskah_Utama/Proposal_Arthur_NoBab3.docx
+++ b/01_Naskah_Utama/Proposal_Arthur_NoBab3.docx
@@ -12,7 +12,7 @@
           <w:noProof/>
         </w:rPr>
         <w:drawing>
-          <wp:inline distT="0" distB="0" distL="0" distR="0" wp14:anchorId="5685E947" wp14:editId="6A533A88">
+          <wp:inline distT="0" distB="0" distL="0" distR="0" wp14:anchorId="6C45FBF8" wp14:editId="53E05360">
             <wp:extent cx="1152000" cy="1152000"/>
             <wp:effectExtent l="0" t="0" r="0" b="0"/>
             <wp:docPr id="1" name="Picture 1"/>
@@ -274,7 +274,7 @@
         <w:spacing w:after="360"/>
         <w:outlineLvl w:val="0"/>
       </w:pPr>
-      <w:bookmarkStart w:id="0" w:name="_Toc240461098"/>
+      <w:bookmarkStart w:id="0" w:name="_Toc240476611"/>
       <w:r>
         <w:rPr>
           <w:rFonts w:ascii="Times New Roman" w:hAnsi="Times New Roman"/>
@@ -567,7 +567,7 @@
         <w:spacing w:after="360"/>
         <w:outlineLvl w:val="0"/>
       </w:pPr>
-      <w:bookmarkStart w:id="1" w:name="_Toc240461099"/>
+      <w:bookmarkStart w:id="1" w:name="_Toc240476612"/>
       <w:r>
         <w:rPr>
           <w:rFonts w:ascii="Times New Roman" w:hAnsi="Times New Roman"/>
@@ -691,7 +691,7 @@
         <w:spacing w:after="360"/>
         <w:outlineLvl w:val="0"/>
       </w:pPr>
-      <w:bookmarkStart w:id="2" w:name="_Toc240461100"/>
+      <w:bookmarkStart w:id="2" w:name="_Toc240476613"/>
       <w:r>
         <w:rPr>
           <w:rFonts w:ascii="Times New Roman" w:hAnsi="Times New Roman"/>
@@ -853,7 +853,7 @@
       <w:r>
         <w:fldChar w:fldCharType="separate"/>
       </w:r>
-      <w:hyperlink w:anchor="_Toc240461098" w:history="1">
+      <w:hyperlink w:anchor="_Toc240476611" w:history="1">
         <w:r>
           <w:rPr>
             <w:rStyle w:val="Hyperlink"/>
@@ -880,7 +880,7 @@
             <w:noProof/>
             <w:webHidden/>
           </w:rPr>
-          <w:instrText xml:space="preserve"> PAGEREF _Toc240461098 \h </w:instrText>
+          <w:instrText xml:space="preserve"> PAGEREF _Toc240476611 \h </w:instrText>
         </w:r>
         <w:r>
           <w:rPr>
@@ -927,7 +927,7 @@
           <w14:ligatures w14:val="standardContextual"/>
         </w:rPr>
       </w:pPr>
-      <w:hyperlink w:anchor="_Toc240461099" w:history="1">
+      <w:hyperlink w:anchor="_Toc240476612" w:history="1">
         <w:r>
           <w:rPr>
             <w:rStyle w:val="Hyperlink"/>
@@ -954,7 +954,7 @@
             <w:noProof/>
             <w:webHidden/>
           </w:rPr>
-          <w:instrText xml:space="preserve"> PAGEREF _Toc240461099 \h </w:instrText>
+          <w:instrText xml:space="preserve"> PAGEREF _Toc240476612 \h </w:instrText>
         </w:r>
         <w:r>
           <w:rPr>
@@ -1001,7 +1001,7 @@
           <w14:ligatures w14:val="standardContextual"/>
         </w:rPr>
       </w:pPr>
-      <w:hyperlink w:anchor="_Toc240461100" w:history="1">
+      <w:hyperlink w:anchor="_Toc240476613" w:history="1">
         <w:r>
           <w:rPr>
             <w:rStyle w:val="Hyperlink"/>
@@ -1028,7 +1028,7 @@
             <w:noProof/>
             <w:webHidden/>
           </w:rPr>
-          <w:instrText xml:space="preserve"> PAGEREF _Toc240461100 \h </w:instrText>
+          <w:instrText xml:space="preserve"> PAGEREF _Toc240476613 \h </w:instrText>
         </w:r>
         <w:r>
           <w:rPr>
@@ -1075,7 +1075,7 @@
           <w14:ligatures w14:val="standardContextual"/>
         </w:rPr>
       </w:pPr>
-      <w:hyperlink w:anchor="_Toc240461101" w:history="1">
+      <w:hyperlink w:anchor="_Toc240476614" w:history="1">
         <w:r>
           <w:rPr>
             <w:rStyle w:val="Hyperlink"/>
@@ -1102,7 +1102,7 @@
             <w:noProof/>
             <w:webHidden/>
           </w:rPr>
-          <w:instrText xml:space="preserve"> PAGEREF _Toc240461101 \h </w:instrText>
+          <w:instrText xml:space="preserve"> PAGEREF _Toc240476614 \h </w:instrText>
         </w:r>
         <w:r>
           <w:rPr>
@@ -1149,7 +1149,7 @@
           <w14:ligatures w14:val="standardContextual"/>
         </w:rPr>
       </w:pPr>
-      <w:hyperlink w:anchor="_Toc240461102" w:history="1">
+      <w:hyperlink w:anchor="_Toc240476615" w:history="1">
         <w:r>
           <w:rPr>
             <w:rStyle w:val="Hyperlink"/>
@@ -1176,7 +1176,7 @@
             <w:noProof/>
             <w:webHidden/>
           </w:rPr>
-          <w:instrText xml:space="preserve"> PAGEREF _Toc240461102 \h </w:instrText>
+          <w:instrText xml:space="preserve"> PAGEREF _Toc240476615 \h </w:instrText>
         </w:r>
         <w:r>
           <w:rPr>
@@ -1223,7 +1223,7 @@
           <w14:ligatures w14:val="standardContextual"/>
         </w:rPr>
       </w:pPr>
-      <w:hyperlink w:anchor="_Toc240461103" w:history="1">
+      <w:hyperlink w:anchor="_Toc240476616" w:history="1">
         <w:r>
           <w:rPr>
             <w:rStyle w:val="Hyperlink"/>
@@ -1250,7 +1250,7 @@
             <w:noProof/>
             <w:webHidden/>
           </w:rPr>
-          <w:instrText xml:space="preserve"> PAGEREF _Toc240461103 \h </w:instrText>
+          <w:instrText xml:space="preserve"> PAGEREF _Toc240476616 \h </w:instrText>
         </w:r>
         <w:r>
           <w:rPr>
@@ -1296,7 +1296,7 @@
           <w14:ligatures w14:val="standardContextual"/>
         </w:rPr>
       </w:pPr>
-      <w:hyperlink w:anchor="_Toc240461104" w:history="1">
+      <w:hyperlink w:anchor="_Toc240476617" w:history="1">
         <w:r>
           <w:rPr>
             <w:rStyle w:val="Hyperlink"/>
@@ -1323,7 +1323,7 @@
             <w:noProof/>
             <w:webHidden/>
           </w:rPr>
-          <w:instrText xml:space="preserve"> PAGEREF _Toc240461104 \h </w:instrText>
+          <w:instrText xml:space="preserve"> PAGEREF _Toc240476617 \h </w:instrText>
         </w:r>
         <w:r>
           <w:rPr>
@@ -1369,7 +1369,7 @@
           <w14:ligatures w14:val="standardContextual"/>
         </w:rPr>
       </w:pPr>
-      <w:hyperlink w:anchor="_Toc240461105" w:history="1">
+      <w:hyperlink w:anchor="_Toc240476618" w:history="1">
         <w:r>
           <w:rPr>
             <w:rStyle w:val="Hyperlink"/>
@@ -1396,7 +1396,7 @@
             <w:noProof/>
             <w:webHidden/>
           </w:rPr>
-          <w:instrText xml:space="preserve"> PAGEREF _Toc240461105 \h </w:instrText>
+          <w:instrText xml:space="preserve"> PAGEREF _Toc240476618 \h </w:instrText>
         </w:r>
         <w:r>
           <w:rPr>
@@ -1442,7 +1442,7 @@
           <w14:ligatures w14:val="standardContextual"/>
         </w:rPr>
       </w:pPr>
-      <w:hyperlink w:anchor="_Toc240461106" w:history="1">
+      <w:hyperlink w:anchor="_Toc240476619" w:history="1">
         <w:r>
           <w:rPr>
             <w:rStyle w:val="Hyperlink"/>
@@ -1469,7 +1469,7 @@
             <w:noProof/>
             <w:webHidden/>
           </w:rPr>
-          <w:instrText xml:space="preserve"> PAGEREF _Toc240461106 \h </w:instrText>
+          <w:instrText xml:space="preserve"> PAGEREF _Toc240476619 \h </w:instrText>
         </w:r>
         <w:r>
           <w:rPr>
@@ -1515,7 +1515,7 @@
           <w14:ligatures w14:val="standardContextual"/>
         </w:rPr>
       </w:pPr>
-      <w:hyperlink w:anchor="_Toc240461107" w:history="1">
+      <w:hyperlink w:anchor="_Toc240476620" w:history="1">
         <w:r>
           <w:rPr>
             <w:rStyle w:val="Hyperlink"/>
@@ -1542,7 +1542,7 @@
             <w:noProof/>
             <w:webHidden/>
           </w:rPr>
-          <w:instrText xml:space="preserve"> PAGEREF _Toc240461107 \h </w:instrText>
+          <w:instrText xml:space="preserve"> PAGEREF _Toc240476620 \h </w:instrText>
         </w:r>
         <w:r>
           <w:rPr>
@@ -1589,7 +1589,7 @@
           <w14:ligatures w14:val="standardContextual"/>
         </w:rPr>
       </w:pPr>
-      <w:hyperlink w:anchor="_Toc240461108" w:history="1">
+      <w:hyperlink w:anchor="_Toc240476621" w:history="1">
         <w:r>
           <w:rPr>
             <w:rStyle w:val="Hyperlink"/>
@@ -1616,7 +1616,7 @@
             <w:noProof/>
             <w:webHidden/>
           </w:rPr>
-          <w:instrText xml:space="preserve"> PAGEREF _Toc240461108 \h </w:instrText>
+          <w:instrText xml:space="preserve"> PAGEREF _Toc240476621 \h </w:instrText>
         </w:r>
         <w:r>
           <w:rPr>
@@ -1663,7 +1663,7 @@
           <w14:ligatures w14:val="standardContextual"/>
         </w:rPr>
       </w:pPr>
-      <w:hyperlink w:anchor="_Toc240461109" w:history="1">
+      <w:hyperlink w:anchor="_Toc240476622" w:history="1">
         <w:r>
           <w:rPr>
             <w:rStyle w:val="Hyperlink"/>
@@ -1690,7 +1690,7 @@
             <w:noProof/>
             <w:webHidden/>
           </w:rPr>
-          <w:instrText xml:space="preserve"> PAGEREF _Toc240461109 \h </w:instrText>
+          <w:instrText xml:space="preserve"> PAGEREF _Toc240476622 \h </w:instrText>
         </w:r>
         <w:r>
           <w:rPr>
@@ -1737,7 +1737,7 @@
           <w14:ligatures w14:val="standardContextual"/>
         </w:rPr>
       </w:pPr>
-      <w:hyperlink w:anchor="_Toc240461110" w:history="1">
+      <w:hyperlink w:anchor="_Toc240476623" w:history="1">
         <w:r>
           <w:rPr>
             <w:rStyle w:val="Hyperlink"/>
@@ -1764,7 +1764,7 @@
             <w:noProof/>
             <w:webHidden/>
           </w:rPr>
-          <w:instrText xml:space="preserve"> PAGEREF _Toc240461110 \h </w:instrText>
+          <w:instrText xml:space="preserve"> PAGEREF _Toc240476623 \h </w:instrText>
         </w:r>
         <w:r>
           <w:rPr>
@@ -1810,7 +1810,7 @@
           <w14:ligatures w14:val="standardContextual"/>
         </w:rPr>
       </w:pPr>
-      <w:hyperlink w:anchor="_Toc240461111" w:history="1">
+      <w:hyperlink w:anchor="_Toc240476624" w:history="1">
         <w:r>
           <w:rPr>
             <w:rStyle w:val="Hyperlink"/>
@@ -1837,7 +1837,7 @@
             <w:noProof/>
             <w:webHidden/>
           </w:rPr>
-          <w:instrText xml:space="preserve"> PAGEREF _Toc240461111 \h </w:instrText>
+          <w:instrText xml:space="preserve"> PAGEREF _Toc240476624 \h </w:instrText>
         </w:r>
         <w:r>
           <w:rPr>
@@ -1884,7 +1884,7 @@
           <w14:ligatures w14:val="standardContextual"/>
         </w:rPr>
       </w:pPr>
-      <w:hyperlink w:anchor="_Toc240461112" w:history="1">
+      <w:hyperlink w:anchor="_Toc240476625" w:history="1">
         <w:r>
           <w:rPr>
             <w:rStyle w:val="Hyperlink"/>
@@ -1926,7 +1926,7 @@
             <w:noProof/>
             <w:webHidden/>
           </w:rPr>
-          <w:instrText xml:space="preserve"> PAGEREF _Toc240461112 \h </w:instrText>
+          <w:instrText xml:space="preserve"> PAGEREF _Toc240476625 \h </w:instrText>
         </w:r>
         <w:r>
           <w:rPr>
@@ -1973,7 +1973,7 @@
           <w14:ligatures w14:val="standardContextual"/>
         </w:rPr>
       </w:pPr>
-      <w:hyperlink w:anchor="_Toc240461113" w:history="1">
+      <w:hyperlink w:anchor="_Toc240476626" w:history="1">
         <w:r>
           <w:rPr>
             <w:rStyle w:val="Hyperlink"/>
@@ -2015,7 +2015,7 @@
             <w:noProof/>
             <w:webHidden/>
           </w:rPr>
-          <w:instrText xml:space="preserve"> PAGEREF _Toc240461113 \h </w:instrText>
+          <w:instrText xml:space="preserve"> PAGEREF _Toc240476626 \h </w:instrText>
         </w:r>
         <w:r>
           <w:rPr>
@@ -2062,7 +2062,7 @@
           <w14:ligatures w14:val="standardContextual"/>
         </w:rPr>
       </w:pPr>
-      <w:hyperlink w:anchor="_Toc240461114" w:history="1">
+      <w:hyperlink w:anchor="_Toc240476627" w:history="1">
         <w:r>
           <w:rPr>
             <w:rStyle w:val="Hyperlink"/>
@@ -2097,7 +2097,7 @@
             <w:noProof/>
             <w:webHidden/>
           </w:rPr>
-          <w:instrText xml:space="preserve"> PAGEREF _Toc240461114 \h </w:instrText>
+          <w:instrText xml:space="preserve"> PAGEREF _Toc240476627 \h </w:instrText>
         </w:r>
         <w:r>
           <w:rPr>
@@ -2144,7 +2144,7 @@
           <w14:ligatures w14:val="standardContextual"/>
         </w:rPr>
       </w:pPr>
-      <w:hyperlink w:anchor="_Toc240461115" w:history="1">
+      <w:hyperlink w:anchor="_Toc240476628" w:history="1">
         <w:r>
           <w:rPr>
             <w:rStyle w:val="Hyperlink"/>
@@ -2186,7 +2186,7 @@
             <w:noProof/>
             <w:webHidden/>
           </w:rPr>
-          <w:instrText xml:space="preserve"> PAGEREF _Toc240461115 \h </w:instrText>
+          <w:instrText xml:space="preserve"> PAGEREF _Toc240476628 \h </w:instrText>
         </w:r>
         <w:r>
           <w:rPr>
@@ -2232,7 +2232,7 @@
           <w14:ligatures w14:val="standardContextual"/>
         </w:rPr>
       </w:pPr>
-      <w:hyperlink w:anchor="_Toc240461116" w:history="1">
+      <w:hyperlink w:anchor="_Toc240476629" w:history="1">
         <w:r>
           <w:rPr>
             <w:rStyle w:val="Hyperlink"/>
@@ -2259,7 +2259,7 @@
             <w:noProof/>
             <w:webHidden/>
           </w:rPr>
-          <w:instrText xml:space="preserve"> PAGEREF _Toc240461116 \h </w:instrText>
+          <w:instrText xml:space="preserve"> PAGEREF _Toc240476629 \h </w:instrText>
         </w:r>
         <w:r>
           <w:rPr>
@@ -2306,7 +2306,7 @@
           <w14:ligatures w14:val="standardContextual"/>
         </w:rPr>
       </w:pPr>
-      <w:hyperlink w:anchor="_Toc240461117" w:history="1">
+      <w:hyperlink w:anchor="_Toc240476630" w:history="1">
         <w:r>
           <w:rPr>
             <w:rStyle w:val="Hyperlink"/>
@@ -2363,7 +2363,7 @@
             <w:noProof/>
             <w:webHidden/>
           </w:rPr>
-          <w:instrText xml:space="preserve"> PAGEREF _Toc240461117 \h </w:instrText>
+          <w:instrText xml:space="preserve"> PAGEREF _Toc240476630 \h </w:instrText>
         </w:r>
         <w:r>
           <w:rPr>
@@ -2410,7 +2410,7 @@
           <w14:ligatures w14:val="standardContextual"/>
         </w:rPr>
       </w:pPr>
-      <w:hyperlink w:anchor="_Toc240461118" w:history="1">
+      <w:hyperlink w:anchor="_Toc240476631" w:history="1">
         <w:r>
           <w:rPr>
             <w:rStyle w:val="Hyperlink"/>
@@ -2467,7 +2467,7 @@
             <w:noProof/>
             <w:webHidden/>
           </w:rPr>
-          <w:instrText xml:space="preserve"> PAGEREF _Toc240461118 \h </w:instrText>
+          <w:instrText xml:space="preserve"> PAGEREF _Toc240476631 \h </w:instrText>
         </w:r>
         <w:r>
           <w:rPr>
@@ -2514,7 +2514,7 @@
           <w14:ligatures w14:val="standardContextual"/>
         </w:rPr>
       </w:pPr>
-      <w:hyperlink w:anchor="_Toc240461119" w:history="1">
+      <w:hyperlink w:anchor="_Toc240476632" w:history="1">
         <w:r>
           <w:rPr>
             <w:rStyle w:val="Hyperlink"/>
@@ -2571,7 +2571,7 @@
             <w:noProof/>
             <w:webHidden/>
           </w:rPr>
-          <w:instrText xml:space="preserve"> PAGEREF _Toc240461119 \h </w:instrText>
+          <w:instrText xml:space="preserve"> PAGEREF _Toc240476632 \h </w:instrText>
         </w:r>
         <w:r>
           <w:rPr>
@@ -2618,7 +2618,7 @@
           <w14:ligatures w14:val="standardContextual"/>
         </w:rPr>
       </w:pPr>
-      <w:hyperlink w:anchor="_Toc240461120" w:history="1">
+      <w:hyperlink w:anchor="_Toc240476633" w:history="1">
         <w:r>
           <w:rPr>
             <w:rStyle w:val="Hyperlink"/>
@@ -2675,7 +2675,7 @@
             <w:noProof/>
             <w:webHidden/>
           </w:rPr>
-          <w:instrText xml:space="preserve"> PAGEREF _Toc240461120 \h </w:instrText>
+          <w:instrText xml:space="preserve"> PAGEREF _Toc240476633 \h </w:instrText>
         </w:r>
         <w:r>
           <w:rPr>
@@ -2722,7 +2722,7 @@
           <w14:ligatures w14:val="standardContextual"/>
         </w:rPr>
       </w:pPr>
-      <w:hyperlink w:anchor="_Toc240461121" w:history="1">
+      <w:hyperlink w:anchor="_Toc240476634" w:history="1">
         <w:r>
           <w:rPr>
             <w:rStyle w:val="Hyperlink"/>
@@ -2779,7 +2779,7 @@
             <w:noProof/>
             <w:webHidden/>
           </w:rPr>
-          <w:instrText xml:space="preserve"> PAGEREF _Toc240461121 \h </w:instrText>
+          <w:instrText xml:space="preserve"> PAGEREF _Toc240476634 \h </w:instrText>
         </w:r>
         <w:r>
           <w:rPr>
@@ -2825,7 +2825,7 @@
           <w14:ligatures w14:val="standardContextual"/>
         </w:rPr>
       </w:pPr>
-      <w:hyperlink w:anchor="_Toc240461122" w:history="1">
+      <w:hyperlink w:anchor="_Toc240476635" w:history="1">
         <w:r>
           <w:rPr>
             <w:rStyle w:val="Hyperlink"/>
@@ -2852,7 +2852,7 @@
             <w:noProof/>
             <w:webHidden/>
           </w:rPr>
-          <w:instrText xml:space="preserve"> PAGEREF _Toc240461122 \h </w:instrText>
+          <w:instrText xml:space="preserve"> PAGEREF _Toc240476635 \h </w:instrText>
         </w:r>
         <w:r>
           <w:rPr>
@@ -2898,7 +2898,7 @@
           <w14:ligatures w14:val="standardContextual"/>
         </w:rPr>
       </w:pPr>
-      <w:hyperlink w:anchor="_Toc240461123" w:history="1">
+      <w:hyperlink w:anchor="_Toc240476636" w:history="1">
         <w:r>
           <w:rPr>
             <w:rStyle w:val="Hyperlink"/>
@@ -2925,7 +2925,7 @@
             <w:noProof/>
             <w:webHidden/>
           </w:rPr>
-          <w:instrText xml:space="preserve"> PAGEREF _Toc240461123 \h </w:instrText>
+          <w:instrText xml:space="preserve"> PAGEREF _Toc240476636 \h </w:instrText>
         </w:r>
         <w:r>
           <w:rPr>
@@ -2972,7 +2972,7 @@
           <w14:ligatures w14:val="standardContextual"/>
         </w:rPr>
       </w:pPr>
-      <w:hyperlink w:anchor="_Toc240461124" w:history="1">
+      <w:hyperlink w:anchor="_Toc240476637" w:history="1">
         <w:r>
           <w:rPr>
             <w:rStyle w:val="Hyperlink"/>
@@ -3022,7 +3022,7 @@
             <w:noProof/>
             <w:webHidden/>
           </w:rPr>
-          <w:instrText xml:space="preserve"> PAGEREF _Toc240461124 \h </w:instrText>
+          <w:instrText xml:space="preserve"> PAGEREF _Toc240476637 \h </w:instrText>
         </w:r>
         <w:r>
           <w:rPr>
@@ -3069,7 +3069,7 @@
           <w14:ligatures w14:val="standardContextual"/>
         </w:rPr>
       </w:pPr>
-      <w:hyperlink w:anchor="_Toc240461125" w:history="1">
+      <w:hyperlink w:anchor="_Toc240476638" w:history="1">
         <w:r>
           <w:rPr>
             <w:rStyle w:val="Hyperlink"/>
@@ -3119,7 +3119,7 @@
             <w:noProof/>
             <w:webHidden/>
           </w:rPr>
-          <w:instrText xml:space="preserve"> PAGEREF _Toc240461125 \h </w:instrText>
+          <w:instrText xml:space="preserve"> PAGEREF _Toc240476638 \h </w:instrText>
         </w:r>
         <w:r>
           <w:rPr>
@@ -3166,7 +3166,7 @@
           <w14:ligatures w14:val="standardContextual"/>
         </w:rPr>
       </w:pPr>
-      <w:hyperlink w:anchor="_Toc240461126" w:history="1">
+      <w:hyperlink w:anchor="_Toc240476639" w:history="1">
         <w:r>
           <w:rPr>
             <w:rStyle w:val="Hyperlink"/>
@@ -3216,7 +3216,7 @@
             <w:noProof/>
             <w:webHidden/>
           </w:rPr>
-          <w:instrText xml:space="preserve"> PAGEREF _Toc240461126 \h </w:instrText>
+          <w:instrText xml:space="preserve"> PAGEREF _Toc240476639 \h </w:instrText>
         </w:r>
         <w:r>
           <w:rPr>
@@ -3263,7 +3263,7 @@
           <w14:ligatures w14:val="standardContextual"/>
         </w:rPr>
       </w:pPr>
-      <w:hyperlink w:anchor="_Toc240461127" w:history="1">
+      <w:hyperlink w:anchor="_Toc240476640" w:history="1">
         <w:r>
           <w:rPr>
             <w:rStyle w:val="Hyperlink"/>
@@ -3328,7 +3328,7 @@
             <w:noProof/>
             <w:webHidden/>
           </w:rPr>
-          <w:instrText xml:space="preserve"> PAGEREF _Toc240461127 \h </w:instrText>
+          <w:instrText xml:space="preserve"> PAGEREF _Toc240476640 \h </w:instrText>
         </w:r>
         <w:r>
           <w:rPr>
@@ -3375,7 +3375,7 @@
           <w14:ligatures w14:val="standardContextual"/>
         </w:rPr>
       </w:pPr>
-      <w:hyperlink w:anchor="_Toc240461128" w:history="1">
+      <w:hyperlink w:anchor="_Toc240476641" w:history="1">
         <w:r>
           <w:rPr>
             <w:rStyle w:val="Hyperlink"/>
@@ -3440,7 +3440,7 @@
             <w:noProof/>
             <w:webHidden/>
           </w:rPr>
-          <w:instrText xml:space="preserve"> PAGEREF _Toc240461128 \h </w:instrText>
+          <w:instrText xml:space="preserve"> PAGEREF _Toc240476641 \h </w:instrText>
         </w:r>
         <w:r>
           <w:rPr>
@@ -3487,7 +3487,7 @@
           <w14:ligatures w14:val="standardContextual"/>
         </w:rPr>
       </w:pPr>
-      <w:hyperlink w:anchor="_Toc240461129" w:history="1">
+      <w:hyperlink w:anchor="_Toc240476642" w:history="1">
         <w:r>
           <w:rPr>
             <w:rStyle w:val="Hyperlink"/>
@@ -3552,7 +3552,7 @@
             <w:noProof/>
             <w:webHidden/>
           </w:rPr>
-          <w:instrText xml:space="preserve"> PAGEREF _Toc240461129 \h </w:instrText>
+          <w:instrText xml:space="preserve"> PAGEREF _Toc240476642 \h </w:instrText>
         </w:r>
         <w:r>
           <w:rPr>
@@ -3598,7 +3598,7 @@
           <w14:ligatures w14:val="standardContextual"/>
         </w:rPr>
       </w:pPr>
-      <w:hyperlink w:anchor="_Toc240461130" w:history="1">
+      <w:hyperlink w:anchor="_Toc240476643" w:history="1">
         <w:r>
           <w:rPr>
             <w:rStyle w:val="Hyperlink"/>
@@ -3625,7 +3625,7 @@
             <w:noProof/>
             <w:webHidden/>
           </w:rPr>
-          <w:instrText xml:space="preserve"> PAGEREF _Toc240461130 \h </w:instrText>
+          <w:instrText xml:space="preserve"> PAGEREF _Toc240476643 \h </w:instrText>
         </w:r>
         <w:r>
           <w:rPr>
@@ -3672,7 +3672,7 @@
           <w14:ligatures w14:val="standardContextual"/>
         </w:rPr>
       </w:pPr>
-      <w:hyperlink w:anchor="_Toc240461131" w:history="1">
+      <w:hyperlink w:anchor="_Toc240476644" w:history="1">
         <w:r>
           <w:rPr>
             <w:rStyle w:val="Hyperlink"/>
@@ -3699,7 +3699,7 @@
             <w:noProof/>
             <w:webHidden/>
           </w:rPr>
-          <w:instrText xml:space="preserve"> PAGEREF _Toc240461131 \h </w:instrText>
+          <w:instrText xml:space="preserve"> PAGEREF _Toc240476644 \h </w:instrText>
         </w:r>
         <w:r>
           <w:rPr>
@@ -3745,7 +3745,7 @@
         </w:rPr>
         <w:fldChar w:fldCharType="end"/>
       </w:r>
-      <w:bookmarkStart w:id="3" w:name="_Toc240461101"/>
+      <w:bookmarkStart w:id="3" w:name="_Toc240476614"/>
       <w:r>
         <w:rPr>
           <w:rFonts w:ascii="Times New Roman" w:hAnsi="Times New Roman"/>
@@ -3800,7 +3800,7 @@
         <w:spacing w:after="360"/>
         <w:outlineLvl w:val="0"/>
       </w:pPr>
-      <w:bookmarkStart w:id="4" w:name="_Toc240461102"/>
+      <w:bookmarkStart w:id="4" w:name="_Toc240476615"/>
       <w:r>
         <w:rPr>
           <w:rFonts w:ascii="Times New Roman" w:hAnsi="Times New Roman"/>
@@ -3956,7 +3956,7 @@
         <w:pStyle w:val="Heading1"/>
         <w:outlineLvl w:val="0"/>
       </w:pPr>
-      <w:bookmarkStart w:id="5" w:name="_Toc240461103"/>
+      <w:bookmarkStart w:id="5" w:name="_Toc240476616"/>
       <w:r>
         <w:rPr>
           <w:rFonts w:ascii="Times New Roman" w:hAnsi="Times New Roman"/>
@@ -3974,7 +3974,7 @@
         <w:pStyle w:val="Heading2"/>
         <w:outlineLvl w:val="1"/>
       </w:pPr>
-      <w:bookmarkStart w:id="6" w:name="_Toc240461104"/>
+      <w:bookmarkStart w:id="6" w:name="_Toc240476617"/>
       <w:r>
         <w:rPr>
           <w:rFonts w:ascii="Times New Roman" w:hAnsi="Times New Roman"/>
@@ -4366,8 +4366,8 @@
         </w:rPr>
         <w:lastRenderedPageBreak/>
         <w:drawing>
-          <wp:inline distT="0" distB="0" distL="0" distR="0" wp14:anchorId="15F96945" wp14:editId="1C484B31">
-            <wp:extent cx="4860000" cy="2709609"/>
+          <wp:inline distT="0" distB="0" distL="0" distR="0" wp14:anchorId="5FEB747F" wp14:editId="66E1182E">
+            <wp:extent cx="4860000" cy="2980356"/>
             <wp:effectExtent l="0" t="0" r="0" b="0"/>
             <wp:docPr id="2" name="Picture 2"/>
             <wp:cNvGraphicFramePr>
@@ -4389,7 +4389,7 @@
                   <pic:spPr>
                     <a:xfrm>
                       <a:off x="0" y="0"/>
-                      <a:ext cx="4860000" cy="2709609"/>
+                      <a:ext cx="4860000" cy="2980356"/>
                     </a:xfrm>
                     <a:prstGeom prst="rect">
                       <a:avLst/>
@@ -4518,7 +4518,7 @@
         </w:rPr>
         <w:lastRenderedPageBreak/>
         <w:drawing>
-          <wp:inline distT="0" distB="0" distL="0" distR="0" wp14:anchorId="1C796973" wp14:editId="78CF21A9">
+          <wp:inline distT="0" distB="0" distL="0" distR="0" wp14:anchorId="64699A10" wp14:editId="42485398">
             <wp:extent cx="4860000" cy="2719286"/>
             <wp:effectExtent l="0" t="0" r="0" b="0"/>
             <wp:docPr id="3" name="Picture 3"/>
@@ -5013,7 +5013,7 @@
           <w:noProof/>
         </w:rPr>
         <w:drawing>
-          <wp:inline distT="0" distB="0" distL="0" distR="0" wp14:anchorId="3D4B5C23" wp14:editId="0F1A7B6A">
+          <wp:inline distT="0" distB="0" distL="0" distR="0" wp14:anchorId="6BBBCAC1" wp14:editId="1E5E3478">
             <wp:extent cx="4860000" cy="2818800"/>
             <wp:effectExtent l="0" t="0" r="0" b="0"/>
             <wp:docPr id="4" name="Picture 4"/>
@@ -6738,7 +6738,7 @@
         <w:pStyle w:val="Heading2"/>
         <w:outlineLvl w:val="1"/>
       </w:pPr>
-      <w:bookmarkStart w:id="7" w:name="_Toc240461105"/>
+      <w:bookmarkStart w:id="7" w:name="_Toc240476618"/>
       <w:r>
         <w:rPr>
           <w:rFonts w:ascii="Times New Roman" w:hAnsi="Times New Roman"/>
@@ -7083,7 +7083,7 @@
         <w:pStyle w:val="Heading2"/>
         <w:outlineLvl w:val="1"/>
       </w:pPr>
-      <w:bookmarkStart w:id="8" w:name="_Toc240461106"/>
+      <w:bookmarkStart w:id="8" w:name="_Toc240476619"/>
       <w:r>
         <w:rPr>
           <w:rFonts w:ascii="Times New Roman" w:hAnsi="Times New Roman"/>
@@ -7429,7 +7429,7 @@
         <w:pStyle w:val="Heading2"/>
         <w:outlineLvl w:val="1"/>
       </w:pPr>
-      <w:bookmarkStart w:id="9" w:name="_Toc240461107"/>
+      <w:bookmarkStart w:id="9" w:name="_Toc240476620"/>
       <w:r>
         <w:rPr>
           <w:rFonts w:ascii="Times New Roman" w:hAnsi="Times New Roman"/>
@@ -7459,7 +7459,7 @@
         <w:pStyle w:val="Heading3"/>
         <w:outlineLvl w:val="2"/>
       </w:pPr>
-      <w:bookmarkStart w:id="10" w:name="_Toc240461108"/>
+      <w:bookmarkStart w:id="10" w:name="_Toc240476621"/>
       <w:r>
         <w:rPr>
           <w:rFonts w:ascii="Times New Roman" w:hAnsi="Times New Roman"/>
@@ -7639,7 +7639,7 @@
         <w:pStyle w:val="Heading3"/>
         <w:outlineLvl w:val="2"/>
       </w:pPr>
-      <w:bookmarkStart w:id="11" w:name="_Toc240461109"/>
+      <w:bookmarkStart w:id="11" w:name="_Toc240476622"/>
       <w:r>
         <w:rPr>
           <w:rFonts w:ascii="Times New Roman" w:hAnsi="Times New Roman"/>
@@ -7785,7 +7785,7 @@
         <w:pStyle w:val="Heading1"/>
         <w:outlineLvl w:val="0"/>
       </w:pPr>
-      <w:bookmarkStart w:id="12" w:name="_Toc240461110"/>
+      <w:bookmarkStart w:id="12" w:name="_Toc240476623"/>
       <w:r>
         <w:rPr>
           <w:rFonts w:ascii="Times New Roman" w:hAnsi="Times New Roman"/>
@@ -7803,7 +7803,7 @@
         <w:pStyle w:val="Heading2"/>
         <w:outlineLvl w:val="1"/>
       </w:pPr>
-      <w:bookmarkStart w:id="13" w:name="_Toc240461111"/>
+      <w:bookmarkStart w:id="13" w:name="_Toc240476624"/>
       <w:r>
         <w:rPr>
           <w:rFonts w:ascii="Times New Roman" w:hAnsi="Times New Roman"/>
@@ -7820,7 +7820,7 @@
         <w:pStyle w:val="Heading3"/>
         <w:outlineLvl w:val="2"/>
       </w:pPr>
-      <w:bookmarkStart w:id="14" w:name="_Toc240461112"/>
+      <w:bookmarkStart w:id="14" w:name="_Toc240476625"/>
       <w:r>
         <w:rPr>
           <w:rFonts w:ascii="Times New Roman" w:hAnsi="Times New Roman"/>
@@ -8144,7 +8144,7 @@
         <w:pStyle w:val="Heading3"/>
         <w:outlineLvl w:val="2"/>
       </w:pPr>
-      <w:bookmarkStart w:id="15" w:name="_Toc240461113"/>
+      <w:bookmarkStart w:id="15" w:name="_Toc240476626"/>
       <w:r>
         <w:rPr>
           <w:rFonts w:ascii="Times New Roman" w:hAnsi="Times New Roman"/>
@@ -8483,7 +8483,7 @@
         <w:pStyle w:val="Heading3"/>
         <w:outlineLvl w:val="2"/>
       </w:pPr>
-      <w:bookmarkStart w:id="16" w:name="_Toc240461114"/>
+      <w:bookmarkStart w:id="16" w:name="_Toc240476627"/>
       <w:r>
         <w:rPr>
           <w:rFonts w:ascii="Times New Roman" w:hAnsi="Times New Roman"/>
@@ -8629,7 +8629,7 @@
         <w:pStyle w:val="Heading3"/>
         <w:outlineLvl w:val="2"/>
       </w:pPr>
-      <w:bookmarkStart w:id="17" w:name="_Toc240461115"/>
+      <w:bookmarkStart w:id="17" w:name="_Toc240476628"/>
       <w:r>
         <w:rPr>
           <w:rFonts w:ascii="Times New Roman" w:hAnsi="Times New Roman"/>
@@ -8718,7 +8718,7 @@
         <w:pStyle w:val="Heading2"/>
         <w:outlineLvl w:val="1"/>
       </w:pPr>
-      <w:bookmarkStart w:id="18" w:name="_Toc240461116"/>
+      <w:bookmarkStart w:id="18" w:name="_Toc240476629"/>
       <w:r>
         <w:rPr>
           <w:rFonts w:ascii="Times New Roman" w:hAnsi="Times New Roman"/>
@@ -8735,7 +8735,7 @@
         <w:pStyle w:val="Heading3"/>
         <w:outlineLvl w:val="2"/>
       </w:pPr>
-      <w:bookmarkStart w:id="19" w:name="_Toc240461117"/>
+      <w:bookmarkStart w:id="19" w:name="_Toc240476630"/>
       <w:r>
         <w:rPr>
           <w:rFonts w:ascii="Times New Roman" w:hAnsi="Times New Roman"/>
@@ -8816,7 +8816,7 @@
         <w:pStyle w:val="Heading3"/>
         <w:outlineLvl w:val="2"/>
       </w:pPr>
-      <w:bookmarkStart w:id="20" w:name="_Toc240461118"/>
+      <w:bookmarkStart w:id="20" w:name="_Toc240476631"/>
       <w:r>
         <w:rPr>
           <w:rFonts w:ascii="Times New Roman" w:hAnsi="Times New Roman"/>
@@ -8936,7 +8936,7 @@
         <w:pStyle w:val="Heading3"/>
         <w:outlineLvl w:val="2"/>
       </w:pPr>
-      <w:bookmarkStart w:id="21" w:name="_Toc240461119"/>
+      <w:bookmarkStart w:id="21" w:name="_Toc240476632"/>
       <w:r>
         <w:rPr>
           <w:rFonts w:ascii="Times New Roman" w:hAnsi="Times New Roman"/>
@@ -9090,7 +9090,7 @@
         <w:pStyle w:val="Heading3"/>
         <w:outlineLvl w:val="2"/>
       </w:pPr>
-      <w:bookmarkStart w:id="22" w:name="_Toc240461120"/>
+      <w:bookmarkStart w:id="22" w:name="_Toc240476633"/>
       <w:r>
         <w:rPr>
           <w:rFonts w:ascii="Times New Roman" w:hAnsi="Times New Roman"/>
@@ -9275,7 +9275,7 @@
         <w:pStyle w:val="Heading3"/>
         <w:outlineLvl w:val="2"/>
       </w:pPr>
-      <w:bookmarkStart w:id="23" w:name="_Toc240461121"/>
+      <w:bookmarkStart w:id="23" w:name="_Toc240476634"/>
       <w:r>
         <w:rPr>
           <w:rFonts w:ascii="Times New Roman" w:hAnsi="Times New Roman"/>
@@ -9415,7 +9415,7 @@
         <w:pStyle w:val="Heading2"/>
         <w:outlineLvl w:val="1"/>
       </w:pPr>
-      <w:bookmarkStart w:id="24" w:name="_Toc240461122"/>
+      <w:bookmarkStart w:id="24" w:name="_Toc240476635"/>
       <w:r>
         <w:rPr>
           <w:rFonts w:ascii="Times New Roman" w:hAnsi="Times New Roman"/>
@@ -10955,7 +10955,7 @@
         <w:pStyle w:val="Heading2"/>
         <w:outlineLvl w:val="1"/>
       </w:pPr>
-      <w:bookmarkStart w:id="25" w:name="_Toc240461123"/>
+      <w:bookmarkStart w:id="25" w:name="_Toc240476636"/>
       <w:r>
         <w:rPr>
           <w:rFonts w:ascii="Times New Roman" w:hAnsi="Times New Roman"/>
@@ -10972,7 +10972,7 @@
         <w:pStyle w:val="Heading3"/>
         <w:outlineLvl w:val="2"/>
       </w:pPr>
-      <w:bookmarkStart w:id="26" w:name="_Toc240461124"/>
+      <w:bookmarkStart w:id="26" w:name="_Toc240476637"/>
       <w:r>
         <w:rPr>
           <w:rFonts w:ascii="Times New Roman" w:hAnsi="Times New Roman"/>
@@ -11194,7 +11194,7 @@
         <w:pStyle w:val="Heading3"/>
         <w:outlineLvl w:val="2"/>
       </w:pPr>
-      <w:bookmarkStart w:id="27" w:name="_Toc240461125"/>
+      <w:bookmarkStart w:id="27" w:name="_Toc240476638"/>
       <w:r>
         <w:rPr>
           <w:rFonts w:ascii="Times New Roman" w:hAnsi="Times New Roman"/>
@@ -11513,7 +11513,7 @@
         <w:pStyle w:val="Heading3"/>
         <w:outlineLvl w:val="2"/>
       </w:pPr>
-      <w:bookmarkStart w:id="28" w:name="_Toc240461126"/>
+      <w:bookmarkStart w:id="28" w:name="_Toc240476639"/>
       <w:r>
         <w:rPr>
           <w:rFonts w:ascii="Times New Roman" w:hAnsi="Times New Roman"/>
@@ -11794,7 +11794,7 @@
         <w:pStyle w:val="Heading3"/>
         <w:outlineLvl w:val="2"/>
       </w:pPr>
-      <w:bookmarkStart w:id="29" w:name="_Toc240461127"/>
+      <w:bookmarkStart w:id="29" w:name="_Toc240476640"/>
       <w:r>
         <w:rPr>
           <w:rFonts w:ascii="Times New Roman" w:hAnsi="Times New Roman"/>
@@ -12115,7 +12115,7 @@
         <w:pStyle w:val="Heading3"/>
         <w:outlineLvl w:val="2"/>
       </w:pPr>
-      <w:bookmarkStart w:id="30" w:name="_Toc240461128"/>
+      <w:bookmarkStart w:id="30" w:name="_Toc240476641"/>
       <w:r>
         <w:rPr>
           <w:rFonts w:ascii="Times New Roman" w:hAnsi="Times New Roman"/>
@@ -12397,7 +12397,7 @@
         <w:pStyle w:val="Heading3"/>
         <w:outlineLvl w:val="2"/>
       </w:pPr>
-      <w:bookmarkStart w:id="31" w:name="_Toc240461129"/>
+      <w:bookmarkStart w:id="31" w:name="_Toc240476642"/>
       <w:r>
         <w:rPr>
           <w:rFonts w:ascii="Times New Roman" w:hAnsi="Times New Roman"/>
@@ -12633,7 +12633,7 @@
         <w:pStyle w:val="Heading2"/>
         <w:outlineLvl w:val="1"/>
       </w:pPr>
-      <w:bookmarkStart w:id="32" w:name="_Toc240461130"/>
+      <w:bookmarkStart w:id="32" w:name="_Toc240476643"/>
       <w:r>
         <w:rPr>
           <w:rFonts w:ascii="Times New Roman" w:hAnsi="Times New Roman"/>
@@ -12669,7 +12669,7 @@
         </w:rPr>
         <w:lastRenderedPageBreak/>
         <w:drawing>
-          <wp:inline distT="0" distB="0" distL="0" distR="0" wp14:anchorId="05FD5D0A" wp14:editId="63E6FFB4">
+          <wp:inline distT="0" distB="0" distL="0" distR="0" wp14:anchorId="1F0F97DE" wp14:editId="3441E2EF">
             <wp:extent cx="5040000" cy="2753704"/>
             <wp:effectExtent l="0" t="0" r="0" b="0"/>
             <wp:docPr id="5" name="Picture 5"/>
@@ -12742,7 +12742,7 @@
         <w:pStyle w:val="Heading1"/>
         <w:outlineLvl w:val="0"/>
       </w:pPr>
-      <w:bookmarkStart w:id="33" w:name="_Toc240461131"/>
+      <w:bookmarkStart w:id="33" w:name="_Toc240476644"/>
       <w:r>
         <w:rPr>
           <w:rFonts w:ascii="Times New Roman" w:hAnsi="Times New Roman"/>
@@ -14576,31 +14576,31 @@
       </w:rPr>
     </w:lvl>
   </w:abstractNum>
-  <w:num w:numId="1" w16cid:durableId="1499032536">
+  <w:num w:numId="1" w16cid:durableId="785542706">
     <w:abstractNumId w:val="8"/>
   </w:num>
-  <w:num w:numId="2" w16cid:durableId="493571068">
+  <w:num w:numId="2" w16cid:durableId="1507330640">
     <w:abstractNumId w:val="6"/>
   </w:num>
-  <w:num w:numId="3" w16cid:durableId="1206679361">
+  <w:num w:numId="3" w16cid:durableId="1105809034">
     <w:abstractNumId w:val="5"/>
   </w:num>
-  <w:num w:numId="4" w16cid:durableId="648168050">
+  <w:num w:numId="4" w16cid:durableId="1596942121">
     <w:abstractNumId w:val="4"/>
   </w:num>
-  <w:num w:numId="5" w16cid:durableId="1739743632">
+  <w:num w:numId="5" w16cid:durableId="1403060570">
     <w:abstractNumId w:val="7"/>
   </w:num>
-  <w:num w:numId="6" w16cid:durableId="69431229">
+  <w:num w:numId="6" w16cid:durableId="269046916">
     <w:abstractNumId w:val="3"/>
   </w:num>
-  <w:num w:numId="7" w16cid:durableId="1050764968">
+  <w:num w:numId="7" w16cid:durableId="866679809">
     <w:abstractNumId w:val="2"/>
   </w:num>
-  <w:num w:numId="8" w16cid:durableId="1780099741">
+  <w:num w:numId="8" w16cid:durableId="699210528">
     <w:abstractNumId w:val="1"/>
   </w:num>
-  <w:num w:numId="9" w16cid:durableId="1471489">
+  <w:num w:numId="9" w16cid:durableId="68504724">
     <w:abstractNumId w:val="0"/>
   </w:num>
 </w:numbering>
@@ -26041,7 +26041,7 @@
     <w:autoRedefine/>
     <w:uiPriority w:val="39"/>
     <w:unhideWhenUsed/>
-    <w:rsid w:val="000D09A1"/>
+    <w:rsid w:val="006B4C0B"/>
     <w:pPr>
       <w:spacing w:after="40" w:line="240" w:lineRule="auto"/>
     </w:pPr>
@@ -26057,7 +26057,7 @@
     <w:autoRedefine/>
     <w:uiPriority w:val="39"/>
     <w:unhideWhenUsed/>
-    <w:rsid w:val="000D09A1"/>
+    <w:rsid w:val="006B4C0B"/>
     <w:pPr>
       <w:spacing w:after="40" w:line="240" w:lineRule="auto"/>
       <w:ind w:left="360"/>
@@ -26073,7 +26073,7 @@
     <w:autoRedefine/>
     <w:uiPriority w:val="39"/>
     <w:unhideWhenUsed/>
-    <w:rsid w:val="000D09A1"/>
+    <w:rsid w:val="006B4C0B"/>
     <w:pPr>
       <w:spacing w:after="40" w:line="240" w:lineRule="auto"/>
       <w:ind w:left="720"/>
@@ -26088,7 +26088,7 @@
     <w:basedOn w:val="DefaultParagraphFont"/>
     <w:uiPriority w:val="99"/>
     <w:unhideWhenUsed/>
-    <w:rsid w:val="000D09A1"/>
+    <w:rsid w:val="006B4C0B"/>
     <w:rPr>
       <w:color w:val="0000FF" w:themeColor="hyperlink"/>
       <w:u w:val="single"/>

</xml_diff>

<commit_message>
fix(citations): audit klikabilitas 55 sitasi, perbaiki 6 DOI mati, ganti Tirtayasa
- verify_all_citation_links.py baru: 32 hidup / 21 walled / 0 MATI- references.bib: Gao->JM2014, Sultan->MarkLett2012, Tirtayasa->IJBE2020 (rename key), Long+Dewi digit DOI- naskah: label tipping-point, Tirtayasa Temuan B->A + matriks gap, rebuild 62/44 hlm- RIS 53 UR + Mendeley cloud prune/sync; framework C-LINK-1 + SOP/template
</commit_message>
<xml_diff>
--- a/01_Naskah_Utama/Proposal_Arthur_NoBab3.docx
+++ b/01_Naskah_Utama/Proposal_Arthur_NoBab3.docx
@@ -12,7 +12,7 @@
           <w:noProof/>
         </w:rPr>
         <w:drawing>
-          <wp:inline distT="0" distB="0" distL="0" distR="0" wp14:anchorId="34CBAD4A" wp14:editId="04C3C8FA">
+          <wp:inline distT="0" distB="0" distL="0" distR="0" wp14:anchorId="5B086F80" wp14:editId="6DAA5809">
             <wp:extent cx="1152000" cy="1152000"/>
             <wp:effectExtent l="0" t="0" r="0" b="0"/>
             <wp:docPr id="1" name="Picture 1"/>
@@ -274,7 +274,7 @@
         <w:spacing w:after="360"/>
         <w:outlineLvl w:val="0"/>
       </w:pPr>
-      <w:bookmarkStart w:id="0" w:name="_Toc240482213"/>
+      <w:bookmarkStart w:id="0" w:name="_Toc240483636"/>
       <w:r>
         <w:rPr>
           <w:rFonts w:ascii="Times New Roman" w:hAnsi="Times New Roman"/>
@@ -567,7 +567,7 @@
         <w:spacing w:after="360"/>
         <w:outlineLvl w:val="0"/>
       </w:pPr>
-      <w:bookmarkStart w:id="1" w:name="_Toc240482214"/>
+      <w:bookmarkStart w:id="1" w:name="_Toc240483637"/>
       <w:r>
         <w:rPr>
           <w:rFonts w:ascii="Times New Roman" w:hAnsi="Times New Roman"/>
@@ -691,7 +691,7 @@
         <w:spacing w:after="360"/>
         <w:outlineLvl w:val="0"/>
       </w:pPr>
-      <w:bookmarkStart w:id="2" w:name="_Toc240482215"/>
+      <w:bookmarkStart w:id="2" w:name="_Toc240483638"/>
       <w:r>
         <w:rPr>
           <w:rFonts w:ascii="Times New Roman" w:hAnsi="Times New Roman"/>
@@ -853,7 +853,7 @@
       <w:r>
         <w:fldChar w:fldCharType="separate"/>
       </w:r>
-      <w:hyperlink w:anchor="_Toc240482213" w:history="1">
+      <w:hyperlink w:anchor="_Toc240483636" w:history="1">
         <w:r>
           <w:rPr>
             <w:rStyle w:val="Hyperlink"/>
@@ -880,7 +880,7 @@
             <w:noProof/>
             <w:webHidden/>
           </w:rPr>
-          <w:instrText xml:space="preserve"> PAGEREF _Toc240482213 \h </w:instrText>
+          <w:instrText xml:space="preserve"> PAGEREF _Toc240483636 \h </w:instrText>
         </w:r>
         <w:r>
           <w:rPr>
@@ -927,7 +927,7 @@
           <w14:ligatures w14:val="standardContextual"/>
         </w:rPr>
       </w:pPr>
-      <w:hyperlink w:anchor="_Toc240482214" w:history="1">
+      <w:hyperlink w:anchor="_Toc240483637" w:history="1">
         <w:r>
           <w:rPr>
             <w:rStyle w:val="Hyperlink"/>
@@ -954,7 +954,7 @@
             <w:noProof/>
             <w:webHidden/>
           </w:rPr>
-          <w:instrText xml:space="preserve"> PAGEREF _Toc240482214 \h </w:instrText>
+          <w:instrText xml:space="preserve"> PAGEREF _Toc240483637 \h </w:instrText>
         </w:r>
         <w:r>
           <w:rPr>
@@ -1001,7 +1001,7 @@
           <w14:ligatures w14:val="standardContextual"/>
         </w:rPr>
       </w:pPr>
-      <w:hyperlink w:anchor="_Toc240482215" w:history="1">
+      <w:hyperlink w:anchor="_Toc240483638" w:history="1">
         <w:r>
           <w:rPr>
             <w:rStyle w:val="Hyperlink"/>
@@ -1028,7 +1028,7 @@
             <w:noProof/>
             <w:webHidden/>
           </w:rPr>
-          <w:instrText xml:space="preserve"> PAGEREF _Toc240482215 \h </w:instrText>
+          <w:instrText xml:space="preserve"> PAGEREF _Toc240483638 \h </w:instrText>
         </w:r>
         <w:r>
           <w:rPr>
@@ -1075,7 +1075,7 @@
           <w14:ligatures w14:val="standardContextual"/>
         </w:rPr>
       </w:pPr>
-      <w:hyperlink w:anchor="_Toc240482216" w:history="1">
+      <w:hyperlink w:anchor="_Toc240483639" w:history="1">
         <w:r>
           <w:rPr>
             <w:rStyle w:val="Hyperlink"/>
@@ -1102,7 +1102,7 @@
             <w:noProof/>
             <w:webHidden/>
           </w:rPr>
-          <w:instrText xml:space="preserve"> PAGEREF _Toc240482216 \h </w:instrText>
+          <w:instrText xml:space="preserve"> PAGEREF _Toc240483639 \h </w:instrText>
         </w:r>
         <w:r>
           <w:rPr>
@@ -1149,7 +1149,7 @@
           <w14:ligatures w14:val="standardContextual"/>
         </w:rPr>
       </w:pPr>
-      <w:hyperlink w:anchor="_Toc240482217" w:history="1">
+      <w:hyperlink w:anchor="_Toc240483640" w:history="1">
         <w:r>
           <w:rPr>
             <w:rStyle w:val="Hyperlink"/>
@@ -1176,7 +1176,7 @@
             <w:noProof/>
             <w:webHidden/>
           </w:rPr>
-          <w:instrText xml:space="preserve"> PAGEREF _Toc240482217 \h </w:instrText>
+          <w:instrText xml:space="preserve"> PAGEREF _Toc240483640 \h </w:instrText>
         </w:r>
         <w:r>
           <w:rPr>
@@ -1223,7 +1223,7 @@
           <w14:ligatures w14:val="standardContextual"/>
         </w:rPr>
       </w:pPr>
-      <w:hyperlink w:anchor="_Toc240482218" w:history="1">
+      <w:hyperlink w:anchor="_Toc240483641" w:history="1">
         <w:r>
           <w:rPr>
             <w:rStyle w:val="Hyperlink"/>
@@ -1250,7 +1250,7 @@
             <w:noProof/>
             <w:webHidden/>
           </w:rPr>
-          <w:instrText xml:space="preserve"> PAGEREF _Toc240482218 \h </w:instrText>
+          <w:instrText xml:space="preserve"> PAGEREF _Toc240483641 \h </w:instrText>
         </w:r>
         <w:r>
           <w:rPr>
@@ -1296,7 +1296,7 @@
           <w14:ligatures w14:val="standardContextual"/>
         </w:rPr>
       </w:pPr>
-      <w:hyperlink w:anchor="_Toc240482219" w:history="1">
+      <w:hyperlink w:anchor="_Toc240483642" w:history="1">
         <w:r>
           <w:rPr>
             <w:rStyle w:val="Hyperlink"/>
@@ -1323,7 +1323,7 @@
             <w:noProof/>
             <w:webHidden/>
           </w:rPr>
-          <w:instrText xml:space="preserve"> PAGEREF _Toc240482219 \h </w:instrText>
+          <w:instrText xml:space="preserve"> PAGEREF _Toc240483642 \h </w:instrText>
         </w:r>
         <w:r>
           <w:rPr>
@@ -1369,7 +1369,7 @@
           <w14:ligatures w14:val="standardContextual"/>
         </w:rPr>
       </w:pPr>
-      <w:hyperlink w:anchor="_Toc240482220" w:history="1">
+      <w:hyperlink w:anchor="_Toc240483643" w:history="1">
         <w:r>
           <w:rPr>
             <w:rStyle w:val="Hyperlink"/>
@@ -1396,7 +1396,7 @@
             <w:noProof/>
             <w:webHidden/>
           </w:rPr>
-          <w:instrText xml:space="preserve"> PAGEREF _Toc240482220 \h </w:instrText>
+          <w:instrText xml:space="preserve"> PAGEREF _Toc240483643 \h </w:instrText>
         </w:r>
         <w:r>
           <w:rPr>
@@ -1442,7 +1442,7 @@
           <w14:ligatures w14:val="standardContextual"/>
         </w:rPr>
       </w:pPr>
-      <w:hyperlink w:anchor="_Toc240482221" w:history="1">
+      <w:hyperlink w:anchor="_Toc240483644" w:history="1">
         <w:r>
           <w:rPr>
             <w:rStyle w:val="Hyperlink"/>
@@ -1469,7 +1469,7 @@
             <w:noProof/>
             <w:webHidden/>
           </w:rPr>
-          <w:instrText xml:space="preserve"> PAGEREF _Toc240482221 \h </w:instrText>
+          <w:instrText xml:space="preserve"> PAGEREF _Toc240483644 \h </w:instrText>
         </w:r>
         <w:r>
           <w:rPr>
@@ -1515,7 +1515,7 @@
           <w14:ligatures w14:val="standardContextual"/>
         </w:rPr>
       </w:pPr>
-      <w:hyperlink w:anchor="_Toc240482222" w:history="1">
+      <w:hyperlink w:anchor="_Toc240483645" w:history="1">
         <w:r>
           <w:rPr>
             <w:rStyle w:val="Hyperlink"/>
@@ -1542,7 +1542,7 @@
             <w:noProof/>
             <w:webHidden/>
           </w:rPr>
-          <w:instrText xml:space="preserve"> PAGEREF _Toc240482222 \h </w:instrText>
+          <w:instrText xml:space="preserve"> PAGEREF _Toc240483645 \h </w:instrText>
         </w:r>
         <w:r>
           <w:rPr>
@@ -1589,7 +1589,7 @@
           <w14:ligatures w14:val="standardContextual"/>
         </w:rPr>
       </w:pPr>
-      <w:hyperlink w:anchor="_Toc240482223" w:history="1">
+      <w:hyperlink w:anchor="_Toc240483646" w:history="1">
         <w:r>
           <w:rPr>
             <w:rStyle w:val="Hyperlink"/>
@@ -1616,7 +1616,7 @@
             <w:noProof/>
             <w:webHidden/>
           </w:rPr>
-          <w:instrText xml:space="preserve"> PAGEREF _Toc240482223 \h </w:instrText>
+          <w:instrText xml:space="preserve"> PAGEREF _Toc240483646 \h </w:instrText>
         </w:r>
         <w:r>
           <w:rPr>
@@ -1663,7 +1663,7 @@
           <w14:ligatures w14:val="standardContextual"/>
         </w:rPr>
       </w:pPr>
-      <w:hyperlink w:anchor="_Toc240482224" w:history="1">
+      <w:hyperlink w:anchor="_Toc240483647" w:history="1">
         <w:r>
           <w:rPr>
             <w:rStyle w:val="Hyperlink"/>
@@ -1690,7 +1690,7 @@
             <w:noProof/>
             <w:webHidden/>
           </w:rPr>
-          <w:instrText xml:space="preserve"> PAGEREF _Toc240482224 \h </w:instrText>
+          <w:instrText xml:space="preserve"> PAGEREF _Toc240483647 \h </w:instrText>
         </w:r>
         <w:r>
           <w:rPr>
@@ -1737,7 +1737,7 @@
           <w14:ligatures w14:val="standardContextual"/>
         </w:rPr>
       </w:pPr>
-      <w:hyperlink w:anchor="_Toc240482225" w:history="1">
+      <w:hyperlink w:anchor="_Toc240483648" w:history="1">
         <w:r>
           <w:rPr>
             <w:rStyle w:val="Hyperlink"/>
@@ -1764,7 +1764,7 @@
             <w:noProof/>
             <w:webHidden/>
           </w:rPr>
-          <w:instrText xml:space="preserve"> PAGEREF _Toc240482225 \h </w:instrText>
+          <w:instrText xml:space="preserve"> PAGEREF _Toc240483648 \h </w:instrText>
         </w:r>
         <w:r>
           <w:rPr>
@@ -1810,7 +1810,7 @@
           <w14:ligatures w14:val="standardContextual"/>
         </w:rPr>
       </w:pPr>
-      <w:hyperlink w:anchor="_Toc240482226" w:history="1">
+      <w:hyperlink w:anchor="_Toc240483649" w:history="1">
         <w:r>
           <w:rPr>
             <w:rStyle w:val="Hyperlink"/>
@@ -1837,7 +1837,7 @@
             <w:noProof/>
             <w:webHidden/>
           </w:rPr>
-          <w:instrText xml:space="preserve"> PAGEREF _Toc240482226 \h </w:instrText>
+          <w:instrText xml:space="preserve"> PAGEREF _Toc240483649 \h </w:instrText>
         </w:r>
         <w:r>
           <w:rPr>
@@ -1884,7 +1884,7 @@
           <w14:ligatures w14:val="standardContextual"/>
         </w:rPr>
       </w:pPr>
-      <w:hyperlink w:anchor="_Toc240482227" w:history="1">
+      <w:hyperlink w:anchor="_Toc240483650" w:history="1">
         <w:r>
           <w:rPr>
             <w:rStyle w:val="Hyperlink"/>
@@ -1926,7 +1926,7 @@
             <w:noProof/>
             <w:webHidden/>
           </w:rPr>
-          <w:instrText xml:space="preserve"> PAGEREF _Toc240482227 \h </w:instrText>
+          <w:instrText xml:space="preserve"> PAGEREF _Toc240483650 \h </w:instrText>
         </w:r>
         <w:r>
           <w:rPr>
@@ -1973,7 +1973,7 @@
           <w14:ligatures w14:val="standardContextual"/>
         </w:rPr>
       </w:pPr>
-      <w:hyperlink w:anchor="_Toc240482228" w:history="1">
+      <w:hyperlink w:anchor="_Toc240483651" w:history="1">
         <w:r>
           <w:rPr>
             <w:rStyle w:val="Hyperlink"/>
@@ -2015,7 +2015,7 @@
             <w:noProof/>
             <w:webHidden/>
           </w:rPr>
-          <w:instrText xml:space="preserve"> PAGEREF _Toc240482228 \h </w:instrText>
+          <w:instrText xml:space="preserve"> PAGEREF _Toc240483651 \h </w:instrText>
         </w:r>
         <w:r>
           <w:rPr>
@@ -2062,21 +2062,13 @@
           <w14:ligatures w14:val="standardContextual"/>
         </w:rPr>
       </w:pPr>
-      <w:hyperlink w:anchor="_Toc240482229" w:history="1">
+      <w:hyperlink w:anchor="_Toc240483652" w:history="1">
         <w:r>
           <w:rPr>
             <w:rStyle w:val="Hyperlink"/>
             <w:noProof/>
           </w:rPr>
-          <w:t>2.1.3 Supporting Theory: Psikologi Ko</w:t>
-        </w:r>
-        <w:r>
-          <w:rPr>
-            <w:rStyle w:val="Hyperlink"/>
-            <w:noProof/>
-          </w:rPr>
-          <w:lastRenderedPageBreak/>
-          <w:t xml:space="preserve">lektor dan </w:t>
+          <w:t xml:space="preserve">2.1.3 Supporting Theory: Psikologi Kolektor dan </w:t>
         </w:r>
         <w:r>
           <w:rPr>
@@ -2105,7 +2097,7 @@
             <w:noProof/>
             <w:webHidden/>
           </w:rPr>
-          <w:instrText xml:space="preserve"> PAGEREF _Toc240482229 \h </w:instrText>
+          <w:instrText xml:space="preserve"> PAGEREF _Toc240483652 \h </w:instrText>
         </w:r>
         <w:r>
           <w:rPr>
@@ -2152,7 +2144,7 @@
           <w14:ligatures w14:val="standardContextual"/>
         </w:rPr>
       </w:pPr>
-      <w:hyperlink w:anchor="_Toc240482230" w:history="1">
+      <w:hyperlink w:anchor="_Toc240483653" w:history="1">
         <w:r>
           <w:rPr>
             <w:rStyle w:val="Hyperlink"/>
@@ -2194,7 +2186,7 @@
             <w:noProof/>
             <w:webHidden/>
           </w:rPr>
-          <w:instrText xml:space="preserve"> PAGEREF _Toc240482230 \h </w:instrText>
+          <w:instrText xml:space="preserve"> PAGEREF _Toc240483653 \h </w:instrText>
         </w:r>
         <w:r>
           <w:rPr>
@@ -2240,7 +2232,7 @@
           <w14:ligatures w14:val="standardContextual"/>
         </w:rPr>
       </w:pPr>
-      <w:hyperlink w:anchor="_Toc240482231" w:history="1">
+      <w:hyperlink w:anchor="_Toc240483654" w:history="1">
         <w:r>
           <w:rPr>
             <w:rStyle w:val="Hyperlink"/>
@@ -2267,7 +2259,7 @@
             <w:noProof/>
             <w:webHidden/>
           </w:rPr>
-          <w:instrText xml:space="preserve"> PAGEREF _Toc240482231 \h </w:instrText>
+          <w:instrText xml:space="preserve"> PAGEREF _Toc240483654 \h </w:instrText>
         </w:r>
         <w:r>
           <w:rPr>
@@ -2314,7 +2306,7 @@
           <w14:ligatures w14:val="standardContextual"/>
         </w:rPr>
       </w:pPr>
-      <w:hyperlink w:anchor="_Toc240482232" w:history="1">
+      <w:hyperlink w:anchor="_Toc240483655" w:history="1">
         <w:r>
           <w:rPr>
             <w:rStyle w:val="Hyperlink"/>
@@ -2371,7 +2363,7 @@
             <w:noProof/>
             <w:webHidden/>
           </w:rPr>
-          <w:instrText xml:space="preserve"> PAGEREF _Toc240482232 \h </w:instrText>
+          <w:instrText xml:space="preserve"> PAGEREF _Toc240483655 \h </w:instrText>
         </w:r>
         <w:r>
           <w:rPr>
@@ -2418,7 +2410,7 @@
           <w14:ligatures w14:val="standardContextual"/>
         </w:rPr>
       </w:pPr>
-      <w:hyperlink w:anchor="_Toc240482233" w:history="1">
+      <w:hyperlink w:anchor="_Toc240483656" w:history="1">
         <w:r>
           <w:rPr>
             <w:rStyle w:val="Hyperlink"/>
@@ -2475,7 +2467,7 @@
             <w:noProof/>
             <w:webHidden/>
           </w:rPr>
-          <w:instrText xml:space="preserve"> PAGEREF _Toc240482233 \h </w:instrText>
+          <w:instrText xml:space="preserve"> PAGEREF _Toc240483656 \h </w:instrText>
         </w:r>
         <w:r>
           <w:rPr>
@@ -2522,7 +2514,7 @@
           <w14:ligatures w14:val="standardContextual"/>
         </w:rPr>
       </w:pPr>
-      <w:hyperlink w:anchor="_Toc240482234" w:history="1">
+      <w:hyperlink w:anchor="_Toc240483657" w:history="1">
         <w:r>
           <w:rPr>
             <w:rStyle w:val="Hyperlink"/>
@@ -2579,7 +2571,7 @@
             <w:noProof/>
             <w:webHidden/>
           </w:rPr>
-          <w:instrText xml:space="preserve"> PAGEREF _Toc240482234 \h </w:instrText>
+          <w:instrText xml:space="preserve"> PAGEREF _Toc240483657 \h </w:instrText>
         </w:r>
         <w:r>
           <w:rPr>
@@ -2626,7 +2618,7 @@
           <w14:ligatures w14:val="standardContextual"/>
         </w:rPr>
       </w:pPr>
-      <w:hyperlink w:anchor="_Toc240482235" w:history="1">
+      <w:hyperlink w:anchor="_Toc240483658" w:history="1">
         <w:r>
           <w:rPr>
             <w:rStyle w:val="Hyperlink"/>
@@ -2683,7 +2675,7 @@
             <w:noProof/>
             <w:webHidden/>
           </w:rPr>
-          <w:instrText xml:space="preserve"> PAGEREF _Toc240482235 \h </w:instrText>
+          <w:instrText xml:space="preserve"> PAGEREF _Toc240483658 \h </w:instrText>
         </w:r>
         <w:r>
           <w:rPr>
@@ -2730,7 +2722,7 @@
           <w14:ligatures w14:val="standardContextual"/>
         </w:rPr>
       </w:pPr>
-      <w:hyperlink w:anchor="_Toc240482236" w:history="1">
+      <w:hyperlink w:anchor="_Toc240483659" w:history="1">
         <w:r>
           <w:rPr>
             <w:rStyle w:val="Hyperlink"/>
@@ -2787,7 +2779,7 @@
             <w:noProof/>
             <w:webHidden/>
           </w:rPr>
-          <w:instrText xml:space="preserve"> PAGEREF _Toc240482236 \h </w:instrText>
+          <w:instrText xml:space="preserve"> PAGEREF _Toc240483659 \h </w:instrText>
         </w:r>
         <w:r>
           <w:rPr>
@@ -2833,7 +2825,7 @@
           <w14:ligatures w14:val="standardContextual"/>
         </w:rPr>
       </w:pPr>
-      <w:hyperlink w:anchor="_Toc240482237" w:history="1">
+      <w:hyperlink w:anchor="_Toc240483660" w:history="1">
         <w:r>
           <w:rPr>
             <w:rStyle w:val="Hyperlink"/>
@@ -2860,7 +2852,7 @@
             <w:noProof/>
             <w:webHidden/>
           </w:rPr>
-          <w:instrText xml:space="preserve"> PAGEREF _Toc240482237 \h </w:instrText>
+          <w:instrText xml:space="preserve"> PAGEREF _Toc240483660 \h </w:instrText>
         </w:r>
         <w:r>
           <w:rPr>
@@ -2906,7 +2898,7 @@
           <w14:ligatures w14:val="standardContextual"/>
         </w:rPr>
       </w:pPr>
-      <w:hyperlink w:anchor="_Toc240482238" w:history="1">
+      <w:hyperlink w:anchor="_Toc240483661" w:history="1">
         <w:r>
           <w:rPr>
             <w:rStyle w:val="Hyperlink"/>
@@ -2933,7 +2925,7 @@
             <w:noProof/>
             <w:webHidden/>
           </w:rPr>
-          <w:instrText xml:space="preserve"> PAGEREF _Toc240482238 \h </w:instrText>
+          <w:instrText xml:space="preserve"> PAGEREF _Toc240483661 \h </w:instrText>
         </w:r>
         <w:r>
           <w:rPr>
@@ -2980,7 +2972,7 @@
           <w14:ligatures w14:val="standardContextual"/>
         </w:rPr>
       </w:pPr>
-      <w:hyperlink w:anchor="_Toc240482239" w:history="1">
+      <w:hyperlink w:anchor="_Toc240483662" w:history="1">
         <w:r>
           <w:rPr>
             <w:rStyle w:val="Hyperlink"/>
@@ -3030,7 +3022,7 @@
             <w:noProof/>
             <w:webHidden/>
           </w:rPr>
-          <w:instrText xml:space="preserve"> PAGEREF _Toc240482239 \h </w:instrText>
+          <w:instrText xml:space="preserve"> PAGEREF _Toc240483662 \h </w:instrText>
         </w:r>
         <w:r>
           <w:rPr>
@@ -3077,7 +3069,7 @@
           <w14:ligatures w14:val="standardContextual"/>
         </w:rPr>
       </w:pPr>
-      <w:hyperlink w:anchor="_Toc240482240" w:history="1">
+      <w:hyperlink w:anchor="_Toc240483663" w:history="1">
         <w:r>
           <w:rPr>
             <w:rStyle w:val="Hyperlink"/>
@@ -3127,7 +3119,7 @@
             <w:noProof/>
             <w:webHidden/>
           </w:rPr>
-          <w:instrText xml:space="preserve"> PAGEREF _Toc240482240 \h </w:instrText>
+          <w:instrText xml:space="preserve"> PAGEREF _Toc240483663 \h </w:instrText>
         </w:r>
         <w:r>
           <w:rPr>
@@ -3174,7 +3166,7 @@
           <w14:ligatures w14:val="standardContextual"/>
         </w:rPr>
       </w:pPr>
-      <w:hyperlink w:anchor="_Toc240482241" w:history="1">
+      <w:hyperlink w:anchor="_Toc240483664" w:history="1">
         <w:r>
           <w:rPr>
             <w:rStyle w:val="Hyperlink"/>
@@ -3224,7 +3216,7 @@
             <w:noProof/>
             <w:webHidden/>
           </w:rPr>
-          <w:instrText xml:space="preserve"> PAGEREF _Toc240482241 \h </w:instrText>
+          <w:instrText xml:space="preserve"> PAGEREF _Toc240483664 \h </w:instrText>
         </w:r>
         <w:r>
           <w:rPr>
@@ -3271,7 +3263,7 @@
           <w14:ligatures w14:val="standardContextual"/>
         </w:rPr>
       </w:pPr>
-      <w:hyperlink w:anchor="_Toc240482242" w:history="1">
+      <w:hyperlink w:anchor="_Toc240483665" w:history="1">
         <w:r>
           <w:rPr>
             <w:rStyle w:val="Hyperlink"/>
@@ -3336,7 +3328,7 @@
             <w:noProof/>
             <w:webHidden/>
           </w:rPr>
-          <w:instrText xml:space="preserve"> PAGEREF _Toc240482242 \h </w:instrText>
+          <w:instrText xml:space="preserve"> PAGEREF _Toc240483665 \h </w:instrText>
         </w:r>
         <w:r>
           <w:rPr>
@@ -3383,7 +3375,7 @@
           <w14:ligatures w14:val="standardContextual"/>
         </w:rPr>
       </w:pPr>
-      <w:hyperlink w:anchor="_Toc240482243" w:history="1">
+      <w:hyperlink w:anchor="_Toc240483666" w:history="1">
         <w:r>
           <w:rPr>
             <w:rStyle w:val="Hyperlink"/>
@@ -3448,7 +3440,7 @@
             <w:noProof/>
             <w:webHidden/>
           </w:rPr>
-          <w:instrText xml:space="preserve"> PAGEREF _Toc240482243 \h </w:instrText>
+          <w:instrText xml:space="preserve"> PAGEREF _Toc240483666 \h </w:instrText>
         </w:r>
         <w:r>
           <w:rPr>
@@ -3495,7 +3487,7 @@
           <w14:ligatures w14:val="standardContextual"/>
         </w:rPr>
       </w:pPr>
-      <w:hyperlink w:anchor="_Toc240482244" w:history="1">
+      <w:hyperlink w:anchor="_Toc240483667" w:history="1">
         <w:r>
           <w:rPr>
             <w:rStyle w:val="Hyperlink"/>
@@ -3560,7 +3552,7 @@
             <w:noProof/>
             <w:webHidden/>
           </w:rPr>
-          <w:instrText xml:space="preserve"> PAGEREF _Toc240482244 \h </w:instrText>
+          <w:instrText xml:space="preserve"> PAGEREF _Toc240483667 \h </w:instrText>
         </w:r>
         <w:r>
           <w:rPr>
@@ -3606,7 +3598,7 @@
           <w14:ligatures w14:val="standardContextual"/>
         </w:rPr>
       </w:pPr>
-      <w:hyperlink w:anchor="_Toc240482245" w:history="1">
+      <w:hyperlink w:anchor="_Toc240483668" w:history="1">
         <w:r>
           <w:rPr>
             <w:rStyle w:val="Hyperlink"/>
@@ -3633,7 +3625,15 @@
             <w:noProof/>
             <w:webHidden/>
           </w:rPr>
-          <w:instrText xml:space="preserve"> PAGEREF _Toc240482245 \h </w:instrText>
+          <w:instrText xml:space="preserve"> PAGEREF _Toc</w:instrText>
+        </w:r>
+        <w:r>
+          <w:rPr>
+            <w:noProof/>
+            <w:webHidden/>
+          </w:rPr>
+          <w:lastRenderedPageBreak/>
+          <w:instrText xml:space="preserve">240483668 \h </w:instrText>
         </w:r>
         <w:r>
           <w:rPr>
@@ -3680,7 +3680,7 @@
           <w14:ligatures w14:val="standardContextual"/>
         </w:rPr>
       </w:pPr>
-      <w:hyperlink w:anchor="_Toc240482246" w:history="1">
+      <w:hyperlink w:anchor="_Toc240483669" w:history="1">
         <w:r>
           <w:rPr>
             <w:rStyle w:val="Hyperlink"/>
@@ -3707,7 +3707,7 @@
             <w:noProof/>
             <w:webHidden/>
           </w:rPr>
-          <w:instrText xml:space="preserve"> PAGEREF _Toc240482246 \h </w:instrText>
+          <w:instrText xml:space="preserve"> PAGEREF _Toc240483669 \h </w:instrText>
         </w:r>
         <w:r>
           <w:rPr>
@@ -3753,7 +3753,7 @@
         </w:rPr>
         <w:fldChar w:fldCharType="end"/>
       </w:r>
-      <w:bookmarkStart w:id="3" w:name="_Toc240482216"/>
+      <w:bookmarkStart w:id="3" w:name="_Toc240483639"/>
       <w:r>
         <w:rPr>
           <w:rFonts w:ascii="Times New Roman" w:hAnsi="Times New Roman"/>
@@ -3844,7 +3844,7 @@
         <w:spacing w:after="360"/>
         <w:outlineLvl w:val="0"/>
       </w:pPr>
-      <w:bookmarkStart w:id="4" w:name="_Toc240482217"/>
+      <w:bookmarkStart w:id="4" w:name="_Toc240483640"/>
       <w:r>
         <w:rPr>
           <w:rFonts w:ascii="Times New Roman" w:hAnsi="Times New Roman"/>
@@ -4000,7 +4000,7 @@
         <w:pStyle w:val="Heading1"/>
         <w:outlineLvl w:val="0"/>
       </w:pPr>
-      <w:bookmarkStart w:id="5" w:name="_Toc240482218"/>
+      <w:bookmarkStart w:id="5" w:name="_Toc240483641"/>
       <w:r>
         <w:rPr>
           <w:rFonts w:ascii="Times New Roman" w:hAnsi="Times New Roman"/>
@@ -4018,7 +4018,7 @@
         <w:pStyle w:val="Heading2"/>
         <w:outlineLvl w:val="1"/>
       </w:pPr>
-      <w:bookmarkStart w:id="6" w:name="_Toc240482219"/>
+      <w:bookmarkStart w:id="6" w:name="_Toc240483642"/>
       <w:r>
         <w:rPr>
           <w:rFonts w:ascii="Times New Roman" w:hAnsi="Times New Roman"/>
@@ -4423,7 +4423,7 @@
           <w:noProof/>
         </w:rPr>
         <w:drawing>
-          <wp:inline distT="0" distB="0" distL="0" distR="0" wp14:anchorId="6601D12C" wp14:editId="6EC26138">
+          <wp:inline distT="0" distB="0" distL="0" distR="0" wp14:anchorId="3B0041F6" wp14:editId="13EF5B67">
             <wp:extent cx="4860000" cy="2980356"/>
             <wp:effectExtent l="0" t="0" r="0" b="0"/>
             <wp:docPr id="2" name="Picture 2"/>
@@ -4612,7 +4612,7 @@
           <w:noProof/>
         </w:rPr>
         <w:drawing>
-          <wp:inline distT="0" distB="0" distL="0" distR="0" wp14:anchorId="32189230" wp14:editId="73AD0431">
+          <wp:inline distT="0" distB="0" distL="0" distR="0" wp14:anchorId="60923A82" wp14:editId="64DB80FD">
             <wp:extent cx="4860000" cy="2719286"/>
             <wp:effectExtent l="0" t="0" r="0" b="0"/>
             <wp:docPr id="3" name="Picture 3"/>
@@ -5166,7 +5166,7 @@
           <w:noProof/>
         </w:rPr>
         <w:drawing>
-          <wp:inline distT="0" distB="0" distL="0" distR="0" wp14:anchorId="4F86B3F3" wp14:editId="7DB25DB2">
+          <wp:inline distT="0" distB="0" distL="0" distR="0" wp14:anchorId="53F05C1A" wp14:editId="470A2464">
             <wp:extent cx="4860000" cy="2818800"/>
             <wp:effectExtent l="0" t="0" r="0" b="0"/>
             <wp:docPr id="4" name="Picture 4"/>
@@ -10554,7 +10554,7 @@
         <w:pStyle w:val="Heading2"/>
         <w:outlineLvl w:val="1"/>
       </w:pPr>
-      <w:bookmarkStart w:id="7" w:name="_Toc240482220"/>
+      <w:bookmarkStart w:id="7" w:name="_Toc240483643"/>
       <w:r>
         <w:rPr>
           <w:rFonts w:ascii="Times New Roman" w:hAnsi="Times New Roman"/>
@@ -10978,7 +10978,7 @@
         <w:pStyle w:val="Heading2"/>
         <w:outlineLvl w:val="1"/>
       </w:pPr>
-      <w:bookmarkStart w:id="8" w:name="_Toc240482221"/>
+      <w:bookmarkStart w:id="8" w:name="_Toc240483644"/>
       <w:r>
         <w:rPr>
           <w:rFonts w:ascii="Times New Roman" w:hAnsi="Times New Roman"/>
@@ -11401,7 +11401,7 @@
         <w:pStyle w:val="Heading2"/>
         <w:outlineLvl w:val="1"/>
       </w:pPr>
-      <w:bookmarkStart w:id="9" w:name="_Toc240482222"/>
+      <w:bookmarkStart w:id="9" w:name="_Toc240483645"/>
       <w:r>
         <w:rPr>
           <w:rFonts w:ascii="Times New Roman" w:hAnsi="Times New Roman"/>
@@ -11432,7 +11432,7 @@
         <w:pStyle w:val="Heading3"/>
         <w:outlineLvl w:val="2"/>
       </w:pPr>
-      <w:bookmarkStart w:id="10" w:name="_Toc240482223"/>
+      <w:bookmarkStart w:id="10" w:name="_Toc240483646"/>
       <w:r>
         <w:rPr>
           <w:rFonts w:ascii="Times New Roman" w:hAnsi="Times New Roman"/>
@@ -11612,7 +11612,7 @@
         <w:pStyle w:val="Heading3"/>
         <w:outlineLvl w:val="2"/>
       </w:pPr>
-      <w:bookmarkStart w:id="11" w:name="_Toc240482224"/>
+      <w:bookmarkStart w:id="11" w:name="_Toc240483647"/>
       <w:r>
         <w:rPr>
           <w:rFonts w:ascii="Times New Roman" w:hAnsi="Times New Roman"/>
@@ -11758,7 +11758,7 @@
         <w:pStyle w:val="Heading1"/>
         <w:outlineLvl w:val="0"/>
       </w:pPr>
-      <w:bookmarkStart w:id="12" w:name="_Toc240482225"/>
+      <w:bookmarkStart w:id="12" w:name="_Toc240483648"/>
       <w:r>
         <w:rPr>
           <w:rFonts w:ascii="Times New Roman" w:hAnsi="Times New Roman"/>
@@ -11776,7 +11776,7 @@
         <w:pStyle w:val="Heading2"/>
         <w:outlineLvl w:val="1"/>
       </w:pPr>
-      <w:bookmarkStart w:id="13" w:name="_Toc240482226"/>
+      <w:bookmarkStart w:id="13" w:name="_Toc240483649"/>
       <w:r>
         <w:rPr>
           <w:rFonts w:ascii="Times New Roman" w:hAnsi="Times New Roman"/>
@@ -11793,7 +11793,7 @@
         <w:pStyle w:val="Heading3"/>
         <w:outlineLvl w:val="2"/>
       </w:pPr>
-      <w:bookmarkStart w:id="14" w:name="_Toc240482227"/>
+      <w:bookmarkStart w:id="14" w:name="_Toc240483650"/>
       <w:r>
         <w:rPr>
           <w:rFonts w:ascii="Times New Roman" w:hAnsi="Times New Roman"/>
@@ -12117,7 +12117,7 @@
         <w:pStyle w:val="Heading3"/>
         <w:outlineLvl w:val="2"/>
       </w:pPr>
-      <w:bookmarkStart w:id="15" w:name="_Toc240482228"/>
+      <w:bookmarkStart w:id="15" w:name="_Toc240483651"/>
       <w:r>
         <w:rPr>
           <w:rFonts w:ascii="Times New Roman" w:hAnsi="Times New Roman"/>
@@ -12456,7 +12456,7 @@
         <w:pStyle w:val="Heading3"/>
         <w:outlineLvl w:val="2"/>
       </w:pPr>
-      <w:bookmarkStart w:id="16" w:name="_Toc240482229"/>
+      <w:bookmarkStart w:id="16" w:name="_Toc240483652"/>
       <w:r>
         <w:rPr>
           <w:rFonts w:ascii="Times New Roman" w:hAnsi="Times New Roman"/>
@@ -12602,7 +12602,7 @@
         <w:pStyle w:val="Heading3"/>
         <w:outlineLvl w:val="2"/>
       </w:pPr>
-      <w:bookmarkStart w:id="17" w:name="_Toc240482230"/>
+      <w:bookmarkStart w:id="17" w:name="_Toc240483653"/>
       <w:r>
         <w:rPr>
           <w:rFonts w:ascii="Times New Roman" w:hAnsi="Times New Roman"/>
@@ -12691,7 +12691,7 @@
         <w:pStyle w:val="Heading2"/>
         <w:outlineLvl w:val="1"/>
       </w:pPr>
-      <w:bookmarkStart w:id="18" w:name="_Toc240482231"/>
+      <w:bookmarkStart w:id="18" w:name="_Toc240483654"/>
       <w:r>
         <w:rPr>
           <w:rFonts w:ascii="Times New Roman" w:hAnsi="Times New Roman"/>
@@ -12708,7 +12708,7 @@
         <w:pStyle w:val="Heading3"/>
         <w:outlineLvl w:val="2"/>
       </w:pPr>
-      <w:bookmarkStart w:id="19" w:name="_Toc240482232"/>
+      <w:bookmarkStart w:id="19" w:name="_Toc240483655"/>
       <w:r>
         <w:rPr>
           <w:rFonts w:ascii="Times New Roman" w:hAnsi="Times New Roman"/>
@@ -12789,7 +12789,7 @@
         <w:pStyle w:val="Heading3"/>
         <w:outlineLvl w:val="2"/>
       </w:pPr>
-      <w:bookmarkStart w:id="20" w:name="_Toc240482233"/>
+      <w:bookmarkStart w:id="20" w:name="_Toc240483656"/>
       <w:r>
         <w:rPr>
           <w:rFonts w:ascii="Times New Roman" w:hAnsi="Times New Roman"/>
@@ -12909,7 +12909,7 @@
         <w:pStyle w:val="Heading3"/>
         <w:outlineLvl w:val="2"/>
       </w:pPr>
-      <w:bookmarkStart w:id="21" w:name="_Toc240482234"/>
+      <w:bookmarkStart w:id="21" w:name="_Toc240483657"/>
       <w:r>
         <w:rPr>
           <w:rFonts w:ascii="Times New Roman" w:hAnsi="Times New Roman"/>
@@ -13063,7 +13063,7 @@
         <w:pStyle w:val="Heading3"/>
         <w:outlineLvl w:val="2"/>
       </w:pPr>
-      <w:bookmarkStart w:id="22" w:name="_Toc240482235"/>
+      <w:bookmarkStart w:id="22" w:name="_Toc240483658"/>
       <w:r>
         <w:rPr>
           <w:rFonts w:ascii="Times New Roman" w:hAnsi="Times New Roman"/>
@@ -13274,7 +13274,7 @@
         <w:pStyle w:val="Heading3"/>
         <w:outlineLvl w:val="2"/>
       </w:pPr>
-      <w:bookmarkStart w:id="23" w:name="_Toc240482236"/>
+      <w:bookmarkStart w:id="23" w:name="_Toc240483659"/>
       <w:r>
         <w:rPr>
           <w:rFonts w:ascii="Times New Roman" w:hAnsi="Times New Roman"/>
@@ -13414,7 +13414,7 @@
         <w:pStyle w:val="Heading2"/>
         <w:outlineLvl w:val="1"/>
       </w:pPr>
-      <w:bookmarkStart w:id="24" w:name="_Toc240482237"/>
+      <w:bookmarkStart w:id="24" w:name="_Toc240483660"/>
       <w:r>
         <w:rPr>
           <w:rFonts w:ascii="Times New Roman" w:hAnsi="Times New Roman"/>
@@ -15417,7 +15417,7 @@
         <w:pStyle w:val="Heading2"/>
         <w:outlineLvl w:val="1"/>
       </w:pPr>
-      <w:bookmarkStart w:id="25" w:name="_Toc240482238"/>
+      <w:bookmarkStart w:id="25" w:name="_Toc240483661"/>
       <w:r>
         <w:rPr>
           <w:rFonts w:ascii="Times New Roman" w:hAnsi="Times New Roman"/>
@@ -15434,7 +15434,7 @@
         <w:pStyle w:val="Heading3"/>
         <w:outlineLvl w:val="2"/>
       </w:pPr>
-      <w:bookmarkStart w:id="26" w:name="_Toc240482239"/>
+      <w:bookmarkStart w:id="26" w:name="_Toc240483662"/>
       <w:r>
         <w:rPr>
           <w:rFonts w:ascii="Times New Roman" w:hAnsi="Times New Roman"/>
@@ -15671,7 +15671,7 @@
         <w:pStyle w:val="Heading3"/>
         <w:outlineLvl w:val="2"/>
       </w:pPr>
-      <w:bookmarkStart w:id="27" w:name="_Toc240482240"/>
+      <w:bookmarkStart w:id="27" w:name="_Toc240483663"/>
       <w:r>
         <w:rPr>
           <w:rFonts w:ascii="Times New Roman" w:hAnsi="Times New Roman"/>
@@ -16005,7 +16005,7 @@
         <w:pStyle w:val="Heading3"/>
         <w:outlineLvl w:val="2"/>
       </w:pPr>
-      <w:bookmarkStart w:id="28" w:name="_Toc240482241"/>
+      <w:bookmarkStart w:id="28" w:name="_Toc240483664"/>
       <w:r>
         <w:rPr>
           <w:rFonts w:ascii="Times New Roman" w:hAnsi="Times New Roman"/>
@@ -16301,7 +16301,7 @@
         <w:pStyle w:val="Heading3"/>
         <w:outlineLvl w:val="2"/>
       </w:pPr>
-      <w:bookmarkStart w:id="29" w:name="_Toc240482242"/>
+      <w:bookmarkStart w:id="29" w:name="_Toc240483665"/>
       <w:r>
         <w:rPr>
           <w:rFonts w:ascii="Times New Roman" w:hAnsi="Times New Roman"/>
@@ -16663,7 +16663,7 @@
         <w:pStyle w:val="Heading3"/>
         <w:outlineLvl w:val="2"/>
       </w:pPr>
-      <w:bookmarkStart w:id="30" w:name="_Toc240482243"/>
+      <w:bookmarkStart w:id="30" w:name="_Toc240483666"/>
       <w:r>
         <w:rPr>
           <w:rFonts w:ascii="Times New Roman" w:hAnsi="Times New Roman"/>
@@ -16986,7 +16986,7 @@
         <w:pStyle w:val="Heading3"/>
         <w:outlineLvl w:val="2"/>
       </w:pPr>
-      <w:bookmarkStart w:id="31" w:name="_Toc240482244"/>
+      <w:bookmarkStart w:id="31" w:name="_Toc240483667"/>
       <w:r>
         <w:rPr>
           <w:rFonts w:ascii="Times New Roman" w:hAnsi="Times New Roman"/>
@@ -17277,7 +17277,7 @@
         <w:pStyle w:val="Heading2"/>
         <w:outlineLvl w:val="1"/>
       </w:pPr>
-      <w:bookmarkStart w:id="32" w:name="_Toc240482245"/>
+      <w:bookmarkStart w:id="32" w:name="_Toc240483668"/>
       <w:r>
         <w:rPr>
           <w:rFonts w:ascii="Times New Roman" w:hAnsi="Times New Roman"/>
@@ -17312,7 +17312,7 @@
           <w:noProof/>
         </w:rPr>
         <w:drawing>
-          <wp:inline distT="0" distB="0" distL="0" distR="0" wp14:anchorId="3EC16F7F" wp14:editId="1DDF4277">
+          <wp:inline distT="0" distB="0" distL="0" distR="0" wp14:anchorId="6B22ED16" wp14:editId="35EE6040">
             <wp:extent cx="5040000" cy="2753704"/>
             <wp:effectExtent l="0" t="0" r="0" b="0"/>
             <wp:docPr id="5" name="Picture 5"/>
@@ -17385,7 +17385,7 @@
         <w:pStyle w:val="Heading1"/>
         <w:outlineLvl w:val="0"/>
       </w:pPr>
-      <w:bookmarkStart w:id="33" w:name="_Toc240482246"/>
+      <w:bookmarkStart w:id="33" w:name="_Toc240483669"/>
       <w:r>
         <w:rPr>
           <w:rFonts w:ascii="Times New Roman" w:hAnsi="Times New Roman"/>
@@ -19225,31 +19225,31 @@
       </w:rPr>
     </w:lvl>
   </w:abstractNum>
-  <w:num w:numId="1" w16cid:durableId="617105567">
+  <w:num w:numId="1" w16cid:durableId="1018313218">
     <w:abstractNumId w:val="8"/>
   </w:num>
-  <w:num w:numId="2" w16cid:durableId="23796428">
+  <w:num w:numId="2" w16cid:durableId="1716813022">
     <w:abstractNumId w:val="6"/>
   </w:num>
-  <w:num w:numId="3" w16cid:durableId="277033457">
+  <w:num w:numId="3" w16cid:durableId="370955179">
     <w:abstractNumId w:val="5"/>
   </w:num>
-  <w:num w:numId="4" w16cid:durableId="1924100312">
+  <w:num w:numId="4" w16cid:durableId="1304312891">
     <w:abstractNumId w:val="4"/>
   </w:num>
-  <w:num w:numId="5" w16cid:durableId="612592960">
+  <w:num w:numId="5" w16cid:durableId="461920147">
     <w:abstractNumId w:val="7"/>
   </w:num>
-  <w:num w:numId="6" w16cid:durableId="740101494">
+  <w:num w:numId="6" w16cid:durableId="218831215">
     <w:abstractNumId w:val="3"/>
   </w:num>
-  <w:num w:numId="7" w16cid:durableId="1347487440">
+  <w:num w:numId="7" w16cid:durableId="678580741">
     <w:abstractNumId w:val="2"/>
   </w:num>
-  <w:num w:numId="8" w16cid:durableId="2016876740">
+  <w:num w:numId="8" w16cid:durableId="1916158265">
     <w:abstractNumId w:val="1"/>
   </w:num>
-  <w:num w:numId="9" w16cid:durableId="695815559">
+  <w:num w:numId="9" w16cid:durableId="689643692">
     <w:abstractNumId w:val="0"/>
   </w:num>
 </w:numbering>
@@ -30690,7 +30690,7 @@
     <w:autoRedefine/>
     <w:uiPriority w:val="39"/>
     <w:unhideWhenUsed/>
-    <w:rsid w:val="00E63B37"/>
+    <w:rsid w:val="002D2E87"/>
     <w:pPr>
       <w:spacing w:after="40" w:line="240" w:lineRule="auto"/>
     </w:pPr>
@@ -30706,7 +30706,7 @@
     <w:autoRedefine/>
     <w:uiPriority w:val="39"/>
     <w:unhideWhenUsed/>
-    <w:rsid w:val="00E63B37"/>
+    <w:rsid w:val="002D2E87"/>
     <w:pPr>
       <w:spacing w:after="40" w:line="240" w:lineRule="auto"/>
       <w:ind w:left="360"/>
@@ -30722,7 +30722,7 @@
     <w:autoRedefine/>
     <w:uiPriority w:val="39"/>
     <w:unhideWhenUsed/>
-    <w:rsid w:val="00E63B37"/>
+    <w:rsid w:val="002D2E87"/>
     <w:pPr>
       <w:spacing w:after="40" w:line="240" w:lineRule="auto"/>
       <w:ind w:left="720"/>
@@ -30737,7 +30737,7 @@
     <w:basedOn w:val="DefaultParagraphFont"/>
     <w:uiPriority w:val="99"/>
     <w:unhideWhenUsed/>
-    <w:rsid w:val="00E63B37"/>
+    <w:rsid w:val="002D2E87"/>
     <w:rPr>
       <w:color w:val="0000FF" w:themeColor="hyperlink"/>
       <w:u w:val="single"/>

</xml_diff>

<commit_message>
fix(word): enforce standalone page breaks for DAFTAR TABEL and DAFTAR GAMBAR with COM interop buffer and update G4 audit
</commit_message>
<xml_diff>
--- a/01_Naskah_Utama/Proposal_Arthur_NoBab3.docx
+++ b/01_Naskah_Utama/Proposal_Arthur_NoBab3.docx
@@ -12,7 +12,7 @@
           <w:noProof/>
         </w:rPr>
         <w:drawing>
-          <wp:inline distT="0" distB="0" distL="0" distR="0" wp14:anchorId="195777B6" wp14:editId="4B985317">
+          <wp:inline distT="0" distB="0" distL="0" distR="0" wp14:anchorId="114A7801" wp14:editId="70EA8099">
             <wp:extent cx="1152000" cy="1152000"/>
             <wp:effectExtent l="0" t="0" r="0" b="0"/>
             <wp:docPr id="1" name="Picture 1"/>
@@ -274,7 +274,7 @@
         <w:spacing w:after="360"/>
         <w:outlineLvl w:val="0"/>
       </w:pPr>
-      <w:bookmarkStart w:id="0" w:name="_Toc240642889"/>
+      <w:bookmarkStart w:id="0" w:name="_Toc240917107"/>
       <w:r>
         <w:rPr>
           <w:rFonts w:ascii="Times New Roman" w:hAnsi="Times New Roman"/>
@@ -564,10 +564,11 @@
     <w:p>
       <w:pPr>
         <w:pStyle w:val="Heading1"/>
+        <w:pageBreakBefore/>
         <w:spacing w:after="360"/>
         <w:outlineLvl w:val="0"/>
       </w:pPr>
-      <w:bookmarkStart w:id="1" w:name="_Toc240642890"/>
+      <w:bookmarkStart w:id="1" w:name="_Toc240917108"/>
       <w:r>
         <w:rPr>
           <w:rFonts w:ascii="Times New Roman" w:hAnsi="Times New Roman"/>
@@ -726,10 +727,11 @@
     <w:p>
       <w:pPr>
         <w:pStyle w:val="Heading1"/>
+        <w:pageBreakBefore/>
         <w:spacing w:after="360"/>
         <w:outlineLvl w:val="0"/>
       </w:pPr>
-      <w:bookmarkStart w:id="2" w:name="_Toc240642891"/>
+      <w:bookmarkStart w:id="2" w:name="_Toc240917109"/>
       <w:r>
         <w:rPr>
           <w:rFonts w:ascii="Times New Roman" w:hAnsi="Times New Roman"/>
@@ -890,6 +892,7 @@
     <w:p>
       <w:pPr>
         <w:keepNext/>
+        <w:pageBreakBefore/>
         <w:spacing w:after="360" w:line="360" w:lineRule="auto"/>
         <w:jc w:val="center"/>
       </w:pPr>
@@ -928,7 +931,7 @@
       <w:r>
         <w:fldChar w:fldCharType="separate"/>
       </w:r>
-      <w:hyperlink w:anchor="_Toc240642889" w:history="1">
+      <w:hyperlink w:anchor="_Toc240917107" w:history="1">
         <w:r>
           <w:rPr>
             <w:rStyle w:val="Hyperlink"/>
@@ -955,7 +958,7 @@
             <w:noProof/>
             <w:webHidden/>
           </w:rPr>
-          <w:instrText xml:space="preserve"> PAGEREF _Toc240642889 \h </w:instrText>
+          <w:instrText xml:space="preserve"> PAGEREF _Toc240917107 \h </w:instrText>
         </w:r>
         <w:r>
           <w:rPr>
@@ -1003,7 +1006,7 @@
           <w14:ligatures w14:val="standardContextual"/>
         </w:rPr>
       </w:pPr>
-      <w:hyperlink w:anchor="_Toc240642890" w:history="1">
+      <w:hyperlink w:anchor="_Toc240917108" w:history="1">
         <w:r>
           <w:rPr>
             <w:rStyle w:val="Hyperlink"/>
@@ -1030,7 +1033,7 @@
             <w:noProof/>
             <w:webHidden/>
           </w:rPr>
-          <w:instrText xml:space="preserve"> PAGEREF _Toc240642890 \h </w:instrText>
+          <w:instrText xml:space="preserve"> PAGEREF _Toc240917108 \h </w:instrText>
         </w:r>
         <w:r>
           <w:rPr>
@@ -1078,7 +1081,7 @@
           <w14:ligatures w14:val="standardContextual"/>
         </w:rPr>
       </w:pPr>
-      <w:hyperlink w:anchor="_Toc240642891" w:history="1">
+      <w:hyperlink w:anchor="_Toc240917109" w:history="1">
         <w:r>
           <w:rPr>
             <w:rStyle w:val="Hyperlink"/>
@@ -1105,7 +1108,7 @@
             <w:noProof/>
             <w:webHidden/>
           </w:rPr>
-          <w:instrText xml:space="preserve"> PAGEREF _Toc240642891 \h </w:instrText>
+          <w:instrText xml:space="preserve"> PAGEREF _Toc240917109 \h </w:instrText>
         </w:r>
         <w:r>
           <w:rPr>
@@ -1153,7 +1156,7 @@
           <w14:ligatures w14:val="standardContextual"/>
         </w:rPr>
       </w:pPr>
-      <w:hyperlink w:anchor="_Toc240642892" w:history="1">
+      <w:hyperlink w:anchor="_Toc240917110" w:history="1">
         <w:r>
           <w:rPr>
             <w:rStyle w:val="Hyperlink"/>
@@ -1180,7 +1183,7 @@
             <w:noProof/>
             <w:webHidden/>
           </w:rPr>
-          <w:instrText xml:space="preserve"> PAGEREF _Toc240642892 \h </w:instrText>
+          <w:instrText xml:space="preserve"> PAGEREF _Toc240917110 \h </w:instrText>
         </w:r>
         <w:r>
           <w:rPr>
@@ -1200,7 +1203,7 @@
             <w:noProof/>
             <w:webHidden/>
           </w:rPr>
-          <w:t>vii</w:t>
+          <w:t>viii</w:t>
         </w:r>
         <w:r>
           <w:rPr>
@@ -1228,7 +1231,7 @@
           <w14:ligatures w14:val="standardContextual"/>
         </w:rPr>
       </w:pPr>
-      <w:hyperlink w:anchor="_Toc240642893" w:history="1">
+      <w:hyperlink w:anchor="_Toc240917111" w:history="1">
         <w:r>
           <w:rPr>
             <w:rStyle w:val="Hyperlink"/>
@@ -1255,7 +1258,7 @@
             <w:noProof/>
             <w:webHidden/>
           </w:rPr>
-          <w:instrText xml:space="preserve"> PAGEREF _Toc240642893 \h </w:instrText>
+          <w:instrText xml:space="preserve"> PAGEREF _Toc240917111 \h </w:instrText>
         </w:r>
         <w:r>
           <w:rPr>
@@ -1275,7 +1278,7 @@
             <w:noProof/>
             <w:webHidden/>
           </w:rPr>
-          <w:t>viii</w:t>
+          <w:t>ix</w:t>
         </w:r>
         <w:r>
           <w:rPr>
@@ -1303,7 +1306,7 @@
           <w14:ligatures w14:val="standardContextual"/>
         </w:rPr>
       </w:pPr>
-      <w:hyperlink w:anchor="_Toc240642894" w:history="1">
+      <w:hyperlink w:anchor="_Toc240917112" w:history="1">
         <w:r>
           <w:rPr>
             <w:rStyle w:val="Hyperlink"/>
@@ -1330,7 +1333,7 @@
             <w:noProof/>
             <w:webHidden/>
           </w:rPr>
-          <w:instrText xml:space="preserve"> PAGEREF _Toc240642894 \h </w:instrText>
+          <w:instrText xml:space="preserve"> PAGEREF _Toc240917112 \h </w:instrText>
         </w:r>
         <w:r>
           <w:rPr>
@@ -1377,7 +1380,7 @@
           <w14:ligatures w14:val="standardContextual"/>
         </w:rPr>
       </w:pPr>
-      <w:hyperlink w:anchor="_Toc240642895" w:history="1">
+      <w:hyperlink w:anchor="_Toc240917113" w:history="1">
         <w:r>
           <w:rPr>
             <w:rStyle w:val="Hyperlink"/>
@@ -1404,7 +1407,7 @@
             <w:noProof/>
             <w:webHidden/>
           </w:rPr>
-          <w:instrText xml:space="preserve"> PAGEREF _Toc240642895 \h </w:instrText>
+          <w:instrText xml:space="preserve"> PAGEREF _Toc240917113 \h </w:instrText>
         </w:r>
         <w:r>
           <w:rPr>
@@ -1451,7 +1454,7 @@
           <w14:ligatures w14:val="standardContextual"/>
         </w:rPr>
       </w:pPr>
-      <w:hyperlink w:anchor="_Toc240642896" w:history="1">
+      <w:hyperlink w:anchor="_Toc240917114" w:history="1">
         <w:r>
           <w:rPr>
             <w:rStyle w:val="Hyperlink"/>
@@ -1478,7 +1481,7 @@
             <w:noProof/>
             <w:webHidden/>
           </w:rPr>
-          <w:instrText xml:space="preserve"> PAGEREF _Toc240642896 \h </w:instrText>
+          <w:instrText xml:space="preserve"> PAGEREF _Toc240917114 \h </w:instrText>
         </w:r>
         <w:r>
           <w:rPr>
@@ -1525,7 +1528,7 @@
           <w14:ligatures w14:val="standardContextual"/>
         </w:rPr>
       </w:pPr>
-      <w:hyperlink w:anchor="_Toc240642897" w:history="1">
+      <w:hyperlink w:anchor="_Toc240917115" w:history="1">
         <w:r>
           <w:rPr>
             <w:rStyle w:val="Hyperlink"/>
@@ -1552,7 +1555,7 @@
             <w:noProof/>
             <w:webHidden/>
           </w:rPr>
-          <w:instrText xml:space="preserve"> PAGEREF _Toc240642897 \h </w:instrText>
+          <w:instrText xml:space="preserve"> PAGEREF _Toc240917115 \h </w:instrText>
         </w:r>
         <w:r>
           <w:rPr>
@@ -1599,7 +1602,7 @@
           <w14:ligatures w14:val="standardContextual"/>
         </w:rPr>
       </w:pPr>
-      <w:hyperlink w:anchor="_Toc240642898" w:history="1">
+      <w:hyperlink w:anchor="_Toc240917116" w:history="1">
         <w:r>
           <w:rPr>
             <w:rStyle w:val="Hyperlink"/>
@@ -1626,7 +1629,7 @@
             <w:noProof/>
             <w:webHidden/>
           </w:rPr>
-          <w:instrText xml:space="preserve"> PAGEREF _Toc240642898 \h </w:instrText>
+          <w:instrText xml:space="preserve"> PAGEREF _Toc240917116 \h </w:instrText>
         </w:r>
         <w:r>
           <w:rPr>
@@ -1674,7 +1677,7 @@
           <w14:ligatures w14:val="standardContextual"/>
         </w:rPr>
       </w:pPr>
-      <w:hyperlink w:anchor="_Toc240642899" w:history="1">
+      <w:hyperlink w:anchor="_Toc240917117" w:history="1">
         <w:r>
           <w:rPr>
             <w:rStyle w:val="Hyperlink"/>
@@ -1701,7 +1704,7 @@
             <w:noProof/>
             <w:webHidden/>
           </w:rPr>
-          <w:instrText xml:space="preserve"> PAGEREF _Toc240642899 \h </w:instrText>
+          <w:instrText xml:space="preserve"> PAGEREF _Toc240917117 \h </w:instrText>
         </w:r>
         <w:r>
           <w:rPr>
@@ -1749,7 +1752,7 @@
           <w14:ligatures w14:val="standardContextual"/>
         </w:rPr>
       </w:pPr>
-      <w:hyperlink w:anchor="_Toc240642900" w:history="1">
+      <w:hyperlink w:anchor="_Toc240917118" w:history="1">
         <w:r>
           <w:rPr>
             <w:rStyle w:val="Hyperlink"/>
@@ -1776,7 +1779,7 @@
             <w:noProof/>
             <w:webHidden/>
           </w:rPr>
-          <w:instrText xml:space="preserve"> PAGEREF _Toc240642900 \h </w:instrText>
+          <w:instrText xml:space="preserve"> PAGEREF _Toc240917118 \h </w:instrText>
         </w:r>
         <w:r>
           <w:rPr>
@@ -1824,7 +1827,7 @@
           <w14:ligatures w14:val="standardContextual"/>
         </w:rPr>
       </w:pPr>
-      <w:hyperlink w:anchor="_Toc240642901" w:history="1">
+      <w:hyperlink w:anchor="_Toc240917119" w:history="1">
         <w:r>
           <w:rPr>
             <w:rStyle w:val="Hyperlink"/>
@@ -1851,7 +1854,7 @@
             <w:noProof/>
             <w:webHidden/>
           </w:rPr>
-          <w:instrText xml:space="preserve"> PAGEREF _Toc240642901 \h </w:instrText>
+          <w:instrText xml:space="preserve"> PAGEREF _Toc240917119 \h </w:instrText>
         </w:r>
         <w:r>
           <w:rPr>
@@ -1898,7 +1901,7 @@
           <w14:ligatures w14:val="standardContextual"/>
         </w:rPr>
       </w:pPr>
-      <w:hyperlink w:anchor="_Toc240642902" w:history="1">
+      <w:hyperlink w:anchor="_Toc240917120" w:history="1">
         <w:r>
           <w:rPr>
             <w:rStyle w:val="Hyperlink"/>
@@ -1925,7 +1928,7 @@
             <w:noProof/>
             <w:webHidden/>
           </w:rPr>
-          <w:instrText xml:space="preserve"> PAGEREF _Toc240642902 \h </w:instrText>
+          <w:instrText xml:space="preserve"> PAGEREF _Toc240917120 \h </w:instrText>
         </w:r>
         <w:r>
           <w:rPr>
@@ -1973,7 +1976,7 @@
           <w14:ligatures w14:val="standardContextual"/>
         </w:rPr>
       </w:pPr>
-      <w:hyperlink w:anchor="_Toc240642903" w:history="1">
+      <w:hyperlink w:anchor="_Toc240917121" w:history="1">
         <w:r>
           <w:rPr>
             <w:rStyle w:val="Hyperlink"/>
@@ -2015,7 +2018,7 @@
             <w:noProof/>
             <w:webHidden/>
           </w:rPr>
-          <w:instrText xml:space="preserve"> PAGEREF _Toc240642903 \h </w:instrText>
+          <w:instrText xml:space="preserve"> PAGEREF _Toc240917121 \h </w:instrText>
         </w:r>
         <w:r>
           <w:rPr>
@@ -2063,7 +2066,7 @@
           <w14:ligatures w14:val="standardContextual"/>
         </w:rPr>
       </w:pPr>
-      <w:hyperlink w:anchor="_Toc240642904" w:history="1">
+      <w:hyperlink w:anchor="_Toc240917122" w:history="1">
         <w:r>
           <w:rPr>
             <w:rStyle w:val="Hyperlink"/>
@@ -2105,7 +2108,7 @@
             <w:noProof/>
             <w:webHidden/>
           </w:rPr>
-          <w:instrText xml:space="preserve"> PAGEREF _Toc240642904 \h </w:instrText>
+          <w:instrText xml:space="preserve"> PAGEREF _Toc240917122 \h </w:instrText>
         </w:r>
         <w:r>
           <w:rPr>
@@ -2153,21 +2156,13 @@
           <w14:ligatures w14:val="standardContextual"/>
         </w:rPr>
       </w:pPr>
-      <w:hyperlink w:anchor="_Toc240642905" w:history="1">
+      <w:hyperlink w:anchor="_Toc240917123" w:history="1">
         <w:r>
           <w:rPr>
             <w:rStyle w:val="Hyperlink"/>
             <w:noProof/>
           </w:rPr>
-          <w:t>2.1.3 Supporting Theory: Psikologi Kolektor</w:t>
-        </w:r>
-        <w:r>
-          <w:rPr>
-            <w:rStyle w:val="Hyperlink"/>
-            <w:noProof/>
-          </w:rPr>
-          <w:lastRenderedPageBreak/>
-          <w:t xml:space="preserve"> dan </w:t>
+          <w:t xml:space="preserve">2.1.3 Supporting Theory: Psikologi Kolektor dan </w:t>
         </w:r>
         <w:r>
           <w:rPr>
@@ -2196,7 +2191,7 @@
             <w:noProof/>
             <w:webHidden/>
           </w:rPr>
-          <w:instrText xml:space="preserve"> PAGEREF _Toc240642905 \h </w:instrText>
+          <w:instrText xml:space="preserve"> PAGEREF _Toc240917123 \h </w:instrText>
         </w:r>
         <w:r>
           <w:rPr>
@@ -2244,7 +2239,7 @@
           <w14:ligatures w14:val="standardContextual"/>
         </w:rPr>
       </w:pPr>
-      <w:hyperlink w:anchor="_Toc240642906" w:history="1">
+      <w:hyperlink w:anchor="_Toc240917124" w:history="1">
         <w:r>
           <w:rPr>
             <w:rStyle w:val="Hyperlink"/>
@@ -2286,7 +2281,7 @@
             <w:noProof/>
             <w:webHidden/>
           </w:rPr>
-          <w:instrText xml:space="preserve"> PAGEREF _Toc240642906 \h </w:instrText>
+          <w:instrText xml:space="preserve"> PAGEREF _Toc240917124 \h </w:instrText>
         </w:r>
         <w:r>
           <w:rPr>
@@ -2333,7 +2328,7 @@
           <w14:ligatures w14:val="standardContextual"/>
         </w:rPr>
       </w:pPr>
-      <w:hyperlink w:anchor="_Toc240642907" w:history="1">
+      <w:hyperlink w:anchor="_Toc240917125" w:history="1">
         <w:r>
           <w:rPr>
             <w:rStyle w:val="Hyperlink"/>
@@ -2360,7 +2355,7 @@
             <w:noProof/>
             <w:webHidden/>
           </w:rPr>
-          <w:instrText xml:space="preserve"> PAGEREF _Toc240642907 \h </w:instrText>
+          <w:instrText xml:space="preserve"> PAGEREF _Toc240917125 \h </w:instrText>
         </w:r>
         <w:r>
           <w:rPr>
@@ -2408,7 +2403,7 @@
           <w14:ligatures w14:val="standardContextual"/>
         </w:rPr>
       </w:pPr>
-      <w:hyperlink w:anchor="_Toc240642908" w:history="1">
+      <w:hyperlink w:anchor="_Toc240917126" w:history="1">
         <w:r>
           <w:rPr>
             <w:rStyle w:val="Hyperlink"/>
@@ -2465,7 +2460,7 @@
             <w:noProof/>
             <w:webHidden/>
           </w:rPr>
-          <w:instrText xml:space="preserve"> PAGEREF _Toc240642908 \h </w:instrText>
+          <w:instrText xml:space="preserve"> PAGEREF _Toc240917126 \h </w:instrText>
         </w:r>
         <w:r>
           <w:rPr>
@@ -2513,7 +2508,7 @@
           <w14:ligatures w14:val="standardContextual"/>
         </w:rPr>
       </w:pPr>
-      <w:hyperlink w:anchor="_Toc240642909" w:history="1">
+      <w:hyperlink w:anchor="_Toc240917127" w:history="1">
         <w:r>
           <w:rPr>
             <w:rStyle w:val="Hyperlink"/>
@@ -2570,7 +2565,7 @@
             <w:noProof/>
             <w:webHidden/>
           </w:rPr>
-          <w:instrText xml:space="preserve"> PAGEREF _Toc240642909 \h </w:instrText>
+          <w:instrText xml:space="preserve"> PAGEREF _Toc240917127 \h </w:instrText>
         </w:r>
         <w:r>
           <w:rPr>
@@ -2618,7 +2613,7 @@
           <w14:ligatures w14:val="standardContextual"/>
         </w:rPr>
       </w:pPr>
-      <w:hyperlink w:anchor="_Toc240642910" w:history="1">
+      <w:hyperlink w:anchor="_Toc240917128" w:history="1">
         <w:r>
           <w:rPr>
             <w:rStyle w:val="Hyperlink"/>
@@ -2675,7 +2670,7 @@
             <w:noProof/>
             <w:webHidden/>
           </w:rPr>
-          <w:instrText xml:space="preserve"> PAGEREF _Toc240642910 \h </w:instrText>
+          <w:instrText xml:space="preserve"> PAGEREF _Toc240917128 \h </w:instrText>
         </w:r>
         <w:r>
           <w:rPr>
@@ -2723,7 +2718,7 @@
           <w14:ligatures w14:val="standardContextual"/>
         </w:rPr>
       </w:pPr>
-      <w:hyperlink w:anchor="_Toc240642911" w:history="1">
+      <w:hyperlink w:anchor="_Toc240917129" w:history="1">
         <w:r>
           <w:rPr>
             <w:rStyle w:val="Hyperlink"/>
@@ -2780,7 +2775,7 @@
             <w:noProof/>
             <w:webHidden/>
           </w:rPr>
-          <w:instrText xml:space="preserve"> PAGEREF _Toc240642911 \h </w:instrText>
+          <w:instrText xml:space="preserve"> PAGEREF _Toc240917129 \h </w:instrText>
         </w:r>
         <w:r>
           <w:rPr>
@@ -2828,7 +2823,7 @@
           <w14:ligatures w14:val="standardContextual"/>
         </w:rPr>
       </w:pPr>
-      <w:hyperlink w:anchor="_Toc240642912" w:history="1">
+      <w:hyperlink w:anchor="_Toc240917130" w:history="1">
         <w:r>
           <w:rPr>
             <w:rStyle w:val="Hyperlink"/>
@@ -2885,7 +2880,7 @@
             <w:noProof/>
             <w:webHidden/>
           </w:rPr>
-          <w:instrText xml:space="preserve"> PAGEREF _Toc240642912 \h </w:instrText>
+          <w:instrText xml:space="preserve"> PAGEREF _Toc240917130 \h </w:instrText>
         </w:r>
         <w:r>
           <w:rPr>
@@ -2932,7 +2927,7 @@
           <w14:ligatures w14:val="standardContextual"/>
         </w:rPr>
       </w:pPr>
-      <w:hyperlink w:anchor="_Toc240642913" w:history="1">
+      <w:hyperlink w:anchor="_Toc240917131" w:history="1">
         <w:r>
           <w:rPr>
             <w:rStyle w:val="Hyperlink"/>
@@ -2959,7 +2954,7 @@
             <w:noProof/>
             <w:webHidden/>
           </w:rPr>
-          <w:instrText xml:space="preserve"> PAGEREF _Toc240642913 \h </w:instrText>
+          <w:instrText xml:space="preserve"> PAGEREF _Toc240917131 \h </w:instrText>
         </w:r>
         <w:r>
           <w:rPr>
@@ -3006,7 +3001,7 @@
           <w14:ligatures w14:val="standardContextual"/>
         </w:rPr>
       </w:pPr>
-      <w:hyperlink w:anchor="_Toc240642914" w:history="1">
+      <w:hyperlink w:anchor="_Toc240917132" w:history="1">
         <w:r>
           <w:rPr>
             <w:rStyle w:val="Hyperlink"/>
@@ -3033,7 +3028,7 @@
             <w:noProof/>
             <w:webHidden/>
           </w:rPr>
-          <w:instrText xml:space="preserve"> PAGEREF _Toc240642914 \h </w:instrText>
+          <w:instrText xml:space="preserve"> PAGEREF _Toc240917132 \h </w:instrText>
         </w:r>
         <w:r>
           <w:rPr>
@@ -3081,7 +3076,7 @@
           <w14:ligatures w14:val="standardContextual"/>
         </w:rPr>
       </w:pPr>
-      <w:hyperlink w:anchor="_Toc240642915" w:history="1">
+      <w:hyperlink w:anchor="_Toc240917133" w:history="1">
         <w:r>
           <w:rPr>
             <w:rStyle w:val="Hyperlink"/>
@@ -3131,7 +3126,7 @@
             <w:noProof/>
             <w:webHidden/>
           </w:rPr>
-          <w:instrText xml:space="preserve"> PAGEREF _Toc240642915 \h </w:instrText>
+          <w:instrText xml:space="preserve"> PAGEREF _Toc240917133 \h </w:instrText>
         </w:r>
         <w:r>
           <w:rPr>
@@ -3179,7 +3174,7 @@
           <w14:ligatures w14:val="standardContextual"/>
         </w:rPr>
       </w:pPr>
-      <w:hyperlink w:anchor="_Toc240642916" w:history="1">
+      <w:hyperlink w:anchor="_Toc240917134" w:history="1">
         <w:r>
           <w:rPr>
             <w:rStyle w:val="Hyperlink"/>
@@ -3229,7 +3224,7 @@
             <w:noProof/>
             <w:webHidden/>
           </w:rPr>
-          <w:instrText xml:space="preserve"> PAGEREF _Toc240642916 \h </w:instrText>
+          <w:instrText xml:space="preserve"> PAGEREF _Toc240917134 \h </w:instrText>
         </w:r>
         <w:r>
           <w:rPr>
@@ -3277,7 +3272,7 @@
           <w14:ligatures w14:val="standardContextual"/>
         </w:rPr>
       </w:pPr>
-      <w:hyperlink w:anchor="_Toc240642917" w:history="1">
+      <w:hyperlink w:anchor="_Toc240917135" w:history="1">
         <w:r>
           <w:rPr>
             <w:rStyle w:val="Hyperlink"/>
@@ -3327,7 +3322,7 @@
             <w:noProof/>
             <w:webHidden/>
           </w:rPr>
-          <w:instrText xml:space="preserve"> PAGEREF _Toc240642917 \h </w:instrText>
+          <w:instrText xml:space="preserve"> PAGEREF _Toc240917135 \h </w:instrText>
         </w:r>
         <w:r>
           <w:rPr>
@@ -3375,7 +3370,7 @@
           <w14:ligatures w14:val="standardContextual"/>
         </w:rPr>
       </w:pPr>
-      <w:hyperlink w:anchor="_Toc240642918" w:history="1">
+      <w:hyperlink w:anchor="_Toc240917136" w:history="1">
         <w:r>
           <w:rPr>
             <w:rStyle w:val="Hyperlink"/>
@@ -3440,7 +3435,7 @@
             <w:noProof/>
             <w:webHidden/>
           </w:rPr>
-          <w:instrText xml:space="preserve"> PAGEREF _Toc240642918 \h </w:instrText>
+          <w:instrText xml:space="preserve"> PAGEREF _Toc240917136 \h </w:instrText>
         </w:r>
         <w:r>
           <w:rPr>
@@ -3488,7 +3483,7 @@
           <w14:ligatures w14:val="standardContextual"/>
         </w:rPr>
       </w:pPr>
-      <w:hyperlink w:anchor="_Toc240642919" w:history="1">
+      <w:hyperlink w:anchor="_Toc240917137" w:history="1">
         <w:r>
           <w:rPr>
             <w:rStyle w:val="Hyperlink"/>
@@ -3553,7 +3548,7 @@
             <w:noProof/>
             <w:webHidden/>
           </w:rPr>
-          <w:instrText xml:space="preserve"> PAGEREF _Toc240642919 \h </w:instrText>
+          <w:instrText xml:space="preserve"> PAGEREF _Toc240917137 \h </w:instrText>
         </w:r>
         <w:r>
           <w:rPr>
@@ -3601,7 +3596,7 @@
           <w14:ligatures w14:val="standardContextual"/>
         </w:rPr>
       </w:pPr>
-      <w:hyperlink w:anchor="_Toc240642920" w:history="1">
+      <w:hyperlink w:anchor="_Toc240917138" w:history="1">
         <w:r>
           <w:rPr>
             <w:rStyle w:val="Hyperlink"/>
@@ -3666,7 +3661,7 @@
             <w:noProof/>
             <w:webHidden/>
           </w:rPr>
-          <w:instrText xml:space="preserve"> PAGEREF _Toc240642920 \h </w:instrText>
+          <w:instrText xml:space="preserve"> PAGEREF _Toc240917138 \h </w:instrText>
         </w:r>
         <w:r>
           <w:rPr>
@@ -3713,7 +3708,7 @@
           <w14:ligatures w14:val="standardContextual"/>
         </w:rPr>
       </w:pPr>
-      <w:hyperlink w:anchor="_Toc240642921" w:history="1">
+      <w:hyperlink w:anchor="_Toc240917139" w:history="1">
         <w:r>
           <w:rPr>
             <w:rStyle w:val="Hyperlink"/>
@@ -3740,7 +3735,7 @@
             <w:noProof/>
             <w:webHidden/>
           </w:rPr>
-          <w:instrText xml:space="preserve"> PAGEREF _Toc240642921 \h </w:instrText>
+          <w:instrText xml:space="preserve"> PAGEREF _Toc240917139 \h </w:instrText>
         </w:r>
         <w:r>
           <w:rPr>
@@ -3788,7 +3783,7 @@
           <w14:ligatures w14:val="standardContextual"/>
         </w:rPr>
       </w:pPr>
-      <w:hyperlink w:anchor="_Toc240642922" w:history="1">
+      <w:hyperlink w:anchor="_Toc240917140" w:history="1">
         <w:r>
           <w:rPr>
             <w:rStyle w:val="Hyperlink"/>
@@ -3815,7 +3810,7 @@
             <w:noProof/>
             <w:webHidden/>
           </w:rPr>
-          <w:instrText xml:space="preserve"> PAGEREF _Toc240642922 \h </w:instrText>
+          <w:instrText xml:space="preserve"> PAGEREF _Toc240917140 \h </w:instrText>
         </w:r>
         <w:r>
           <w:rPr>
@@ -3849,6 +3844,7 @@
     <w:p>
       <w:pPr>
         <w:pStyle w:val="Heading1"/>
+        <w:pageBreakBefore/>
         <w:spacing w:after="360"/>
         <w:outlineLvl w:val="0"/>
       </w:pPr>
@@ -3859,9 +3855,18 @@
           <w:color w:val="000000"/>
           <w:sz w:val="24"/>
         </w:rPr>
+        <w:lastRenderedPageBreak/>
         <w:fldChar w:fldCharType="end"/>
       </w:r>
-      <w:bookmarkStart w:id="3" w:name="_Toc240642892"/>
+    </w:p>
+    <w:p>
+      <w:pPr>
+        <w:pStyle w:val="Heading1"/>
+        <w:pageBreakBefore/>
+        <w:spacing w:after="360"/>
+        <w:outlineLvl w:val="0"/>
+      </w:pPr>
+      <w:bookmarkStart w:id="3" w:name="_Toc240917110"/>
       <w:r>
         <w:rPr>
           <w:rFonts w:ascii="Times New Roman" w:hAnsi="Times New Roman"/>
@@ -3869,6 +3874,7 @@
           <w:color w:val="000000"/>
           <w:sz w:val="24"/>
         </w:rPr>
+        <w:lastRenderedPageBreak/>
         <w:t>DAFTAR TABEL</w:t>
       </w:r>
       <w:bookmarkEnd w:id="3"/>
@@ -3997,10 +4003,11 @@
     <w:p>
       <w:pPr>
         <w:pStyle w:val="Heading1"/>
+        <w:pageBreakBefore/>
         <w:spacing w:after="360"/>
         <w:outlineLvl w:val="0"/>
       </w:pPr>
-      <w:bookmarkStart w:id="4" w:name="_Toc240642893"/>
+      <w:bookmarkStart w:id="4" w:name="_Toc240917111"/>
       <w:r>
         <w:rPr>
           <w:rFonts w:ascii="Times New Roman" w:hAnsi="Times New Roman"/>
@@ -4148,7 +4155,7 @@
         <w:pStyle w:val="Heading1"/>
         <w:outlineLvl w:val="0"/>
       </w:pPr>
-      <w:bookmarkStart w:id="5" w:name="_Toc240642894"/>
+      <w:bookmarkStart w:id="5" w:name="_Toc240917112"/>
       <w:r>
         <w:rPr>
           <w:rFonts w:ascii="Times New Roman" w:hAnsi="Times New Roman"/>
@@ -4166,7 +4173,7 @@
         <w:pStyle w:val="Heading2"/>
         <w:outlineLvl w:val="1"/>
       </w:pPr>
-      <w:bookmarkStart w:id="6" w:name="_Toc240642895"/>
+      <w:bookmarkStart w:id="6" w:name="_Toc240917113"/>
       <w:r>
         <w:rPr>
           <w:rFonts w:ascii="Times New Roman" w:hAnsi="Times New Roman"/>
@@ -4582,7 +4589,7 @@
           <w:noProof/>
         </w:rPr>
         <w:drawing>
-          <wp:inline distT="0" distB="0" distL="0" distR="0" wp14:anchorId="2DB86842" wp14:editId="168469B8">
+          <wp:inline distT="0" distB="0" distL="0" distR="0" wp14:anchorId="6F545D4C" wp14:editId="128C2639">
             <wp:extent cx="4860000" cy="2980356"/>
             <wp:effectExtent l="0" t="0" r="0" b="0"/>
             <wp:docPr id="2" name="Picture 2"/>
@@ -4795,7 +4802,7 @@
           <w:noProof/>
         </w:rPr>
         <w:drawing>
-          <wp:inline distT="0" distB="0" distL="0" distR="0" wp14:anchorId="70D88518" wp14:editId="3D76CDF9">
+          <wp:inline distT="0" distB="0" distL="0" distR="0" wp14:anchorId="25A304B1" wp14:editId="79F7C5AD">
             <wp:extent cx="4860000" cy="2719286"/>
             <wp:effectExtent l="0" t="0" r="0" b="0"/>
             <wp:docPr id="3" name="Picture 3"/>
@@ -5373,7 +5380,7 @@
           <w:noProof/>
         </w:rPr>
         <w:drawing>
-          <wp:inline distT="0" distB="0" distL="0" distR="0" wp14:anchorId="11C8A4CC" wp14:editId="5966E9B2">
+          <wp:inline distT="0" distB="0" distL="0" distR="0" wp14:anchorId="316773B6" wp14:editId="68CEDC50">
             <wp:extent cx="4860000" cy="2818800"/>
             <wp:effectExtent l="0" t="0" r="0" b="0"/>
             <wp:docPr id="4" name="Picture 4"/>
@@ -11715,7 +11722,7 @@
         <w:pStyle w:val="Heading2"/>
         <w:outlineLvl w:val="1"/>
       </w:pPr>
-      <w:bookmarkStart w:id="11" w:name="_Toc240642896"/>
+      <w:bookmarkStart w:id="11" w:name="_Toc240917114"/>
       <w:r>
         <w:rPr>
           <w:rFonts w:ascii="Times New Roman" w:hAnsi="Times New Roman"/>
@@ -12138,7 +12145,7 @@
         <w:pStyle w:val="Heading2"/>
         <w:outlineLvl w:val="1"/>
       </w:pPr>
-      <w:bookmarkStart w:id="12" w:name="_Toc240642897"/>
+      <w:bookmarkStart w:id="12" w:name="_Toc240917115"/>
       <w:r>
         <w:rPr>
           <w:rFonts w:ascii="Times New Roman" w:hAnsi="Times New Roman"/>
@@ -12562,7 +12569,7 @@
         <w:pStyle w:val="Heading2"/>
         <w:outlineLvl w:val="1"/>
       </w:pPr>
-      <w:bookmarkStart w:id="13" w:name="_Toc240642898"/>
+      <w:bookmarkStart w:id="13" w:name="_Toc240917116"/>
       <w:r>
         <w:rPr>
           <w:rFonts w:ascii="Times New Roman" w:hAnsi="Times New Roman"/>
@@ -12592,7 +12599,7 @@
         <w:pStyle w:val="Heading3"/>
         <w:outlineLvl w:val="2"/>
       </w:pPr>
-      <w:bookmarkStart w:id="14" w:name="_Toc240642899"/>
+      <w:bookmarkStart w:id="14" w:name="_Toc240917117"/>
       <w:r>
         <w:rPr>
           <w:rFonts w:ascii="Times New Roman" w:hAnsi="Times New Roman"/>
@@ -12823,7 +12830,7 @@
         <w:pStyle w:val="Heading3"/>
         <w:outlineLvl w:val="2"/>
       </w:pPr>
-      <w:bookmarkStart w:id="15" w:name="_Toc240642900"/>
+      <w:bookmarkStart w:id="15" w:name="_Toc240917118"/>
       <w:r>
         <w:rPr>
           <w:rFonts w:ascii="Times New Roman" w:hAnsi="Times New Roman"/>
@@ -12968,7 +12975,7 @@
         <w:pStyle w:val="Heading1"/>
         <w:outlineLvl w:val="0"/>
       </w:pPr>
-      <w:bookmarkStart w:id="16" w:name="_Toc240642901"/>
+      <w:bookmarkStart w:id="16" w:name="_Toc240917119"/>
       <w:r>
         <w:rPr>
           <w:rFonts w:ascii="Times New Roman" w:hAnsi="Times New Roman"/>
@@ -12986,7 +12993,7 @@
         <w:pStyle w:val="Heading2"/>
         <w:outlineLvl w:val="1"/>
       </w:pPr>
-      <w:bookmarkStart w:id="17" w:name="_Toc240642902"/>
+      <w:bookmarkStart w:id="17" w:name="_Toc240917120"/>
       <w:r>
         <w:rPr>
           <w:rFonts w:ascii="Times New Roman" w:hAnsi="Times New Roman"/>
@@ -13003,7 +13010,7 @@
         <w:pStyle w:val="Heading3"/>
         <w:outlineLvl w:val="2"/>
       </w:pPr>
-      <w:bookmarkStart w:id="18" w:name="_Toc240642903"/>
+      <w:bookmarkStart w:id="18" w:name="_Toc240917121"/>
       <w:r>
         <w:rPr>
           <w:rFonts w:ascii="Times New Roman" w:hAnsi="Times New Roman"/>
@@ -13390,7 +13397,7 @@
         <w:pStyle w:val="Heading3"/>
         <w:outlineLvl w:val="2"/>
       </w:pPr>
-      <w:bookmarkStart w:id="19" w:name="_Toc240642904"/>
+      <w:bookmarkStart w:id="19" w:name="_Toc240917122"/>
       <w:r>
         <w:rPr>
           <w:rFonts w:ascii="Times New Roman" w:hAnsi="Times New Roman"/>
@@ -13740,7 +13747,7 @@
         <w:pStyle w:val="Heading3"/>
         <w:outlineLvl w:val="2"/>
       </w:pPr>
-      <w:bookmarkStart w:id="20" w:name="_Toc240642905"/>
+      <w:bookmarkStart w:id="20" w:name="_Toc240917123"/>
       <w:r>
         <w:rPr>
           <w:rFonts w:ascii="Times New Roman" w:hAnsi="Times New Roman"/>
@@ -13930,7 +13937,7 @@
         <w:pStyle w:val="Heading3"/>
         <w:outlineLvl w:val="2"/>
       </w:pPr>
-      <w:bookmarkStart w:id="21" w:name="_Toc240642906"/>
+      <w:bookmarkStart w:id="21" w:name="_Toc240917124"/>
       <w:r>
         <w:rPr>
           <w:rFonts w:ascii="Times New Roman" w:hAnsi="Times New Roman"/>
@@ -14052,7 +14059,7 @@
         <w:pStyle w:val="Heading2"/>
         <w:outlineLvl w:val="1"/>
       </w:pPr>
-      <w:bookmarkStart w:id="22" w:name="_Toc240642907"/>
+      <w:bookmarkStart w:id="22" w:name="_Toc240917125"/>
       <w:r>
         <w:rPr>
           <w:rFonts w:ascii="Times New Roman" w:hAnsi="Times New Roman"/>
@@ -14069,7 +14076,7 @@
         <w:pStyle w:val="Heading3"/>
         <w:outlineLvl w:val="2"/>
       </w:pPr>
-      <w:bookmarkStart w:id="23" w:name="_Toc240642908"/>
+      <w:bookmarkStart w:id="23" w:name="_Toc240917126"/>
       <w:r>
         <w:rPr>
           <w:rFonts w:ascii="Times New Roman" w:hAnsi="Times New Roman"/>
@@ -14205,7 +14212,7 @@
         <w:pStyle w:val="Heading3"/>
         <w:outlineLvl w:val="2"/>
       </w:pPr>
-      <w:bookmarkStart w:id="24" w:name="_Toc240642909"/>
+      <w:bookmarkStart w:id="24" w:name="_Toc240917127"/>
       <w:r>
         <w:rPr>
           <w:rFonts w:ascii="Times New Roman" w:hAnsi="Times New Roman"/>
@@ -14358,7 +14365,7 @@
         <w:pStyle w:val="Heading3"/>
         <w:outlineLvl w:val="2"/>
       </w:pPr>
-      <w:bookmarkStart w:id="25" w:name="_Toc240642910"/>
+      <w:bookmarkStart w:id="25" w:name="_Toc240917128"/>
       <w:r>
         <w:rPr>
           <w:rFonts w:ascii="Times New Roman" w:hAnsi="Times New Roman"/>
@@ -14545,7 +14552,7 @@
         <w:pStyle w:val="Heading3"/>
         <w:outlineLvl w:val="2"/>
       </w:pPr>
-      <w:bookmarkStart w:id="26" w:name="_Toc240642911"/>
+      <w:bookmarkStart w:id="26" w:name="_Toc240917129"/>
       <w:r>
         <w:rPr>
           <w:rFonts w:ascii="Times New Roman" w:hAnsi="Times New Roman"/>
@@ -14789,7 +14796,7 @@
         <w:pStyle w:val="Heading3"/>
         <w:outlineLvl w:val="2"/>
       </w:pPr>
-      <w:bookmarkStart w:id="27" w:name="_Toc240642912"/>
+      <w:bookmarkStart w:id="27" w:name="_Toc240917130"/>
       <w:r>
         <w:rPr>
           <w:rFonts w:ascii="Times New Roman" w:hAnsi="Times New Roman"/>
@@ -14984,7 +14991,7 @@
         <w:pStyle w:val="Heading2"/>
         <w:outlineLvl w:val="1"/>
       </w:pPr>
-      <w:bookmarkStart w:id="28" w:name="_Toc240642913"/>
+      <w:bookmarkStart w:id="28" w:name="_Toc240917131"/>
       <w:r>
         <w:rPr>
           <w:rFonts w:ascii="Times New Roman" w:hAnsi="Times New Roman"/>
@@ -16596,7 +16603,7 @@
         <w:pStyle w:val="Heading2"/>
         <w:outlineLvl w:val="1"/>
       </w:pPr>
-      <w:bookmarkStart w:id="30" w:name="_Toc240642914"/>
+      <w:bookmarkStart w:id="30" w:name="_Toc240917132"/>
       <w:r>
         <w:rPr>
           <w:rFonts w:ascii="Times New Roman" w:hAnsi="Times New Roman"/>
@@ -16614,7 +16621,7 @@
         <w:pStyle w:val="Heading3"/>
         <w:outlineLvl w:val="2"/>
       </w:pPr>
-      <w:bookmarkStart w:id="31" w:name="_Toc240642915"/>
+      <w:bookmarkStart w:id="31" w:name="_Toc240917133"/>
       <w:r>
         <w:rPr>
           <w:rFonts w:ascii="Times New Roman" w:hAnsi="Times New Roman"/>
@@ -16897,7 +16904,7 @@
         <w:pStyle w:val="Heading3"/>
         <w:outlineLvl w:val="2"/>
       </w:pPr>
-      <w:bookmarkStart w:id="32" w:name="_Toc240642916"/>
+      <w:bookmarkStart w:id="32" w:name="_Toc240917134"/>
       <w:r>
         <w:rPr>
           <w:rFonts w:ascii="Times New Roman" w:hAnsi="Times New Roman"/>
@@ -17339,7 +17346,7 @@
         <w:pStyle w:val="Heading3"/>
         <w:outlineLvl w:val="2"/>
       </w:pPr>
-      <w:bookmarkStart w:id="33" w:name="_Toc240642917"/>
+      <w:bookmarkStart w:id="33" w:name="_Toc240917135"/>
       <w:r>
         <w:rPr>
           <w:rFonts w:ascii="Times New Roman" w:hAnsi="Times New Roman"/>
@@ -17746,7 +17753,7 @@
         <w:pStyle w:val="Heading3"/>
         <w:outlineLvl w:val="2"/>
       </w:pPr>
-      <w:bookmarkStart w:id="34" w:name="_Toc240642918"/>
+      <w:bookmarkStart w:id="34" w:name="_Toc240917136"/>
       <w:r>
         <w:rPr>
           <w:rFonts w:ascii="Times New Roman" w:hAnsi="Times New Roman"/>
@@ -17934,7 +17941,20 @@
         <w:rPr>
           <w:rFonts w:cs="Times New Roman"/>
         </w:rPr>
-        <w:t>) motivasi hedonis terhadap pembelian impulsif (\frac{</w:t>
+        <w:t>) motivasi hedonis terhadap pembelian impulsif (∂Y/∂X₁</w:t>
+      </w:r>
+      <w:r>
+        <w:rPr>
+          <w:rFonts w:cs="Times New Roman"/>
+          <w:i/>
+        </w:rPr>
+        <w:t xml:space="preserve"> = β₁ + β₅M</w:t>
+      </w:r>
+      <w:r>
+        <w:rPr>
+          <w:rFonts w:cs="Times New Roman"/>
+        </w:rPr>
+        <w:t>) akan semakin melemah atau teredam seiring dengan meningkatnya kontrol diri individu.</w:t>
       </w:r>
     </w:p>
     <w:p>
@@ -17946,8 +17966,124 @@
       <w:r>
         <w:rPr>
           <w:rFonts w:cs="Times New Roman"/>
-        </w:rPr>
-        <w:t>tial Y}{</w:t>
+          <w:b/>
+        </w:rPr>
+        <w:t>Kajian Empiris Terdahulu:</w:t>
+      </w:r>
+      <w:r>
+        <w:rPr>
+          <w:rFonts w:cs="Times New Roman"/>
+        </w:rPr>
+        <w:t xml:space="preserve"> Bukti moderasi langsung berasal dari </w:t>
+      </w:r>
+      <w:hyperlink w:anchor="Ref_lienardy2026role" w:history="1">
+        <w:r>
+          <w:t>Lienardy dan Panasea (2026)</w:t>
+        </w:r>
+      </w:hyperlink>
+      <w:r>
+        <w:rPr>
+          <w:rFonts w:cs="Times New Roman"/>
+        </w:rPr>
+        <w:t xml:space="preserve"> yang membuktikan melalui MRA bahwa </w:t>
+      </w:r>
+      <w:r>
+        <w:rPr>
+          <w:rFonts w:cs="Times New Roman"/>
+          <w:i/>
+        </w:rPr>
+        <w:t>Self-Control</w:t>
+      </w:r>
+      <w:r>
+        <w:rPr>
+          <w:rFonts w:cs="Times New Roman"/>
+        </w:rPr>
+        <w:t xml:space="preserve"> secara signifikan memoderasi dan memperlemah pengaruh perilaku hedonis terhadap </w:t>
+      </w:r>
+      <w:r>
+        <w:rPr>
+          <w:rFonts w:cs="Times New Roman"/>
+          <w:i/>
+        </w:rPr>
+        <w:t>impulsive buying</w:t>
+      </w:r>
+      <w:r>
+        <w:rPr>
+          <w:rFonts w:cs="Times New Roman"/>
+        </w:rPr>
+        <w:t xml:space="preserve"> (H4 diterima; n=160 konsumen Shopee Denpasar). Dukungan tak langsung datang dari </w:t>
+      </w:r>
+      <w:hyperlink w:anchor="Ref_katauke2023financial" w:history="1">
+        <w:r>
+          <w:t xml:space="preserve">Katauke </w:t>
+        </w:r>
+        <w:r>
+          <w:rPr>
+            <w:rFonts w:cs="Times New Roman"/>
+            <w:i/>
+          </w:rPr>
+          <w:t>et al.</w:t>
+        </w:r>
+        <w:r>
+          <w:rPr>
+            <w:rFonts w:cs="Times New Roman"/>
+          </w:rPr>
+          <w:t xml:space="preserve"> (2023)</w:t>
+        </w:r>
+      </w:hyperlink>
+      <w:r>
+        <w:rPr>
+          <w:rFonts w:cs="Times New Roman"/>
+        </w:rPr>
+        <w:t xml:space="preserve"> bahwa kapasitas literasi finansial (proksi pengambilan keputusan rasional) berhubungan negatif dengan impulsivitas diskonto hiperbolik. Sebaliknya, </w:t>
+      </w:r>
+      <w:hyperlink w:anchor="Ref_apidana2022peran" w:history="1">
+        <w:r>
+          <w:t>Apidana dan Kholifah (2022)</w:t>
+        </w:r>
+      </w:hyperlink>
+      <w:r>
+        <w:rPr>
+          <w:rFonts w:cs="Times New Roman"/>
+        </w:rPr>
+        <w:t xml:space="preserve"> justru menemukan interaksi </w:t>
+      </w:r>
+      <w:r>
+        <w:rPr>
+          <w:rFonts w:cs="Times New Roman"/>
+          <w:i/>
+        </w:rPr>
+        <w:t>X</w:t>
+      </w:r>
+      <w:r>
+        <w:rPr>
+          <w:rFonts w:cs="Times New Roman"/>
+        </w:rPr>
+        <w:t xml:space="preserve">₁ · </w:t>
+      </w:r>
+      <w:r>
+        <w:rPr>
+          <w:rFonts w:cs="Times New Roman"/>
+          <w:i/>
+        </w:rPr>
+        <w:t>M</w:t>
+      </w:r>
+      <w:r>
+        <w:rPr>
+          <w:rFonts w:cs="Times New Roman"/>
+        </w:rPr>
+        <w:t xml:space="preserve"> TIDAK signifikan (p=0,597; H3 ditolak) dan </w:t>
+      </w:r>
+      <w:hyperlink w:anchor="Ref_artadita2024how" w:history="1">
+        <w:r>
+          <w:t>Artadita dan Firmialy (2024)</w:t>
+        </w:r>
+      </w:hyperlink>
+      <w:r>
+        <w:rPr>
+          <w:rFonts w:cs="Times New Roman"/>
+        </w:rPr>
+        <w:t xml:space="preserve"> menemukan efek moderasi TIDAK signifikan (β=0{,}092, n.s.) — keduanya dicatat sebagai bukti gagal-moderasi pada Subjek 5B, bukan pendukung H4.</w:t>
       </w:r>
     </w:p>
     <w:p>
@@ -17959,21 +18095,15 @@
       <w:r>
         <w:rPr>
           <w:rFonts w:cs="Times New Roman"/>
-        </w:rPr>
-        <w:t>tial X_1^</w:t>
-      </w:r>
-      <w:r>
-        <w:rPr>
-          <w:rFonts w:cs="Times New Roman"/>
-          <w:i/>
-        </w:rPr>
-        <w:t>} = β₁ + β₅ M^</w:t>
-      </w:r>
-      <w:r>
-        <w:rPr>
-          <w:rFonts w:cs="Times New Roman"/>
-        </w:rPr>
-        <w:t>) akan semakin melemah atau teredam seiring dengan meningkatnya kontrol diri individu.</w:t>
+          <w:b/>
+        </w:rPr>
+        <w:t>Keterkaitan dengan Objek (Pokémon TCG):</w:t>
+      </w:r>
+      <w:r>
+        <w:rPr>
+          <w:rFonts w:cs="Times New Roman"/>
+        </w:rPr>
+        <w:t xml:space="preserve"> Saat melihat pajangan kartu di minimarket dan timbul dorongan kesenangan membuka kemasan, pembeli dengan kontrol diri tinggi mampu mengaktifkan rem kognitifnya, menolak godaan sesaat, dan mematuhi batas anggaran. Akibatnya, kontrol diri memperlemah pengaruh motivasi hedonis terhadap pembelian impulsif.</w:t>
       </w:r>
     </w:p>
     <w:p>
@@ -17987,28 +18117,13 @@
           <w:rFonts w:cs="Times New Roman"/>
           <w:b/>
         </w:rPr>
-        <w:t>Kajian Empiris Terdahulu:</w:t>
-      </w:r>
-      <w:r>
-        <w:rPr>
-          <w:rFonts w:cs="Times New Roman"/>
-        </w:rPr>
-        <w:t xml:space="preserve"> Bukti moderasi langsung berasal dari </w:t>
-      </w:r>
-      <w:hyperlink w:anchor="Ref_lienardy2026role" w:history="1">
-        <w:r>
-          <w:t>Lienardy dan Panasea (2026)</w:t>
-        </w:r>
-      </w:hyperlink>
-      <w:r>
-        <w:rPr>
-          <w:rFonts w:cs="Times New Roman"/>
-        </w:rPr>
-        <w:t xml:space="preserve"> yang membuktikan melalui MRA bahwa </w:t>
-      </w:r>
-      <w:r>
-        <w:rPr>
-          <w:rFonts w:cs="Times New Roman"/>
+        <w:lastRenderedPageBreak/>
+        <w:t xml:space="preserve">H4: </w:t>
+      </w:r>
+      <w:r>
+        <w:rPr>
+          <w:rFonts w:cs="Times New Roman"/>
+          <w:b/>
           <w:i/>
         </w:rPr>
         <w:t>Self-Control</w:t>
@@ -18016,94 +18131,120 @@
       <w:r>
         <w:rPr>
           <w:rFonts w:cs="Times New Roman"/>
-        </w:rPr>
-        <w:t xml:space="preserve"> secara signifikan memoderasi dan memperlemah pengaruh perilaku hedonis terhadap </w:t>
-      </w:r>
-      <w:r>
-        <w:rPr>
-          <w:rFonts w:cs="Times New Roman"/>
-          <w:i/>
-        </w:rPr>
-        <w:t>impulsive buying</w:t>
-      </w:r>
-      <w:r>
-        <w:rPr>
-          <w:rFonts w:cs="Times New Roman"/>
-        </w:rPr>
-        <w:t xml:space="preserve"> (H4 diterima; n=160 konsumen Shopee Denpasar). Dukungan tak langsung datang dari </w:t>
-      </w:r>
-      <w:hyperlink w:anchor="Ref_katauke2023financial" w:history="1">
-        <w:r>
-          <w:t xml:space="preserve">Katauke </w:t>
-        </w:r>
-        <w:r>
-          <w:rPr>
-            <w:rFonts w:cs="Times New Roman"/>
-            <w:i/>
-          </w:rPr>
-          <w:t>et al.</w:t>
-        </w:r>
-        <w:r>
-          <w:rPr>
-            <w:rFonts w:cs="Times New Roman"/>
-          </w:rPr>
-          <w:t xml:space="preserve"> (2023)</w:t>
-        </w:r>
-      </w:hyperlink>
-      <w:r>
-        <w:rPr>
-          <w:rFonts w:cs="Times New Roman"/>
-        </w:rPr>
-        <w:t xml:space="preserve"> bahwa kapasitas literasi finansial (proksi pengambilan keputusan rasional) berhubungan negatif dengan impulsivitas diskonto hiperbolik. Sebaliknya, </w:t>
-      </w:r>
-      <w:hyperlink w:anchor="Ref_apidana2022peran" w:history="1">
-        <w:r>
-          <w:t>Apidana dan Kholifah (2022)</w:t>
-        </w:r>
-      </w:hyperlink>
-      <w:r>
-        <w:rPr>
-          <w:rFonts w:cs="Times New Roman"/>
-        </w:rPr>
-        <w:t xml:space="preserve"> justru menemukan interaksi </w:t>
-      </w:r>
-      <w:r>
-        <w:rPr>
-          <w:rFonts w:cs="Times New Roman"/>
-          <w:i/>
-        </w:rPr>
-        <w:t>X</w:t>
-      </w:r>
-      <w:r>
-        <w:rPr>
-          <w:rFonts w:cs="Times New Roman"/>
-        </w:rPr>
-        <w:t xml:space="preserve">₁ · </w:t>
-      </w:r>
-      <w:r>
-        <w:rPr>
-          <w:rFonts w:cs="Times New Roman"/>
-          <w:i/>
-        </w:rPr>
-        <w:t>M</w:t>
-      </w:r>
-      <w:r>
-        <w:rPr>
-          <w:rFonts w:cs="Times New Roman"/>
-        </w:rPr>
-        <w:t xml:space="preserve"> TIDAK signifikan (p=0,597; H3 ditolak) dan </w:t>
-      </w:r>
-      <w:hyperlink w:anchor="Ref_artadita2024how" w:history="1">
-        <w:r>
-          <w:t>Artadita dan Firmialy (2024)</w:t>
-        </w:r>
-      </w:hyperlink>
-      <w:r>
-        <w:rPr>
-          <w:rFonts w:cs="Times New Roman"/>
-        </w:rPr>
-        <w:t xml:space="preserve"> menemukan efek moderasi TIDAK signifikan (β=0{,}092, n.s.) — keduanya dicatat sebagai bukti gagal-moderasi pada Subjek 5B, bukan pendukung H4.</w:t>
-      </w:r>
+          <w:b/>
+        </w:rPr>
+        <w:t xml:space="preserve"> memoderasi (memperlemah) pengaruh </w:t>
+      </w:r>
+      <w:r>
+        <w:rPr>
+          <w:rFonts w:cs="Times New Roman"/>
+          <w:b/>
+          <w:i/>
+        </w:rPr>
+        <w:t>Hedonic Motivation</w:t>
+      </w:r>
+      <w:r>
+        <w:rPr>
+          <w:rFonts w:cs="Times New Roman"/>
+          <w:b/>
+        </w:rPr>
+        <w:t xml:space="preserve"> terhadap </w:t>
+      </w:r>
+      <w:r>
+        <w:rPr>
+          <w:rFonts w:cs="Times New Roman"/>
+          <w:b/>
+          <w:i/>
+        </w:rPr>
+        <w:t>Impulsive Buying</w:t>
+      </w:r>
+      <w:r>
+        <w:rPr>
+          <w:rFonts w:cs="Times New Roman"/>
+          <w:b/>
+        </w:rPr>
+        <w:t xml:space="preserve"> </w:t>
+      </w:r>
+      <w:r>
+        <w:rPr>
+          <w:rFonts w:cs="Times New Roman"/>
+          <w:b/>
+          <w:i/>
+        </w:rPr>
+        <w:t>booster pack</w:t>
+      </w:r>
+      <w:r>
+        <w:rPr>
+          <w:rFonts w:cs="Times New Roman"/>
+          <w:b/>
+        </w:rPr>
+        <w:t xml:space="preserve"> kartu Pokémon TCG.</w:t>
+      </w:r>
+    </w:p>
+    <w:p>
+      <w:pPr>
+        <w:pStyle w:val="Heading3"/>
+        <w:outlineLvl w:val="2"/>
+      </w:pPr>
+      <w:bookmarkStart w:id="35" w:name="_Toc240917137"/>
+      <w:r>
+        <w:rPr>
+          <w:rFonts w:ascii="Times New Roman" w:hAnsi="Times New Roman"/>
+          <w:b/>
+          <w:color w:val="000000"/>
+          <w:sz w:val="24"/>
+        </w:rPr>
+        <w:t xml:space="preserve">2.4.5 Pengaruh Moderasi </w:t>
+      </w:r>
+      <w:r>
+        <w:rPr>
+          <w:rFonts w:ascii="Times New Roman" w:hAnsi="Times New Roman"/>
+          <w:b/>
+          <w:i/>
+          <w:color w:val="000000"/>
+          <w:sz w:val="24"/>
+        </w:rPr>
+        <w:t>Self-Control</w:t>
+      </w:r>
+      <w:r>
+        <w:rPr>
+          <w:rFonts w:ascii="Times New Roman" w:hAnsi="Times New Roman"/>
+          <w:b/>
+          <w:color w:val="000000"/>
+          <w:sz w:val="24"/>
+        </w:rPr>
+        <w:t xml:space="preserve"> terhadap Hubungan </w:t>
+      </w:r>
+      <w:r>
+        <w:rPr>
+          <w:rFonts w:ascii="Times New Roman" w:hAnsi="Times New Roman"/>
+          <w:b/>
+          <w:i/>
+          <w:color w:val="000000"/>
+          <w:sz w:val="24"/>
+        </w:rPr>
+        <w:t>Desire for Completeness</w:t>
+      </w:r>
+      <w:r>
+        <w:rPr>
+          <w:rFonts w:ascii="Times New Roman" w:hAnsi="Times New Roman"/>
+          <w:b/>
+          <w:color w:val="000000"/>
+          <w:sz w:val="24"/>
+        </w:rPr>
+        <w:t xml:space="preserve"> dan </w:t>
+      </w:r>
+      <w:r>
+        <w:rPr>
+          <w:rFonts w:ascii="Times New Roman" w:hAnsi="Times New Roman"/>
+          <w:b/>
+          <w:i/>
+          <w:color w:val="000000"/>
+          <w:sz w:val="24"/>
+        </w:rPr>
+        <w:t>Impulsive Buying</w:t>
+      </w:r>
+      <w:bookmarkEnd w:id="35"/>
     </w:p>
     <w:p>
       <w:pPr>
@@ -18116,20 +18257,87 @@
           <w:rFonts w:cs="Times New Roman"/>
           <w:b/>
         </w:rPr>
-        <w:t>Keterkaitan dengan Objek (Pokémon TCG):</w:t>
-      </w:r>
-      <w:r>
-        <w:rPr>
-          <w:rFonts w:cs="Times New Roman"/>
-        </w:rPr>
-        <w:t xml:space="preserve"> Saat melihat pajangan kartu di minimarket dan timbul dorongan kesenangan membuka kemasan, pembeli dengan kontrol diri tinggi mampu mengaktifkan rem kognitifnya, </w:t>
-      </w:r>
-      <w:r>
-        <w:rPr>
-          <w:rFonts w:cs="Times New Roman"/>
-        </w:rPr>
-        <w:lastRenderedPageBreak/>
-        <w:t>menolak godaan sesaat, dan mematuhi batas anggaran. Akibatnya, kontrol diri memperlemah pengaruh motivasi hedonis terhadap pembelian impulsif.</w:t>
+        <w:t>Landasan Teoretis:</w:t>
+      </w:r>
+      <w:r>
+        <w:rPr>
+          <w:rFonts w:cs="Times New Roman"/>
+        </w:rPr>
+        <w:t xml:space="preserve"> Respon terhadap ketegangan kognitif celah koleksi (</w:t>
+      </w:r>
+      <w:r>
+        <w:rPr>
+          <w:rFonts w:cs="Times New Roman"/>
+          <w:i/>
+        </w:rPr>
+        <w:t>Zeigarnik Effect</w:t>
+      </w:r>
+      <w:r>
+        <w:rPr>
+          <w:rFonts w:cs="Times New Roman"/>
+        </w:rPr>
+        <w:t>) dimoderasi oleh kapasitas regulasi diri individu. Seseorang dengan kontrol diri matang mampu mentoleransi ketidaknyamanan mental tanpa meresponnya secara reaktif atau tergesa-gesa (</w:t>
+      </w:r>
+      <w:hyperlink w:anchor="Ref_tangney2004high" w:history="1">
+        <w:r>
+          <w:t xml:space="preserve">Tangney </w:t>
+        </w:r>
+        <w:r>
+          <w:rPr>
+            <w:rFonts w:cs="Times New Roman"/>
+            <w:i/>
+          </w:rPr>
+          <w:t>et al.</w:t>
+        </w:r>
+        <w:r>
+          <w:rPr>
+            <w:rFonts w:cs="Times New Roman"/>
+          </w:rPr>
+          <w:t>, 2004</w:t>
+        </w:r>
+      </w:hyperlink>
+      <w:r>
+        <w:rPr>
+          <w:rFonts w:cs="Times New Roman"/>
+        </w:rPr>
+        <w:t xml:space="preserve">; </w:t>
+      </w:r>
+      <w:hyperlink w:anchor="Ref_baumeister2002yield" w:history="1">
+        <w:r>
+          <w:t>Baumeister, 2002</w:t>
+        </w:r>
+      </w:hyperlink>
+      <w:r>
+        <w:rPr>
+          <w:rFonts w:cs="Times New Roman"/>
+        </w:rPr>
+        <w:t>). Secara matematis, efek interaksi negatif (β₆ &lt; 0) menunjukkan kontrol diri yang tinggi menghasilkan kemiringan bersyarat (∂Y/∂X₂</w:t>
+      </w:r>
+      <w:r>
+        <w:rPr>
+          <w:rFonts w:cs="Times New Roman"/>
+          <w:i/>
+        </w:rPr>
+        <w:t xml:space="preserve"> = β₂ + β₆M</w:t>
+      </w:r>
+      <w:r>
+        <w:rPr>
+          <w:rFonts w:cs="Times New Roman"/>
+        </w:rPr>
+        <w:t>) yang lebih landai, sejalan dengan dugaan efek peredaman (</w:t>
+      </w:r>
+      <w:r>
+        <w:rPr>
+          <w:rFonts w:cs="Times New Roman"/>
+          <w:i/>
+        </w:rPr>
+        <w:t>buffering effect</w:t>
+      </w:r>
+      <w:r>
+        <w:rPr>
+          <w:rFonts w:cs="Times New Roman"/>
+        </w:rPr>
+        <w:t>) terhadap dorongan menuntaskan koleksi.</w:t>
       </w:r>
     </w:p>
     <w:p>
@@ -18143,133 +18351,125 @@
           <w:rFonts w:cs="Times New Roman"/>
           <w:b/>
         </w:rPr>
-        <w:t xml:space="preserve">H4: </w:t>
-      </w:r>
-      <w:r>
-        <w:rPr>
-          <w:rFonts w:cs="Times New Roman"/>
-          <w:b/>
-          <w:i/>
-        </w:rPr>
-        <w:t>Self-Control</w:t>
-      </w:r>
-      <w:r>
-        <w:rPr>
-          <w:rFonts w:cs="Times New Roman"/>
-          <w:b/>
-        </w:rPr>
-        <w:t xml:space="preserve"> memoderasi (memperlemah) pengaruh </w:t>
-      </w:r>
-      <w:r>
-        <w:rPr>
-          <w:rFonts w:cs="Times New Roman"/>
-          <w:b/>
-          <w:i/>
-        </w:rPr>
-        <w:t>Hedonic Motivation</w:t>
-      </w:r>
-      <w:r>
-        <w:rPr>
-          <w:rFonts w:cs="Times New Roman"/>
-          <w:b/>
-        </w:rPr>
-        <w:t xml:space="preserve"> terhadap </w:t>
-      </w:r>
-      <w:r>
-        <w:rPr>
-          <w:rFonts w:cs="Times New Roman"/>
-          <w:b/>
-          <w:i/>
-        </w:rPr>
-        <w:t>Impulsive Buying</w:t>
-      </w:r>
-      <w:r>
-        <w:rPr>
-          <w:rFonts w:cs="Times New Roman"/>
-          <w:b/>
-        </w:rPr>
-        <w:t xml:space="preserve"> </w:t>
-      </w:r>
-      <w:r>
-        <w:rPr>
-          <w:rFonts w:cs="Times New Roman"/>
-          <w:b/>
-          <w:i/>
-        </w:rPr>
-        <w:t>booster pack</w:t>
-      </w:r>
-      <w:r>
-        <w:rPr>
-          <w:rFonts w:cs="Times New Roman"/>
-          <w:b/>
-        </w:rPr>
-        <w:t xml:space="preserve"> kartu Pokémon TCG.</w:t>
-      </w:r>
-    </w:p>
-    <w:p>
-      <w:pPr>
-        <w:pStyle w:val="Heading3"/>
-        <w:outlineLvl w:val="2"/>
-      </w:pPr>
-      <w:bookmarkStart w:id="35" w:name="_Toc240642919"/>
-      <w:r>
-        <w:rPr>
-          <w:rFonts w:ascii="Times New Roman" w:hAnsi="Times New Roman"/>
-          <w:b/>
-          <w:color w:val="000000"/>
-          <w:sz w:val="24"/>
-        </w:rPr>
-        <w:t xml:space="preserve">2.4.5 Pengaruh Moderasi </w:t>
-      </w:r>
-      <w:r>
-        <w:rPr>
-          <w:rFonts w:ascii="Times New Roman" w:hAnsi="Times New Roman"/>
-          <w:b/>
-          <w:i/>
-          <w:color w:val="000000"/>
-          <w:sz w:val="24"/>
-        </w:rPr>
-        <w:t>Self-Control</w:t>
-      </w:r>
-      <w:r>
-        <w:rPr>
-          <w:rFonts w:ascii="Times New Roman" w:hAnsi="Times New Roman"/>
-          <w:b/>
-          <w:color w:val="000000"/>
-          <w:sz w:val="24"/>
-        </w:rPr>
-        <w:t xml:space="preserve"> terhadap Hubungan </w:t>
-      </w:r>
-      <w:r>
-        <w:rPr>
-          <w:rFonts w:ascii="Times New Roman" w:hAnsi="Times New Roman"/>
-          <w:b/>
-          <w:i/>
-          <w:color w:val="000000"/>
-          <w:sz w:val="24"/>
-        </w:rPr>
-        <w:t>Desire for Completeness</w:t>
-      </w:r>
-      <w:r>
-        <w:rPr>
-          <w:rFonts w:ascii="Times New Roman" w:hAnsi="Times New Roman"/>
-          <w:b/>
-          <w:color w:val="000000"/>
-          <w:sz w:val="24"/>
-        </w:rPr>
-        <w:t xml:space="preserve"> dan </w:t>
-      </w:r>
-      <w:r>
-        <w:rPr>
-          <w:rFonts w:ascii="Times New Roman" w:hAnsi="Times New Roman"/>
-          <w:b/>
-          <w:i/>
-          <w:color w:val="000000"/>
-          <w:sz w:val="24"/>
-        </w:rPr>
-        <w:t>Impulsive Buying</w:t>
-      </w:r>
-      <w:bookmarkEnd w:id="35"/>
+        <w:t>Kajian Empiris Terdahulu:</w:t>
+      </w:r>
+      <w:r>
+        <w:rPr>
+          <w:rFonts w:cs="Times New Roman"/>
+        </w:rPr>
+        <w:t xml:space="preserve"> Uji interaksi </w:t>
+      </w:r>
+      <w:r>
+        <w:rPr>
+          <w:rFonts w:cs="Times New Roman"/>
+          <w:i/>
+        </w:rPr>
+        <w:t>X</w:t>
+      </w:r>
+      <w:r>
+        <w:rPr>
+          <w:rFonts w:cs="Times New Roman"/>
+        </w:rPr>
+        <w:t xml:space="preserve">₂ · </w:t>
+      </w:r>
+      <w:r>
+        <w:rPr>
+          <w:rFonts w:cs="Times New Roman"/>
+          <w:i/>
+        </w:rPr>
+        <w:t>M</w:t>
+      </w:r>
+      <w:r>
+        <w:rPr>
+          <w:rFonts w:cs="Times New Roman"/>
+        </w:rPr>
+        <w:t xml:space="preserve"> secara langsung belum tersedia dalam korpus; dukungan bersifat tak langsung dan dinyatakan eksplisit sebagai demikian. Bukti parsial terdekat berasal dari </w:t>
+      </w:r>
+      <w:hyperlink w:anchor="Ref_artadita2024how" w:history="1">
+        <w:r>
+          <w:t>Artadita dan Firmialy (2024)</w:t>
+        </w:r>
+      </w:hyperlink>
+      <w:r>
+        <w:rPr>
+          <w:rFonts w:cs="Times New Roman"/>
+        </w:rPr>
+        <w:t xml:space="preserve">: hanya dimensi kontrol kognitif yang signifikan melemahkan impulsivitas koleksi item game (-0{,}3473, p&lt;0{,}10 pada Model 3), sementara efek moderasi keseluruhan DITOLAK (β=0{,}092, n.s.). Dukungan umum datang dari </w:t>
+      </w:r>
+      <w:hyperlink w:anchor="Ref_katauke2023financial" w:history="1">
+        <w:r>
+          <w:t xml:space="preserve">Katauke </w:t>
+        </w:r>
+        <w:r>
+          <w:rPr>
+            <w:rFonts w:cs="Times New Roman"/>
+            <w:i/>
+          </w:rPr>
+          <w:t>et al.</w:t>
+        </w:r>
+        <w:r>
+          <w:rPr>
+            <w:rFonts w:cs="Times New Roman"/>
+          </w:rPr>
+          <w:t xml:space="preserve"> (2023)</w:t>
+        </w:r>
+      </w:hyperlink>
+      <w:r>
+        <w:rPr>
+          <w:rFonts w:cs="Times New Roman"/>
+        </w:rPr>
+        <w:t xml:space="preserve"> bahwa kapasitas regulasi (literasi finansial) menekan impulsivitas, serta bukti MRA </w:t>
+      </w:r>
+      <w:hyperlink w:anchor="Ref_apidana2022peran" w:history="1">
+        <w:r>
+          <w:t>Apidana dan Kholifah (2022)</w:t>
+        </w:r>
+      </w:hyperlink>
+      <w:r>
+        <w:rPr>
+          <w:rFonts w:cs="Times New Roman"/>
+        </w:rPr>
+        <w:t xml:space="preserve"> bahwa kontrol diri memperlemah dorongan non-afektif (</w:t>
+      </w:r>
+      <w:r>
+        <w:rPr>
+          <w:rFonts w:cs="Times New Roman"/>
+          <w:i/>
+        </w:rPr>
+        <w:t>shopping lifestyle</w:t>
+      </w:r>
+      <w:r>
+        <w:rPr>
+          <w:rFonts w:cs="Times New Roman"/>
+        </w:rPr>
+        <w:t xml:space="preserve">, H4 diterima, β&lt;0) — keduanya analogi, bukan uji </w:t>
+      </w:r>
+      <w:r>
+        <w:rPr>
+          <w:rFonts w:cs="Times New Roman"/>
+          <w:i/>
+        </w:rPr>
+        <w:t>X</w:t>
+      </w:r>
+      <w:r>
+        <w:rPr>
+          <w:rFonts w:cs="Times New Roman"/>
+        </w:rPr>
+        <w:t xml:space="preserve">₂ · </w:t>
+      </w:r>
+      <w:r>
+        <w:rPr>
+          <w:rFonts w:cs="Times New Roman"/>
+          <w:i/>
+        </w:rPr>
+        <w:t>M</w:t>
+      </w:r>
+      <w:r>
+        <w:rPr>
+          <w:rFonts w:cs="Times New Roman"/>
+        </w:rPr>
+        <w:t>.</w:t>
+      </w:r>
     </w:p>
     <w:p>
       <w:pPr>
@@ -18282,61 +18482,39 @@
           <w:rFonts w:cs="Times New Roman"/>
           <w:b/>
         </w:rPr>
-        <w:t>Landasan Teoretis:</w:t>
-      </w:r>
-      <w:r>
-        <w:rPr>
-          <w:rFonts w:cs="Times New Roman"/>
-        </w:rPr>
-        <w:t xml:space="preserve"> Respon terhadap ketegangan kognitif celah koleksi (</w:t>
-      </w:r>
-      <w:r>
-        <w:rPr>
-          <w:rFonts w:cs="Times New Roman"/>
-          <w:i/>
-        </w:rPr>
-        <w:t>Zeigarnik Effect</w:t>
-      </w:r>
-      <w:r>
-        <w:rPr>
-          <w:rFonts w:cs="Times New Roman"/>
-        </w:rPr>
-        <w:t>) dimoderasi oleh kapasitas regulasi diri individu. Seseorang dengan kontrol diri matang mampu mentoleransi ketidaknyamanan mental tanpa meresponnya secara reaktif atau tergesa-gesa (</w:t>
-      </w:r>
-      <w:hyperlink w:anchor="Ref_tangney2004high" w:history="1">
-        <w:r>
-          <w:t xml:space="preserve">Tangney </w:t>
-        </w:r>
-        <w:r>
-          <w:rPr>
-            <w:rFonts w:cs="Times New Roman"/>
-            <w:i/>
-          </w:rPr>
-          <w:t>et al.</w:t>
-        </w:r>
-        <w:r>
-          <w:rPr>
-            <w:rFonts w:cs="Times New Roman"/>
-          </w:rPr>
-          <w:t>, 2004</w:t>
-        </w:r>
-      </w:hyperlink>
-      <w:r>
-        <w:rPr>
-          <w:rFonts w:cs="Times New Roman"/>
-        </w:rPr>
-        <w:t xml:space="preserve">; </w:t>
-      </w:r>
-      <w:hyperlink w:anchor="Ref_baumeister2002yield" w:history="1">
-        <w:r>
-          <w:t>Baumeister, 2002</w:t>
-        </w:r>
-      </w:hyperlink>
-      <w:r>
-        <w:rPr>
-          <w:rFonts w:cs="Times New Roman"/>
-        </w:rPr>
-        <w:t>). Secara matematis, efek interaksi negatif (β₆ &lt; 0) menunjukkan kontrol diri yang tinggi menghasilkan kemiringan bersyarat (\frac{</w:t>
+        <w:t>Keterkaitan dengan Objek (Pokémon TCG):</w:t>
+      </w:r>
+      <w:r>
+        <w:rPr>
+          <w:rFonts w:cs="Times New Roman"/>
+        </w:rPr>
+        <w:t xml:space="preserve"> Kolektor yang memiliki kontrol diri tinggi menyadari bahwa membeli </w:t>
+      </w:r>
+      <w:r>
+        <w:rPr>
+          <w:rFonts w:cs="Times New Roman"/>
+          <w:i/>
+        </w:rPr>
+        <w:t>pack</w:t>
+      </w:r>
+      <w:r>
+        <w:rPr>
+          <w:rFonts w:cs="Times New Roman"/>
+        </w:rPr>
+        <w:t xml:space="preserve"> acak demi mencari satu kartu spesifik yang hilang memiliki probabilitas sangat kecil dan boros biaya. Kontrol diri memampukan kolektor menahan diri dari belanja impulsif dan memilih membeli kartu lepasan (</w:t>
+      </w:r>
+      <w:r>
+        <w:rPr>
+          <w:rFonts w:cs="Times New Roman"/>
+          <w:i/>
+        </w:rPr>
+        <w:t>singles</w:t>
+      </w:r>
+      <w:r>
+        <w:rPr>
+          <w:rFonts w:cs="Times New Roman"/>
+        </w:rPr>
+        <w:t>) di pasar sekunder secara terencana. Akibatnya, kontrol diri memperlemah pengaruh hasrat kelengkapan terhadap pembelian impulsif.</w:t>
       </w:r>
     </w:p>
     <w:p>
@@ -18348,9 +18526,136 @@
       <w:r>
         <w:rPr>
           <w:rFonts w:cs="Times New Roman"/>
-        </w:rPr>
-        <w:t>tial Y}{</w:t>
-      </w:r>
+          <w:b/>
+        </w:rPr>
+        <w:t xml:space="preserve">H5: </w:t>
+      </w:r>
+      <w:r>
+        <w:rPr>
+          <w:rFonts w:cs="Times New Roman"/>
+          <w:b/>
+          <w:i/>
+        </w:rPr>
+        <w:t>Self-Control</w:t>
+      </w:r>
+      <w:r>
+        <w:rPr>
+          <w:rFonts w:cs="Times New Roman"/>
+          <w:b/>
+        </w:rPr>
+        <w:t xml:space="preserve"> memoderasi (memperlemah) pengaruh </w:t>
+      </w:r>
+      <w:r>
+        <w:rPr>
+          <w:rFonts w:cs="Times New Roman"/>
+          <w:b/>
+          <w:i/>
+        </w:rPr>
+        <w:t>Desire for Completeness</w:t>
+      </w:r>
+      <w:r>
+        <w:rPr>
+          <w:rFonts w:cs="Times New Roman"/>
+          <w:b/>
+        </w:rPr>
+        <w:t xml:space="preserve"> terhadap </w:t>
+      </w:r>
+      <w:r>
+        <w:rPr>
+          <w:rFonts w:cs="Times New Roman"/>
+          <w:b/>
+          <w:i/>
+        </w:rPr>
+        <w:t>Impulsive Buying</w:t>
+      </w:r>
+      <w:r>
+        <w:rPr>
+          <w:rFonts w:cs="Times New Roman"/>
+          <w:b/>
+        </w:rPr>
+        <w:t xml:space="preserve"> </w:t>
+      </w:r>
+      <w:r>
+        <w:rPr>
+          <w:rFonts w:cs="Times New Roman"/>
+          <w:b/>
+          <w:i/>
+        </w:rPr>
+        <w:t>booster pack</w:t>
+      </w:r>
+      <w:r>
+        <w:rPr>
+          <w:rFonts w:cs="Times New Roman"/>
+          <w:b/>
+        </w:rPr>
+        <w:t xml:space="preserve"> kartu Pokémon TCG.</w:t>
+      </w:r>
+    </w:p>
+    <w:p>
+      <w:pPr>
+        <w:pStyle w:val="Heading3"/>
+        <w:outlineLvl w:val="2"/>
+      </w:pPr>
+      <w:bookmarkStart w:id="36" w:name="_Toc240917138"/>
+      <w:r>
+        <w:rPr>
+          <w:rFonts w:ascii="Times New Roman" w:hAnsi="Times New Roman"/>
+          <w:b/>
+          <w:color w:val="000000"/>
+          <w:sz w:val="24"/>
+        </w:rPr>
+        <w:lastRenderedPageBreak/>
+        <w:t xml:space="preserve">2.4.6 Pengaruh Moderasi </w:t>
+      </w:r>
+      <w:r>
+        <w:rPr>
+          <w:rFonts w:ascii="Times New Roman" w:hAnsi="Times New Roman"/>
+          <w:b/>
+          <w:i/>
+          <w:color w:val="000000"/>
+          <w:sz w:val="24"/>
+        </w:rPr>
+        <w:t>Self-Control</w:t>
+      </w:r>
+      <w:r>
+        <w:rPr>
+          <w:rFonts w:ascii="Times New Roman" w:hAnsi="Times New Roman"/>
+          <w:b/>
+          <w:color w:val="000000"/>
+          <w:sz w:val="24"/>
+        </w:rPr>
+        <w:t xml:space="preserve"> terhadap Hubungan </w:t>
+      </w:r>
+      <w:r>
+        <w:rPr>
+          <w:rFonts w:ascii="Times New Roman" w:hAnsi="Times New Roman"/>
+          <w:b/>
+          <w:i/>
+          <w:color w:val="000000"/>
+          <w:sz w:val="24"/>
+        </w:rPr>
+        <w:t>Speculative Motive</w:t>
+      </w:r>
+      <w:r>
+        <w:rPr>
+          <w:rFonts w:ascii="Times New Roman" w:hAnsi="Times New Roman"/>
+          <w:b/>
+          <w:color w:val="000000"/>
+          <w:sz w:val="24"/>
+        </w:rPr>
+        <w:t xml:space="preserve"> dan </w:t>
+      </w:r>
+      <w:r>
+        <w:rPr>
+          <w:rFonts w:ascii="Times New Roman" w:hAnsi="Times New Roman"/>
+          <w:b/>
+          <w:i/>
+          <w:color w:val="000000"/>
+          <w:sz w:val="24"/>
+        </w:rPr>
+        <w:t>Impulsive Buying</w:t>
+      </w:r>
+      <w:bookmarkEnd w:id="36"/>
     </w:p>
     <w:p>
       <w:pPr>
@@ -18361,34 +18666,63 @@
       <w:r>
         <w:rPr>
           <w:rFonts w:cs="Times New Roman"/>
-        </w:rPr>
-        <w:t>tial X_2^</w:t>
-      </w:r>
-      <w:r>
-        <w:rPr>
-          <w:rFonts w:cs="Times New Roman"/>
-          <w:i/>
-        </w:rPr>
-        <w:t>} = β₂ + β₆ M^</w:t>
-      </w:r>
-      <w:r>
-        <w:rPr>
-          <w:rFonts w:cs="Times New Roman"/>
-        </w:rPr>
-        <w:t>) yang lebih landai, sejalan dengan dugaan efek peredaman (</w:t>
-      </w:r>
-      <w:r>
-        <w:rPr>
-          <w:rFonts w:cs="Times New Roman"/>
-          <w:i/>
-        </w:rPr>
-        <w:t>buffering effect</w:t>
-      </w:r>
-      <w:r>
-        <w:rPr>
-          <w:rFonts w:cs="Times New Roman"/>
-        </w:rPr>
-        <w:t>) terhadap dorongan menuntaskan koleksi.</w:t>
+          <w:b/>
+        </w:rPr>
+        <w:t>Landasan Teoretis:</w:t>
+      </w:r>
+      <w:r>
+        <w:rPr>
+          <w:rFonts w:cs="Times New Roman"/>
+        </w:rPr>
+        <w:t xml:space="preserve"> Dalam </w:t>
+      </w:r>
+      <w:r>
+        <w:rPr>
+          <w:rFonts w:cs="Times New Roman"/>
+          <w:i/>
+        </w:rPr>
+        <w:t>Behavioral Finance</w:t>
+      </w:r>
+      <w:r>
+        <w:rPr>
+          <w:rFonts w:cs="Times New Roman"/>
+        </w:rPr>
+        <w:t>, kontrol diri mendisiplinkan individu untuk menimbang risiko kerugian modal riil dan tidak terjebak dalam euforia transaksi spekulatif berlebihan (</w:t>
+      </w:r>
+      <w:hyperlink w:anchor="Ref_thaler1981economic" w:history="1">
+        <w:r>
+          <w:t>Thaler dan Shefrin, 1981</w:t>
+        </w:r>
+      </w:hyperlink>
+      <w:r>
+        <w:rPr>
+          <w:rFonts w:cs="Times New Roman"/>
+        </w:rPr>
+        <w:t xml:space="preserve">; </w:t>
+      </w:r>
+      <w:hyperlink w:anchor="Ref_barber2008all" w:history="1">
+        <w:r>
+          <w:t>Barber dan Odean, 2008</w:t>
+        </w:r>
+      </w:hyperlink>
+      <w:r>
+        <w:rPr>
+          <w:rFonts w:cs="Times New Roman"/>
+        </w:rPr>
+        <w:t>). Efek interaksi negatif (β₇ &lt; 0) menunjukkan pengaruh spekulasi terhadap pembelian spontan teredam secara bersyarat (∂Y/∂X₃</w:t>
+      </w:r>
+      <w:r>
+        <w:rPr>
+          <w:rFonts w:cs="Times New Roman"/>
+          <w:i/>
+        </w:rPr>
+        <w:t xml:space="preserve"> = β₃ + β₇M</w:t>
+      </w:r>
+      <w:r>
+        <w:rPr>
+          <w:rFonts w:cs="Times New Roman"/>
+        </w:rPr>
+        <w:t>) ketika kapasitas volisional konsumen membatasi toleransi risiko spekulatif.</w:t>
       </w:r>
     </w:p>
     <w:p>
@@ -18408,44 +18742,7 @@
         <w:rPr>
           <w:rFonts w:cs="Times New Roman"/>
         </w:rPr>
-        <w:t xml:space="preserve"> Uji interaksi </w:t>
-      </w:r>
-      <w:r>
-        <w:rPr>
-          <w:rFonts w:cs="Times New Roman"/>
-          <w:i/>
-        </w:rPr>
-        <w:t>X</w:t>
-      </w:r>
-      <w:r>
-        <w:rPr>
-          <w:rFonts w:cs="Times New Roman"/>
-        </w:rPr>
-        <w:t xml:space="preserve">₂ · </w:t>
-      </w:r>
-      <w:r>
-        <w:rPr>
-          <w:rFonts w:cs="Times New Roman"/>
-          <w:i/>
-        </w:rPr>
-        <w:t>M</w:t>
-      </w:r>
-      <w:r>
-        <w:rPr>
-          <w:rFonts w:cs="Times New Roman"/>
-        </w:rPr>
-        <w:t xml:space="preserve"> secara langsung belum tersedia dalam korpus; dukungan bersifat tak langsung dan dinyatakan eksplisit sebagai demikian. Bukti parsial terdekat berasal dari </w:t>
-      </w:r>
-      <w:hyperlink w:anchor="Ref_artadita2024how" w:history="1">
-        <w:r>
-          <w:t>Artadita dan Firmialy (2024)</w:t>
-        </w:r>
-      </w:hyperlink>
-      <w:r>
-        <w:rPr>
-          <w:rFonts w:cs="Times New Roman"/>
-        </w:rPr>
-        <w:t xml:space="preserve">: hanya dimensi kontrol kognitif yang signifikan melemahkan impulsivitas koleksi item game (-0{,}3473, p&lt;0{,}10 pada Model 3), sementara efek moderasi keseluruhan DITOLAK (β=0{,}092, n.s.). Dukungan umum datang dari </w:t>
+        <w:t xml:space="preserve"> Dukungan tak langsung (dinyatakan eksplisit): </w:t>
       </w:r>
       <w:hyperlink w:anchor="Ref_katauke2023financial" w:history="1">
         <w:r>
@@ -18469,57 +18766,68 @@
         <w:rPr>
           <w:rFonts w:cs="Times New Roman"/>
         </w:rPr>
-        <w:t xml:space="preserve"> bahwa kapasitas regulasi (literasi finansial) menekan impulsivitas, serta bukti MRA </w:t>
-      </w:r>
-      <w:hyperlink w:anchor="Ref_apidana2022peran" w:history="1">
-        <w:r>
-          <w:t>Apidana dan Kholifah (2022)</w:t>
+        <w:t xml:space="preserve"> membuktikan kapasitas literasi finansial berhubungan negatif dengan impulsivitas diskonto hiperbolik (Jepang, probit + IV) — proksi regulasi rasional, bukan uji </w:t>
+      </w:r>
+      <w:r>
+        <w:rPr>
+          <w:rFonts w:cs="Times New Roman"/>
+          <w:i/>
+        </w:rPr>
+        <w:t>X</w:t>
+      </w:r>
+      <w:r>
+        <w:rPr>
+          <w:rFonts w:cs="Times New Roman"/>
+        </w:rPr>
+        <w:t xml:space="preserve">₃ · </w:t>
+      </w:r>
+      <w:r>
+        <w:rPr>
+          <w:rFonts w:cs="Times New Roman"/>
+          <w:i/>
+        </w:rPr>
+        <w:t>M</w:t>
+      </w:r>
+      <w:r>
+        <w:rPr>
+          <w:rFonts w:cs="Times New Roman"/>
+        </w:rPr>
+        <w:t xml:space="preserve">. </w:t>
+      </w:r>
+      <w:hyperlink w:anchor="Ref_aryadi2024personal" w:history="1">
+        <w:r>
+          <w:t>Aryadi dan Lingga (2026)</w:t>
         </w:r>
       </w:hyperlink>
       <w:r>
         <w:rPr>
           <w:rFonts w:cs="Times New Roman"/>
         </w:rPr>
-        <w:t xml:space="preserve"> bahwa kontrol diri memperlemah dorongan non-afektif (</w:t>
-      </w:r>
-      <w:r>
-        <w:rPr>
-          <w:rFonts w:cs="Times New Roman"/>
-          <w:i/>
-        </w:rPr>
-        <w:t>shopping lifestyle</w:t>
-      </w:r>
-      <w:r>
-        <w:rPr>
-          <w:rFonts w:cs="Times New Roman"/>
-        </w:rPr>
-        <w:t xml:space="preserve">, H4 diterima, β&lt;0) — keduanya analogi, bukan uji </w:t>
-      </w:r>
-      <w:r>
-        <w:rPr>
-          <w:rFonts w:cs="Times New Roman"/>
-          <w:i/>
-        </w:rPr>
-        <w:t>X</w:t>
-      </w:r>
-      <w:r>
-        <w:rPr>
-          <w:rFonts w:cs="Times New Roman"/>
-        </w:rPr>
-        <w:t xml:space="preserve">₂ · </w:t>
-      </w:r>
-      <w:r>
-        <w:rPr>
-          <w:rFonts w:cs="Times New Roman"/>
-          <w:i/>
-        </w:rPr>
-        <w:t>M</w:t>
-      </w:r>
-      <w:r>
-        <w:rPr>
-          <w:rFonts w:cs="Times New Roman"/>
-        </w:rPr>
-        <w:t>.</w:t>
+        <w:t xml:space="preserve"> dan </w:t>
+      </w:r>
+      <w:hyperlink w:anchor="Ref_colline2024biases" w:history="1">
+        <w:r>
+          <w:t>Colline (2024)</w:t>
+        </w:r>
+      </w:hyperlink>
+      <w:r>
+        <w:rPr>
+          <w:rFonts w:cs="Times New Roman"/>
+        </w:rPr>
+        <w:t xml:space="preserve"> mendokumentasikan kuatnya motif investasi koleksi (CM p=0,000) dan bias </w:t>
+      </w:r>
+      <w:r>
+        <w:rPr>
+          <w:rFonts w:cs="Times New Roman"/>
+          <w:i/>
+        </w:rPr>
+        <w:t>herding</w:t>
+      </w:r>
+      <w:r>
+        <w:rPr>
+          <w:rFonts w:cs="Times New Roman"/>
+        </w:rPr>
+        <w:t xml:space="preserve"> investor — keduanya bukti sisi pendorong spekulasi (ranah H3), bukan bukti efek meredam kontrol diri.</w:t>
       </w:r>
     </w:p>
     <w:p>
@@ -18539,33 +18847,33 @@
         <w:rPr>
           <w:rFonts w:cs="Times New Roman"/>
         </w:rPr>
-        <w:t xml:space="preserve"> Kolektor yang memiliki kontrol diri tinggi menyadari bahwa membeli </w:t>
-      </w:r>
-      <w:r>
-        <w:rPr>
-          <w:rFonts w:cs="Times New Roman"/>
-          <w:i/>
-        </w:rPr>
-        <w:t>pack</w:t>
-      </w:r>
-      <w:r>
-        <w:rPr>
-          <w:rFonts w:cs="Times New Roman"/>
-        </w:rPr>
-        <w:t xml:space="preserve"> acak demi mencari satu kartu spesifik yang hilang memiliki probabilitas sangat kecil dan boros biaya. Kontrol diri memampukan kolektor menahan diri dari belanja impulsif dan memilih membeli kartu lepasan (</w:t>
-      </w:r>
-      <w:r>
-        <w:rPr>
-          <w:rFonts w:cs="Times New Roman"/>
-          <w:i/>
-        </w:rPr>
-        <w:t>singles</w:t>
-      </w:r>
-      <w:r>
-        <w:rPr>
-          <w:rFonts w:cs="Times New Roman"/>
-        </w:rPr>
-        <w:t>) di pasar sekunder secara terencana. Akibatnya, kontrol diri memperlemah pengaruh hasrat kelengkapan terhadap pembelian impulsif.</w:t>
+        <w:t xml:space="preserve"> Godaan keuntungan menjual kembali kartu bersertifikat </w:t>
+      </w:r>
+      <w:r>
+        <w:rPr>
+          <w:rFonts w:cs="Times New Roman"/>
+          <w:i/>
+        </w:rPr>
+        <w:t>grading</w:t>
+      </w:r>
+      <w:r>
+        <w:rPr>
+          <w:rFonts w:cs="Times New Roman"/>
+        </w:rPr>
+        <w:t xml:space="preserve"> PSA 10 kuat memikat. Sebaliknya, pembeli dengan kontrol diri kokoh memiliki disiplin untuk tidak menghamburkan uang secara spontan pada kemasan acak berisiko tinggi. Disiplin tersebut meredam ambisi spekulatif agar tidak bertransformasi menjadi tindakan </w:t>
+      </w:r>
+      <w:r>
+        <w:rPr>
+          <w:rFonts w:cs="Times New Roman"/>
+          <w:i/>
+        </w:rPr>
+        <w:t>impulsive buying</w:t>
+      </w:r>
+      <w:r>
+        <w:rPr>
+          <w:rFonts w:cs="Times New Roman"/>
+        </w:rPr>
+        <w:t>.</w:t>
       </w:r>
     </w:p>
     <w:p>
@@ -18579,8 +18887,7 @@
           <w:rFonts w:cs="Times New Roman"/>
           <w:b/>
         </w:rPr>
-        <w:lastRenderedPageBreak/>
-        <w:t xml:space="preserve">H5: </w:t>
+        <w:t xml:space="preserve">H6: </w:t>
       </w:r>
       <w:r>
         <w:rPr>
@@ -18603,7 +18910,7 @@
           <w:b/>
           <w:i/>
         </w:rPr>
-        <w:t>Desire for Completeness</w:t>
+        <w:t>Speculative Motive</w:t>
       </w:r>
       <w:r>
         <w:rPr>
@@ -18645,10 +18952,10 @@
     </w:p>
     <w:p>
       <w:pPr>
-        <w:pStyle w:val="Heading3"/>
-        <w:outlineLvl w:val="2"/>
-      </w:pPr>
-      <w:bookmarkStart w:id="36" w:name="_Toc240642920"/>
+        <w:pStyle w:val="Heading2"/>
+        <w:outlineLvl w:val="1"/>
+      </w:pPr>
+      <w:bookmarkStart w:id="37" w:name="_Toc240917139"/>
       <w:r>
         <w:rPr>
           <w:rFonts w:ascii="Times New Roman" w:hAnsi="Times New Roman"/>
@@ -18656,57 +18963,9 @@
           <w:color w:val="000000"/>
           <w:sz w:val="24"/>
         </w:rPr>
-        <w:t xml:space="preserve">2.4.6 Pengaruh Moderasi </w:t>
-      </w:r>
-      <w:r>
-        <w:rPr>
-          <w:rFonts w:ascii="Times New Roman" w:hAnsi="Times New Roman"/>
-          <w:b/>
-          <w:i/>
-          <w:color w:val="000000"/>
-          <w:sz w:val="24"/>
-        </w:rPr>
-        <w:t>Self-Control</w:t>
-      </w:r>
-      <w:r>
-        <w:rPr>
-          <w:rFonts w:ascii="Times New Roman" w:hAnsi="Times New Roman"/>
-          <w:b/>
-          <w:color w:val="000000"/>
-          <w:sz w:val="24"/>
-        </w:rPr>
-        <w:t xml:space="preserve"> terhadap Hubungan </w:t>
-      </w:r>
-      <w:r>
-        <w:rPr>
-          <w:rFonts w:ascii="Times New Roman" w:hAnsi="Times New Roman"/>
-          <w:b/>
-          <w:i/>
-          <w:color w:val="000000"/>
-          <w:sz w:val="24"/>
-        </w:rPr>
-        <w:t>Speculative Motive</w:t>
-      </w:r>
-      <w:r>
-        <w:rPr>
-          <w:rFonts w:ascii="Times New Roman" w:hAnsi="Times New Roman"/>
-          <w:b/>
-          <w:color w:val="000000"/>
-          <w:sz w:val="24"/>
-        </w:rPr>
-        <w:t xml:space="preserve"> dan </w:t>
-      </w:r>
-      <w:r>
-        <w:rPr>
-          <w:rFonts w:ascii="Times New Roman" w:hAnsi="Times New Roman"/>
-          <w:b/>
-          <w:i/>
-          <w:color w:val="000000"/>
-          <w:sz w:val="24"/>
-        </w:rPr>
-        <w:t>Impulsive Buying</w:t>
-      </w:r>
-      <w:bookmarkEnd w:id="36"/>
+        <w:t>2.5 Rerangka Penelitian</w:t>
+      </w:r>
+      <w:bookmarkEnd w:id="37"/>
     </w:p>
     <w:p>
       <w:pPr>
@@ -18717,342 +18976,6 @@
       <w:r>
         <w:rPr>
           <w:rFonts w:cs="Times New Roman"/>
-          <w:b/>
-        </w:rPr>
-        <w:t>Landasan Teoretis:</w:t>
-      </w:r>
-      <w:r>
-        <w:rPr>
-          <w:rFonts w:cs="Times New Roman"/>
-        </w:rPr>
-        <w:t xml:space="preserve"> Dalam </w:t>
-      </w:r>
-      <w:r>
-        <w:rPr>
-          <w:rFonts w:cs="Times New Roman"/>
-          <w:i/>
-        </w:rPr>
-        <w:t>Behavioral Finance</w:t>
-      </w:r>
-      <w:r>
-        <w:rPr>
-          <w:rFonts w:cs="Times New Roman"/>
-        </w:rPr>
-        <w:t>, kontrol diri mendisiplinkan individu untuk menimbang risiko kerugian modal riil dan tidak terjebak dalam euforia transaksi spekulatif berlebihan (</w:t>
-      </w:r>
-      <w:hyperlink w:anchor="Ref_thaler1981economic" w:history="1">
-        <w:r>
-          <w:t>Thaler dan Shefrin, 1981</w:t>
-        </w:r>
-      </w:hyperlink>
-      <w:r>
-        <w:rPr>
-          <w:rFonts w:cs="Times New Roman"/>
-        </w:rPr>
-        <w:t xml:space="preserve">; </w:t>
-      </w:r>
-      <w:hyperlink w:anchor="Ref_barber2008all" w:history="1">
-        <w:r>
-          <w:t>Barber dan Odean, 2008</w:t>
-        </w:r>
-      </w:hyperlink>
-      <w:r>
-        <w:rPr>
-          <w:rFonts w:cs="Times New Roman"/>
-        </w:rPr>
-        <w:t>). Efek interaksi negatif (β₇ &lt; 0) menunjukkan pengaruh spekulasi terhadap pembelian spontan teredam secara bersyarat (\frac{</w:t>
-      </w:r>
-    </w:p>
-    <w:p>
-      <w:pPr>
-        <w:spacing w:after="0" w:line="360" w:lineRule="auto"/>
-        <w:ind w:firstLine="709"/>
-        <w:jc w:val="both"/>
-      </w:pPr>
-      <w:r>
-        <w:rPr>
-          <w:rFonts w:cs="Times New Roman"/>
-        </w:rPr>
-        <w:t>tial Y}{</w:t>
-      </w:r>
-    </w:p>
-    <w:p>
-      <w:pPr>
-        <w:spacing w:after="0" w:line="360" w:lineRule="auto"/>
-        <w:ind w:firstLine="709"/>
-        <w:jc w:val="both"/>
-      </w:pPr>
-      <w:r>
-        <w:rPr>
-          <w:rFonts w:cs="Times New Roman"/>
-        </w:rPr>
-        <w:t>tial X_3^</w:t>
-      </w:r>
-      <w:r>
-        <w:rPr>
-          <w:rFonts w:cs="Times New Roman"/>
-          <w:i/>
-        </w:rPr>
-        <w:t>} = β₃ + β₇ M^</w:t>
-      </w:r>
-      <w:r>
-        <w:rPr>
-          <w:rFonts w:cs="Times New Roman"/>
-        </w:rPr>
-        <w:t>) ketika kapasitas volisional konsumen membatasi toleransi risiko spekulatif.</w:t>
-      </w:r>
-    </w:p>
-    <w:p>
-      <w:pPr>
-        <w:spacing w:after="0" w:line="360" w:lineRule="auto"/>
-        <w:ind w:firstLine="709"/>
-        <w:jc w:val="both"/>
-      </w:pPr>
-      <w:r>
-        <w:rPr>
-          <w:rFonts w:cs="Times New Roman"/>
-          <w:b/>
-        </w:rPr>
-        <w:t>Kajian Empiris Terdahulu:</w:t>
-      </w:r>
-      <w:r>
-        <w:rPr>
-          <w:rFonts w:cs="Times New Roman"/>
-        </w:rPr>
-        <w:t xml:space="preserve"> Dukungan tak langsung (dinyatakan eksplisit): </w:t>
-      </w:r>
-      <w:hyperlink w:anchor="Ref_katauke2023financial" w:history="1">
-        <w:r>
-          <w:t xml:space="preserve">Katauke </w:t>
-        </w:r>
-        <w:r>
-          <w:rPr>
-            <w:rFonts w:cs="Times New Roman"/>
-            <w:i/>
-          </w:rPr>
-          <w:t>et al.</w:t>
-        </w:r>
-        <w:r>
-          <w:rPr>
-            <w:rFonts w:cs="Times New Roman"/>
-          </w:rPr>
-          <w:t xml:space="preserve"> (2023)</w:t>
-        </w:r>
-      </w:hyperlink>
-      <w:r>
-        <w:rPr>
-          <w:rFonts w:cs="Times New Roman"/>
-        </w:rPr>
-        <w:t xml:space="preserve"> membuktikan kapasitas literasi finansial berhubungan negatif dengan impulsivitas diskonto hiperbolik (Jepang, probit + IV) — proksi regulasi rasional, bukan uji </w:t>
-      </w:r>
-      <w:r>
-        <w:rPr>
-          <w:rFonts w:cs="Times New Roman"/>
-          <w:i/>
-        </w:rPr>
-        <w:t>X</w:t>
-      </w:r>
-      <w:r>
-        <w:rPr>
-          <w:rFonts w:cs="Times New Roman"/>
-        </w:rPr>
-        <w:t xml:space="preserve">₃ · </w:t>
-      </w:r>
-      <w:r>
-        <w:rPr>
-          <w:rFonts w:cs="Times New Roman"/>
-          <w:i/>
-        </w:rPr>
-        <w:t>M</w:t>
-      </w:r>
-      <w:r>
-        <w:rPr>
-          <w:rFonts w:cs="Times New Roman"/>
-        </w:rPr>
-        <w:t xml:space="preserve">. </w:t>
-      </w:r>
-      <w:hyperlink w:anchor="Ref_aryadi2024personal" w:history="1">
-        <w:r>
-          <w:t>Aryadi dan Lingga (2026)</w:t>
-        </w:r>
-      </w:hyperlink>
-      <w:r>
-        <w:rPr>
-          <w:rFonts w:cs="Times New Roman"/>
-        </w:rPr>
-        <w:t xml:space="preserve"> dan </w:t>
-      </w:r>
-      <w:hyperlink w:anchor="Ref_colline2024biases" w:history="1">
-        <w:r>
-          <w:t>Colline (2024)</w:t>
-        </w:r>
-      </w:hyperlink>
-      <w:r>
-        <w:rPr>
-          <w:rFonts w:cs="Times New Roman"/>
-        </w:rPr>
-        <w:t xml:space="preserve"> mendokumentasikan kuatnya motif investasi koleksi (CM p=0,000) dan bias </w:t>
-      </w:r>
-      <w:r>
-        <w:rPr>
-          <w:rFonts w:cs="Times New Roman"/>
-          <w:i/>
-        </w:rPr>
-        <w:t>herding</w:t>
-      </w:r>
-      <w:r>
-        <w:rPr>
-          <w:rFonts w:cs="Times New Roman"/>
-        </w:rPr>
-        <w:t xml:space="preserve"> investor — keduanya bukti sisi pendorong spekulasi (ranah H3), bukan bukti efek meredam kontrol diri.</w:t>
-      </w:r>
-    </w:p>
-    <w:p>
-      <w:pPr>
-        <w:spacing w:after="0" w:line="360" w:lineRule="auto"/>
-        <w:ind w:firstLine="709"/>
-        <w:jc w:val="both"/>
-      </w:pPr>
-      <w:r>
-        <w:rPr>
-          <w:rFonts w:cs="Times New Roman"/>
-          <w:b/>
-        </w:rPr>
-        <w:t>Keterkaitan dengan Objek (Pokémon TCG):</w:t>
-      </w:r>
-      <w:r>
-        <w:rPr>
-          <w:rFonts w:cs="Times New Roman"/>
-        </w:rPr>
-        <w:t xml:space="preserve"> Godaan keuntungan menjual kembali kartu bersertifikat </w:t>
-      </w:r>
-      <w:r>
-        <w:rPr>
-          <w:rFonts w:cs="Times New Roman"/>
-          <w:i/>
-        </w:rPr>
-        <w:t>grading</w:t>
-      </w:r>
-      <w:r>
-        <w:rPr>
-          <w:rFonts w:cs="Times New Roman"/>
-        </w:rPr>
-        <w:t xml:space="preserve"> PSA 10 kuat memikat. Sebaliknya, pembeli dengan kontrol diri kokoh memiliki disiplin untuk tidak menghamburkan uang secara spontan pada kemasan acak berisiko tinggi. Disiplin tersebut meredam ambisi spekulatif agar tidak bertransformasi menjadi tindakan </w:t>
-      </w:r>
-      <w:r>
-        <w:rPr>
-          <w:rFonts w:cs="Times New Roman"/>
-          <w:i/>
-        </w:rPr>
-        <w:t>impulsive buying</w:t>
-      </w:r>
-      <w:r>
-        <w:rPr>
-          <w:rFonts w:cs="Times New Roman"/>
-        </w:rPr>
-        <w:t>.</w:t>
-      </w:r>
-    </w:p>
-    <w:p>
-      <w:pPr>
-        <w:spacing w:after="0" w:line="360" w:lineRule="auto"/>
-        <w:ind w:firstLine="709"/>
-        <w:jc w:val="both"/>
-      </w:pPr>
-      <w:r>
-        <w:rPr>
-          <w:rFonts w:cs="Times New Roman"/>
-          <w:b/>
-        </w:rPr>
-        <w:t xml:space="preserve">H6: </w:t>
-      </w:r>
-      <w:r>
-        <w:rPr>
-          <w:rFonts w:cs="Times New Roman"/>
-          <w:b/>
-          <w:i/>
-        </w:rPr>
-        <w:t>Self-Control</w:t>
-      </w:r>
-      <w:r>
-        <w:rPr>
-          <w:rFonts w:cs="Times New Roman"/>
-          <w:b/>
-        </w:rPr>
-        <w:t xml:space="preserve"> memoderasi (memperlemah) pengaruh </w:t>
-      </w:r>
-      <w:r>
-        <w:rPr>
-          <w:rFonts w:cs="Times New Roman"/>
-          <w:b/>
-          <w:i/>
-        </w:rPr>
-        <w:t>Speculative Motive</w:t>
-      </w:r>
-      <w:r>
-        <w:rPr>
-          <w:rFonts w:cs="Times New Roman"/>
-          <w:b/>
-        </w:rPr>
-        <w:t xml:space="preserve"> terhadap </w:t>
-      </w:r>
-      <w:r>
-        <w:rPr>
-          <w:rFonts w:cs="Times New Roman"/>
-          <w:b/>
-          <w:i/>
-        </w:rPr>
-        <w:t>Impulsive Buying</w:t>
-      </w:r>
-      <w:r>
-        <w:rPr>
-          <w:rFonts w:cs="Times New Roman"/>
-          <w:b/>
-        </w:rPr>
-        <w:t xml:space="preserve"> </w:t>
-      </w:r>
-      <w:r>
-        <w:rPr>
-          <w:rFonts w:cs="Times New Roman"/>
-          <w:b/>
-          <w:i/>
-        </w:rPr>
-        <w:t>booster pack</w:t>
-      </w:r>
-      <w:r>
-        <w:rPr>
-          <w:rFonts w:cs="Times New Roman"/>
-          <w:b/>
-        </w:rPr>
-        <w:t xml:space="preserve"> kartu Pokémon TCG.</w:t>
-      </w:r>
-    </w:p>
-    <w:p>
-      <w:pPr>
-        <w:pStyle w:val="Heading2"/>
-        <w:outlineLvl w:val="1"/>
-      </w:pPr>
-      <w:bookmarkStart w:id="37" w:name="_Toc240642921"/>
-      <w:r>
-        <w:rPr>
-          <w:rFonts w:ascii="Times New Roman" w:hAnsi="Times New Roman"/>
-          <w:b/>
-          <w:color w:val="000000"/>
-          <w:sz w:val="24"/>
-        </w:rPr>
-        <w:t>2.5 Rerangka Penelitian</w:t>
-      </w:r>
-      <w:bookmarkEnd w:id="37"/>
-    </w:p>
-    <w:p>
-      <w:pPr>
-        <w:spacing w:after="0" w:line="360" w:lineRule="auto"/>
-        <w:ind w:firstLine="709"/>
-        <w:jc w:val="both"/>
-      </w:pPr>
-      <w:r>
-        <w:rPr>
-          <w:rFonts w:cs="Times New Roman"/>
         </w:rPr>
         <w:t>Hubungan struktural antarvariabel disajikan pada Gambar 2.1:</w:t>
       </w:r>
@@ -19068,7 +18991,7 @@
         </w:rPr>
         <w:lastRenderedPageBreak/>
         <w:drawing>
-          <wp:inline distT="0" distB="0" distL="0" distR="0" wp14:anchorId="5C20255C" wp14:editId="58461024">
+          <wp:inline distT="0" distB="0" distL="0" distR="0" wp14:anchorId="62E6E90A" wp14:editId="4F8707C3">
             <wp:extent cx="5040000" cy="2753704"/>
             <wp:effectExtent l="0" t="0" r="0" b="0"/>
             <wp:docPr id="5" name="Picture 5"/>
@@ -19143,7 +19066,7 @@
         <w:pStyle w:val="Heading1"/>
         <w:outlineLvl w:val="0"/>
       </w:pPr>
-      <w:bookmarkStart w:id="39" w:name="_Toc240642922"/>
+      <w:bookmarkStart w:id="39" w:name="_Toc240917140"/>
       <w:r>
         <w:rPr>
           <w:rFonts w:ascii="Times New Roman" w:hAnsi="Times New Roman"/>
@@ -21127,31 +21050,31 @@
       </w:rPr>
     </w:lvl>
   </w:abstractNum>
-  <w:num w:numId="1" w16cid:durableId="574900975">
+  <w:num w:numId="1" w16cid:durableId="688801665">
     <w:abstractNumId w:val="8"/>
   </w:num>
-  <w:num w:numId="2" w16cid:durableId="930815334">
+  <w:num w:numId="2" w16cid:durableId="290749911">
     <w:abstractNumId w:val="6"/>
   </w:num>
-  <w:num w:numId="3" w16cid:durableId="455297901">
+  <w:num w:numId="3" w16cid:durableId="1730613734">
     <w:abstractNumId w:val="5"/>
   </w:num>
-  <w:num w:numId="4" w16cid:durableId="1297376855">
+  <w:num w:numId="4" w16cid:durableId="1160461049">
     <w:abstractNumId w:val="4"/>
   </w:num>
-  <w:num w:numId="5" w16cid:durableId="1425879703">
+  <w:num w:numId="5" w16cid:durableId="845369357">
     <w:abstractNumId w:val="7"/>
   </w:num>
-  <w:num w:numId="6" w16cid:durableId="776366063">
+  <w:num w:numId="6" w16cid:durableId="1393580814">
     <w:abstractNumId w:val="3"/>
   </w:num>
-  <w:num w:numId="7" w16cid:durableId="371227103">
+  <w:num w:numId="7" w16cid:durableId="192617689">
     <w:abstractNumId w:val="2"/>
   </w:num>
-  <w:num w:numId="8" w16cid:durableId="315496744">
+  <w:num w:numId="8" w16cid:durableId="1251743387">
     <w:abstractNumId w:val="1"/>
   </w:num>
-  <w:num w:numId="9" w16cid:durableId="632369014">
+  <w:num w:numId="9" w16cid:durableId="1172379463">
     <w:abstractNumId w:val="0"/>
   </w:num>
 </w:numbering>
@@ -32592,7 +32515,7 @@
     <w:autoRedefine/>
     <w:uiPriority w:val="39"/>
     <w:unhideWhenUsed/>
-    <w:rsid w:val="0003037C"/>
+    <w:rsid w:val="002A5294"/>
     <w:pPr>
       <w:spacing w:after="40" w:line="240" w:lineRule="auto"/>
     </w:pPr>
@@ -32608,7 +32531,7 @@
     <w:autoRedefine/>
     <w:uiPriority w:val="39"/>
     <w:unhideWhenUsed/>
-    <w:rsid w:val="0003037C"/>
+    <w:rsid w:val="002A5294"/>
     <w:pPr>
       <w:spacing w:after="40" w:line="240" w:lineRule="auto"/>
       <w:ind w:left="360"/>
@@ -32624,7 +32547,7 @@
     <w:autoRedefine/>
     <w:uiPriority w:val="39"/>
     <w:unhideWhenUsed/>
-    <w:rsid w:val="0003037C"/>
+    <w:rsid w:val="002A5294"/>
     <w:pPr>
       <w:spacing w:after="40" w:line="240" w:lineRule="auto"/>
       <w:ind w:left="720"/>
@@ -32639,7 +32562,7 @@
     <w:basedOn w:val="DefaultParagraphFont"/>
     <w:uiPriority w:val="99"/>
     <w:unhideWhenUsed/>
-    <w:rsid w:val="0003037C"/>
+    <w:rsid w:val="002A5294"/>
     <w:rPr>
       <w:color w:val="0000FF" w:themeColor="hyperlink"/>
       <w:u w:val="single"/>

</xml_diff>